<commit_message>
op 112: light round done (#649 merged; #646/#315 fixed; #635/#315 Opus APPROVE); v6 refreshed 14:37
</commit_message>
<xml_diff>
--- a/handoffs/op-6870f2ca/TGP-Operator-Prompt-v6-Agent-113.docx
+++ b/handoffs/op-6870f2ca/TGP-Operator-Prompt-v6-Agent-113.docx
@@ -2,7 +2,7 @@
 <file path=word/document.xml><?xml version="1.0" encoding="utf-8"?>
 <w:document xmlns:w="http://schemas.openxmlformats.org/wordprocessingml/2006/main" xmlns:m="http://schemas.openxmlformats.org/officeDocument/2006/math" xmlns:r="http://schemas.openxmlformats.org/officeDocument/2006/relationships" xmlns:o="urn:schemas-microsoft-com:office:office" xmlns:v="urn:schemas-microsoft-com:vml" xmlns:w10="urn:schemas-microsoft-com:office:word" xmlns:a="http://schemas.openxmlformats.org/drawingml/2006/main" xmlns:pic="http://schemas.openxmlformats.org/drawingml/2006/picture" xmlns:wp="http://schemas.openxmlformats.org/drawingml/2006/wordprocessingDrawing">
   <w:body>
-    <w:bookmarkStart w:id="62" w:name="Xc52d7d2b3b12d18d55f2fb0d6b0776b1d13b02c"/>
+    <w:bookmarkStart w:id="63" w:name="Xc52d7d2b3b12d18d55f2fb0d6b0776b1d13b02c"/>
     <w:p>
       <w:pPr>
         <w:pStyle w:val="Heading1"/>
@@ -25,7 +25,7 @@
         <w:t xml:space="preserve">“lets prepare for your OUT OF CREDIT reitre … prep for [the next agent] (a fresh, no prior context agent) who will need you to cleanly stop, no wasted work, and a great pickup-prompt from you - just like you used the agent 111 prompt document, but perferably yours would be even better!”</w:t>
       </w:r>
       <w:r>
-        <w:t xml:space="preserve">). Snapshot: 2026-10-02 13:53 PDT (real clock). The newest copy lives in tgp-agent-context at handoffs/op-6870f2ca/TGP-Operator-Prompt-v6-Agent-113.md (and .docx). Paste this whole document as the first message to the next operator and attach the owner documents listed in section 3.4. It replaces prompt v5 (handoffs/op-f083060f/TGP-Operator-Prompt-v5-Agent-111.md, kept for history). Most of v5 is carried over word for word. Changed or new: the START HERE card (new), 0.A (new), 2 (10-02 update), 3 (rewritten: new ops kit), 4.14 (new), 5 (rewritten), 6.0 (112’s lessons, new), 7, 12, 13, 14 and 16.</w:t>
+        <w:t xml:space="preserve">). Snapshot: 2026-10-02 14:37 PDT (real clock). The newest copy lives in tgp-agent-context at handoffs/op-6870f2ca/TGP-Operator-Prompt-v6-Agent-113.md (and .docx). Paste this whole document as the first message to the next operator and attach the owner documents listed in section 3.4. It replaces prompt v5 (handoffs/op-f083060f/TGP-Operator-Prompt-v5-Agent-111.md, kept for history). Most of v5 is carried over word for word. Changed or new: the START HERE card (new), 0.A (new), 2 (10-02 update), 3 (rewritten: new ops kit), 4.14 (new), 5 (rewritten), 6.0 (112’s lessons, new), 7, 12, 13, 14 and 16.</w:t>
       </w:r>
     </w:p>
     <w:p>
@@ -2658,7 +2658,7 @@
         </w:numPr>
       </w:pPr>
       <w:r>
-        <w:t xml:space="preserve">Agent 112 (11:20-13:53) merged mobile #310 (consultation onboarding), backend #607 (consultation intake; deployed 13:01-13:08 with migration 20270212000000) and mobile #324 (one support email). It also ran 17 parallel lanes that produced about 35 audit verdicts and 15 fix rounds or new PRs.</w:t>
+        <w:t xml:space="preserve">Agent 112 (11:20-14:37) merged mobile #310 (consultation onboarding), backend #607 (consultation intake; deployed 13:01-13:08 with migration 20270212000000) and mobile #324 (one support email). It also ran 17 parallel lanes that produced about 35 audit verdicts and 15 fix rounds or new PRs.</w:t>
       </w:r>
     </w:p>
     <w:p>
@@ -8735,9 +8735,45 @@
         <w:t xml:space="preserve">OR-112-20: #649’s end-of-migration guard (it fails if Day 1 still names the diagnostic) is kept. Before deploying #649, agent 113 runs one read-only SELECT on the Build Week Day 1 rows in production and confirms they hold the original seed text, so the guard can’t fail the deploy. The deploy needs migrations=apply-migrations.</w:t>
       </w:r>
     </w:p>
+    <w:p>
+      <w:pPr>
+        <w:pStyle w:val="Compact"/>
+        <w:numPr>
+          <w:ilvl w:val="0"/>
+          <w:numId w:val="1094"/>
+        </w:numPr>
+      </w:pPr>
+      <w:r>
+        <w:t xml:space="preserve">OR-112-21: #315 is T4. Its own promotion rule fired because the screen now sends failure reports to Sentry, so it needs both lenses and still merges with #611. The shared SupportEmailFallback copy</w:t>
+      </w:r>
+      <w:r>
+        <w:t xml:space="preserve"> </w:t>
+      </w:r>
+      <w:r>
+        <w:t xml:space="preserve">“write to us”</w:t>
+      </w:r>
+      <w:r>
+        <w:t xml:space="preserve"> </w:t>
+      </w:r>
+      <w:r>
+        <w:t xml:space="preserve">is first person, so a small app-wide copy fix goes before launch. C-649-1: the #649 guard could miss leftover</w:t>
+      </w:r>
+      <w:r>
+        <w:t xml:space="preserve"> </w:t>
+      </w:r>
+      <w:r>
+        <w:t xml:space="preserve">“diagnostic”</w:t>
+      </w:r>
+      <w:r>
+        <w:t xml:space="preserve"> </w:t>
+      </w:r>
+      <w:r>
+        <w:t xml:space="preserve">text if production’s Day 1 drifted; the pre-deploy SELECT covers that.</w:t>
+      </w:r>
+    </w:p>
     <w:bookmarkEnd w:id="37"/>
     <w:bookmarkEnd w:id="38"/>
-    <w:bookmarkStart w:id="45" w:name="X4fd48c18ea9d1ad3abc1bcdad38451e4c82ba6e"/>
+    <w:bookmarkStart w:id="46" w:name="X4fd48c18ea9d1ad3abc1bcdad38451e4c82ba6e"/>
     <w:p>
       <w:pPr>
         <w:pStyle w:val="Heading2"/>
@@ -8772,13 +8808,13 @@
         <w:t xml:space="preserve">. If this prompt and the train log disagree, the train log wins, and GitHub beats both.</w:t>
       </w:r>
     </w:p>
-    <w:bookmarkStart w:id="44" w:name="X2b7433d4125794921a22b4bee6a33256ab63992"/>
+    <w:bookmarkStart w:id="45" w:name="X3e25525eea792b744c28f518b3ca8d426a04ef5"/>
     <w:p>
       <w:pPr>
         <w:pStyle w:val="Heading3"/>
       </w:pPr>
       <w:r>
-        <w:t xml:space="preserve">AGENT 112 STATE FOR AGENT 113: snapshot 2026-10-02 13:53 PDT (real clock)</w:t>
+        <w:t xml:space="preserve">AGENT 112 STATE FOR AGENT 113: snapshot 2026-10-02 14:37 PDT (real clock)</w:t>
       </w:r>
     </w:p>
     <w:bookmarkStart w:id="39" w:name="production-and-mains"/>
@@ -8892,7 +8928,7 @@
         </w:numPr>
       </w:pPr>
       <w:r>
-        <w:t xml:space="preserve">Backend main: 5d1f224a (#644 on top of the deployed f04289f9). Mobile main: f34b5b99 (#324, 13:36), on top of 2c17c241 (#310 consultation onboarding, 12:11).</w:t>
+        <w:t xml:space="preserve">Backend main: c8e5e71f (#644 and #649 on top of the deployed f04289f9; neither is deployed yet). Mobile main: f34b5b99 (#324, 13:36), on top of 2c17c241 (#310 consultation onboarding, 12:11).</w:t>
       </w:r>
     </w:p>
     <w:p>
@@ -9023,6 +9059,18 @@
       </w:pPr>
       <w:r>
         <w:t xml:space="preserve">backend #644: diagnostic quiz switched off in the fitness backend (T2; Sol APPROVE at d32dcfca; no mobile caller), 13:40 → 5d1f224a. NOT deployed yet; it rides the next deploy.</w:t>
+      </w:r>
+    </w:p>
+    <w:p>
+      <w:pPr>
+        <w:pStyle w:val="Compact"/>
+        <w:numPr>
+          <w:ilvl w:val="0"/>
+          <w:numId w:val="1105"/>
+        </w:numPr>
+      </w:pPr>
+      <w:r>
+        <w:t xml:space="preserve">backend #649: Build Week Day 1 points to the consultation (migration 20270224000000; T3; Opus APPROVE at aa1da69d plus a merge-delta APPROVE at 650d0e48), 14:37 → c8e5e71f. NOT deployed. Before the deploy that carries it, run the read-only pre-deploy SELECT in probes/aud-opus5-112/649-predeploy-select.sql (OR-112-20). Deploy with migrations=apply-migrations.</w:t>
       </w:r>
     </w:p>
     <w:bookmarkEnd w:id="40"/>
@@ -9674,8 +9722,147 @@
         <w:t xml:space="preserve">— Model: Claude Opus 5.5; Scope: #640/#328 + undo; Final state at 112’s stop: DONE (no WIP): #640 -&gt; 213a186d (A-640-1, B-640-2..4, C-640-5..10, Undo/Redo, 2nd-client clone 409, sub-coach day access, legacy archive guard; main f04289f9 merged; CI was running at 13:45), #328 -&gt; 67f9ef4 (B-328-1..4, C-328-2; CI green). NOT STARTED: archive guard for programs referenced by #607 clinic program sets; program copies in #608 erasure manifest. Order: #640 -&gt; deploy + MWB manifest flips -&gt; #328; Report: S-MWB-2-112.md</w:t>
       </w:r>
     </w:p>
+    <w:p>
+      <w:pPr>
+        <w:pStyle w:val="Compact"/>
+        <w:numPr>
+          <w:ilvl w:val="0"/>
+          <w:numId w:val="1106"/>
+        </w:numPr>
+      </w:pPr>
+      <w:r>
+        <w:rPr>
+          <w:b/>
+          <w:bCs/>
+        </w:rPr>
+        <w:t xml:space="preserve">B-SECRETS-2 (post-stop)</w:t>
+      </w:r>
+      <w:r>
+        <w:t xml:space="preserve"> </w:t>
+      </w:r>
+      <w:r>
+        <w:t xml:space="preserve">— Model: Claude Opus 5.5; Scope: #646 client purchase secrets; Final state at 112’s stop: DONE: #646 -&gt; 32f7ede4 (client list + coach feed allow-listed; 3/6 fail before); Report: B-SECRETS-2-112.md</w:t>
+      </w:r>
+    </w:p>
+    <w:p>
+      <w:pPr>
+        <w:pStyle w:val="Compact"/>
+        <w:numPr>
+          <w:ilvl w:val="0"/>
+          <w:numId w:val="1106"/>
+        </w:numPr>
+      </w:pPr>
+      <w:r>
+        <w:rPr>
+          <w:b/>
+          <w:bCs/>
+        </w:rPr>
+        <w:t xml:space="preserve">B-315-ERR (post-stop)</w:t>
+      </w:r>
+      <w:r>
+        <w:t xml:space="preserve"> </w:t>
+      </w:r>
+      <w:r>
+        <w:t xml:space="preserve">— Model: Claude Opus 5.5; Scope: #315 policy-link copy; Final state at 112’s stop: DONE: #315 -&gt; d545f5b6 (per-cause copy, captureErrorWithoutPii; 16 fail before); now T4; Report: B-315-ERR-112.md</w:t>
+      </w:r>
+    </w:p>
+    <w:p>
+      <w:pPr>
+        <w:pStyle w:val="Compact"/>
+        <w:numPr>
+          <w:ilvl w:val="0"/>
+          <w:numId w:val="1106"/>
+        </w:numPr>
+      </w:pPr>
+      <w:r>
+        <w:rPr>
+          <w:b/>
+          <w:bCs/>
+        </w:rPr>
+        <w:t xml:space="preserve">AUD-OPUS-5 (post-stop)</w:t>
+      </w:r>
+      <w:r>
+        <w:t xml:space="preserve"> </w:t>
+      </w:r>
+      <w:r>
+        <w:t xml:space="preserve">— Model: Claude Opus 5.5; Scope: lens; Final state at 112’s stop: DONE: #649 APPROVE (aa1da69d + delta 650d0e48; merged 14:37), #635 APPROVE delta</w:t>
+      </w:r>
+      <w:r>
+        <w:t xml:space="preserve"> </w:t>
+      </w:r>
+      <w:r>
+        <w:t xml:space="preserve">@9c5ae5ef</w:t>
+      </w:r>
+      <w:r>
+        <w:t xml:space="preserve">, #315 APPROVE</w:t>
+      </w:r>
+      <w:r>
+        <w:t xml:space="preserve"> </w:t>
+      </w:r>
+      <w:r>
+        <w:t xml:space="preserve">@d545f5b6</w:t>
+      </w:r>
+      <w:r>
+        <w:t xml:space="preserve">; Report: AUD-OPUS-5-112.md</w:t>
+      </w:r>
+    </w:p>
     <w:bookmarkEnd w:id="41"/>
-    <w:bookmarkStart w:id="42" w:name="X582e2f822231ec3e238ba31532d907188cf21e2"/>
+    <w:bookmarkStart w:id="42" w:name="X810ce142402ae3b56d7967758e6e0c8aba09eff"/>
+    <w:p>
+      <w:pPr>
+        <w:pStyle w:val="Heading4"/>
+      </w:pPr>
+      <w:r>
+        <w:t xml:space="preserve">Post-stop light round (owner 14:13:</w:t>
+      </w:r>
+      <w:r>
+        <w:t xml:space="preserve"> </w:t>
+      </w:r>
+      <w:r>
+        <w:t xml:space="preserve">“do the next 3 lgithest agent rounds”</w:t>
+      </w:r>
+      <w:r>
+        <w:t xml:space="preserve">), 14:15-14:37</w:t>
+      </w:r>
+    </w:p>
+    <w:p>
+      <w:pPr>
+        <w:pStyle w:val="Compact"/>
+        <w:numPr>
+          <w:ilvl w:val="0"/>
+          <w:numId w:val="1107"/>
+        </w:numPr>
+      </w:pPr>
+      <w:r>
+        <w:t xml:space="preserve">B-SECRETS-2: #646 → 32f7ede4. The client purchase list (GET /v1/checkout/purchases) and the coach feed (GET /v1/coach/purchases) no longer send Stripe client secrets. Mobile never read them, so they’re dropped for every status. 10/10 checks green. Needs a dual T4 audit.</w:t>
+      </w:r>
+    </w:p>
+    <w:p>
+      <w:pPr>
+        <w:pStyle w:val="Compact"/>
+        <w:numPr>
+          <w:ilvl w:val="0"/>
+          <w:numId w:val="1107"/>
+        </w:numPr>
+      </w:pPr>
+      <w:r>
+        <w:t xml:space="preserve">B-315-ERR: #315 → d545f5b6. Policy-link failures now name the page and differ by cause, and Sentry gets no PII (new captureErrorWithoutPii). 3/3 checks green. The PR’s own rule promoted it to T4 (OR-112-21).</w:t>
+      </w:r>
+    </w:p>
+    <w:p>
+      <w:pPr>
+        <w:pStyle w:val="Compact"/>
+        <w:numPr>
+          <w:ilvl w:val="0"/>
+          <w:numId w:val="1107"/>
+        </w:numPr>
+      </w:pPr>
+      <w:r>
+        <w:t xml:space="preserve">AUD-OPUS-5: Opus APPROVE on #649 (aa1da69d, plus the delta at 650d0e48; merged), #635 (9c5ae5ef, delta from c2688010) and #315 (d545f5b6).</w:t>
+      </w:r>
+    </w:p>
+    <w:bookmarkEnd w:id="42"/>
+    <w:bookmarkStart w:id="43" w:name="X582e2f822231ec3e238ba31532d907188cf21e2"/>
     <w:p>
       <w:pPr>
         <w:pStyle w:val="Heading4"/>
@@ -9699,15 +9886,15 @@
         <w:t xml:space="preserve"> </w:t>
       </w:r>
       <w:r>
-        <w:t xml:space="preserve">(24 open launch PRs; dependabot bumps and pre-launch PRs omitted)</w:t>
-      </w:r>
-    </w:p>
-    <w:p>
-      <w:pPr>
-        <w:pStyle w:val="Compact"/>
-        <w:numPr>
-          <w:ilvl w:val="0"/>
-          <w:numId w:val="1107"/>
+        <w:t xml:space="preserve">(23 open launch PRs; dependabot bumps and pre-launch PRs omitted)</w:t>
+      </w:r>
+    </w:p>
+    <w:p>
+      <w:pPr>
+        <w:pStyle w:val="Compact"/>
+        <w:numPr>
+          <w:ilvl w:val="0"/>
+          <w:numId w:val="1108"/>
         </w:numPr>
       </w:pPr>
       <w:r>
@@ -9729,7 +9916,7 @@
         <w:pStyle w:val="Compact"/>
         <w:numPr>
           <w:ilvl w:val="0"/>
-          <w:numId w:val="1107"/>
+          <w:numId w:val="1108"/>
         </w:numPr>
       </w:pPr>
       <w:r>
@@ -9751,7 +9938,7 @@
         <w:pStyle w:val="Compact"/>
         <w:numPr>
           <w:ilvl w:val="0"/>
-          <w:numId w:val="1107"/>
+          <w:numId w:val="1108"/>
         </w:numPr>
       </w:pPr>
       <w:r>
@@ -9773,7 +9960,7 @@
         <w:pStyle w:val="Compact"/>
         <w:numPr>
           <w:ilvl w:val="0"/>
-          <w:numId w:val="1107"/>
+          <w:numId w:val="1108"/>
         </w:numPr>
       </w:pPr>
       <w:r>
@@ -9795,7 +9982,7 @@
         <w:pStyle w:val="Compact"/>
         <w:numPr>
           <w:ilvl w:val="0"/>
-          <w:numId w:val="1107"/>
+          <w:numId w:val="1108"/>
         </w:numPr>
       </w:pPr>
       <w:r>
@@ -9817,7 +10004,7 @@
         <w:pStyle w:val="Compact"/>
         <w:numPr>
           <w:ilvl w:val="0"/>
-          <w:numId w:val="1107"/>
+          <w:numId w:val="1108"/>
         </w:numPr>
       </w:pPr>
       <w:r>
@@ -9857,7 +10044,7 @@
         <w:pStyle w:val="Compact"/>
         <w:numPr>
           <w:ilvl w:val="0"/>
-          <w:numId w:val="1107"/>
+          <w:numId w:val="1108"/>
         </w:numPr>
       </w:pPr>
       <w:r>
@@ -9903,7 +10090,7 @@
         <w:pStyle w:val="Compact"/>
         <w:numPr>
           <w:ilvl w:val="0"/>
-          <w:numId w:val="1107"/>
+          <w:numId w:val="1108"/>
         </w:numPr>
       </w:pPr>
       <w:r>
@@ -9949,7 +10136,7 @@
         <w:pStyle w:val="Compact"/>
         <w:numPr>
           <w:ilvl w:val="0"/>
-          <w:numId w:val="1107"/>
+          <w:numId w:val="1108"/>
         </w:numPr>
       </w:pPr>
       <w:r>
@@ -9989,7 +10176,7 @@
         <w:pStyle w:val="Compact"/>
         <w:numPr>
           <w:ilvl w:val="0"/>
-          <w:numId w:val="1107"/>
+          <w:numId w:val="1108"/>
         </w:numPr>
       </w:pPr>
       <w:r>
@@ -10029,7 +10216,7 @@
         <w:pStyle w:val="Compact"/>
         <w:numPr>
           <w:ilvl w:val="0"/>
-          <w:numId w:val="1107"/>
+          <w:numId w:val="1108"/>
         </w:numPr>
       </w:pPr>
       <w:r>
@@ -10075,7 +10262,7 @@
         <w:pStyle w:val="Compact"/>
         <w:numPr>
           <w:ilvl w:val="0"/>
-          <w:numId w:val="1107"/>
+          <w:numId w:val="1108"/>
         </w:numPr>
       </w:pPr>
       <w:r>
@@ -10121,7 +10308,7 @@
         <w:pStyle w:val="Compact"/>
         <w:numPr>
           <w:ilvl w:val="0"/>
-          <w:numId w:val="1107"/>
+          <w:numId w:val="1108"/>
         </w:numPr>
       </w:pPr>
       <w:r>
@@ -10135,7 +10322,7 @@
         <w:t xml:space="preserve"> </w:t>
       </w:r>
       <w:r>
-        <w:t xml:space="preserve">— Head: 4d987916; State: BEHIND; Base: main; Latest Opus: APPROVE</w:t>
+        <w:t xml:space="preserve">— Head: 4d987916; State: UNKNOWN; Base: main; Latest Opus: APPROVE</w:t>
       </w:r>
       <w:r>
         <w:t xml:space="preserve"> </w:t>
@@ -10161,7 +10348,7 @@
         <w:pStyle w:val="Compact"/>
         <w:numPr>
           <w:ilvl w:val="0"/>
-          <w:numId w:val="1107"/>
+          <w:numId w:val="1108"/>
         </w:numPr>
       </w:pPr>
       <w:r>
@@ -10181,18 +10368,21 @@
         <w:t xml:space="preserve"> </w:t>
       </w:r>
       <w:r>
+        <w:t xml:space="preserve">@9c5ae5ef</w:t>
+      </w:r>
+      <w:r>
+        <w:t xml:space="preserve"> </w:t>
+      </w:r>
+      <w:r>
+        <w:t xml:space="preserve">(at head); Latest Sol: REQUEST CHANGES</w:t>
+      </w:r>
+      <w:r>
+        <w:t xml:space="preserve"> </w:t>
+      </w:r>
+      <w:r>
         <w:t xml:space="preserve">@c2688010</w:t>
       </w:r>
       <w:r>
-        <w:t xml:space="preserve">; Latest Sol: REQUEST CHANGES</w:t>
-      </w:r>
-      <w:r>
-        <w:t xml:space="preserve"> </w:t>
-      </w:r>
-      <w:r>
-        <w:t xml:space="preserve">@c2688010</w:t>
-      </w:r>
-      <w:r>
         <w:t xml:space="preserve">; Title: feat(ai-consent): client-ai-v4 true AI-chat retention copy; Roman delete erases the transc</w:t>
       </w:r>
     </w:p>
@@ -10201,7 +10391,7 @@
         <w:pStyle w:val="Compact"/>
         <w:numPr>
           <w:ilvl w:val="0"/>
-          <w:numId w:val="1107"/>
+          <w:numId w:val="1108"/>
         </w:numPr>
       </w:pPr>
       <w:r>
@@ -10241,7 +10431,7 @@
         <w:pStyle w:val="Compact"/>
         <w:numPr>
           <w:ilvl w:val="0"/>
-          <w:numId w:val="1107"/>
+          <w:numId w:val="1108"/>
         </w:numPr>
       </w:pPr>
       <w:r>
@@ -10281,7 +10471,7 @@
         <w:pStyle w:val="Compact"/>
         <w:numPr>
           <w:ilvl w:val="0"/>
-          <w:numId w:val="1107"/>
+          <w:numId w:val="1108"/>
         </w:numPr>
       </w:pPr>
       <w:r>
@@ -10321,7 +10511,7 @@
         <w:pStyle w:val="Compact"/>
         <w:numPr>
           <w:ilvl w:val="0"/>
-          <w:numId w:val="1107"/>
+          <w:numId w:val="1108"/>
         </w:numPr>
       </w:pPr>
       <w:r>
@@ -10367,7 +10557,7 @@
         <w:pStyle w:val="Compact"/>
         <w:numPr>
           <w:ilvl w:val="0"/>
-          <w:numId w:val="1107"/>
+          <w:numId w:val="1108"/>
         </w:numPr>
       </w:pPr>
       <w:r>
@@ -10413,7 +10603,7 @@
         <w:pStyle w:val="Compact"/>
         <w:numPr>
           <w:ilvl w:val="0"/>
-          <w:numId w:val="1107"/>
+          <w:numId w:val="1108"/>
         </w:numPr>
       </w:pPr>
       <w:r>
@@ -10427,15 +10617,15 @@
         <w:t xml:space="preserve"> </w:t>
       </w:r>
       <w:r>
-        <w:t xml:space="preserve">— Head: 7b6165ab; State: BEHIND; Base: main; Title: ci(branch-protection): setup script lists the 10 live required checks incl. Schema parity</w:t>
-      </w:r>
-    </w:p>
-    <w:p>
-      <w:pPr>
-        <w:pStyle w:val="Compact"/>
-        <w:numPr>
-          <w:ilvl w:val="0"/>
-          <w:numId w:val="1107"/>
+        <w:t xml:space="preserve">— Head: 7b6165ab; State: UNKNOWN; Base: main; Title: ci(branch-protection): setup script lists the 10 live required checks incl. Schema parity</w:t>
+      </w:r>
+    </w:p>
+    <w:p>
+      <w:pPr>
+        <w:pStyle w:val="Compact"/>
+        <w:numPr>
+          <w:ilvl w:val="0"/>
+          <w:numId w:val="1108"/>
         </w:numPr>
       </w:pPr>
       <w:r>
@@ -10449,15 +10639,15 @@
         <w:t xml:space="preserve"> </w:t>
       </w:r>
       <w:r>
-        <w:t xml:space="preserve">— Head: ea919f6b; State: UNKNOWN; Base: main; Title: fix(payments): never send client Stripe secrets to coach routes</w:t>
-      </w:r>
-    </w:p>
-    <w:p>
-      <w:pPr>
-        <w:pStyle w:val="Compact"/>
-        <w:numPr>
-          <w:ilvl w:val="0"/>
-          <w:numId w:val="1107"/>
+        <w:t xml:space="preserve">— Head: 32f7ede4; State: UNKNOWN; Base: main; Title: fix(payments): never send Stripe client secrets to coach routes or client purchase lists</w:t>
+      </w:r>
+    </w:p>
+    <w:p>
+      <w:pPr>
+        <w:pStyle w:val="Compact"/>
+        <w:numPr>
+          <w:ilvl w:val="0"/>
+          <w:numId w:val="1108"/>
         </w:numPr>
       </w:pPr>
       <w:r>
@@ -10471,15 +10661,15 @@
         <w:t xml:space="preserve"> </w:t>
       </w:r>
       <w:r>
-        <w:t xml:space="preserve">— Head: 3a93fbde; State: BEHIND; Base: main; Title: fix(notifications): booking times in the recipient’s zone, one inbox row per event (B-643-</w:t>
-      </w:r>
-    </w:p>
-    <w:p>
-      <w:pPr>
-        <w:pStyle w:val="Compact"/>
-        <w:numPr>
-          <w:ilvl w:val="0"/>
-          <w:numId w:val="1107"/>
+        <w:t xml:space="preserve">— Head: 3a93fbde; State: UNKNOWN; Base: main; Title: fix(notifications): booking times in the recipient’s zone, one inbox row per event (B-643-</w:t>
+      </w:r>
+    </w:p>
+    <w:p>
+      <w:pPr>
+        <w:pStyle w:val="Compact"/>
+        <w:numPr>
+          <w:ilvl w:val="0"/>
+          <w:numId w:val="1108"/>
         </w:numPr>
       </w:pPr>
       <w:r>
@@ -10493,29 +10683,7 @@
         <w:t xml:space="preserve"> </w:t>
       </w:r>
       <w:r>
-        <w:t xml:space="preserve">— Head: 81c52a12; State: BEHIND; Base: main; Title: feat(notifications): deliver inbox notifications to devices via Expo push (C-643-2)</w:t>
-      </w:r>
-    </w:p>
-    <w:p>
-      <w:pPr>
-        <w:pStyle w:val="Compact"/>
-        <w:numPr>
-          <w:ilvl w:val="0"/>
-          <w:numId w:val="1107"/>
-        </w:numPr>
-      </w:pPr>
-      <w:r>
-        <w:rPr>
-          <w:b/>
-          <w:bCs/>
-        </w:rPr>
-        <w:t xml:space="preserve">#649</w:t>
-      </w:r>
-      <w:r>
-        <w:t xml:space="preserve"> </w:t>
-      </w:r>
-      <w:r>
-        <w:t xml:space="preserve">— Head: aa1da69d; State: BEHIND; Base: main; Title: fix(build-week): Day 1 points to the consultation, not the switched-off diagnostic (T3)</w:t>
+        <w:t xml:space="preserve">— Head: 81c52a12; State: UNKNOWN; Base: main; Title: feat(notifications): deliver inbox notifications to devices via Expo push (C-643-2)</w:t>
       </w:r>
     </w:p>
     <w:p>
@@ -10541,7 +10709,7 @@
         <w:pStyle w:val="Compact"/>
         <w:numPr>
           <w:ilvl w:val="0"/>
-          <w:numId w:val="1108"/>
+          <w:numId w:val="1109"/>
         </w:numPr>
       </w:pPr>
       <w:r>
@@ -10587,7 +10755,7 @@
         <w:pStyle w:val="Compact"/>
         <w:numPr>
           <w:ilvl w:val="0"/>
-          <w:numId w:val="1108"/>
+          <w:numId w:val="1109"/>
         </w:numPr>
       </w:pPr>
       <w:r>
@@ -10601,7 +10769,7 @@
         <w:t xml:space="preserve"> </w:t>
       </w:r>
       <w:r>
-        <w:t xml:space="preserve">— Head: 90e78abe; State: UNKNOWN; Base: main; Latest Opus: REQUEST CHANGES</w:t>
+        <w:t xml:space="preserve">— Head: 90e78abe; State: BEHIND; Base: main; Latest Opus: REQUEST CHANGES</w:t>
       </w:r>
       <w:r>
         <w:t xml:space="preserve"> </w:t>
@@ -10633,7 +10801,7 @@
         <w:pStyle w:val="Compact"/>
         <w:numPr>
           <w:ilvl w:val="0"/>
-          <w:numId w:val="1108"/>
+          <w:numId w:val="1109"/>
         </w:numPr>
       </w:pPr>
       <w:r>
@@ -10647,7 +10815,7 @@
         <w:t xml:space="preserve"> </w:t>
       </w:r>
       <w:r>
-        <w:t xml:space="preserve">— Head: 48d76d21; State: UNKNOWN; Base: main; Latest Opus: APPROVE</w:t>
+        <w:t xml:space="preserve">— Head: 48d76d21; State: BEHIND; Base: main; Latest Opus: APPROVE</w:t>
       </w:r>
       <w:r>
         <w:t xml:space="preserve"> </w:t>
@@ -10679,7 +10847,7 @@
         <w:pStyle w:val="Compact"/>
         <w:numPr>
           <w:ilvl w:val="0"/>
-          <w:numId w:val="1108"/>
+          <w:numId w:val="1109"/>
         </w:numPr>
       </w:pPr>
       <w:r>
@@ -10693,7 +10861,19 @@
         <w:t xml:space="preserve"> </w:t>
       </w:r>
       <w:r>
-        <w:t xml:space="preserve">— Head: de1c79aa; State: UNKNOWN; Base: main; Latest Opus: APPROVE</w:t>
+        <w:t xml:space="preserve">— Head: d545f5b6; State: CLEAN; Base: main; Latest Opus: APPROVE</w:t>
+      </w:r>
+      <w:r>
+        <w:t xml:space="preserve"> </w:t>
+      </w:r>
+      <w:r>
+        <w:t xml:space="preserve">@d545f5b6</w:t>
+      </w:r>
+      <w:r>
+        <w:t xml:space="preserve"> </w:t>
+      </w:r>
+      <w:r>
+        <w:t xml:space="preserve">(at head); Latest Sol: APPROVE</w:t>
       </w:r>
       <w:r>
         <w:t xml:space="preserve"> </w:t>
@@ -10702,15 +10882,6 @@
         <w:t xml:space="preserve">@d9c2e669</w:t>
       </w:r>
       <w:r>
-        <w:t xml:space="preserve">; Latest Sol: APPROVE</w:t>
-      </w:r>
-      <w:r>
-        <w:t xml:space="preserve"> </w:t>
-      </w:r>
-      <w:r>
-        <w:t xml:space="preserve">@d9c2e669</w:t>
-      </w:r>
-      <w:r>
         <w:t xml:space="preserve">; Title: fix(trust-center): open the real privacy policy, link the consumer health policy, accurate</w:t>
       </w:r>
     </w:p>
@@ -10719,7 +10890,7 @@
         <w:pStyle w:val="Compact"/>
         <w:numPr>
           <w:ilvl w:val="0"/>
-          <w:numId w:val="1108"/>
+          <w:numId w:val="1109"/>
         </w:numPr>
       </w:pPr>
       <w:r>
@@ -10733,7 +10904,7 @@
         <w:t xml:space="preserve"> </w:t>
       </w:r>
       <w:r>
-        <w:t xml:space="preserve">— Head: 58c2d53f; State: UNKNOWN; Base: main; Latest Opus: APPROVE</w:t>
+        <w:t xml:space="preserve">— Head: 58c2d53f; State: BEHIND; Base: main; Latest Opus: APPROVE</w:t>
       </w:r>
       <w:r>
         <w:t xml:space="preserve"> </w:t>
@@ -10765,7 +10936,7 @@
         <w:pStyle w:val="Compact"/>
         <w:numPr>
           <w:ilvl w:val="0"/>
-          <w:numId w:val="1108"/>
+          <w:numId w:val="1109"/>
         </w:numPr>
       </w:pPr>
       <w:r>
@@ -10779,7 +10950,7 @@
         <w:t xml:space="preserve"> </w:t>
       </w:r>
       <w:r>
-        <w:t xml:space="preserve">— Head: 1413edb7; State: UNKNOWN; Base: main; Latest Opus: REQUEST CHANGES</w:t>
+        <w:t xml:space="preserve">— Head: 1413edb7; State: BEHIND; Base: main; Latest Opus: REQUEST CHANGES</w:t>
       </w:r>
       <w:r>
         <w:t xml:space="preserve"> </w:t>
@@ -10805,7 +10976,7 @@
         <w:pStyle w:val="Compact"/>
         <w:numPr>
           <w:ilvl w:val="0"/>
-          <w:numId w:val="1108"/>
+          <w:numId w:val="1109"/>
         </w:numPr>
       </w:pPr>
       <w:r>
@@ -10819,7 +10990,7 @@
         <w:t xml:space="preserve"> </w:t>
       </w:r>
       <w:r>
-        <w:t xml:space="preserve">— Head: 0b4813dc; State: UNKNOWN; Base: main; Latest Opus: APPROVE</w:t>
+        <w:t xml:space="preserve">— Head: 0b4813dc; State: BEHIND; Base: main; Latest Opus: APPROVE</w:t>
       </w:r>
       <w:r>
         <w:t xml:space="preserve"> </w:t>
@@ -10851,7 +11022,7 @@
         <w:pStyle w:val="Compact"/>
         <w:numPr>
           <w:ilvl w:val="0"/>
-          <w:numId w:val="1108"/>
+          <w:numId w:val="1109"/>
         </w:numPr>
       </w:pPr>
       <w:r>
@@ -10865,7 +11036,7 @@
         <w:t xml:space="preserve"> </w:t>
       </w:r>
       <w:r>
-        <w:t xml:space="preserve">— Head: 36f05bba; State: UNKNOWN; Base: main; Latest Opus: APPROVE</w:t>
+        <w:t xml:space="preserve">— Head: 36f05bba; State: DIRTY; Base: main; Latest Opus: APPROVE</w:t>
       </w:r>
       <w:r>
         <w:t xml:space="preserve"> </w:t>
@@ -10897,7 +11068,7 @@
         <w:pStyle w:val="Compact"/>
         <w:numPr>
           <w:ilvl w:val="0"/>
-          <w:numId w:val="1108"/>
+          <w:numId w:val="1109"/>
         </w:numPr>
       </w:pPr>
       <w:r>
@@ -10911,7 +11082,7 @@
         <w:t xml:space="preserve"> </w:t>
       </w:r>
       <w:r>
-        <w:t xml:space="preserve">— Head: 16e7e97c; State: UNKNOWN; Base: main; Latest Opus: REQUEST CHANGES</w:t>
+        <w:t xml:space="preserve">— Head: 16e7e97c; State: BEHIND; Base: main; Latest Opus: REQUEST CHANGES</w:t>
       </w:r>
       <w:r>
         <w:t xml:space="preserve"> </w:t>
@@ -10937,7 +11108,7 @@
         <w:pStyle w:val="Compact"/>
         <w:numPr>
           <w:ilvl w:val="0"/>
-          <w:numId w:val="1108"/>
+          <w:numId w:val="1109"/>
         </w:numPr>
       </w:pPr>
       <w:r>
@@ -10951,7 +11122,7 @@
         <w:t xml:space="preserve"> </w:t>
       </w:r>
       <w:r>
-        <w:t xml:space="preserve">— Head: 395c3312; State: UNKNOWN; Base: main; Latest Opus: APPROVE</w:t>
+        <w:t xml:space="preserve">— Head: 395c3312; State: BEHIND; Base: main; Latest Opus: APPROVE</w:t>
       </w:r>
       <w:r>
         <w:t xml:space="preserve"> </w:t>
@@ -10977,7 +11148,7 @@
         <w:pStyle w:val="Compact"/>
         <w:numPr>
           <w:ilvl w:val="0"/>
-          <w:numId w:val="1108"/>
+          <w:numId w:val="1109"/>
         </w:numPr>
       </w:pPr>
       <w:r>
@@ -10991,7 +11162,7 @@
         <w:t xml:space="preserve"> </w:t>
       </w:r>
       <w:r>
-        <w:t xml:space="preserve">— Head: 67f9ef4f; State: UNKNOWN; Base: main; Latest Opus: REQUEST CHANGES</w:t>
+        <w:t xml:space="preserve">— Head: 67f9ef4f; State: BEHIND; Base: main; Latest Opus: REQUEST CHANGES</w:t>
       </w:r>
       <w:r>
         <w:t xml:space="preserve"> </w:t>
@@ -11017,7 +11188,7 @@
         <w:pStyle w:val="Compact"/>
         <w:numPr>
           <w:ilvl w:val="0"/>
-          <w:numId w:val="1108"/>
+          <w:numId w:val="1109"/>
         </w:numPr>
       </w:pPr>
       <w:r>
@@ -11031,7 +11202,7 @@
         <w:t xml:space="preserve"> </w:t>
       </w:r>
       <w:r>
-        <w:t xml:space="preserve">— Head: 83ee0e46; State: UNKNOWN; Base: main; Latest Opus: BLOCK</w:t>
+        <w:t xml:space="preserve">— Head: 83ee0e46; State: BEHIND; Base: main; Latest Opus: BLOCK</w:t>
       </w:r>
       <w:r>
         <w:t xml:space="preserve"> </w:t>
@@ -11063,7 +11234,7 @@
         <w:pStyle w:val="Compact"/>
         <w:numPr>
           <w:ilvl w:val="0"/>
-          <w:numId w:val="1108"/>
+          <w:numId w:val="1109"/>
         </w:numPr>
       </w:pPr>
       <w:r>
@@ -11109,7 +11280,7 @@
         <w:pStyle w:val="Compact"/>
         <w:numPr>
           <w:ilvl w:val="0"/>
-          <w:numId w:val="1108"/>
+          <w:numId w:val="1109"/>
         </w:numPr>
       </w:pPr>
       <w:r>
@@ -11155,7 +11326,7 @@
         <w:pStyle w:val="Compact"/>
         <w:numPr>
           <w:ilvl w:val="0"/>
-          <w:numId w:val="1108"/>
+          <w:numId w:val="1109"/>
         </w:numPr>
       </w:pPr>
       <w:r>
@@ -11201,7 +11372,7 @@
         <w:pStyle w:val="Compact"/>
         <w:numPr>
           <w:ilvl w:val="0"/>
-          <w:numId w:val="1108"/>
+          <w:numId w:val="1109"/>
         </w:numPr>
       </w:pPr>
       <w:r>
@@ -11242,8 +11413,8 @@
         <w:t xml:space="preserve">(at head); Title: feat(release): pre-build release-env check per EAS profile (clinic, production, preview)</w:t>
       </w:r>
     </w:p>
-    <w:bookmarkEnd w:id="42"/>
-    <w:bookmarkStart w:id="43" w:name="first-moves-for-agent-113-in-this-order"/>
+    <w:bookmarkEnd w:id="43"/>
+    <w:bookmarkStart w:id="44" w:name="first-moves-for-agent-113-in-this-order"/>
     <w:p>
       <w:pPr>
         <w:pStyle w:val="Heading4"/>
@@ -11257,7 +11428,7 @@
         <w:pStyle w:val="Compact"/>
         <w:numPr>
           <w:ilvl w:val="0"/>
-          <w:numId w:val="1109"/>
+          <w:numId w:val="1110"/>
         </w:numPr>
       </w:pPr>
       <w:r>
@@ -11281,19 +11452,19 @@
         <w:pStyle w:val="Compact"/>
         <w:numPr>
           <w:ilvl w:val="0"/>
-          <w:numId w:val="1109"/>
-        </w:numPr>
-      </w:pPr>
-      <w:r>
-        <w:t xml:space="preserve">Unlock builds first. Backend #635’s fix round 9c5ae5ef is all green (112 re-ran a known flaky test). It needs a Sol re-audit and an Opus delta, then merge and deploy (standing approval). After that comes mobile #326 (16e7e97c, needs deltas), then mobile #331. #331 first needs a fix round: Sol BLOCK 1/3/2 with A = a cross-account destructive-intent / transport-credential race, and Opus B-331-1.</w:t>
-      </w:r>
-    </w:p>
-    <w:p>
-      <w:pPr>
-        <w:pStyle w:val="Compact"/>
-        <w:numPr>
-          <w:ilvl w:val="0"/>
-          <w:numId w:val="1109"/>
+          <w:numId w:val="1110"/>
+        </w:numPr>
+      </w:pPr>
+      <w:r>
+        <w:t xml:space="preserve">Unlock builds first. Backend #635 at 9c5ae5ef is all green and has Opus APPROVE (AUD-OPUS-5 delta, 14:27). It needs only a Sol re-audit. Then update-branch it (clean; Opus’s approval carries if the resulting tree is e193eb50; otherwise take an Opus delta), merge, and deploy under the standing approval. The same deploy carries #644 and #649: run #649’s pre-deploy SELECT first. After that comes mobile #326 (16e7e97c, needs deltas), then mobile #331. #331 first needs a fix round: Sol BLOCK 1/3/2 with A = a cross-account destructive-intent / transport-credential race, and Opus B-331-1.</w:t>
+      </w:r>
+    </w:p>
+    <w:p>
+      <w:pPr>
+        <w:pStyle w:val="Compact"/>
+        <w:numPr>
+          <w:ilvl w:val="0"/>
+          <w:numId w:val="1110"/>
         </w:numPr>
       </w:pPr>
       <w:r>
@@ -11305,226 +11476,271 @@
         <w:pStyle w:val="Compact"/>
         <w:numPr>
           <w:ilvl w:val="1"/>
+          <w:numId w:val="1111"/>
+        </w:numPr>
+      </w:pPr>
+      <w:r>
+        <w:t xml:space="preserve">mobile #325 (dual APPROVE at 36f05bba) waits for backend #634, now at round-5 head 4d987916. Its last verdicts were Opus APPROVE and Sol REQUEST CHANGES at d1661ab8, so it needs a Sol re-audit and an Opus delta.</w:t>
+      </w:r>
+    </w:p>
+    <w:p>
+      <w:pPr>
+        <w:pStyle w:val="Compact"/>
+        <w:numPr>
+          <w:ilvl w:val="1"/>
+          <w:numId w:val="1111"/>
+        </w:numPr>
+      </w:pPr>
+      <w:r>
+        <w:t xml:space="preserve">mobile #314 (dual APPROVE at 48d76d21) waits for backend #610: Opus APPROVE and Sol REQUEST CHANGES at a98d08b5; needs a fix round.</w:t>
+      </w:r>
+    </w:p>
+    <w:p>
+      <w:pPr>
+        <w:pStyle w:val="Compact"/>
+        <w:numPr>
+          <w:ilvl w:val="1"/>
+          <w:numId w:val="1111"/>
+        </w:numPr>
+      </w:pPr>
+      <w:r>
+        <w:t xml:space="preserve">For each pair: merge the backend half, deploy (re-run #634’s zero-row queries first), run the manifest flips whose preconditions are live, then update-branch the mobile half, take a delta and merge.</w:t>
+      </w:r>
+    </w:p>
+    <w:p>
+      <w:pPr>
+        <w:pStyle w:val="Compact"/>
+        <w:numPr>
+          <w:ilvl w:val="0"/>
           <w:numId w:val="1110"/>
         </w:numPr>
       </w:pPr>
       <w:r>
-        <w:t xml:space="preserve">mobile #325 (dual APPROVE at 36f05bba) waits for backend #634, now at round-5 head 4d987916. Its last verdicts were Opus APPROVE and Sol REQUEST CHANGES at d1661ab8, so it needs a Sol re-audit and an Opus delta.</w:t>
-      </w:r>
-    </w:p>
-    <w:p>
-      <w:pPr>
-        <w:pStyle w:val="Compact"/>
-        <w:numPr>
-          <w:ilvl w:val="1"/>
+        <w:t xml:space="preserve">Release trio, all needing a fix round. #333 is Opus APPROVE and Sol RC 0/2/1. #330 is Opus APPROVE and Sol RC 0/2/2. #305 is Opus RC (B-305-5/6) and Sol RC 0/4/3. One S-RELEASE lane fixes all three under a push hold, since both lenses have posted. Order: #333, #330, #305. Verify the EAS env values before #333.</w:t>
+      </w:r>
+    </w:p>
+    <w:p>
+      <w:pPr>
+        <w:pStyle w:val="Compact"/>
+        <w:numPr>
+          <w:ilvl w:val="0"/>
           <w:numId w:val="1110"/>
         </w:numPr>
       </w:pPr>
       <w:r>
-        <w:t xml:space="preserve">mobile #314 (dual APPROVE at 48d76d21) waits for backend #610: Opus APPROVE and Sol REQUEST CHANGES at a98d08b5; needs a fix round.</w:t>
-      </w:r>
-    </w:p>
-    <w:p>
-      <w:pPr>
-        <w:pStyle w:val="Compact"/>
-        <w:numPr>
-          <w:ilvl w:val="1"/>
+        <w:t xml:space="preserve">Needs audit by both lenses at the current heads:</w:t>
+      </w:r>
+    </w:p>
+    <w:p>
+      <w:pPr>
+        <w:pStyle w:val="Compact"/>
+        <w:numPr>
+          <w:ilvl w:val="1"/>
+          <w:numId w:val="1112"/>
+        </w:numPr>
+      </w:pPr>
+      <w:r>
+        <w:t xml:space="preserve">#627 c1d69c7f / #321 1413edb7 (B-FEE-R6 done)</w:t>
+      </w:r>
+    </w:p>
+    <w:p>
+      <w:pPr>
+        <w:pStyle w:val="Compact"/>
+        <w:numPr>
+          <w:ilvl w:val="1"/>
+          <w:numId w:val="1112"/>
+        </w:numPr>
+      </w:pPr>
+      <w:r>
+        <w:t xml:space="preserve">#608 / #636 / #327 (B-EXPORT-3)</w:t>
+      </w:r>
+    </w:p>
+    <w:p>
+      <w:pPr>
+        <w:pStyle w:val="Compact"/>
+        <w:numPr>
+          <w:ilvl w:val="1"/>
+          <w:numId w:val="1112"/>
+        </w:numPr>
+      </w:pPr>
+      <w:r>
+        <w:t xml:space="preserve">#640 / #328 (S-MWB-2)</w:t>
+      </w:r>
+    </w:p>
+    <w:p>
+      <w:pPr>
+        <w:pStyle w:val="Compact"/>
+        <w:numPr>
+          <w:ilvl w:val="1"/>
+          <w:numId w:val="1112"/>
+        </w:numPr>
+      </w:pPr>
+      <w:r>
+        <w:t xml:space="preserve">#641</w:t>
+      </w:r>
+      <w:r>
+        <w:t xml:space="preserve"> </w:t>
+      </w:r>
+      <w:r>
+        <w:t xml:space="preserve">@bb17e19a</w:t>
+      </w:r>
+      <w:r>
+        <w:t xml:space="preserve"> </w:t>
+      </w:r>
+      <w:r>
+        <w:t xml:space="preserve">/ #646</w:t>
+      </w:r>
+      <w:r>
+        <w:t xml:space="preserve"> </w:t>
+      </w:r>
+      <w:r>
+        <w:t xml:space="preserve">@32f7ede4</w:t>
+      </w:r>
+      <w:r>
+        <w:t xml:space="preserve"> </w:t>
+      </w:r>
+      <w:r>
+        <w:t xml:space="preserve">(S-COACH-BE-2 + B-SECRETS-2)</w:t>
+      </w:r>
+    </w:p>
+    <w:p>
+      <w:pPr>
+        <w:pStyle w:val="Compact"/>
+        <w:numPr>
+          <w:ilvl w:val="1"/>
+          <w:numId w:val="1112"/>
+        </w:numPr>
+      </w:pPr>
+      <w:r>
+        <w:t xml:space="preserve">#647 / #648 (notifications, T4)</w:t>
+      </w:r>
+    </w:p>
+    <w:p>
+      <w:pPr>
+        <w:pStyle w:val="Compact"/>
+        <w:numPr>
+          <w:ilvl w:val="1"/>
+          <w:numId w:val="1112"/>
+        </w:numPr>
+      </w:pPr>
+      <w:r>
+        <w:t xml:space="preserve">#645</w:t>
+      </w:r>
+      <w:r>
+        <w:t xml:space="preserve"> </w:t>
+      </w:r>
+      <w:r>
+        <w:t xml:space="preserve">@7b6165ab</w:t>
+      </w:r>
+      <w:r>
+        <w:t xml:space="preserve"> </w:t>
+      </w:r>
+      <w:r>
+        <w:t xml:space="preserve">(T4 gate file; mirrors live protection)</w:t>
+      </w:r>
+    </w:p>
+    <w:p>
+      <w:pPr>
+        <w:pStyle w:val="Compact"/>
+        <w:numPr>
+          <w:ilvl w:val="1"/>
+          <w:numId w:val="1112"/>
+        </w:numPr>
+      </w:pPr>
+      <w:r>
+        <w:t xml:space="preserve">#649</w:t>
+      </w:r>
+      <w:r>
+        <w:t xml:space="preserve"> </w:t>
+      </w:r>
+      <w:r>
+        <w:t xml:space="preserve">@aa1da69d</w:t>
+      </w:r>
+      <w:r>
+        <w:t xml:space="preserve"> </w:t>
+      </w:r>
+      <w:r>
+        <w:t xml:space="preserve">(T3, Build Week Day 1 copy migration 20270224000000; OR-112-20 pre-deploy SELECT)</w:t>
+      </w:r>
+    </w:p>
+    <w:p>
+      <w:pPr>
+        <w:pStyle w:val="Compact"/>
+        <w:numPr>
+          <w:ilvl w:val="1"/>
+          <w:numId w:val="1112"/>
+        </w:numPr>
+      </w:pPr>
+      <w:r>
+        <w:t xml:space="preserve">#315</w:t>
+      </w:r>
+      <w:r>
+        <w:t xml:space="preserve"> </w:t>
+      </w:r>
+      <w:r>
+        <w:t xml:space="preserve">@d545f5b6</w:t>
+      </w:r>
+      <w:r>
+        <w:t xml:space="preserve">: now T4 (OR-112-21). Opus APPROVE, needs Sol. It merges with #611.</w:t>
+      </w:r>
+    </w:p>
+    <w:p>
+      <w:pPr>
+        <w:pStyle w:val="Compact"/>
+        <w:numPr>
+          <w:ilvl w:val="1"/>
+          <w:numId w:val="1112"/>
+        </w:numPr>
+      </w:pPr>
+      <w:r>
+        <w:t xml:space="preserve">#611 / #326 (B-CONSENT-4)</w:t>
+      </w:r>
+    </w:p>
+    <w:p>
+      <w:pPr>
+        <w:pStyle w:val="Compact"/>
+        <w:numPr>
+          <w:ilvl w:val="1"/>
+          <w:numId w:val="1112"/>
+        </w:numPr>
+      </w:pPr>
+      <w:r>
+        <w:t xml:space="preserve">#634</w:t>
+      </w:r>
+      <w:r>
+        <w:t xml:space="preserve"> </w:t>
+      </w:r>
+      <w:r>
+        <w:t xml:space="preserve">@4d987916</w:t>
+      </w:r>
+      <w:r>
+        <w:t xml:space="preserve"> </w:t>
+      </w:r>
+      <w:r>
+        <w:t xml:space="preserve">(round 5; item 3) and #635</w:t>
+      </w:r>
+      <w:r>
+        <w:t xml:space="preserve"> </w:t>
+      </w:r>
+      <w:r>
+        <w:t xml:space="preserve">@9c5ae5ef</w:t>
+      </w:r>
+      <w:r>
+        <w:t xml:space="preserve"> </w:t>
+      </w:r>
+      <w:r>
+        <w:t xml:space="preserve">(item 2).</w:t>
+      </w:r>
+    </w:p>
+    <w:p>
+      <w:pPr>
+        <w:pStyle w:val="Compact"/>
+        <w:numPr>
+          <w:ilvl w:val="0"/>
           <w:numId w:val="1110"/>
         </w:numPr>
       </w:pPr>
       <w:r>
-        <w:t xml:space="preserve">For each pair: merge the backend half, deploy (re-run #634’s zero-row queries first), run the manifest flips whose preconditions are live, then update-branch the mobile half, take a delta and merge.</w:t>
-      </w:r>
-    </w:p>
-    <w:p>
-      <w:pPr>
-        <w:pStyle w:val="Compact"/>
-        <w:numPr>
-          <w:ilvl w:val="0"/>
-          <w:numId w:val="1109"/>
-        </w:numPr>
-      </w:pPr>
-      <w:r>
-        <w:t xml:space="preserve">Release trio, all needing a fix round. #333 is Opus APPROVE and Sol RC 0/2/1. #330 is Opus APPROVE and Sol RC 0/2/2. #305 is Opus RC (B-305-5/6) and Sol RC 0/4/3. One S-RELEASE lane fixes all three under a push hold, since both lenses have posted. Order: #333, #330, #305. Verify the EAS env values before #333.</w:t>
-      </w:r>
-    </w:p>
-    <w:p>
-      <w:pPr>
-        <w:pStyle w:val="Compact"/>
-        <w:numPr>
-          <w:ilvl w:val="0"/>
-          <w:numId w:val="1109"/>
-        </w:numPr>
-      </w:pPr>
-      <w:r>
-        <w:t xml:space="preserve">Needs audit by both lenses at the current heads:</w:t>
-      </w:r>
-    </w:p>
-    <w:p>
-      <w:pPr>
-        <w:pStyle w:val="Compact"/>
-        <w:numPr>
-          <w:ilvl w:val="1"/>
-          <w:numId w:val="1111"/>
-        </w:numPr>
-      </w:pPr>
-      <w:r>
-        <w:t xml:space="preserve">#627 c1d69c7f / #321 1413edb7 (B-FEE-R6 done)</w:t>
-      </w:r>
-    </w:p>
-    <w:p>
-      <w:pPr>
-        <w:pStyle w:val="Compact"/>
-        <w:numPr>
-          <w:ilvl w:val="1"/>
-          <w:numId w:val="1111"/>
-        </w:numPr>
-      </w:pPr>
-      <w:r>
-        <w:t xml:space="preserve">#608 / #636 / #327 (B-EXPORT-3)</w:t>
-      </w:r>
-    </w:p>
-    <w:p>
-      <w:pPr>
-        <w:pStyle w:val="Compact"/>
-        <w:numPr>
-          <w:ilvl w:val="1"/>
-          <w:numId w:val="1111"/>
-        </w:numPr>
-      </w:pPr>
-      <w:r>
-        <w:t xml:space="preserve">#640 / #328 (S-MWB-2)</w:t>
-      </w:r>
-    </w:p>
-    <w:p>
-      <w:pPr>
-        <w:pStyle w:val="Compact"/>
-        <w:numPr>
-          <w:ilvl w:val="1"/>
-          <w:numId w:val="1111"/>
-        </w:numPr>
-      </w:pPr>
-      <w:r>
-        <w:t xml:space="preserve">#641 / #646 (S-COACH-BE-2)</w:t>
-      </w:r>
-    </w:p>
-    <w:p>
-      <w:pPr>
-        <w:pStyle w:val="Compact"/>
-        <w:numPr>
-          <w:ilvl w:val="1"/>
-          <w:numId w:val="1111"/>
-        </w:numPr>
-      </w:pPr>
-      <w:r>
-        <w:t xml:space="preserve">#647 / #648 (notifications, T4)</w:t>
-      </w:r>
-    </w:p>
-    <w:p>
-      <w:pPr>
-        <w:pStyle w:val="Compact"/>
-        <w:numPr>
-          <w:ilvl w:val="1"/>
-          <w:numId w:val="1111"/>
-        </w:numPr>
-      </w:pPr>
-      <w:r>
-        <w:t xml:space="preserve">#645</w:t>
-      </w:r>
-      <w:r>
-        <w:t xml:space="preserve"> </w:t>
-      </w:r>
-      <w:r>
-        <w:t xml:space="preserve">@7b6165ab</w:t>
-      </w:r>
-      <w:r>
-        <w:t xml:space="preserve"> </w:t>
-      </w:r>
-      <w:r>
-        <w:t xml:space="preserve">(T4 gate file; mirrors live protection)</w:t>
-      </w:r>
-    </w:p>
-    <w:p>
-      <w:pPr>
-        <w:pStyle w:val="Compact"/>
-        <w:numPr>
-          <w:ilvl w:val="1"/>
-          <w:numId w:val="1111"/>
-        </w:numPr>
-      </w:pPr>
-      <w:r>
-        <w:t xml:space="preserve">#649</w:t>
-      </w:r>
-      <w:r>
-        <w:t xml:space="preserve"> </w:t>
-      </w:r>
-      <w:r>
-        <w:t xml:space="preserve">@aa1da69d</w:t>
-      </w:r>
-      <w:r>
-        <w:t xml:space="preserve"> </w:t>
-      </w:r>
-      <w:r>
-        <w:t xml:space="preserve">(T3, Build Week Day 1 copy migration 20270224000000; OR-112-20 pre-deploy SELECT)</w:t>
-      </w:r>
-    </w:p>
-    <w:p>
-      <w:pPr>
-        <w:pStyle w:val="Compact"/>
-        <w:numPr>
-          <w:ilvl w:val="1"/>
-          <w:numId w:val="1111"/>
-        </w:numPr>
-      </w:pPr>
-      <w:r>
-        <w:t xml:space="preserve">#315 / #611 / #326 (B-CONSENT-4)</w:t>
-      </w:r>
-    </w:p>
-    <w:p>
-      <w:pPr>
-        <w:pStyle w:val="Compact"/>
-        <w:numPr>
-          <w:ilvl w:val="1"/>
-          <w:numId w:val="1111"/>
-        </w:numPr>
-      </w:pPr>
-      <w:r>
-        <w:t xml:space="preserve">#634</w:t>
-      </w:r>
-      <w:r>
-        <w:t xml:space="preserve"> </w:t>
-      </w:r>
-      <w:r>
-        <w:t xml:space="preserve">@4d987916</w:t>
-      </w:r>
-      <w:r>
-        <w:t xml:space="preserve"> </w:t>
-      </w:r>
-      <w:r>
-        <w:t xml:space="preserve">(round 5; item 3) and #635</w:t>
-      </w:r>
-      <w:r>
-        <w:t xml:space="preserve"> </w:t>
-      </w:r>
-      <w:r>
-        <w:t xml:space="preserve">@9c5ae5ef</w:t>
-      </w:r>
-      <w:r>
-        <w:t xml:space="preserve"> </w:t>
-      </w:r>
-      <w:r>
-        <w:t xml:space="preserve">(item 2).</w:t>
-      </w:r>
-    </w:p>
-    <w:p>
-      <w:pPr>
-        <w:pStyle w:val="Compact"/>
-        <w:numPr>
-          <w:ilvl w:val="0"/>
-          <w:numId w:val="1109"/>
-        </w:numPr>
-      </w:pPr>
-      <w:r>
         <w:t xml:space="preserve">Restart these fixers from WIP branches and HANDOFF notes:</w:t>
       </w:r>
     </w:p>
@@ -11533,7 +11749,7 @@
         <w:pStyle w:val="Compact"/>
         <w:numPr>
           <w:ilvl w:val="1"/>
-          <w:numId w:val="1112"/>
+          <w:numId w:val="1113"/>
         </w:numPr>
       </w:pPr>
       <w:r>
@@ -11566,7 +11782,7 @@
         <w:pStyle w:val="Compact"/>
         <w:numPr>
           <w:ilvl w:val="1"/>
-          <w:numId w:val="1112"/>
+          <w:numId w:val="1113"/>
         </w:numPr>
       </w:pPr>
       <w:r>
@@ -11590,7 +11806,7 @@
         <w:pStyle w:val="Compact"/>
         <w:numPr>
           <w:ilvl w:val="1"/>
-          <w:numId w:val="1112"/>
+          <w:numId w:val="1113"/>
         </w:numPr>
       </w:pPr>
       <w:r>
@@ -11602,7 +11818,7 @@
         <w:pStyle w:val="Compact"/>
         <w:numPr>
           <w:ilvl w:val="1"/>
-          <w:numId w:val="1112"/>
+          <w:numId w:val="1113"/>
         </w:numPr>
       </w:pPr>
       <w:r>
@@ -11614,7 +11830,7 @@
         <w:pStyle w:val="Compact"/>
         <w:numPr>
           <w:ilvl w:val="1"/>
-          <w:numId w:val="1112"/>
+          <w:numId w:val="1113"/>
         </w:numPr>
       </w:pPr>
       <w:r>
@@ -11626,7 +11842,7 @@
         <w:pStyle w:val="Compact"/>
         <w:numPr>
           <w:ilvl w:val="1"/>
-          <w:numId w:val="1112"/>
+          <w:numId w:val="1113"/>
         </w:numPr>
       </w:pPr>
       <w:r>
@@ -11638,17 +11854,17 @@
         <w:pStyle w:val="Compact"/>
         <w:numPr>
           <w:ilvl w:val="0"/>
-          <w:numId w:val="1109"/>
+          <w:numId w:val="1110"/>
         </w:numPr>
       </w:pPr>
       <w:r>
         <w:t xml:space="preserve">Then start the not-started launch scope in section 12.C order, keeping 4-5 auditor lanes busy at all times.</w:t>
       </w:r>
     </w:p>
-    <w:bookmarkEnd w:id="43"/>
     <w:bookmarkEnd w:id="44"/>
     <w:bookmarkEnd w:id="45"/>
-    <w:bookmarkStart w:id="51" w:name="lessons-how-to-be-1-better"/>
+    <w:bookmarkEnd w:id="46"/>
+    <w:bookmarkStart w:id="52" w:name="lessons-how-to-be-1-better"/>
     <w:p>
       <w:pPr>
         <w:pStyle w:val="Heading2"/>
@@ -11657,7 +11873,7 @@
         <w:t xml:space="preserve">6. Lessons: how to be 1% better</w:t>
       </w:r>
     </w:p>
-    <w:bookmarkStart w:id="46" w:name="s-lessons-newest-read-these-first"/>
+    <w:bookmarkStart w:id="47" w:name="s-lessons-newest-read-these-first"/>
     <w:p>
       <w:pPr>
         <w:pStyle w:val="Heading3"/>
@@ -11671,7 +11887,7 @@
         <w:pStyle w:val="Compact"/>
         <w:numPr>
           <w:ilvl w:val="0"/>
-          <w:numId w:val="1113"/>
+          <w:numId w:val="1114"/>
         </w:numPr>
       </w:pPr>
       <w:r>
@@ -11683,7 +11899,7 @@
         <w:pStyle w:val="Compact"/>
         <w:numPr>
           <w:ilvl w:val="0"/>
-          <w:numId w:val="1113"/>
+          <w:numId w:val="1114"/>
         </w:numPr>
       </w:pPr>
       <w:r>
@@ -11695,7 +11911,7 @@
         <w:pStyle w:val="Compact"/>
         <w:numPr>
           <w:ilvl w:val="0"/>
-          <w:numId w:val="1113"/>
+          <w:numId w:val="1114"/>
         </w:numPr>
       </w:pPr>
       <w:r>
@@ -11707,70 +11923,70 @@
         <w:pStyle w:val="Compact"/>
         <w:numPr>
           <w:ilvl w:val="1"/>
+          <w:numId w:val="1115"/>
+        </w:numPr>
+      </w:pPr>
+      <w:r>
+        <w:t xml:space="preserve">112 moved heavy.sh to two slots at 13:10, after two local runs timed out waiting.</w:t>
+      </w:r>
+    </w:p>
+    <w:p>
+      <w:pPr>
+        <w:pStyle w:val="Compact"/>
+        <w:numPr>
+          <w:ilvl w:val="1"/>
+          <w:numId w:val="1115"/>
+        </w:numPr>
+      </w:pPr>
+      <w:r>
+        <w:t xml:space="preserve">Keep pushing tsc and full suites to CI.</w:t>
+      </w:r>
+    </w:p>
+    <w:p>
+      <w:pPr>
+        <w:pStyle w:val="Compact"/>
+        <w:numPr>
+          <w:ilvl w:val="1"/>
+          <w:numId w:val="1115"/>
+        </w:numPr>
+      </w:pPr>
+      <w:r>
+        <w:t xml:space="preserve">Watch heavyq. Above about 8 for long stretches, the next lane adds only waiting.</w:t>
+      </w:r>
+    </w:p>
+    <w:p>
+      <w:pPr>
+        <w:pStyle w:val="Compact"/>
+        <w:numPr>
+          <w:ilvl w:val="0"/>
           <w:numId w:val="1114"/>
         </w:numPr>
       </w:pPr>
       <w:r>
-        <w:t xml:space="preserve">112 moved heavy.sh to two slots at 13:10, after two local runs timed out waiting.</w:t>
-      </w:r>
-    </w:p>
-    <w:p>
-      <w:pPr>
-        <w:pStyle w:val="Compact"/>
-        <w:numPr>
-          <w:ilvl w:val="1"/>
+        <w:t xml:space="preserve">Disk creeps. 63% rose to 75% in 50 minutes from worktrees. Make removing the worktree part of every verdict and every lane’s last step, and clean up finished lanes’ worktrees yourself (unlink the node_modules symlink first).</w:t>
+      </w:r>
+    </w:p>
+    <w:p>
+      <w:pPr>
+        <w:pStyle w:val="Compact"/>
+        <w:numPr>
+          <w:ilvl w:val="0"/>
           <w:numId w:val="1114"/>
         </w:numPr>
       </w:pPr>
       <w:r>
-        <w:t xml:space="preserve">Keep pushing tsc and full suites to CI.</w:t>
-      </w:r>
-    </w:p>
-    <w:p>
-      <w:pPr>
-        <w:pStyle w:val="Compact"/>
-        <w:numPr>
-          <w:ilvl w:val="1"/>
+        <w:t xml:space="preserve">Re-task finished agents by messaging them; a message re-queues a completed subagent with its context intact. It is cheaper than a fresh launch, but never message one by accident.</w:t>
+      </w:r>
+    </w:p>
+    <w:p>
+      <w:pPr>
+        <w:pStyle w:val="Compact"/>
+        <w:numPr>
+          <w:ilvl w:val="0"/>
           <w:numId w:val="1114"/>
         </w:numPr>
       </w:pPr>
       <w:r>
-        <w:t xml:space="preserve">Watch heavyq. Above about 8 for long stretches, the next lane adds only waiting.</w:t>
-      </w:r>
-    </w:p>
-    <w:p>
-      <w:pPr>
-        <w:pStyle w:val="Compact"/>
-        <w:numPr>
-          <w:ilvl w:val="0"/>
-          <w:numId w:val="1113"/>
-        </w:numPr>
-      </w:pPr>
-      <w:r>
-        <w:t xml:space="preserve">Disk creeps. 63% rose to 75% in 50 minutes from worktrees. Make removing the worktree part of every verdict and every lane’s last step, and clean up finished lanes’ worktrees yourself (unlink the node_modules symlink first).</w:t>
-      </w:r>
-    </w:p>
-    <w:p>
-      <w:pPr>
-        <w:pStyle w:val="Compact"/>
-        <w:numPr>
-          <w:ilvl w:val="0"/>
-          <w:numId w:val="1113"/>
-        </w:numPr>
-      </w:pPr>
-      <w:r>
-        <w:t xml:space="preserve">Re-task finished agents by messaging them; a message re-queues a completed subagent with its context intact. It is cheaper than a fresh launch, but never message one by accident.</w:t>
-      </w:r>
-    </w:p>
-    <w:p>
-      <w:pPr>
-        <w:pStyle w:val="Compact"/>
-        <w:numPr>
-          <w:ilvl w:val="0"/>
-          <w:numId w:val="1113"/>
-        </w:numPr>
-      </w:pPr>
-      <w:r>
         <w:t xml:space="preserve">Merge pairs together and hold the approved half. A mobile PR whose backend half isn’t deployed would ship a screen that 404s in the next build.</w:t>
       </w:r>
     </w:p>
@@ -11779,7 +11995,7 @@
         <w:pStyle w:val="Compact"/>
         <w:numPr>
           <w:ilvl w:val="0"/>
-          <w:numId w:val="1113"/>
+          <w:numId w:val="1114"/>
         </w:numPr>
       </w:pPr>
       <w:r>
@@ -11803,7 +12019,7 @@
         <w:pStyle w:val="Compact"/>
         <w:numPr>
           <w:ilvl w:val="0"/>
-          <w:numId w:val="1113"/>
+          <w:numId w:val="1114"/>
         </w:numPr>
       </w:pPr>
       <w:r>
@@ -11827,7 +12043,7 @@
         <w:pStyle w:val="Compact"/>
         <w:numPr>
           <w:ilvl w:val="0"/>
-          <w:numId w:val="1113"/>
+          <w:numId w:val="1114"/>
         </w:numPr>
       </w:pPr>
       <w:r>
@@ -11854,7 +12070,7 @@
         <w:pStyle w:val="Compact"/>
         <w:numPr>
           <w:ilvl w:val="0"/>
-          <w:numId w:val="1113"/>
+          <w:numId w:val="1114"/>
         </w:numPr>
       </w:pPr>
       <w:r>
@@ -11908,7 +12124,7 @@
         <w:pStyle w:val="Compact"/>
         <w:numPr>
           <w:ilvl w:val="0"/>
-          <w:numId w:val="1113"/>
+          <w:numId w:val="1114"/>
         </w:numPr>
       </w:pPr>
       <w:r>
@@ -11920,15 +12136,15 @@
         <w:pStyle w:val="Compact"/>
         <w:numPr>
           <w:ilvl w:val="0"/>
-          <w:numId w:val="1113"/>
+          <w:numId w:val="1114"/>
         </w:numPr>
       </w:pPr>
       <w:r>
         <w:t xml:space="preserve">Small traps that cost minutes: pkill self-match (use pid files); the environment-approval API’s JSON body; fly-env-sync plan also needs the environment approval; Danger fails non-Conventional PR titles; stacked PRs get no CI.</w:t>
       </w:r>
     </w:p>
-    <w:bookmarkEnd w:id="46"/>
-    <w:bookmarkStart w:id="48" w:name="s-lessons"/>
+    <w:bookmarkEnd w:id="47"/>
+    <w:bookmarkStart w:id="49" w:name="s-lessons"/>
     <w:p>
       <w:pPr>
         <w:pStyle w:val="Heading3"/>
@@ -11942,7 +12158,7 @@
         <w:pStyle w:val="Compact"/>
         <w:numPr>
           <w:ilvl w:val="0"/>
-          <w:numId w:val="1115"/>
+          <w:numId w:val="1116"/>
         </w:numPr>
       </w:pPr>
       <w:r>
@@ -11954,7 +12170,7 @@
         <w:pStyle w:val="Compact"/>
         <w:numPr>
           <w:ilvl w:val="0"/>
-          <w:numId w:val="1115"/>
+          <w:numId w:val="1116"/>
         </w:numPr>
       </w:pPr>
       <w:r>
@@ -11978,7 +12194,7 @@
         <w:pStyle w:val="Compact"/>
         <w:numPr>
           <w:ilvl w:val="0"/>
-          <w:numId w:val="1115"/>
+          <w:numId w:val="1116"/>
         </w:numPr>
       </w:pPr>
       <w:r>
@@ -11990,7 +12206,7 @@
         <w:pStyle w:val="Compact"/>
         <w:numPr>
           <w:ilvl w:val="0"/>
-          <w:numId w:val="1115"/>
+          <w:numId w:val="1116"/>
         </w:numPr>
       </w:pPr>
       <w:r>
@@ -12011,7 +12227,7 @@
       <w:r>
         <w:t xml:space="preserve"> </w:t>
       </w:r>
-      <w:hyperlink r:id="rId47">
+      <w:hyperlink r:id="rId48">
         <w:r>
           <w:rPr>
             <w:rStyle w:val="Hyperlink"/>
@@ -12031,7 +12247,7 @@
         <w:pStyle w:val="Compact"/>
         <w:numPr>
           <w:ilvl w:val="0"/>
-          <w:numId w:val="1115"/>
+          <w:numId w:val="1116"/>
         </w:numPr>
       </w:pPr>
       <w:r>
@@ -12082,7 +12298,7 @@
         <w:pStyle w:val="Compact"/>
         <w:numPr>
           <w:ilvl w:val="0"/>
-          <w:numId w:val="1115"/>
+          <w:numId w:val="1116"/>
         </w:numPr>
       </w:pPr>
       <w:r>
@@ -12121,7 +12337,7 @@
         <w:pStyle w:val="Compact"/>
         <w:numPr>
           <w:ilvl w:val="0"/>
-          <w:numId w:val="1115"/>
+          <w:numId w:val="1116"/>
         </w:numPr>
       </w:pPr>
       <w:r>
@@ -12145,7 +12361,7 @@
         <w:pStyle w:val="Compact"/>
         <w:numPr>
           <w:ilvl w:val="0"/>
-          <w:numId w:val="1115"/>
+          <w:numId w:val="1116"/>
         </w:numPr>
       </w:pPr>
       <w:r>
@@ -12169,7 +12385,7 @@
         <w:pStyle w:val="Compact"/>
         <w:numPr>
           <w:ilvl w:val="0"/>
-          <w:numId w:val="1115"/>
+          <w:numId w:val="1116"/>
         </w:numPr>
       </w:pPr>
       <w:r>
@@ -12181,7 +12397,7 @@
         <w:pStyle w:val="Compact"/>
         <w:numPr>
           <w:ilvl w:val="0"/>
-          <w:numId w:val="1115"/>
+          <w:numId w:val="1116"/>
         </w:numPr>
       </w:pPr>
       <w:r>
@@ -12193,15 +12409,15 @@
         <w:pStyle w:val="Compact"/>
         <w:numPr>
           <w:ilvl w:val="0"/>
-          <w:numId w:val="1115"/>
+          <w:numId w:val="1116"/>
         </w:numPr>
       </w:pPr>
       <w:r>
         <w:t xml:space="preserve">The safety check may refuse PR-body edits that carry long agent-written text (B-TRAIN-2’s and the operator’s #604/#607/#609 body updates were refused). Don’t retry or route around it: keep the text in the lane report, point auditors to it, and let the PR’s own builder fold it in with its next fix round.</w:t>
       </w:r>
     </w:p>
-    <w:bookmarkEnd w:id="48"/>
-    <w:bookmarkStart w:id="49" w:name="s-lessons-1"/>
+    <w:bookmarkEnd w:id="49"/>
+    <w:bookmarkStart w:id="50" w:name="s-lessons-1"/>
     <w:p>
       <w:pPr>
         <w:pStyle w:val="Heading3"/>
@@ -12214,7 +12430,7 @@
       <w:pPr>
         <w:numPr>
           <w:ilvl w:val="0"/>
-          <w:numId w:val="1116"/>
+          <w:numId w:val="1117"/>
         </w:numPr>
       </w:pPr>
       <w:r>
@@ -12252,7 +12468,7 @@
       <w:pPr>
         <w:numPr>
           <w:ilvl w:val="0"/>
-          <w:numId w:val="1116"/>
+          <w:numId w:val="1117"/>
         </w:numPr>
       </w:pPr>
       <w:r>
@@ -12263,7 +12479,7 @@
       <w:pPr>
         <w:numPr>
           <w:ilvl w:val="0"/>
-          <w:numId w:val="1116"/>
+          <w:numId w:val="1117"/>
         </w:numPr>
       </w:pPr>
       <w:r>
@@ -12286,7 +12502,7 @@
       <w:pPr>
         <w:numPr>
           <w:ilvl w:val="0"/>
-          <w:numId w:val="1116"/>
+          <w:numId w:val="1117"/>
         </w:numPr>
       </w:pPr>
       <w:r>
@@ -12297,7 +12513,7 @@
       <w:pPr>
         <w:numPr>
           <w:ilvl w:val="0"/>
-          <w:numId w:val="1116"/>
+          <w:numId w:val="1117"/>
         </w:numPr>
       </w:pPr>
       <w:r>
@@ -12320,7 +12536,7 @@
       <w:pPr>
         <w:numPr>
           <w:ilvl w:val="0"/>
-          <w:numId w:val="1116"/>
+          <w:numId w:val="1117"/>
         </w:numPr>
       </w:pPr>
       <w:r>
@@ -12331,7 +12547,7 @@
       <w:pPr>
         <w:numPr>
           <w:ilvl w:val="0"/>
-          <w:numId w:val="1116"/>
+          <w:numId w:val="1117"/>
         </w:numPr>
       </w:pPr>
       <w:r>
@@ -12342,7 +12558,7 @@
       <w:pPr>
         <w:numPr>
           <w:ilvl w:val="0"/>
-          <w:numId w:val="1116"/>
+          <w:numId w:val="1117"/>
         </w:numPr>
       </w:pPr>
       <w:r>
@@ -12353,7 +12569,7 @@
       <w:pPr>
         <w:numPr>
           <w:ilvl w:val="0"/>
-          <w:numId w:val="1116"/>
+          <w:numId w:val="1117"/>
         </w:numPr>
       </w:pPr>
       <w:r>
@@ -12384,8 +12600,8 @@
         <w:t xml:space="preserve">authority in every message. Bradley’s standing approval covers merging audited, dependency-checked PRs; each deploy still needs his click (or an explicit standing approval).</w:t>
       </w:r>
     </w:p>
-    <w:bookmarkEnd w:id="49"/>
-    <w:bookmarkStart w:id="50" w:name="s-lessons-carried-from-v3"/>
+    <w:bookmarkEnd w:id="50"/>
+    <w:bookmarkStart w:id="51" w:name="s-lessons-carried-from-v3"/>
     <w:p>
       <w:pPr>
         <w:pStyle w:val="Heading3"/>
@@ -12406,7 +12622,7 @@
       <w:pPr>
         <w:numPr>
           <w:ilvl w:val="0"/>
-          <w:numId w:val="1117"/>
+          <w:numId w:val="1118"/>
         </w:numPr>
       </w:pPr>
       <w:r>
@@ -12417,7 +12633,7 @@
       <w:pPr>
         <w:numPr>
           <w:ilvl w:val="0"/>
-          <w:numId w:val="1117"/>
+          <w:numId w:val="1118"/>
         </w:numPr>
       </w:pPr>
       <w:r>
@@ -12449,7 +12665,7 @@
       <w:pPr>
         <w:numPr>
           <w:ilvl w:val="0"/>
-          <w:numId w:val="1117"/>
+          <w:numId w:val="1118"/>
         </w:numPr>
       </w:pPr>
       <w:r>
@@ -12460,99 +12676,99 @@
       <w:pPr>
         <w:numPr>
           <w:ilvl w:val="1"/>
+          <w:numId w:val="1119"/>
+        </w:numPr>
+      </w:pPr>
+      <w:r>
+        <w:t xml:space="preserve">a</w:t>
+      </w:r>
+      <w:r>
+        <w:t xml:space="preserve"> </w:t>
+      </w:r>
+      <w:r>
+        <w:t xml:space="preserve">“Money page”</w:t>
+      </w:r>
+      <w:r>
+        <w:t xml:space="preserve"> </w:t>
+      </w:r>
+      <w:r>
+        <w:t xml:space="preserve">Bradley assumed existed;</w:t>
+      </w:r>
+    </w:p>
+    <w:p>
+      <w:pPr>
+        <w:numPr>
+          <w:ilvl w:val="1"/>
+          <w:numId w:val="1119"/>
+        </w:numPr>
+      </w:pPr>
+      <w:r>
+        <w:t xml:space="preserve">an Earnings screen calling six routes that 404 because their PR was closed;</w:t>
+      </w:r>
+    </w:p>
+    <w:p>
+      <w:pPr>
+        <w:numPr>
+          <w:ilvl w:val="1"/>
+          <w:numId w:val="1119"/>
+        </w:numPr>
+      </w:pPr>
+      <w:r>
+        <w:t xml:space="preserve">an APK built from an unpushed commit;</w:t>
+      </w:r>
+    </w:p>
+    <w:p>
+      <w:pPr>
+        <w:numPr>
+          <w:ilvl w:val="1"/>
+          <w:numId w:val="1119"/>
+        </w:numPr>
+      </w:pPr>
+      <w:r>
+        <w:t xml:space="preserve">client booking screens with no entry point.</w:t>
+      </w:r>
+    </w:p>
+    <w:p>
+      <w:pPr>
+        <w:numPr>
+          <w:ilvl w:val="0"/>
           <w:numId w:val="1118"/>
         </w:numPr>
       </w:pPr>
       <w:r>
-        <w:t xml:space="preserve">a</w:t>
-      </w:r>
-      <w:r>
-        <w:t xml:space="preserve"> </w:t>
-      </w:r>
-      <w:r>
-        <w:t xml:space="preserve">“Money page”</w:t>
-      </w:r>
-      <w:r>
-        <w:t xml:space="preserve"> </w:t>
-      </w:r>
-      <w:r>
-        <w:t xml:space="preserve">Bradley assumed existed;</w:t>
-      </w:r>
-    </w:p>
-    <w:p>
-      <w:pPr>
-        <w:numPr>
-          <w:ilvl w:val="1"/>
+        <w:t xml:space="preserve">Before you say something works, hit the live route, find the UI pathway, and confirm the build’s commit.</w:t>
+      </w:r>
+    </w:p>
+    <w:p>
+      <w:pPr>
+        <w:numPr>
+          <w:ilvl w:val="0"/>
           <w:numId w:val="1118"/>
         </w:numPr>
       </w:pPr>
       <w:r>
-        <w:t xml:space="preserve">an Earnings screen calling six routes that 404 because their PR was closed;</w:t>
-      </w:r>
-    </w:p>
-    <w:p>
-      <w:pPr>
-        <w:numPr>
-          <w:ilvl w:val="1"/>
+        <w:t xml:space="preserve">Follow the money early. 108 found the fee loss late. On any payments surface, compute one $100 charge end to end (who pays Stripe, who gets what) before approving anything.</w:t>
+      </w:r>
+    </w:p>
+    <w:p>
+      <w:pPr>
+        <w:numPr>
+          <w:ilvl w:val="0"/>
           <w:numId w:val="1118"/>
         </w:numPr>
       </w:pPr>
       <w:r>
-        <w:t xml:space="preserve">an APK built from an unpushed commit;</w:t>
-      </w:r>
-    </w:p>
-    <w:p>
-      <w:pPr>
-        <w:numPr>
-          <w:ilvl w:val="1"/>
+        <w:t xml:space="preserve">Copy sandbox-only knowledge into GitHub as soon as you create it. Briefs, objectives and contracts lived only in 108’s sandbox until the end. Commit them to tgp-agent-context/handoffs/&lt;your-session&gt;/ as you go; nothing private.</w:t>
+      </w:r>
+    </w:p>
+    <w:p>
+      <w:pPr>
+        <w:numPr>
+          <w:ilvl w:val="0"/>
           <w:numId w:val="1118"/>
         </w:numPr>
       </w:pPr>
       <w:r>
-        <w:t xml:space="preserve">client booking screens with no entry point.</w:t>
-      </w:r>
-    </w:p>
-    <w:p>
-      <w:pPr>
-        <w:numPr>
-          <w:ilvl w:val="0"/>
-          <w:numId w:val="1117"/>
-        </w:numPr>
-      </w:pPr>
-      <w:r>
-        <w:t xml:space="preserve">Before you say something works, hit the live route, find the UI pathway, and confirm the build’s commit.</w:t>
-      </w:r>
-    </w:p>
-    <w:p>
-      <w:pPr>
-        <w:numPr>
-          <w:ilvl w:val="0"/>
-          <w:numId w:val="1117"/>
-        </w:numPr>
-      </w:pPr>
-      <w:r>
-        <w:t xml:space="preserve">Follow the money early. 108 found the fee loss late. On any payments surface, compute one $100 charge end to end (who pays Stripe, who gets what) before approving anything.</w:t>
-      </w:r>
-    </w:p>
-    <w:p>
-      <w:pPr>
-        <w:numPr>
-          <w:ilvl w:val="0"/>
-          <w:numId w:val="1117"/>
-        </w:numPr>
-      </w:pPr>
-      <w:r>
-        <w:t xml:space="preserve">Copy sandbox-only knowledge into GitHub as soon as you create it. Briefs, objectives and contracts lived only in 108’s sandbox until the end. Commit them to tgp-agent-context/handoffs/&lt;your-session&gt;/ as you go; nothing private.</w:t>
-      </w:r>
-    </w:p>
-    <w:p>
-      <w:pPr>
-        <w:numPr>
-          <w:ilvl w:val="0"/>
-          <w:numId w:val="1117"/>
-        </w:numPr>
-      </w:pPr>
-      <w:r>
         <w:t xml:space="preserve">Batch audits. One Sol agent and one Opus agent, each auditing several PRs at exact heads, used the agent and credit budget far better than one agent per PR. Keep doing it.</w:t>
       </w:r>
     </w:p>
@@ -12560,7 +12776,7 @@
       <w:pPr>
         <w:numPr>
           <w:ilvl w:val="0"/>
-          <w:numId w:val="1117"/>
+          <w:numId w:val="1118"/>
         </w:numPr>
       </w:pPr>
       <w:r>
@@ -12571,7 +12787,7 @@
       <w:pPr>
         <w:numPr>
           <w:ilvl w:val="1"/>
-          <w:numId w:val="1119"/>
+          <w:numId w:val="1120"/>
         </w:numPr>
       </w:pPr>
       <w:r>
@@ -12582,7 +12798,7 @@
       <w:pPr>
         <w:numPr>
           <w:ilvl w:val="1"/>
-          <w:numId w:val="1119"/>
+          <w:numId w:val="1120"/>
         </w:numPr>
       </w:pPr>
       <w:r>
@@ -12593,7 +12809,7 @@
       <w:pPr>
         <w:numPr>
           <w:ilvl w:val="1"/>
-          <w:numId w:val="1119"/>
+          <w:numId w:val="1120"/>
         </w:numPr>
       </w:pPr>
       <w:r>
@@ -12604,7 +12820,7 @@
       <w:pPr>
         <w:numPr>
           <w:ilvl w:val="0"/>
-          <w:numId w:val="1117"/>
+          <w:numId w:val="1118"/>
         </w:numPr>
       </w:pPr>
       <w:r>
@@ -12654,7 +12870,7 @@
       <w:pPr>
         <w:numPr>
           <w:ilvl w:val="0"/>
-          <w:numId w:val="1117"/>
+          <w:numId w:val="1118"/>
         </w:numPr>
       </w:pPr>
       <w:r>
@@ -12665,7 +12881,7 @@
       <w:pPr>
         <w:numPr>
           <w:ilvl w:val="0"/>
-          <w:numId w:val="1117"/>
+          <w:numId w:val="1118"/>
         </w:numPr>
       </w:pPr>
       <w:r>
@@ -12682,7 +12898,7 @@
       <w:pPr>
         <w:numPr>
           <w:ilvl w:val="0"/>
-          <w:numId w:val="1117"/>
+          <w:numId w:val="1118"/>
         </w:numPr>
       </w:pPr>
       <w:r>
@@ -12693,16 +12909,16 @@
       <w:pPr>
         <w:numPr>
           <w:ilvl w:val="0"/>
-          <w:numId w:val="1117"/>
+          <w:numId w:val="1118"/>
         </w:numPr>
       </w:pPr>
       <w:r>
         <w:t xml:space="preserve">Be fast and short. He’s under a deadline with limited money. Lead with what changed for the clinic journey; keep jargon out; give numbers, not adjectives.</w:t>
       </w:r>
     </w:p>
-    <w:bookmarkEnd w:id="50"/>
     <w:bookmarkEnd w:id="51"/>
-    <w:bookmarkStart w:id="52" w:name="X8d34259dfddb8eff6b558a6d57db97d4e42af82"/>
+    <w:bookmarkEnd w:id="52"/>
+    <w:bookmarkStart w:id="53" w:name="X8d34259dfddb8eff6b558a6d57db97d4e42af82"/>
     <w:p>
       <w:pPr>
         <w:pStyle w:val="Heading2"/>
@@ -12724,7 +12940,7 @@
         <w:pStyle w:val="Compact"/>
         <w:numPr>
           <w:ilvl w:val="0"/>
-          <w:numId w:val="1120"/>
+          <w:numId w:val="1121"/>
         </w:numPr>
       </w:pPr>
       <w:r>
@@ -12736,118 +12952,118 @@
         <w:pStyle w:val="Compact"/>
         <w:numPr>
           <w:ilvl w:val="1"/>
+          <w:numId w:val="1122"/>
+        </w:numPr>
+      </w:pPr>
+      <w:r>
+        <w:t xml:space="preserve">Firebase project project-2c2ffa46-a1eb-4f5c-b68: Cloud console → IAM → Service accounts → firebase-adminsdk-… → Keys → Add key (JSON).</w:t>
+      </w:r>
+    </w:p>
+    <w:p>
+      <w:pPr>
+        <w:pStyle w:val="Compact"/>
+        <w:numPr>
+          <w:ilvl w:val="1"/>
+          <w:numId w:val="1122"/>
+        </w:numPr>
+      </w:pPr>
+      <w:r>
+        <w:t xml:space="preserve">Upload it in Expo: Credentials → Android → com.growthproject.app → FCM V1 service account key.</w:t>
+      </w:r>
+    </w:p>
+    <w:p>
+      <w:pPr>
+        <w:pStyle w:val="Compact"/>
+        <w:numPr>
+          <w:ilvl w:val="0"/>
           <w:numId w:val="1121"/>
         </w:numPr>
       </w:pPr>
       <w:r>
-        <w:t xml:space="preserve">Firebase project project-2c2ffa46-a1eb-4f5c-b68: Cloud console → IAM → Service accounts → firebase-adminsdk-… → Keys → Add key (JSON).</w:t>
-      </w:r>
-    </w:p>
-    <w:p>
-      <w:pPr>
-        <w:pStyle w:val="Compact"/>
-        <w:numPr>
-          <w:ilvl w:val="1"/>
+        <w:t xml:space="preserve">Stripe live mode, before the dunning flip and before paid sales:</w:t>
+      </w:r>
+    </w:p>
+    <w:p>
+      <w:pPr>
+        <w:pStyle w:val="Compact"/>
+        <w:numPr>
+          <w:ilvl w:val="1"/>
+          <w:numId w:val="1123"/>
+        </w:numPr>
+      </w:pPr>
+      <w:r>
+        <w:t xml:space="preserve">retries at 1, 2 and 4 days (Days 1/3/7), Smart Retries off, leave past-due after the last retry;</w:t>
+      </w:r>
+    </w:p>
+    <w:p>
+      <w:pPr>
+        <w:pStyle w:val="Compact"/>
+        <w:numPr>
+          <w:ilvl w:val="1"/>
+          <w:numId w:val="1123"/>
+        </w:numPr>
+      </w:pPr>
+      <w:r>
+        <w:t xml:space="preserve">Branding (icon, logo, colors) for the Connect onboarding and 3DS pages;</w:t>
+      </w:r>
+    </w:p>
+    <w:p>
+      <w:pPr>
+        <w:pStyle w:val="Compact"/>
+        <w:numPr>
+          <w:ilvl w:val="1"/>
+          <w:numId w:val="1123"/>
+        </w:numPr>
+      </w:pPr>
+      <w:r>
+        <w:t xml:space="preserve">webhook events including charge.dispute.closed;</w:t>
+      </w:r>
+    </w:p>
+    <w:p>
+      <w:pPr>
+        <w:pStyle w:val="Compact"/>
+        <w:numPr>
+          <w:ilvl w:val="1"/>
+          <w:numId w:val="1123"/>
+        </w:numPr>
+      </w:pPr>
+      <w:r>
+        <w:t xml:space="preserve">confirm Connect is enabled;</w:t>
+      </w:r>
+    </w:p>
+    <w:p>
+      <w:pPr>
+        <w:pStyle w:val="Compact"/>
+        <w:numPr>
+          <w:ilvl w:val="1"/>
+          <w:numId w:val="1123"/>
+        </w:numPr>
+      </w:pPr>
+      <w:r>
+        <w:t xml:space="preserve">pk_live on Fly (STRIPE_PUBLISHABLE_KEY) AND in the EAS clinic and production environments. #333 makes clinic and production builds fail without a live pk; send him the exact steps when #333 is ready to merge;</w:t>
+      </w:r>
+    </w:p>
+    <w:p>
+      <w:pPr>
+        <w:pStyle w:val="Compact"/>
+        <w:numPr>
+          <w:ilvl w:val="1"/>
+          <w:numId w:val="1123"/>
+        </w:numPr>
+      </w:pPr>
+      <w:r>
+        <w:t xml:space="preserve">turn off Stripe failed-payment emails only after our email provider is live.</w:t>
+      </w:r>
+    </w:p>
+    <w:p>
+      <w:pPr>
+        <w:pStyle w:val="Compact"/>
+        <w:numPr>
+          <w:ilvl w:val="0"/>
           <w:numId w:val="1121"/>
         </w:numPr>
       </w:pPr>
       <w:r>
-        <w:t xml:space="preserve">Upload it in Expo: Credentials → Android → com.growthproject.app → FCM V1 service account key.</w:t>
-      </w:r>
-    </w:p>
-    <w:p>
-      <w:pPr>
-        <w:pStyle w:val="Compact"/>
-        <w:numPr>
-          <w:ilvl w:val="0"/>
-          <w:numId w:val="1120"/>
-        </w:numPr>
-      </w:pPr>
-      <w:r>
-        <w:t xml:space="preserve">Stripe live mode, before the dunning flip and before paid sales:</w:t>
-      </w:r>
-    </w:p>
-    <w:p>
-      <w:pPr>
-        <w:pStyle w:val="Compact"/>
-        <w:numPr>
-          <w:ilvl w:val="1"/>
-          <w:numId w:val="1122"/>
-        </w:numPr>
-      </w:pPr>
-      <w:r>
-        <w:t xml:space="preserve">retries at 1, 2 and 4 days (Days 1/3/7), Smart Retries off, leave past-due after the last retry;</w:t>
-      </w:r>
-    </w:p>
-    <w:p>
-      <w:pPr>
-        <w:pStyle w:val="Compact"/>
-        <w:numPr>
-          <w:ilvl w:val="1"/>
-          <w:numId w:val="1122"/>
-        </w:numPr>
-      </w:pPr>
-      <w:r>
-        <w:t xml:space="preserve">Branding (icon, logo, colors) for the Connect onboarding and 3DS pages;</w:t>
-      </w:r>
-    </w:p>
-    <w:p>
-      <w:pPr>
-        <w:pStyle w:val="Compact"/>
-        <w:numPr>
-          <w:ilvl w:val="1"/>
-          <w:numId w:val="1122"/>
-        </w:numPr>
-      </w:pPr>
-      <w:r>
-        <w:t xml:space="preserve">webhook events including charge.dispute.closed;</w:t>
-      </w:r>
-    </w:p>
-    <w:p>
-      <w:pPr>
-        <w:pStyle w:val="Compact"/>
-        <w:numPr>
-          <w:ilvl w:val="1"/>
-          <w:numId w:val="1122"/>
-        </w:numPr>
-      </w:pPr>
-      <w:r>
-        <w:t xml:space="preserve">confirm Connect is enabled;</w:t>
-      </w:r>
-    </w:p>
-    <w:p>
-      <w:pPr>
-        <w:pStyle w:val="Compact"/>
-        <w:numPr>
-          <w:ilvl w:val="1"/>
-          <w:numId w:val="1122"/>
-        </w:numPr>
-      </w:pPr>
-      <w:r>
-        <w:t xml:space="preserve">pk_live on Fly (STRIPE_PUBLISHABLE_KEY) AND in the EAS clinic and production environments. #333 makes clinic and production builds fail without a live pk; send him the exact steps when #333 is ready to merge;</w:t>
-      </w:r>
-    </w:p>
-    <w:p>
-      <w:pPr>
-        <w:pStyle w:val="Compact"/>
-        <w:numPr>
-          <w:ilvl w:val="1"/>
-          <w:numId w:val="1122"/>
-        </w:numPr>
-      </w:pPr>
-      <w:r>
-        <w:t xml:space="preserve">turn off Stripe failed-payment emails only after our email provider is live.</w:t>
-      </w:r>
-    </w:p>
-    <w:p>
-      <w:pPr>
-        <w:pStyle w:val="Compact"/>
-        <w:numPr>
-          <w:ilvl w:val="0"/>
-          <w:numId w:val="1120"/>
-        </w:numPr>
-      </w:pPr>
-      <w:r>
         <w:t xml:space="preserve">After #641 deploys, STRIPE_CONNECT_RETURN_URL and STRIPE_CONNECT_REFRESH_URL must be set; Stripe onboarding returns 503 until they are. The operator does this through a manifest PR (OR-112-19), and Bradley does nothing.</w:t>
       </w:r>
     </w:p>
@@ -12856,7 +13072,7 @@
         <w:pStyle w:val="Compact"/>
         <w:numPr>
           <w:ilvl w:val="0"/>
-          <w:numId w:val="1120"/>
+          <w:numId w:val="1121"/>
         </w:numPr>
       </w:pPr>
       <w:r>
@@ -12868,7 +13084,7 @@
         <w:pStyle w:val="Compact"/>
         <w:numPr>
           <w:ilvl w:val="0"/>
-          <w:numId w:val="1120"/>
+          <w:numId w:val="1121"/>
         </w:numPr>
       </w:pPr>
       <w:r>
@@ -12880,7 +13096,7 @@
         <w:pStyle w:val="Compact"/>
         <w:numPr>
           <w:ilvl w:val="0"/>
-          <w:numId w:val="1120"/>
+          <w:numId w:val="1121"/>
         </w:numPr>
       </w:pPr>
       <w:r>
@@ -12892,7 +13108,7 @@
         <w:pStyle w:val="Compact"/>
         <w:numPr>
           <w:ilvl w:val="0"/>
-          <w:numId w:val="1120"/>
+          <w:numId w:val="1121"/>
         </w:numPr>
       </w:pPr>
       <w:r>
@@ -12912,7 +13128,7 @@
         <w:pStyle w:val="Compact"/>
         <w:numPr>
           <w:ilvl w:val="0"/>
-          <w:numId w:val="1123"/>
+          <w:numId w:val="1124"/>
         </w:numPr>
       </w:pPr>
       <w:r>
@@ -12924,7 +13140,7 @@
         <w:pStyle w:val="Compact"/>
         <w:numPr>
           <w:ilvl w:val="0"/>
-          <w:numId w:val="1123"/>
+          <w:numId w:val="1124"/>
         </w:numPr>
       </w:pPr>
       <w:r>
@@ -12948,7 +13164,7 @@
         <w:pStyle w:val="Compact"/>
         <w:numPr>
           <w:ilvl w:val="0"/>
-          <w:numId w:val="1123"/>
+          <w:numId w:val="1124"/>
         </w:numPr>
       </w:pPr>
       <w:r>
@@ -12960,7 +13176,7 @@
         <w:pStyle w:val="Compact"/>
         <w:numPr>
           <w:ilvl w:val="0"/>
-          <w:numId w:val="1123"/>
+          <w:numId w:val="1124"/>
         </w:numPr>
       </w:pPr>
       <w:r>
@@ -12972,7 +13188,7 @@
         <w:pStyle w:val="Compact"/>
         <w:numPr>
           <w:ilvl w:val="0"/>
-          <w:numId w:val="1123"/>
+          <w:numId w:val="1124"/>
         </w:numPr>
       </w:pPr>
       <w:r>
@@ -12984,7 +13200,7 @@
         <w:pStyle w:val="Compact"/>
         <w:numPr>
           <w:ilvl w:val="0"/>
-          <w:numId w:val="1123"/>
+          <w:numId w:val="1124"/>
         </w:numPr>
       </w:pPr>
       <w:r>
@@ -12996,7 +13212,7 @@
         <w:pStyle w:val="Compact"/>
         <w:numPr>
           <w:ilvl w:val="0"/>
-          <w:numId w:val="1123"/>
+          <w:numId w:val="1124"/>
         </w:numPr>
       </w:pPr>
       <w:r>
@@ -13015,8 +13231,8 @@
         <w:t xml:space="preserve">line in a lane report (check every HANDOFF section).</w:t>
       </w:r>
     </w:p>
-    <w:bookmarkEnd w:id="52"/>
-    <w:bookmarkStart w:id="53" w:name="the-operating-loop"/>
+    <w:bookmarkEnd w:id="53"/>
+    <w:bookmarkStart w:id="54" w:name="the-operating-loop"/>
     <w:p>
       <w:pPr>
         <w:pStyle w:val="Heading2"/>
@@ -13037,7 +13253,7 @@
       <w:pPr>
         <w:numPr>
           <w:ilvl w:val="0"/>
-          <w:numId w:val="1124"/>
+          <w:numId w:val="1125"/>
         </w:numPr>
       </w:pPr>
       <w:r>
@@ -13048,7 +13264,7 @@
       <w:pPr>
         <w:numPr>
           <w:ilvl w:val="0"/>
-          <w:numId w:val="1124"/>
+          <w:numId w:val="1125"/>
         </w:numPr>
       </w:pPr>
       <w:r>
@@ -13059,7 +13275,7 @@
       <w:pPr>
         <w:numPr>
           <w:ilvl w:val="0"/>
-          <w:numId w:val="1124"/>
+          <w:numId w:val="1125"/>
         </w:numPr>
       </w:pPr>
       <w:r>
@@ -13070,92 +13286,92 @@
       <w:pPr>
         <w:numPr>
           <w:ilvl w:val="1"/>
+          <w:numId w:val="1126"/>
+        </w:numPr>
+      </w:pPr>
+      <w:r>
+        <w:t xml:space="preserve">one writer per mutable area;</w:t>
+      </w:r>
+    </w:p>
+    <w:p>
+      <w:pPr>
+        <w:numPr>
+          <w:ilvl w:val="1"/>
+          <w:numId w:val="1126"/>
+        </w:numPr>
+      </w:pPr>
+      <w:r>
+        <w:t xml:space="preserve">isolated worktrees in /home/user/workspace/wt/;</w:t>
+      </w:r>
+    </w:p>
+    <w:p>
+      <w:pPr>
+        <w:numPr>
+          <w:ilvl w:val="1"/>
+          <w:numId w:val="1126"/>
+        </w:numPr>
+      </w:pPr>
+      <w:r>
+        <w:t xml:space="preserve">every brief names its exclusions;</w:t>
+      </w:r>
+    </w:p>
+    <w:p>
+      <w:pPr>
+        <w:numPr>
+          <w:ilvl w:val="1"/>
+          <w:numId w:val="1126"/>
+        </w:numPr>
+      </w:pPr>
+      <w:r>
+        <w:t xml:space="preserve">builders push branches and never merge;</w:t>
+      </w:r>
+    </w:p>
+    <w:p>
+      <w:pPr>
+        <w:numPr>
+          <w:ilvl w:val="1"/>
+          <w:numId w:val="1126"/>
+        </w:numPr>
+      </w:pPr>
+      <w:r>
+        <w:t xml:space="preserve">you merge through enforced paths only.</w:t>
+      </w:r>
+    </w:p>
+    <w:p>
+      <w:pPr>
+        <w:numPr>
+          <w:ilvl w:val="0"/>
           <w:numId w:val="1125"/>
         </w:numPr>
       </w:pPr>
       <w:r>
-        <w:t xml:space="preserve">one writer per mutable area;</w:t>
-      </w:r>
-    </w:p>
-    <w:p>
-      <w:pPr>
-        <w:numPr>
-          <w:ilvl w:val="1"/>
+        <w:t xml:space="preserve">Production changes (Fly secrets, flags, deploys) go only through audited GitHub workflows (fly-deploy.yml, fly-env-sync once merged). Never by hand. Fly deletions need your sign-off after audit.</w:t>
+      </w:r>
+    </w:p>
+    <w:p>
+      <w:pPr>
+        <w:numPr>
+          <w:ilvl w:val="0"/>
           <w:numId w:val="1125"/>
         </w:numPr>
       </w:pPr>
       <w:r>
-        <w:t xml:space="preserve">isolated worktrees in /home/user/workspace/wt/;</w:t>
-      </w:r>
-    </w:p>
-    <w:p>
-      <w:pPr>
-        <w:numPr>
-          <w:ilvl w:val="1"/>
+        <w:t xml:space="preserve">Fix defects without asking. Close valid findings, reject invalid ones with evidence, and keep a disposition record in the PR. Re-run invalidated checks and re-audit changed code.</w:t>
+      </w:r>
+    </w:p>
+    <w:p>
+      <w:pPr>
+        <w:numPr>
+          <w:ilvl w:val="0"/>
           <w:numId w:val="1125"/>
         </w:numPr>
       </w:pPr>
       <w:r>
-        <w:t xml:space="preserve">every brief names its exclusions;</w:t>
-      </w:r>
-    </w:p>
-    <w:p>
-      <w:pPr>
-        <w:numPr>
-          <w:ilvl w:val="1"/>
-          <w:numId w:val="1125"/>
-        </w:numPr>
-      </w:pPr>
-      <w:r>
-        <w:t xml:space="preserve">builders push branches and never merge;</w:t>
-      </w:r>
-    </w:p>
-    <w:p>
-      <w:pPr>
-        <w:numPr>
-          <w:ilvl w:val="1"/>
-          <w:numId w:val="1125"/>
-        </w:numPr>
-      </w:pPr>
-      <w:r>
-        <w:t xml:space="preserve">you merge through enforced paths only.</w:t>
-      </w:r>
-    </w:p>
-    <w:p>
-      <w:pPr>
-        <w:numPr>
-          <w:ilvl w:val="0"/>
-          <w:numId w:val="1124"/>
-        </w:numPr>
-      </w:pPr>
-      <w:r>
-        <w:t xml:space="preserve">Production changes (Fly secrets, flags, deploys) go only through audited GitHub workflows (fly-deploy.yml, fly-env-sync once merged). Never by hand. Fly deletions need your sign-off after audit.</w:t>
-      </w:r>
-    </w:p>
-    <w:p>
-      <w:pPr>
-        <w:numPr>
-          <w:ilvl w:val="0"/>
-          <w:numId w:val="1124"/>
-        </w:numPr>
-      </w:pPr>
-      <w:r>
-        <w:t xml:space="preserve">Fix defects without asking. Close valid findings, reject invalid ones with evidence, and keep a disposition record in the PR. Re-run invalidated checks and re-audit changed code.</w:t>
-      </w:r>
-    </w:p>
-    <w:p>
-      <w:pPr>
-        <w:numPr>
-          <w:ilvl w:val="0"/>
-          <w:numId w:val="1124"/>
-        </w:numPr>
-      </w:pPr>
-      <w:r>
         <w:t xml:space="preserve">Stacked PRs: retarget to main only so CI runs, and audit the incremental range (parent head..head). Closing and reopening a PR re-triggers pull_request CI after a retarget.</w:t>
       </w:r>
     </w:p>
-    <w:bookmarkEnd w:id="53"/>
-    <w:bookmarkStart w:id="54" w:name="grading-every-pr-and-slice-t0-t4"/>
+    <w:bookmarkEnd w:id="54"/>
+    <w:bookmarkStart w:id="55" w:name="grading-every-pr-and-slice-t0-t4"/>
     <w:p>
       <w:pPr>
         <w:pStyle w:val="Heading2"/>
@@ -13557,7 +13773,7 @@
       <w:pPr>
         <w:numPr>
           <w:ilvl w:val="0"/>
-          <w:numId w:val="1126"/>
+          <w:numId w:val="1127"/>
         </w:numPr>
       </w:pPr>
       <w:r>
@@ -13568,7 +13784,7 @@
       <w:pPr>
         <w:numPr>
           <w:ilvl w:val="0"/>
-          <w:numId w:val="1126"/>
+          <w:numId w:val="1127"/>
         </w:numPr>
       </w:pPr>
       <w:r>
@@ -13579,7 +13795,7 @@
       <w:pPr>
         <w:numPr>
           <w:ilvl w:val="0"/>
-          <w:numId w:val="1126"/>
+          <w:numId w:val="1127"/>
         </w:numPr>
       </w:pPr>
       <w:r>
@@ -13590,7 +13806,7 @@
       <w:pPr>
         <w:numPr>
           <w:ilvl w:val="0"/>
-          <w:numId w:val="1126"/>
+          <w:numId w:val="1127"/>
         </w:numPr>
       </w:pPr>
       <w:r>
@@ -13601,7 +13817,7 @@
       <w:pPr>
         <w:numPr>
           <w:ilvl w:val="0"/>
-          <w:numId w:val="1126"/>
+          <w:numId w:val="1127"/>
         </w:numPr>
       </w:pPr>
       <w:r>
@@ -13612,7 +13828,7 @@
       <w:pPr>
         <w:numPr>
           <w:ilvl w:val="0"/>
-          <w:numId w:val="1126"/>
+          <w:numId w:val="1127"/>
         </w:numPr>
       </w:pPr>
       <w:r>
@@ -13623,7 +13839,7 @@
       <w:pPr>
         <w:numPr>
           <w:ilvl w:val="0"/>
-          <w:numId w:val="1126"/>
+          <w:numId w:val="1127"/>
         </w:numPr>
       </w:pPr>
       <w:r>
@@ -13634,7 +13850,7 @@
       <w:pPr>
         <w:numPr>
           <w:ilvl w:val="0"/>
-          <w:numId w:val="1126"/>
+          <w:numId w:val="1127"/>
         </w:numPr>
       </w:pPr>
       <w:r>
@@ -13693,7 +13909,7 @@
       <w:pPr>
         <w:numPr>
           <w:ilvl w:val="0"/>
-          <w:numId w:val="1127"/>
+          <w:numId w:val="1128"/>
         </w:numPr>
       </w:pPr>
       <w:r>
@@ -13704,7 +13920,7 @@
       <w:pPr>
         <w:numPr>
           <w:ilvl w:val="0"/>
-          <w:numId w:val="1127"/>
+          <w:numId w:val="1128"/>
         </w:numPr>
       </w:pPr>
       <w:r>
@@ -13715,7 +13931,7 @@
       <w:pPr>
         <w:numPr>
           <w:ilvl w:val="0"/>
-          <w:numId w:val="1127"/>
+          <w:numId w:val="1128"/>
         </w:numPr>
       </w:pPr>
       <w:r>
@@ -13726,7 +13942,7 @@
       <w:pPr>
         <w:numPr>
           <w:ilvl w:val="0"/>
-          <w:numId w:val="1127"/>
+          <w:numId w:val="1128"/>
         </w:numPr>
       </w:pPr>
       <w:r>
@@ -13737,7 +13953,7 @@
       <w:pPr>
         <w:numPr>
           <w:ilvl w:val="0"/>
-          <w:numId w:val="1127"/>
+          <w:numId w:val="1128"/>
         </w:numPr>
       </w:pPr>
       <w:r>
@@ -13748,7 +13964,7 @@
       <w:pPr>
         <w:numPr>
           <w:ilvl w:val="0"/>
-          <w:numId w:val="1127"/>
+          <w:numId w:val="1128"/>
         </w:numPr>
       </w:pPr>
       <w:r>
@@ -13775,7 +13991,7 @@
       <w:pPr>
         <w:numPr>
           <w:ilvl w:val="0"/>
-          <w:numId w:val="1128"/>
+          <w:numId w:val="1129"/>
         </w:numPr>
       </w:pPr>
       <w:r>
@@ -13786,7 +14002,7 @@
       <w:pPr>
         <w:numPr>
           <w:ilvl w:val="0"/>
-          <w:numId w:val="1128"/>
+          <w:numId w:val="1129"/>
         </w:numPr>
       </w:pPr>
       <w:r>
@@ -13797,7 +14013,7 @@
       <w:pPr>
         <w:numPr>
           <w:ilvl w:val="0"/>
-          <w:numId w:val="1128"/>
+          <w:numId w:val="1129"/>
         </w:numPr>
       </w:pPr>
       <w:r>
@@ -13828,8 +14044,8 @@
         <w:t xml:space="preserve">A merged PR is not live. An orphaned screen is not a feature.</w:t>
       </w:r>
     </w:p>
-    <w:bookmarkEnd w:id="54"/>
-    <w:bookmarkStart w:id="55" w:name="the-22-rules-compressed"/>
+    <w:bookmarkEnd w:id="55"/>
+    <w:bookmarkStart w:id="56" w:name="the-22-rules-compressed"/>
     <w:p>
       <w:pPr>
         <w:pStyle w:val="Heading2"/>
@@ -13850,7 +14066,7 @@
       <w:pPr>
         <w:numPr>
           <w:ilvl w:val="0"/>
-          <w:numId w:val="1129"/>
+          <w:numId w:val="1130"/>
         </w:numPr>
       </w:pPr>
       <w:r>
@@ -13861,7 +14077,7 @@
       <w:pPr>
         <w:numPr>
           <w:ilvl w:val="0"/>
-          <w:numId w:val="1129"/>
+          <w:numId w:val="1130"/>
         </w:numPr>
       </w:pPr>
       <w:r>
@@ -13872,7 +14088,7 @@
       <w:pPr>
         <w:numPr>
           <w:ilvl w:val="0"/>
-          <w:numId w:val="1129"/>
+          <w:numId w:val="1130"/>
         </w:numPr>
       </w:pPr>
       <w:r>
@@ -13883,7 +14099,7 @@
       <w:pPr>
         <w:numPr>
           <w:ilvl w:val="0"/>
-          <w:numId w:val="1129"/>
+          <w:numId w:val="1130"/>
         </w:numPr>
       </w:pPr>
       <w:r>
@@ -13894,7 +14110,7 @@
       <w:pPr>
         <w:numPr>
           <w:ilvl w:val="0"/>
-          <w:numId w:val="1129"/>
+          <w:numId w:val="1130"/>
         </w:numPr>
       </w:pPr>
       <w:r>
@@ -13905,7 +14121,7 @@
       <w:pPr>
         <w:numPr>
           <w:ilvl w:val="0"/>
-          <w:numId w:val="1129"/>
+          <w:numId w:val="1130"/>
         </w:numPr>
       </w:pPr>
       <w:r>
@@ -13916,7 +14132,7 @@
       <w:pPr>
         <w:numPr>
           <w:ilvl w:val="0"/>
-          <w:numId w:val="1129"/>
+          <w:numId w:val="1130"/>
         </w:numPr>
       </w:pPr>
       <w:r>
@@ -13927,7 +14143,7 @@
       <w:pPr>
         <w:numPr>
           <w:ilvl w:val="0"/>
-          <w:numId w:val="1129"/>
+          <w:numId w:val="1130"/>
         </w:numPr>
       </w:pPr>
       <w:r>
@@ -13950,7 +14166,7 @@
       <w:pPr>
         <w:numPr>
           <w:ilvl w:val="0"/>
-          <w:numId w:val="1129"/>
+          <w:numId w:val="1130"/>
         </w:numPr>
       </w:pPr>
       <w:r>
@@ -13961,7 +14177,7 @@
       <w:pPr>
         <w:numPr>
           <w:ilvl w:val="0"/>
-          <w:numId w:val="1129"/>
+          <w:numId w:val="1130"/>
         </w:numPr>
       </w:pPr>
       <w:r>
@@ -13972,7 +14188,7 @@
       <w:pPr>
         <w:numPr>
           <w:ilvl w:val="0"/>
-          <w:numId w:val="1129"/>
+          <w:numId w:val="1130"/>
         </w:numPr>
       </w:pPr>
       <w:r>
@@ -13983,7 +14199,7 @@
       <w:pPr>
         <w:numPr>
           <w:ilvl w:val="0"/>
-          <w:numId w:val="1129"/>
+          <w:numId w:val="1130"/>
         </w:numPr>
       </w:pPr>
       <w:r>
@@ -13994,7 +14210,7 @@
       <w:pPr>
         <w:numPr>
           <w:ilvl w:val="0"/>
-          <w:numId w:val="1129"/>
+          <w:numId w:val="1130"/>
         </w:numPr>
       </w:pPr>
       <w:r>
@@ -14005,7 +14221,7 @@
       <w:pPr>
         <w:numPr>
           <w:ilvl w:val="0"/>
-          <w:numId w:val="1129"/>
+          <w:numId w:val="1130"/>
         </w:numPr>
       </w:pPr>
       <w:r>
@@ -14016,7 +14232,7 @@
       <w:pPr>
         <w:numPr>
           <w:ilvl w:val="0"/>
-          <w:numId w:val="1129"/>
+          <w:numId w:val="1130"/>
         </w:numPr>
       </w:pPr>
       <w:r>
@@ -14027,7 +14243,7 @@
       <w:pPr>
         <w:numPr>
           <w:ilvl w:val="0"/>
-          <w:numId w:val="1129"/>
+          <w:numId w:val="1130"/>
         </w:numPr>
       </w:pPr>
       <w:r>
@@ -14038,7 +14254,7 @@
       <w:pPr>
         <w:numPr>
           <w:ilvl w:val="0"/>
-          <w:numId w:val="1129"/>
+          <w:numId w:val="1130"/>
         </w:numPr>
       </w:pPr>
       <w:r>
@@ -14049,7 +14265,7 @@
       <w:pPr>
         <w:numPr>
           <w:ilvl w:val="0"/>
-          <w:numId w:val="1129"/>
+          <w:numId w:val="1130"/>
         </w:numPr>
       </w:pPr>
       <w:r>
@@ -14060,7 +14276,7 @@
       <w:pPr>
         <w:numPr>
           <w:ilvl w:val="0"/>
-          <w:numId w:val="1129"/>
+          <w:numId w:val="1130"/>
         </w:numPr>
       </w:pPr>
       <w:r>
@@ -14071,7 +14287,7 @@
       <w:pPr>
         <w:numPr>
           <w:ilvl w:val="0"/>
-          <w:numId w:val="1129"/>
+          <w:numId w:val="1130"/>
         </w:numPr>
       </w:pPr>
       <w:r>
@@ -14082,7 +14298,7 @@
       <w:pPr>
         <w:numPr>
           <w:ilvl w:val="0"/>
-          <w:numId w:val="1129"/>
+          <w:numId w:val="1130"/>
         </w:numPr>
       </w:pPr>
       <w:r>
@@ -14093,15 +14309,15 @@
       <w:pPr>
         <w:numPr>
           <w:ilvl w:val="0"/>
-          <w:numId w:val="1129"/>
+          <w:numId w:val="1130"/>
         </w:numPr>
       </w:pPr>
       <w:r>
         <w:t xml:space="preserve">G22 Governance must earn its cost.</w:t>
       </w:r>
     </w:p>
-    <w:bookmarkEnd w:id="55"/>
-    <w:bookmarkStart w:id="56" w:name="X0635bdffa95aec1579e8024febda83fa602250d"/>
+    <w:bookmarkEnd w:id="56"/>
+    <w:bookmarkStart w:id="57" w:name="X0635bdffa95aec1579e8024febda83fa602250d"/>
     <w:p>
       <w:pPr>
         <w:pStyle w:val="Heading2"/>
@@ -14951,7 +15167,7 @@
       <w:pPr>
         <w:numPr>
           <w:ilvl w:val="0"/>
-          <w:numId w:val="1130"/>
+          <w:numId w:val="1131"/>
         </w:numPr>
       </w:pPr>
       <w:r>
@@ -14962,7 +15178,7 @@
       <w:pPr>
         <w:numPr>
           <w:ilvl w:val="0"/>
-          <w:numId w:val="1130"/>
+          <w:numId w:val="1131"/>
         </w:numPr>
       </w:pPr>
       <w:r>
@@ -14976,7 +15192,7 @@
       <w:pPr>
         <w:numPr>
           <w:ilvl w:val="0"/>
-          <w:numId w:val="1130"/>
+          <w:numId w:val="1131"/>
         </w:numPr>
       </w:pPr>
       <w:r>
@@ -14996,7 +15212,7 @@
       <w:pPr>
         <w:numPr>
           <w:ilvl w:val="0"/>
-          <w:numId w:val="1130"/>
+          <w:numId w:val="1131"/>
         </w:numPr>
       </w:pPr>
       <w:r>
@@ -15007,7 +15223,7 @@
       <w:pPr>
         <w:numPr>
           <w:ilvl w:val="0"/>
-          <w:numId w:val="1130"/>
+          <w:numId w:val="1131"/>
         </w:numPr>
       </w:pPr>
       <w:r>
@@ -15026,7 +15242,7 @@
       <w:pPr>
         <w:numPr>
           <w:ilvl w:val="0"/>
-          <w:numId w:val="1131"/>
+          <w:numId w:val="1132"/>
         </w:numPr>
       </w:pPr>
       <w:r>
@@ -15037,7 +15253,7 @@
       <w:pPr>
         <w:numPr>
           <w:ilvl w:val="0"/>
-          <w:numId w:val="1131"/>
+          <w:numId w:val="1132"/>
         </w:numPr>
       </w:pPr>
       <w:r>
@@ -15048,7 +15264,7 @@
       <w:pPr>
         <w:numPr>
           <w:ilvl w:val="0"/>
-          <w:numId w:val="1131"/>
+          <w:numId w:val="1132"/>
         </w:numPr>
       </w:pPr>
       <w:r>
@@ -15059,7 +15275,7 @@
       <w:pPr>
         <w:numPr>
           <w:ilvl w:val="0"/>
-          <w:numId w:val="1131"/>
+          <w:numId w:val="1132"/>
         </w:numPr>
       </w:pPr>
       <w:r>
@@ -15070,7 +15286,7 @@
       <w:pPr>
         <w:numPr>
           <w:ilvl w:val="0"/>
-          <w:numId w:val="1131"/>
+          <w:numId w:val="1132"/>
         </w:numPr>
       </w:pPr>
       <w:r>
@@ -15081,7 +15297,7 @@
       <w:pPr>
         <w:numPr>
           <w:ilvl w:val="0"/>
-          <w:numId w:val="1131"/>
+          <w:numId w:val="1132"/>
         </w:numPr>
       </w:pPr>
       <w:r>
@@ -15092,7 +15308,7 @@
       <w:pPr>
         <w:numPr>
           <w:ilvl w:val="0"/>
-          <w:numId w:val="1131"/>
+          <w:numId w:val="1132"/>
         </w:numPr>
       </w:pPr>
       <w:r>
@@ -15103,7 +15319,7 @@
       <w:pPr>
         <w:numPr>
           <w:ilvl w:val="0"/>
-          <w:numId w:val="1131"/>
+          <w:numId w:val="1132"/>
         </w:numPr>
       </w:pPr>
       <w:r>
@@ -15114,7 +15330,7 @@
       <w:pPr>
         <w:numPr>
           <w:ilvl w:val="0"/>
-          <w:numId w:val="1131"/>
+          <w:numId w:val="1132"/>
         </w:numPr>
       </w:pPr>
       <w:r>
@@ -15137,8 +15353,8 @@
         <w:t xml:space="preserve">Every owner decision goes in LAST_OPERATOR_STATE.md §3 and the LIVE_STATE.md directions table within minutes (time and near-verbatim words). Anything superseded stays, marked superseded. Unrecorded chat decisions are lost to agent 111.</w:t>
       </w:r>
     </w:p>
-    <w:bookmarkEnd w:id="56"/>
-    <w:bookmarkStart w:id="57" w:name="X87932c8f9fe1df03120e42570292aae951dc720"/>
+    <w:bookmarkEnd w:id="57"/>
+    <w:bookmarkStart w:id="58" w:name="X87932c8f9fe1df03120e42570292aae951dc720"/>
     <w:p>
       <w:pPr>
         <w:pStyle w:val="Heading2"/>
@@ -15180,7 +15396,7 @@
         <w:pStyle w:val="Compact"/>
         <w:numPr>
           <w:ilvl w:val="0"/>
-          <w:numId w:val="1132"/>
+          <w:numId w:val="1133"/>
         </w:numPr>
       </w:pPr>
       <w:r>
@@ -15201,7 +15417,7 @@
         <w:pStyle w:val="Compact"/>
         <w:numPr>
           <w:ilvl w:val="0"/>
-          <w:numId w:val="1132"/>
+          <w:numId w:val="1133"/>
         </w:numPr>
       </w:pPr>
       <w:r>
@@ -15213,7 +15429,7 @@
         <w:pStyle w:val="Compact"/>
         <w:numPr>
           <w:ilvl w:val="0"/>
-          <w:numId w:val="1132"/>
+          <w:numId w:val="1133"/>
         </w:numPr>
       </w:pPr>
       <w:r>
@@ -15233,7 +15449,7 @@
         <w:pStyle w:val="Compact"/>
         <w:numPr>
           <w:ilvl w:val="0"/>
-          <w:numId w:val="1133"/>
+          <w:numId w:val="1134"/>
         </w:numPr>
       </w:pPr>
       <w:r>
@@ -15245,7 +15461,7 @@
         <w:pStyle w:val="Compact"/>
         <w:numPr>
           <w:ilvl w:val="0"/>
-          <w:numId w:val="1133"/>
+          <w:numId w:val="1134"/>
         </w:numPr>
       </w:pPr>
       <w:r>
@@ -15257,7 +15473,7 @@
         <w:pStyle w:val="Compact"/>
         <w:numPr>
           <w:ilvl w:val="0"/>
-          <w:numId w:val="1133"/>
+          <w:numId w:val="1134"/>
         </w:numPr>
       </w:pPr>
       <w:r>
@@ -15269,7 +15485,7 @@
         <w:pStyle w:val="Compact"/>
         <w:numPr>
           <w:ilvl w:val="0"/>
-          <w:numId w:val="1133"/>
+          <w:numId w:val="1134"/>
         </w:numPr>
       </w:pPr>
       <w:r>
@@ -15281,118 +15497,118 @@
         <w:pStyle w:val="Compact"/>
         <w:numPr>
           <w:ilvl w:val="1"/>
+          <w:numId w:val="1135"/>
+        </w:numPr>
+      </w:pPr>
+      <w:r>
+        <w:t xml:space="preserve">#634 round 5;</w:t>
+      </w:r>
+    </w:p>
+    <w:p>
+      <w:pPr>
+        <w:pStyle w:val="Compact"/>
+        <w:numPr>
+          <w:ilvl w:val="1"/>
+          <w:numId w:val="1135"/>
+        </w:numPr>
+      </w:pPr>
+      <w:r>
+        <w:t xml:space="preserve">#609/#312 (B-JOURNEY-3);</w:t>
+      </w:r>
+    </w:p>
+    <w:p>
+      <w:pPr>
+        <w:pStyle w:val="Compact"/>
+        <w:numPr>
+          <w:ilvl w:val="1"/>
+          <w:numId w:val="1135"/>
+        </w:numPr>
+      </w:pPr>
+      <w:r>
+        <w:t xml:space="preserve">#641 + #646 (S-COACH-BE-2);</w:t>
+      </w:r>
+    </w:p>
+    <w:p>
+      <w:pPr>
+        <w:pStyle w:val="Compact"/>
+        <w:numPr>
+          <w:ilvl w:val="1"/>
+          <w:numId w:val="1135"/>
+        </w:numPr>
+      </w:pPr>
+      <w:r>
+        <w:t xml:space="preserve">#628/#322 dunning round 4 (S-DUNNING-R4 WIP branches);</w:t>
+      </w:r>
+    </w:p>
+    <w:p>
+      <w:pPr>
+        <w:pStyle w:val="Compact"/>
+        <w:numPr>
+          <w:ilvl w:val="1"/>
+          <w:numId w:val="1135"/>
+        </w:numPr>
+      </w:pPr>
+      <w:r>
+        <w:t xml:space="preserve">#640/#328 (S-MWB-2);</w:t>
+      </w:r>
+    </w:p>
+    <w:p>
+      <w:pPr>
+        <w:pStyle w:val="Compact"/>
+        <w:numPr>
+          <w:ilvl w:val="1"/>
+          <w:numId w:val="1135"/>
+        </w:numPr>
+      </w:pPr>
+      <w:r>
+        <w:t xml:space="preserve">#608/#636/#327 (B-EXPORT-3);</w:t>
+      </w:r>
+    </w:p>
+    <w:p>
+      <w:pPr>
+        <w:pStyle w:val="Compact"/>
+        <w:numPr>
+          <w:ilvl w:val="1"/>
+          <w:numId w:val="1135"/>
+        </w:numPr>
+      </w:pPr>
+      <w:r>
+        <w:t xml:space="preserve">#635/#326/#315/#611 (B-CONSENT-4);</w:t>
+      </w:r>
+    </w:p>
+    <w:p>
+      <w:pPr>
+        <w:pStyle w:val="Compact"/>
+        <w:numPr>
+          <w:ilvl w:val="1"/>
+          <w:numId w:val="1135"/>
+        </w:numPr>
+      </w:pPr>
+      <w:r>
+        <w:t xml:space="preserve">#647/#648 (B-FLAGS-3);</w:t>
+      </w:r>
+    </w:p>
+    <w:p>
+      <w:pPr>
+        <w:pStyle w:val="Compact"/>
+        <w:numPr>
+          <w:ilvl w:val="1"/>
+          <w:numId w:val="1135"/>
+        </w:numPr>
+      </w:pPr>
+      <w:r>
+        <w:t xml:space="preserve">#645 and the Build Week copy PR (B-JOURNEY-2).</w:t>
+      </w:r>
+    </w:p>
+    <w:p>
+      <w:pPr>
+        <w:pStyle w:val="Compact"/>
+        <w:numPr>
+          <w:ilvl w:val="0"/>
           <w:numId w:val="1134"/>
         </w:numPr>
       </w:pPr>
       <w:r>
-        <w:t xml:space="preserve">#634 round 5;</w:t>
-      </w:r>
-    </w:p>
-    <w:p>
-      <w:pPr>
-        <w:pStyle w:val="Compact"/>
-        <w:numPr>
-          <w:ilvl w:val="1"/>
-          <w:numId w:val="1134"/>
-        </w:numPr>
-      </w:pPr>
-      <w:r>
-        <w:t xml:space="preserve">#609/#312 (B-JOURNEY-3);</w:t>
-      </w:r>
-    </w:p>
-    <w:p>
-      <w:pPr>
-        <w:pStyle w:val="Compact"/>
-        <w:numPr>
-          <w:ilvl w:val="1"/>
-          <w:numId w:val="1134"/>
-        </w:numPr>
-      </w:pPr>
-      <w:r>
-        <w:t xml:space="preserve">#641 + #646 (S-COACH-BE-2);</w:t>
-      </w:r>
-    </w:p>
-    <w:p>
-      <w:pPr>
-        <w:pStyle w:val="Compact"/>
-        <w:numPr>
-          <w:ilvl w:val="1"/>
-          <w:numId w:val="1134"/>
-        </w:numPr>
-      </w:pPr>
-      <w:r>
-        <w:t xml:space="preserve">#628/#322 dunning round 4 (S-DUNNING-R4 WIP branches);</w:t>
-      </w:r>
-    </w:p>
-    <w:p>
-      <w:pPr>
-        <w:pStyle w:val="Compact"/>
-        <w:numPr>
-          <w:ilvl w:val="1"/>
-          <w:numId w:val="1134"/>
-        </w:numPr>
-      </w:pPr>
-      <w:r>
-        <w:t xml:space="preserve">#640/#328 (S-MWB-2);</w:t>
-      </w:r>
-    </w:p>
-    <w:p>
-      <w:pPr>
-        <w:pStyle w:val="Compact"/>
-        <w:numPr>
-          <w:ilvl w:val="1"/>
-          <w:numId w:val="1134"/>
-        </w:numPr>
-      </w:pPr>
-      <w:r>
-        <w:t xml:space="preserve">#608/#636/#327 (B-EXPORT-3);</w:t>
-      </w:r>
-    </w:p>
-    <w:p>
-      <w:pPr>
-        <w:pStyle w:val="Compact"/>
-        <w:numPr>
-          <w:ilvl w:val="1"/>
-          <w:numId w:val="1134"/>
-        </w:numPr>
-      </w:pPr>
-      <w:r>
-        <w:t xml:space="preserve">#635/#326/#315/#611 (B-CONSENT-4);</w:t>
-      </w:r>
-    </w:p>
-    <w:p>
-      <w:pPr>
-        <w:pStyle w:val="Compact"/>
-        <w:numPr>
-          <w:ilvl w:val="1"/>
-          <w:numId w:val="1134"/>
-        </w:numPr>
-      </w:pPr>
-      <w:r>
-        <w:t xml:space="preserve">#647/#648 (B-FLAGS-3);</w:t>
-      </w:r>
-    </w:p>
-    <w:p>
-      <w:pPr>
-        <w:pStyle w:val="Compact"/>
-        <w:numPr>
-          <w:ilvl w:val="1"/>
-          <w:numId w:val="1134"/>
-        </w:numPr>
-      </w:pPr>
-      <w:r>
-        <w:t xml:space="preserve">#645 and the Build Week copy PR (B-JOURNEY-2).</w:t>
-      </w:r>
-    </w:p>
-    <w:p>
-      <w:pPr>
-        <w:pStyle w:val="Compact"/>
-        <w:numPr>
-          <w:ilvl w:val="0"/>
-          <w:numId w:val="1133"/>
-        </w:numPr>
-      </w:pPr>
-      <w:r>
         <w:t xml:space="preserve">#329/#332: Sol’s verdicts at 83ee0e46 / 61eea115 (BLOCK / REQUEST CHANGES; read the comments) → S-COACH-MOB fix round; must follow #641’s summary-data changes.</w:t>
       </w:r>
     </w:p>
@@ -15409,7 +15625,7 @@
         <w:pStyle w:val="Compact"/>
         <w:numPr>
           <w:ilvl w:val="0"/>
-          <w:numId w:val="1135"/>
+          <w:numId w:val="1136"/>
         </w:numPr>
       </w:pPr>
       <w:r>
@@ -15421,7 +15637,7 @@
         <w:pStyle w:val="Compact"/>
         <w:numPr>
           <w:ilvl w:val="0"/>
-          <w:numId w:val="1135"/>
+          <w:numId w:val="1136"/>
         </w:numPr>
       </w:pPr>
       <w:r>
@@ -15433,7 +15649,7 @@
         <w:pStyle w:val="Compact"/>
         <w:numPr>
           <w:ilvl w:val="0"/>
-          <w:numId w:val="1135"/>
+          <w:numId w:val="1136"/>
         </w:numPr>
       </w:pPr>
       <w:r>
@@ -15445,7 +15661,7 @@
         <w:pStyle w:val="Compact"/>
         <w:numPr>
           <w:ilvl w:val="0"/>
-          <w:numId w:val="1135"/>
+          <w:numId w:val="1136"/>
         </w:numPr>
       </w:pPr>
       <w:r>
@@ -15457,7 +15673,7 @@
         <w:pStyle w:val="Compact"/>
         <w:numPr>
           <w:ilvl w:val="0"/>
-          <w:numId w:val="1135"/>
+          <w:numId w:val="1136"/>
         </w:numPr>
       </w:pPr>
       <w:r>
@@ -15469,7 +15685,7 @@
         <w:pStyle w:val="Compact"/>
         <w:numPr>
           <w:ilvl w:val="0"/>
-          <w:numId w:val="1135"/>
+          <w:numId w:val="1136"/>
         </w:numPr>
       </w:pPr>
       <w:r>
@@ -15481,7 +15697,7 @@
         <w:pStyle w:val="Compact"/>
         <w:numPr>
           <w:ilvl w:val="0"/>
-          <w:numId w:val="1135"/>
+          <w:numId w:val="1136"/>
         </w:numPr>
       </w:pPr>
       <w:r>
@@ -15493,7 +15709,7 @@
         <w:pStyle w:val="Compact"/>
         <w:numPr>
           <w:ilvl w:val="0"/>
-          <w:numId w:val="1135"/>
+          <w:numId w:val="1136"/>
         </w:numPr>
       </w:pPr>
       <w:r>
@@ -15505,7 +15721,7 @@
         <w:pStyle w:val="Compact"/>
         <w:numPr>
           <w:ilvl w:val="0"/>
-          <w:numId w:val="1135"/>
+          <w:numId w:val="1136"/>
         </w:numPr>
       </w:pPr>
       <w:r>
@@ -15517,7 +15733,7 @@
         <w:pStyle w:val="Compact"/>
         <w:numPr>
           <w:ilvl w:val="0"/>
-          <w:numId w:val="1135"/>
+          <w:numId w:val="1136"/>
         </w:numPr>
       </w:pPr>
       <w:r>
@@ -15529,7 +15745,7 @@
         <w:pStyle w:val="Compact"/>
         <w:numPr>
           <w:ilvl w:val="0"/>
-          <w:numId w:val="1135"/>
+          <w:numId w:val="1136"/>
         </w:numPr>
       </w:pPr>
       <w:r>
@@ -15541,7 +15757,7 @@
         <w:pStyle w:val="Compact"/>
         <w:numPr>
           <w:ilvl w:val="0"/>
-          <w:numId w:val="1135"/>
+          <w:numId w:val="1136"/>
         </w:numPr>
       </w:pPr>
       <w:r>
@@ -15553,7 +15769,7 @@
         <w:pStyle w:val="Compact"/>
         <w:numPr>
           <w:ilvl w:val="0"/>
-          <w:numId w:val="1135"/>
+          <w:numId w:val="1136"/>
         </w:numPr>
       </w:pPr>
       <w:r>
@@ -15565,7 +15781,7 @@
         <w:pStyle w:val="Compact"/>
         <w:numPr>
           <w:ilvl w:val="0"/>
-          <w:numId w:val="1135"/>
+          <w:numId w:val="1136"/>
         </w:numPr>
       </w:pPr>
       <w:r>
@@ -15577,7 +15793,7 @@
         <w:pStyle w:val="Compact"/>
         <w:numPr>
           <w:ilvl w:val="0"/>
-          <w:numId w:val="1135"/>
+          <w:numId w:val="1136"/>
         </w:numPr>
       </w:pPr>
       <w:r>
@@ -15589,7 +15805,7 @@
         <w:pStyle w:val="Compact"/>
         <w:numPr>
           <w:ilvl w:val="0"/>
-          <w:numId w:val="1135"/>
+          <w:numId w:val="1136"/>
         </w:numPr>
       </w:pPr>
       <w:r>
@@ -15601,11 +15817,35 @@
         <w:pStyle w:val="Compact"/>
         <w:numPr>
           <w:ilvl w:val="0"/>
-          <w:numId w:val="1135"/>
-        </w:numPr>
-      </w:pPr>
-      <w:r>
-        <w:t xml:space="preserve">Money follow-ups (OR-112-19): stop returning the Stripe client secret on GET /v1/checkout/purchases (before launch); Money reads #628’s dunning delivery rows; the Connect URLs manifest PR after #641 deploys.</w:t>
+          <w:numId w:val="1136"/>
+        </w:numPr>
+      </w:pPr>
+      <w:r>
+        <w:t xml:space="preserve">Money follow-ups (OR-112-19): the client-secret removal on GET /v1/checkout/purchases is DONE in #646 (32f7ede4, needs audit); Money reads #628’s dunning delivery rows; the Connect URLs manifest PR after #641 deploys.</w:t>
+      </w:r>
+    </w:p>
+    <w:p>
+      <w:pPr>
+        <w:pStyle w:val="Compact"/>
+        <w:numPr>
+          <w:ilvl w:val="0"/>
+          <w:numId w:val="1136"/>
+        </w:numPr>
+      </w:pPr>
+      <w:r>
+        <w:t xml:space="preserve">Copy: make SupportEmailFallback’s</w:t>
+      </w:r>
+      <w:r>
+        <w:t xml:space="preserve"> </w:t>
+      </w:r>
+      <w:r>
+        <w:t xml:space="preserve">“write to us”</w:t>
+      </w:r>
+      <w:r>
+        <w:t xml:space="preserve"> </w:t>
+      </w:r>
+      <w:r>
+        <w:t xml:space="preserve">impersonal (OR-112-21). Device pass for #315: confirm a forced failure report carries no user and every policy link opens.</w:t>
       </w:r>
     </w:p>
     <w:p>
@@ -15621,7 +15861,7 @@
         <w:pStyle w:val="Compact"/>
         <w:numPr>
           <w:ilvl w:val="0"/>
-          <w:numId w:val="1136"/>
+          <w:numId w:val="1137"/>
         </w:numPr>
       </w:pPr>
       <w:r>
@@ -15633,7 +15873,7 @@
         <w:pStyle w:val="Compact"/>
         <w:numPr>
           <w:ilvl w:val="0"/>
-          <w:numId w:val="1136"/>
+          <w:numId w:val="1137"/>
         </w:numPr>
       </w:pPr>
       <w:r>
@@ -15645,7 +15885,7 @@
         <w:pStyle w:val="Compact"/>
         <w:numPr>
           <w:ilvl w:val="0"/>
-          <w:numId w:val="1136"/>
+          <w:numId w:val="1137"/>
         </w:numPr>
       </w:pPr>
       <w:r>
@@ -15657,7 +15897,7 @@
         <w:pStyle w:val="Compact"/>
         <w:numPr>
           <w:ilvl w:val="0"/>
-          <w:numId w:val="1136"/>
+          <w:numId w:val="1137"/>
         </w:numPr>
       </w:pPr>
       <w:r>
@@ -15669,7 +15909,7 @@
         <w:pStyle w:val="Compact"/>
         <w:numPr>
           <w:ilvl w:val="0"/>
-          <w:numId w:val="1136"/>
+          <w:numId w:val="1137"/>
         </w:numPr>
       </w:pPr>
       <w:r>
@@ -15681,7 +15921,7 @@
         <w:pStyle w:val="Compact"/>
         <w:numPr>
           <w:ilvl w:val="0"/>
-          <w:numId w:val="1136"/>
+          <w:numId w:val="1137"/>
         </w:numPr>
       </w:pPr>
       <w:r>
@@ -15693,7 +15933,7 @@
         <w:pStyle w:val="Compact"/>
         <w:numPr>
           <w:ilvl w:val="0"/>
-          <w:numId w:val="1136"/>
+          <w:numId w:val="1137"/>
         </w:numPr>
       </w:pPr>
       <w:r>
@@ -15713,7 +15953,7 @@
         <w:pStyle w:val="Compact"/>
         <w:numPr>
           <w:ilvl w:val="0"/>
-          <w:numId w:val="1137"/>
+          <w:numId w:val="1138"/>
         </w:numPr>
       </w:pPr>
       <w:r>
@@ -15725,7 +15965,7 @@
         <w:pStyle w:val="Compact"/>
         <w:numPr>
           <w:ilvl w:val="0"/>
-          <w:numId w:val="1137"/>
+          <w:numId w:val="1138"/>
         </w:numPr>
       </w:pPr>
       <w:r>
@@ -15737,7 +15977,7 @@
         <w:pStyle w:val="Compact"/>
         <w:numPr>
           <w:ilvl w:val="0"/>
-          <w:numId w:val="1137"/>
+          <w:numId w:val="1138"/>
         </w:numPr>
       </w:pPr>
       <w:r>
@@ -15749,15 +15989,15 @@
         <w:pStyle w:val="Compact"/>
         <w:numPr>
           <w:ilvl w:val="0"/>
-          <w:numId w:val="1137"/>
+          <w:numId w:val="1138"/>
         </w:numPr>
       </w:pPr>
       <w:r>
         <w:t xml:space="preserve">Submit only when the whole launch scope meets the bar. Give Bradley a measured date from merge throughput.</w:t>
       </w:r>
     </w:p>
-    <w:bookmarkEnd w:id="57"/>
-    <w:bookmarkStart w:id="58" w:name="X66fa6cb9a96ab16550ae0f545deb8ece155990f"/>
+    <w:bookmarkEnd w:id="58"/>
+    <w:bookmarkStart w:id="59" w:name="X66fa6cb9a96ab16550ae0f545deb8ece155990f"/>
     <w:p>
       <w:pPr>
         <w:pStyle w:val="Heading2"/>
@@ -15771,7 +16011,7 @@
         <w:pStyle w:val="Compact"/>
         <w:numPr>
           <w:ilvl w:val="0"/>
-          <w:numId w:val="1138"/>
+          <w:numId w:val="1139"/>
         </w:numPr>
       </w:pPr>
       <w:r>
@@ -15783,7 +16023,7 @@
         <w:pStyle w:val="Compact"/>
         <w:numPr>
           <w:ilvl w:val="1"/>
-          <w:numId w:val="1139"/>
+          <w:numId w:val="1140"/>
         </w:numPr>
       </w:pPr>
       <w:r>
@@ -15810,7 +16050,7 @@
         <w:pStyle w:val="Compact"/>
         <w:numPr>
           <w:ilvl w:val="1"/>
-          <w:numId w:val="1139"/>
+          <w:numId w:val="1140"/>
         </w:numPr>
       </w:pPr>
       <w:r>
@@ -15822,7 +16062,7 @@
         <w:pStyle w:val="Compact"/>
         <w:numPr>
           <w:ilvl w:val="1"/>
-          <w:numId w:val="1139"/>
+          <w:numId w:val="1140"/>
         </w:numPr>
       </w:pPr>
       <w:r>
@@ -15861,7 +16101,7 @@
         <w:pStyle w:val="Compact"/>
         <w:numPr>
           <w:ilvl w:val="0"/>
-          <w:numId w:val="1138"/>
+          <w:numId w:val="1139"/>
         </w:numPr>
       </w:pPr>
       <w:r>
@@ -15885,7 +16125,7 @@
         <w:pStyle w:val="Compact"/>
         <w:numPr>
           <w:ilvl w:val="0"/>
-          <w:numId w:val="1138"/>
+          <w:numId w:val="1139"/>
         </w:numPr>
       </w:pPr>
       <w:r>
@@ -15897,7 +16137,7 @@
         <w:pStyle w:val="Compact"/>
         <w:numPr>
           <w:ilvl w:val="0"/>
-          <w:numId w:val="1138"/>
+          <w:numId w:val="1139"/>
         </w:numPr>
       </w:pPr>
       <w:r>
@@ -15909,7 +16149,7 @@
         <w:pStyle w:val="Compact"/>
         <w:numPr>
           <w:ilvl w:val="1"/>
-          <w:numId w:val="1140"/>
+          <w:numId w:val="1141"/>
         </w:numPr>
       </w:pPr>
       <w:r>
@@ -15921,7 +16161,7 @@
         <w:pStyle w:val="Compact"/>
         <w:numPr>
           <w:ilvl w:val="1"/>
-          <w:numId w:val="1140"/>
+          <w:numId w:val="1141"/>
         </w:numPr>
       </w:pPr>
       <w:r>
@@ -15942,7 +16182,7 @@
         <w:pStyle w:val="Compact"/>
         <w:numPr>
           <w:ilvl w:val="1"/>
-          <w:numId w:val="1140"/>
+          <w:numId w:val="1141"/>
         </w:numPr>
       </w:pPr>
       <w:r>
@@ -15954,7 +16194,7 @@
         <w:pStyle w:val="Compact"/>
         <w:numPr>
           <w:ilvl w:val="1"/>
-          <w:numId w:val="1140"/>
+          <w:numId w:val="1141"/>
         </w:numPr>
       </w:pPr>
       <w:r>
@@ -15966,7 +16206,7 @@
         <w:pStyle w:val="Compact"/>
         <w:numPr>
           <w:ilvl w:val="1"/>
-          <w:numId w:val="1140"/>
+          <w:numId w:val="1141"/>
         </w:numPr>
       </w:pPr>
       <w:r>
@@ -15978,7 +16218,7 @@
         <w:pStyle w:val="Compact"/>
         <w:numPr>
           <w:ilvl w:val="0"/>
-          <w:numId w:val="1138"/>
+          <w:numId w:val="1139"/>
         </w:numPr>
       </w:pPr>
       <w:r>
@@ -15993,7 +16233,7 @@
         <w:pStyle w:val="Compact"/>
         <w:numPr>
           <w:ilvl w:val="0"/>
-          <w:numId w:val="1138"/>
+          <w:numId w:val="1139"/>
         </w:numPr>
       </w:pPr>
       <w:r>
@@ -16005,7 +16245,7 @@
         <w:pStyle w:val="Compact"/>
         <w:numPr>
           <w:ilvl w:val="0"/>
-          <w:numId w:val="1138"/>
+          <w:numId w:val="1139"/>
         </w:numPr>
       </w:pPr>
       <w:r>
@@ -16029,15 +16269,15 @@
         <w:pStyle w:val="Compact"/>
         <w:numPr>
           <w:ilvl w:val="0"/>
-          <w:numId w:val="1138"/>
+          <w:numId w:val="1139"/>
         </w:numPr>
       </w:pPr>
       <w:r>
         <w:t xml:space="preserve">Bradley: Bellevue, WA (America/Los_Angeles); iPhone for TestFlight; Samsung Android phone; Mac without Homebrew.</w:t>
       </w:r>
     </w:p>
-    <w:bookmarkEnd w:id="58"/>
-    <w:bookmarkStart w:id="59" w:name="definition-of-done-the-clinic-launch"/>
+    <w:bookmarkEnd w:id="59"/>
+    <w:bookmarkStart w:id="60" w:name="definition-of-done-the-clinic-launch"/>
     <w:p>
       <w:pPr>
         <w:pStyle w:val="Heading2"/>
@@ -16058,7 +16298,7 @@
       <w:pPr>
         <w:numPr>
           <w:ilvl w:val="0"/>
-          <w:numId w:val="1141"/>
+          <w:numId w:val="1142"/>
         </w:numPr>
       </w:pPr>
       <w:r>
@@ -16069,7 +16309,7 @@
       <w:pPr>
         <w:numPr>
           <w:ilvl w:val="0"/>
-          <w:numId w:val="1141"/>
+          <w:numId w:val="1142"/>
         </w:numPr>
       </w:pPr>
       <w:r>
@@ -16080,7 +16320,7 @@
       <w:pPr>
         <w:numPr>
           <w:ilvl w:val="0"/>
-          <w:numId w:val="1141"/>
+          <w:numId w:val="1142"/>
         </w:numPr>
       </w:pPr>
       <w:r>
@@ -16091,7 +16331,7 @@
       <w:pPr>
         <w:numPr>
           <w:ilvl w:val="0"/>
-          <w:numId w:val="1141"/>
+          <w:numId w:val="1142"/>
         </w:numPr>
       </w:pPr>
       <w:r>
@@ -16102,131 +16342,131 @@
       <w:pPr>
         <w:numPr>
           <w:ilvl w:val="1"/>
+          <w:numId w:val="1143"/>
+        </w:numPr>
+      </w:pPr>
+      <w:r>
+        <w:t xml:space="preserve">plan and macro targets;</w:t>
+      </w:r>
+    </w:p>
+    <w:p>
+      <w:pPr>
+        <w:numPr>
+          <w:ilvl w:val="1"/>
+          <w:numId w:val="1143"/>
+        </w:numPr>
+      </w:pPr>
+      <w:r>
+        <w:t xml:space="preserve">community (community flags on);</w:t>
+      </w:r>
+    </w:p>
+    <w:p>
+      <w:pPr>
+        <w:numPr>
+          <w:ilvl w:val="1"/>
+          <w:numId w:val="1143"/>
+        </w:numPr>
+      </w:pPr>
+      <w:r>
+        <w:t xml:space="preserve">messaging Bradley;</w:t>
+      </w:r>
+    </w:p>
+    <w:p>
+      <w:pPr>
+        <w:numPr>
+          <w:ilvl w:val="1"/>
+          <w:numId w:val="1143"/>
+        </w:numPr>
+      </w:pPr>
+      <w:r>
+        <w:t xml:space="preserve">Calendar, ending in a booked welcome call that the patient can add to their device calendar;</w:t>
+      </w:r>
+    </w:p>
+    <w:p>
+      <w:pPr>
+        <w:numPr>
+          <w:ilvl w:val="1"/>
+          <w:numId w:val="1143"/>
+        </w:numPr>
+      </w:pPr>
+      <w:r>
+        <w:t xml:space="preserve">wearables connect, plus where health and sleep data live;</w:t>
+      </w:r>
+    </w:p>
+    <w:p>
+      <w:pPr>
+        <w:numPr>
+          <w:ilvl w:val="1"/>
+          <w:numId w:val="1143"/>
+        </w:numPr>
+      </w:pPr>
+      <w:r>
+        <w:t xml:space="preserve">teach-back: first meal logged, first message sent.</w:t>
+      </w:r>
+    </w:p>
+    <w:p>
+      <w:pPr>
+        <w:numPr>
+          <w:ilvl w:val="0"/>
           <w:numId w:val="1142"/>
         </w:numPr>
       </w:pPr>
       <w:r>
-        <w:t xml:space="preserve">plan and macro targets;</w:t>
-      </w:r>
-    </w:p>
-    <w:p>
-      <w:pPr>
-        <w:numPr>
-          <w:ilvl w:val="1"/>
+        <w:t xml:space="preserve">The welcome message arrives about 13 minutes after onboarding. Reminders and push work on iOS and Android.</w:t>
+      </w:r>
+    </w:p>
+    <w:p>
+      <w:pPr>
+        <w:numPr>
+          <w:ilvl w:val="0"/>
           <w:numId w:val="1142"/>
         </w:numPr>
       </w:pPr>
       <w:r>
-        <w:t xml:space="preserve">community (community flags on);</w:t>
-      </w:r>
-    </w:p>
-    <w:p>
-      <w:pPr>
-        <w:numPr>
-          <w:ilvl w:val="1"/>
+        <w:t xml:space="preserve">Account deletion, report/block (both ways) and the privacy pages work: App Review requirements.</w:t>
+      </w:r>
+    </w:p>
+    <w:p>
+      <w:pPr>
+        <w:numPr>
+          <w:ilvl w:val="0"/>
           <w:numId w:val="1142"/>
         </w:numPr>
       </w:pPr>
       <w:r>
-        <w:t xml:space="preserve">messaging Bradley;</w:t>
-      </w:r>
-    </w:p>
-    <w:p>
-      <w:pPr>
-        <w:numPr>
-          <w:ilvl w:val="1"/>
+        <w:t xml:space="preserve">Every critical feature is reachable, and nothing broken or fake is reachable.</w:t>
+      </w:r>
+    </w:p>
+    <w:p>
+      <w:pPr>
+        <w:numPr>
+          <w:ilvl w:val="0"/>
           <w:numId w:val="1142"/>
         </w:numPr>
       </w:pPr>
       <w:r>
-        <w:t xml:space="preserve">Calendar, ending in a booked welcome call that the patient can add to their device calendar;</w:t>
-      </w:r>
-    </w:p>
-    <w:p>
-      <w:pPr>
-        <w:numPr>
-          <w:ilvl w:val="1"/>
+        <w:t xml:space="preserve">Day-1 flags are on and verified. Stay-off flags are off.</w:t>
+      </w:r>
+    </w:p>
+    <w:p>
+      <w:pPr>
+        <w:numPr>
+          <w:ilvl w:val="0"/>
           <w:numId w:val="1142"/>
         </w:numPr>
       </w:pPr>
       <w:r>
-        <w:t xml:space="preserve">wearables connect, plus where health and sleep data live;</w:t>
-      </w:r>
-    </w:p>
-    <w:p>
-      <w:pPr>
-        <w:numPr>
-          <w:ilvl w:val="1"/>
+        <w:t xml:space="preserve">No paid sale can lose TGP money. That is S-FEE, or paid checkout is held until it lands; if neither is possible, that’s a decision for Bradley.</w:t>
+      </w:r>
+    </w:p>
+    <w:p>
+      <w:pPr>
+        <w:numPr>
+          <w:ilvl w:val="0"/>
           <w:numId w:val="1142"/>
         </w:numPr>
       </w:pPr>
       <w:r>
-        <w:t xml:space="preserve">teach-back: first meal logged, first message sent.</w:t>
-      </w:r>
-    </w:p>
-    <w:p>
-      <w:pPr>
-        <w:numPr>
-          <w:ilvl w:val="0"/>
-          <w:numId w:val="1141"/>
-        </w:numPr>
-      </w:pPr>
-      <w:r>
-        <w:t xml:space="preserve">The welcome message arrives about 13 minutes after onboarding. Reminders and push work on iOS and Android.</w:t>
-      </w:r>
-    </w:p>
-    <w:p>
-      <w:pPr>
-        <w:numPr>
-          <w:ilvl w:val="0"/>
-          <w:numId w:val="1141"/>
-        </w:numPr>
-      </w:pPr>
-      <w:r>
-        <w:t xml:space="preserve">Account deletion, report/block (both ways) and the privacy pages work: App Review requirements.</w:t>
-      </w:r>
-    </w:p>
-    <w:p>
-      <w:pPr>
-        <w:numPr>
-          <w:ilvl w:val="0"/>
-          <w:numId w:val="1141"/>
-        </w:numPr>
-      </w:pPr>
-      <w:r>
-        <w:t xml:space="preserve">Every critical feature is reachable, and nothing broken or fake is reachable.</w:t>
-      </w:r>
-    </w:p>
-    <w:p>
-      <w:pPr>
-        <w:numPr>
-          <w:ilvl w:val="0"/>
-          <w:numId w:val="1141"/>
-        </w:numPr>
-      </w:pPr>
-      <w:r>
-        <w:t xml:space="preserve">Day-1 flags are on and verified. Stay-off flags are off.</w:t>
-      </w:r>
-    </w:p>
-    <w:p>
-      <w:pPr>
-        <w:numPr>
-          <w:ilvl w:val="0"/>
-          <w:numId w:val="1141"/>
-        </w:numPr>
-      </w:pPr>
-      <w:r>
-        <w:t xml:space="preserve">No paid sale can lose TGP money. That is S-FEE, or paid checkout is held until it lands; if neither is possible, that’s a decision for Bradley.</w:t>
-      </w:r>
-    </w:p>
-    <w:p>
-      <w:pPr>
-        <w:numPr>
-          <w:ilvl w:val="0"/>
-          <w:numId w:val="1141"/>
-        </w:numPr>
-      </w:pPr>
-      <w:r>
         <w:t xml:space="preserve">Every merged PR has its tier’s audits at the merged head, required checks ran, and no material findings are open.</w:t>
       </w:r>
     </w:p>
@@ -16234,7 +16474,7 @@
       <w:pPr>
         <w:numPr>
           <w:ilvl w:val="0"/>
-          <w:numId w:val="1141"/>
+          <w:numId w:val="1142"/>
         </w:numPr>
       </w:pPr>
       <w:r>
@@ -16249,8 +16489,8 @@
         <w:t xml:space="preserve">Until then, report the exact rung reached and the remaining gap. Never round progress up.</w:t>
       </w:r>
     </w:p>
-    <w:bookmarkEnd w:id="59"/>
-    <w:bookmarkStart w:id="60" w:name="importer-bucket-b-paused"/>
+    <w:bookmarkEnd w:id="60"/>
+    <w:bookmarkStart w:id="61" w:name="importer-bucket-b-paused"/>
     <w:p>
       <w:pPr>
         <w:pStyle w:val="Heading2"/>
@@ -16279,7 +16519,7 @@
       <w:pPr>
         <w:numPr>
           <w:ilvl w:val="0"/>
-          <w:numId w:val="1143"/>
+          <w:numId w:val="1144"/>
         </w:numPr>
       </w:pPr>
       <w:r>
@@ -16290,7 +16530,7 @@
       <w:pPr>
         <w:numPr>
           <w:ilvl w:val="0"/>
-          <w:numId w:val="1143"/>
+          <w:numId w:val="1144"/>
         </w:numPr>
       </w:pPr>
       <w:r>
@@ -16301,7 +16541,7 @@
       <w:pPr>
         <w:numPr>
           <w:ilvl w:val="0"/>
-          <w:numId w:val="1143"/>
+          <w:numId w:val="1144"/>
         </w:numPr>
       </w:pPr>
       <w:r>
@@ -16312,7 +16552,7 @@
       <w:pPr>
         <w:numPr>
           <w:ilvl w:val="0"/>
-          <w:numId w:val="1143"/>
+          <w:numId w:val="1144"/>
         </w:numPr>
       </w:pPr>
       <w:r>
@@ -16323,7 +16563,7 @@
       <w:pPr>
         <w:numPr>
           <w:ilvl w:val="0"/>
-          <w:numId w:val="1143"/>
+          <w:numId w:val="1144"/>
         </w:numPr>
       </w:pPr>
       <w:r>
@@ -16334,7 +16574,7 @@
       <w:pPr>
         <w:numPr>
           <w:ilvl w:val="0"/>
-          <w:numId w:val="1143"/>
+          <w:numId w:val="1144"/>
         </w:numPr>
       </w:pPr>
       <w:r>
@@ -16349,8 +16589,8 @@
         <w:t xml:space="preserve">Read every importer doc and decision record word for word before touching it.</w:t>
       </w:r>
     </w:p>
-    <w:bookmarkEnd w:id="60"/>
-    <w:bookmarkStart w:id="61" w:name="final-directive"/>
+    <w:bookmarkEnd w:id="61"/>
+    <w:bookmarkStart w:id="62" w:name="final-directive"/>
     <w:p>
       <w:pPr>
         <w:pStyle w:val="Heading2"/>
@@ -16397,8 +16637,8 @@
         <w:t xml:space="preserve">, have every lane write a HANDOFF section, regenerate this prompt as v7 with board.py, and leave nothing running. That is how agent 112 handed to you.</w:t>
       </w:r>
     </w:p>
-    <w:bookmarkEnd w:id="61"/>
     <w:bookmarkEnd w:id="62"/>
+    <w:bookmarkEnd w:id="63"/>
     <w:sectPr>
       <w:footnotePr>
         <w:numRestart w:val="eachSect"/>
@@ -17573,6 +17813,9 @@
     <w:abstractNumId w:val="991"/>
   </w:num>
   <w:num w:numId="1109">
+    <w:abstractNumId w:val="991"/>
+  </w:num>
+  <w:num w:numId="1110">
     <w:abstractNumId w:val="99411"/>
     <w:lvlOverride w:ilvl="0">
       <w:startOverride w:val="1"/>
@@ -17601,9 +17844,6 @@
     <w:lvlOverride w:ilvl="8">
       <w:startOverride w:val="1"/>
     </w:lvlOverride>
-  </w:num>
-  <w:num w:numId="1110">
-    <w:abstractNumId w:val="991"/>
   </w:num>
   <w:num w:numId="1111">
     <w:abstractNumId w:val="991"/>
@@ -17612,6 +17852,9 @@
     <w:abstractNumId w:val="991"/>
   </w:num>
   <w:num w:numId="1113">
+    <w:abstractNumId w:val="991"/>
+  </w:num>
+  <w:num w:numId="1114">
     <w:abstractNumId w:val="99411"/>
     <w:lvlOverride w:ilvl="0">
       <w:startOverride w:val="1"/>
@@ -17641,38 +17884,8 @@
       <w:startOverride w:val="1"/>
     </w:lvlOverride>
   </w:num>
-  <w:num w:numId="1114">
+  <w:num w:numId="1115">
     <w:abstractNumId w:val="991"/>
-  </w:num>
-  <w:num w:numId="1115">
-    <w:abstractNumId w:val="99411"/>
-    <w:lvlOverride w:ilvl="0">
-      <w:startOverride w:val="1"/>
-    </w:lvlOverride>
-    <w:lvlOverride w:ilvl="1">
-      <w:startOverride w:val="1"/>
-    </w:lvlOverride>
-    <w:lvlOverride w:ilvl="2">
-      <w:startOverride w:val="1"/>
-    </w:lvlOverride>
-    <w:lvlOverride w:ilvl="3">
-      <w:startOverride w:val="1"/>
-    </w:lvlOverride>
-    <w:lvlOverride w:ilvl="4">
-      <w:startOverride w:val="1"/>
-    </w:lvlOverride>
-    <w:lvlOverride w:ilvl="5">
-      <w:startOverride w:val="1"/>
-    </w:lvlOverride>
-    <w:lvlOverride w:ilvl="6">
-      <w:startOverride w:val="1"/>
-    </w:lvlOverride>
-    <w:lvlOverride w:ilvl="7">
-      <w:startOverride w:val="1"/>
-    </w:lvlOverride>
-    <w:lvlOverride w:ilvl="8">
-      <w:startOverride w:val="1"/>
-    </w:lvlOverride>
   </w:num>
   <w:num w:numId="1116">
     <w:abstractNumId w:val="99411"/>
@@ -17735,12 +17948,42 @@
     </w:lvlOverride>
   </w:num>
   <w:num w:numId="1118">
-    <w:abstractNumId w:val="991"/>
+    <w:abstractNumId w:val="99411"/>
+    <w:lvlOverride w:ilvl="0">
+      <w:startOverride w:val="1"/>
+    </w:lvlOverride>
+    <w:lvlOverride w:ilvl="1">
+      <w:startOverride w:val="1"/>
+    </w:lvlOverride>
+    <w:lvlOverride w:ilvl="2">
+      <w:startOverride w:val="1"/>
+    </w:lvlOverride>
+    <w:lvlOverride w:ilvl="3">
+      <w:startOverride w:val="1"/>
+    </w:lvlOverride>
+    <w:lvlOverride w:ilvl="4">
+      <w:startOverride w:val="1"/>
+    </w:lvlOverride>
+    <w:lvlOverride w:ilvl="5">
+      <w:startOverride w:val="1"/>
+    </w:lvlOverride>
+    <w:lvlOverride w:ilvl="6">
+      <w:startOverride w:val="1"/>
+    </w:lvlOverride>
+    <w:lvlOverride w:ilvl="7">
+      <w:startOverride w:val="1"/>
+    </w:lvlOverride>
+    <w:lvlOverride w:ilvl="8">
+      <w:startOverride w:val="1"/>
+    </w:lvlOverride>
   </w:num>
   <w:num w:numId="1119">
     <w:abstractNumId w:val="991"/>
   </w:num>
   <w:num w:numId="1120">
+    <w:abstractNumId w:val="991"/>
+  </w:num>
+  <w:num w:numId="1121">
     <w:abstractNumId w:val="99411"/>
     <w:lvlOverride w:ilvl="0">
       <w:startOverride w:val="1"/>
@@ -17769,14 +18012,14 @@
     <w:lvlOverride w:ilvl="8">
       <w:startOverride w:val="1"/>
     </w:lvlOverride>
-  </w:num>
-  <w:num w:numId="1121">
-    <w:abstractNumId w:val="991"/>
   </w:num>
   <w:num w:numId="1122">
     <w:abstractNumId w:val="991"/>
   </w:num>
   <w:num w:numId="1123">
+    <w:abstractNumId w:val="991"/>
+  </w:num>
+  <w:num w:numId="1124">
     <w:abstractNumId w:val="99411"/>
     <w:lvlOverride w:ilvl="0">
       <w:startOverride w:val="1"/>
@@ -17805,9 +18048,6 @@
     <w:lvlOverride w:ilvl="8">
       <w:startOverride w:val="1"/>
     </w:lvlOverride>
-  </w:num>
-  <w:num w:numId="1124">
-    <w:abstractNumId w:val="991"/>
   </w:num>
   <w:num w:numId="1125">
     <w:abstractNumId w:val="991"/>
@@ -17822,6 +18062,9 @@
     <w:abstractNumId w:val="991"/>
   </w:num>
   <w:num w:numId="1129">
+    <w:abstractNumId w:val="991"/>
+  </w:num>
+  <w:num w:numId="1130">
     <w:abstractNumId w:val="99411"/>
     <w:lvlOverride w:ilvl="0">
       <w:startOverride w:val="1"/>
@@ -17850,14 +18093,14 @@
     <w:lvlOverride w:ilvl="8">
       <w:startOverride w:val="1"/>
     </w:lvlOverride>
-  </w:num>
-  <w:num w:numId="1130">
-    <w:abstractNumId w:val="991"/>
   </w:num>
   <w:num w:numId="1131">
     <w:abstractNumId w:val="991"/>
   </w:num>
   <w:num w:numId="1132">
+    <w:abstractNumId w:val="991"/>
+  </w:num>
+  <w:num w:numId="1133">
     <w:abstractNumId w:val="99411"/>
     <w:lvlOverride w:ilvl="0">
       <w:startOverride w:val="1"/>
@@ -17887,7 +18130,7 @@
       <w:startOverride w:val="1"/>
     </w:lvlOverride>
   </w:num>
-  <w:num w:numId="1133">
+  <w:num w:numId="1134">
     <w:abstractNumId w:val="99414"/>
     <w:lvlOverride w:ilvl="0">
       <w:startOverride w:val="4"/>
@@ -17917,10 +18160,10 @@
       <w:startOverride w:val="4"/>
     </w:lvlOverride>
   </w:num>
-  <w:num w:numId="1134">
+  <w:num w:numId="1135">
     <w:abstractNumId w:val="991"/>
   </w:num>
-  <w:num w:numId="1135">
+  <w:num w:numId="1136">
     <w:abstractNumId w:val="99419"/>
     <w:lvlOverride w:ilvl="0">
       <w:startOverride w:val="9"/>
@@ -17949,9 +18192,6 @@
     <w:lvlOverride w:ilvl="8">
       <w:startOverride w:val="9"/>
     </w:lvlOverride>
-  </w:num>
-  <w:num w:numId="1136">
-    <w:abstractNumId w:val="991"/>
   </w:num>
   <w:num w:numId="1137">
     <w:abstractNumId w:val="991"/>
@@ -17966,6 +18206,9 @@
     <w:abstractNumId w:val="991"/>
   </w:num>
   <w:num w:numId="1141">
+    <w:abstractNumId w:val="991"/>
+  </w:num>
+  <w:num w:numId="1142">
     <w:abstractNumId w:val="99411"/>
     <w:lvlOverride w:ilvl="0">
       <w:startOverride w:val="1"/>
@@ -17995,10 +18238,10 @@
       <w:startOverride w:val="1"/>
     </w:lvlOverride>
   </w:num>
-  <w:num w:numId="1142">
+  <w:num w:numId="1143">
     <w:abstractNumId w:val="991"/>
   </w:num>
-  <w:num w:numId="1143">
+  <w:num w:numId="1144">
     <w:abstractNumId w:val="991"/>
   </w:num>
 </w:numbering>

</xml_diff>

<commit_message>
op 112: round 3 complete (#334 opened; #610/#333/#330 Sol APPROVE; OR-112-23); v6 refreshed 16:01
</commit_message>
<xml_diff>
--- a/handoffs/op-6870f2ca/TGP-Operator-Prompt-v6-Agent-113.docx
+++ b/handoffs/op-6870f2ca/TGP-Operator-Prompt-v6-Agent-113.docx
@@ -2,7 +2,7 @@
 <file path=word/document.xml><?xml version="1.0" encoding="utf-8"?>
 <w:document xmlns:w="http://schemas.openxmlformats.org/wordprocessingml/2006/main" xmlns:m="http://schemas.openxmlformats.org/officeDocument/2006/math" xmlns:r="http://schemas.openxmlformats.org/officeDocument/2006/relationships" xmlns:o="urn:schemas-microsoft-com:office:office" xmlns:v="urn:schemas-microsoft-com:vml" xmlns:w10="urn:schemas-microsoft-com:office:word" xmlns:a="http://schemas.openxmlformats.org/drawingml/2006/main" xmlns:pic="http://schemas.openxmlformats.org/drawingml/2006/picture" xmlns:wp="http://schemas.openxmlformats.org/drawingml/2006/wordprocessingDrawing">
   <w:body>
-    <w:bookmarkStart w:id="64" w:name="Xc52d7d2b3b12d18d55f2fb0d6b0776b1d13b02c"/>
+    <w:bookmarkStart w:id="65" w:name="Xc52d7d2b3b12d18d55f2fb0d6b0776b1d13b02c"/>
     <w:p>
       <w:pPr>
         <w:pStyle w:val="Heading1"/>
@@ -25,7 +25,7 @@
         <w:t xml:space="preserve">“lets prepare for your OUT OF CREDIT reitre … prep for [the next agent] (a fresh, no prior context agent) who will need you to cleanly stop, no wasted work, and a great pickup-prompt from you - just like you used the agent 111 prompt document, but perferably yours would be even better!”</w:t>
       </w:r>
       <w:r>
-        <w:t xml:space="preserve">). Snapshot: 2026-10-02 15:29 PDT (real clock). The newest copy lives in tgp-agent-context at handoffs/op-6870f2ca/TGP-Operator-Prompt-v6-Agent-113.md (and .docx). Paste this whole document as the first message to the next operator and attach the owner documents listed in section 3.4. It replaces prompt v5 (handoffs/op-f083060f/TGP-Operator-Prompt-v5-Agent-111.md, kept for history). Most of v5 is carried over word for word. Changed or new: the START HERE card (new), 0.A (new), 2 (10-02 update), 3 (rewritten: new ops kit), 4.14 (new), 5 (rewritten), 6.0 (112’s lessons, new), 7, 12, 13, 14 and 16.</w:t>
+        <w:t xml:space="preserve">). Snapshot: 2026-10-02 16:01 PDT (real clock). The newest copy lives in tgp-agent-context at handoffs/op-6870f2ca/TGP-Operator-Prompt-v6-Agent-113.md (and .docx). Paste this whole document as the first message to the next operator and attach the owner documents listed in section 3.4. It replaces prompt v5 (handoffs/op-f083060f/TGP-Operator-Prompt-v5-Agent-111.md, kept for history). Most of v5 is carried over word for word. Changed or new: the START HERE card (new), 0.A (new), 2 (10-02 update), 3 (rewritten: new ops kit), 4.14 (new), 5 (rewritten), 6.0 (112’s lessons, new), 7, 12, 13, 14 and 16.</w:t>
       </w:r>
     </w:p>
     <w:p>
@@ -2658,7 +2658,7 @@
         </w:numPr>
       </w:pPr>
       <w:r>
-        <w:t xml:space="preserve">Agent 112 (11:20-15:29) merged mobile #310 (consultation onboarding), backend #607 (consultation intake; deployed 13:01-13:08 with migration 20270212000000) and mobile #324 (one support email). It also ran 17 parallel lanes that produced about 35 audit verdicts and 15 fix rounds or new PRs.</w:t>
+        <w:t xml:space="preserve">Agent 112 (11:20-16:01) merged mobile #310 (consultation onboarding), backend #607 (consultation intake; deployed 13:01-13:08 with migration 20270212000000) and mobile #324 (one support email). It also ran 17 parallel lanes that produced about 35 audit verdicts and 15 fix rounds or new PRs.</w:t>
       </w:r>
     </w:p>
     <w:p>
@@ -8783,9 +8783,45 @@
         <w:t xml:space="preserve">OR-112-22: the Day 1 package-sheet payment failure is a launch blocker and the first fix to assign. The sheet switches to the payment-intent endpoint, passes the customer id, and shows specific error copy, with a failing-before test against the real backend contract. #646’s Cs (owner admin purchase routes still return raw secrets; cached secrets never cleared after a payment completes) and C-627-8 (a stale repay amount in the failed-transfer log) are one small follow-up PR before launch. Mobile #321 waits for #627 (B-627-8 fix, then a Sol delta).</w:t>
       </w:r>
     </w:p>
+    <w:p>
+      <w:pPr>
+        <w:pStyle w:val="Compact"/>
+        <w:numPr>
+          <w:ilvl w:val="0"/>
+          <w:numId w:val="1094"/>
+        </w:numPr>
+      </w:pPr>
+      <w:r>
+        <w:t xml:space="preserve">OR-112-23: a renewing (monthly or yearly) plan must never be sold as a one-time payment with open-ended access, because that loses TGP and the coach recurring revenue. Two parts:</w:t>
+      </w:r>
+    </w:p>
+    <w:p>
+      <w:pPr>
+        <w:pStyle w:val="Compact"/>
+        <w:numPr>
+          <w:ilvl w:val="1"/>
+          <w:numId w:val="1102"/>
+        </w:numPr>
+      </w:pPr>
+      <w:r>
+        <w:t xml:space="preserve">Backend, before launch: POST /v1/checkout/payment-intent rejects renewing packages with a coded error.</w:t>
+      </w:r>
+    </w:p>
+    <w:p>
+      <w:pPr>
+        <w:pStyle w:val="Compact"/>
+        <w:numPr>
+          <w:ilvl w:val="1"/>
+          <w:numId w:val="1102"/>
+        </w:numPr>
+      </w:pPr>
+      <w:r>
+        <w:t xml:space="preserve">Mobile: the Day 1 package sheet routes renewing plans to the app’s subscription checkout path. If no such path exists, building it is launch scope, because Bradley wants more functionality, not less. #334’s refusal to sell renewing plans is the safe interim.</w:t>
+      </w:r>
+    </w:p>
     <w:bookmarkEnd w:id="37"/>
     <w:bookmarkEnd w:id="38"/>
-    <w:bookmarkStart w:id="47" w:name="X4fd48c18ea9d1ad3abc1bcdad38451e4c82ba6e"/>
+    <w:bookmarkStart w:id="48" w:name="X4fd48c18ea9d1ad3abc1bcdad38451e4c82ba6e"/>
     <w:p>
       <w:pPr>
         <w:pStyle w:val="Heading2"/>
@@ -8820,13 +8856,13 @@
         <w:t xml:space="preserve">. If this prompt and the train log disagree, the train log wins, and GitHub beats both.</w:t>
       </w:r>
     </w:p>
-    <w:bookmarkStart w:id="46" w:name="Xc61f88321dd4833b3b188f88fbfb403781daea2"/>
+    <w:bookmarkStart w:id="47" w:name="X9f00f1bf385b3e0cec3dcee84a73d8f7a17079c"/>
     <w:p>
       <w:pPr>
         <w:pStyle w:val="Heading3"/>
       </w:pPr>
       <w:r>
-        <w:t xml:space="preserve">AGENT 112 STATE FOR AGENT 113: snapshot 2026-10-02 15:29 PDT (real clock)</w:t>
+        <w:t xml:space="preserve">AGENT 112 STATE FOR AGENT 113: snapshot 2026-10-02 16:01 PDT (real clock)</w:t>
       </w:r>
     </w:p>
     <w:bookmarkStart w:id="39" w:name="production-and-mains"/>
@@ -8843,7 +8879,7 @@
         <w:pStyle w:val="Compact"/>
         <w:numPr>
           <w:ilvl w:val="0"/>
-          <w:numId w:val="1102"/>
+          <w:numId w:val="1103"/>
         </w:numPr>
       </w:pPr>
       <w:r>
@@ -8855,136 +8891,136 @@
         <w:pStyle w:val="Compact"/>
         <w:numPr>
           <w:ilvl w:val="1"/>
+          <w:numId w:val="1104"/>
+        </w:numPr>
+      </w:pPr>
+      <w:r>
+        <w:t xml:space="preserve">fly-deploy run 37057884825, migrations=apply-migrations; production environment approved by 112 under the standing approval.</w:t>
+      </w:r>
+    </w:p>
+    <w:p>
+      <w:pPr>
+        <w:pStyle w:val="Compact"/>
+        <w:numPr>
+          <w:ilvl w:val="1"/>
+          <w:numId w:val="1104"/>
+        </w:numPr>
+      </w:pPr>
+      <w:r>
+        <w:t xml:space="preserve">Migration 20270212000000_clinic_onboarding_intake finished at 20:05:07Z, not rolled back.</w:t>
+      </w:r>
+    </w:p>
+    <w:p>
+      <w:pPr>
+        <w:pStyle w:val="Compact"/>
+        <w:numPr>
+          <w:ilvl w:val="1"/>
+          <w:numId w:val="1104"/>
+        </w:numPr>
+      </w:pPr>
+      <w:r>
+        <w:t xml:space="preserve">Postgres ERROR/FATAL: 0. /health 200, /readyz db up. PUT /api/me/onboarding/consultation is live (401 unauthenticated).</w:t>
+      </w:r>
+    </w:p>
+    <w:p>
+      <w:pPr>
+        <w:pStyle w:val="Compact"/>
+        <w:numPr>
+          <w:ilvl w:val="1"/>
+          <w:numId w:val="1104"/>
+        </w:numPr>
+      </w:pPr>
+      <w:r>
+        <w:t xml:space="preserve">fly-env-sync plan run 37058420196:</w:t>
+      </w:r>
+      <w:r>
+        <w:t xml:space="preserve"> </w:t>
+      </w:r>
+      <w:r>
+        <w:t xml:space="preserve">“0 to set, 0 to unset … 53 unchanged. Fly already matches the manifest”</w:t>
+      </w:r>
+      <w:r>
+        <w:t xml:space="preserve">.</w:t>
+      </w:r>
+    </w:p>
+    <w:p>
+      <w:pPr>
+        <w:pStyle w:val="Compact"/>
+        <w:numPr>
+          <w:ilvl w:val="0"/>
           <w:numId w:val="1103"/>
         </w:numPr>
       </w:pPr>
       <w:r>
-        <w:t xml:space="preserve">fly-deploy run 37057884825, migrations=apply-migrations; production environment approved by 112 under the standing approval.</w:t>
-      </w:r>
-    </w:p>
-    <w:p>
-      <w:pPr>
-        <w:pStyle w:val="Compact"/>
-        <w:numPr>
-          <w:ilvl w:val="1"/>
+        <w:t xml:space="preserve">Previous production deploy: 3bd6215b (111, 11:01), which carries the consent ledger with FEATURE_AI_CONSENT_LEDGER_ENABLED=true live.</w:t>
+      </w:r>
+    </w:p>
+    <w:p>
+      <w:pPr>
+        <w:pStyle w:val="Compact"/>
+        <w:numPr>
+          <w:ilvl w:val="0"/>
           <w:numId w:val="1103"/>
         </w:numPr>
       </w:pPr>
       <w:r>
-        <w:t xml:space="preserve">Migration 20270212000000_clinic_onboarding_intake finished at 20:05:07Z, not rolled back.</w:t>
-      </w:r>
-    </w:p>
-    <w:p>
-      <w:pPr>
-        <w:pStyle w:val="Compact"/>
-        <w:numPr>
-          <w:ilvl w:val="1"/>
+        <w:t xml:space="preserve">Live signup-policy: providers email + apple; google_signin_enabled false (OR-112-1); role_choice true; no code required.</w:t>
+      </w:r>
+    </w:p>
+    <w:p>
+      <w:pPr>
+        <w:pStyle w:val="Compact"/>
+        <w:numPr>
+          <w:ilvl w:val="0"/>
           <w:numId w:val="1103"/>
         </w:numPr>
       </w:pPr>
       <w:r>
-        <w:t xml:space="preserve">Postgres ERROR/FATAL: 0. /health 200, /readyz db up. PUT /api/me/onboarding/consultation is live (401 unauthenticated).</w:t>
-      </w:r>
-    </w:p>
-    <w:p>
-      <w:pPr>
-        <w:pStyle w:val="Compact"/>
-        <w:numPr>
-          <w:ilvl w:val="1"/>
+        <w:t xml:space="preserve">Backend main: 9cfd70d6 (#644, #649, #635 and #646 on top of f04289f9). DEPLOYED 15:19-15:25 PDT (fly-deploy run 37071843710, migrations=apply-migrations, production environment approved by 112 under the standing approval). Migration 20270224000000 finished at 22:23:19Z; Build Week Day 1 focus is now</w:t>
+      </w:r>
+      <w:r>
+        <w:t xml:space="preserve"> </w:t>
+      </w:r>
+      <w:r>
+        <w:t xml:space="preserve">“Consultation + Baseline”</w:t>
+      </w:r>
+      <w:r>
+        <w:t xml:space="preserve">. 0 unfinished migrations, Postgres ERROR/FATAL 0 (22:15-22:26Z), /health 200, /readyz db up, /diagnostic/questions 404, /api/v1/checkout/purchases 401. fly-env-sync plan not re-run: none of the four PRs changed the manifest. Mobile main: f34b5b99 (#324, 13:36), on top of 2c17c241 (#310 consultation onboarding, 12:11).</w:t>
+      </w:r>
+    </w:p>
+    <w:p>
+      <w:pPr>
+        <w:pStyle w:val="Compact"/>
+        <w:numPr>
+          <w:ilvl w:val="1"/>
+          <w:numId w:val="1105"/>
+        </w:numPr>
+      </w:pPr>
+      <w:r>
+        <w:t xml:space="preserve">Required checks: backend 10, mobile 3. Both strict and admin-enforced, 0 reviews.</w:t>
+      </w:r>
+    </w:p>
+    <w:p>
+      <w:pPr>
+        <w:pStyle w:val="Compact"/>
+        <w:numPr>
+          <w:ilvl w:val="1"/>
+          <w:numId w:val="1105"/>
+        </w:numPr>
+      </w:pPr>
+      <w:r>
+        <w:t xml:space="preserve">Linear history and conversation resolution are both OFF (unchanged from 10-01).</w:t>
+      </w:r>
+    </w:p>
+    <w:p>
+      <w:pPr>
+        <w:pStyle w:val="Compact"/>
+        <w:numPr>
+          <w:ilvl w:val="0"/>
           <w:numId w:val="1103"/>
         </w:numPr>
       </w:pPr>
       <w:r>
-        <w:t xml:space="preserve">fly-env-sync plan run 37058420196:</w:t>
-      </w:r>
-      <w:r>
-        <w:t xml:space="preserve"> </w:t>
-      </w:r>
-      <w:r>
-        <w:t xml:space="preserve">“0 to set, 0 to unset … 53 unchanged. Fly already matches the manifest”</w:t>
-      </w:r>
-      <w:r>
-        <w:t xml:space="preserve">.</w:t>
-      </w:r>
-    </w:p>
-    <w:p>
-      <w:pPr>
-        <w:pStyle w:val="Compact"/>
-        <w:numPr>
-          <w:ilvl w:val="0"/>
-          <w:numId w:val="1102"/>
-        </w:numPr>
-      </w:pPr>
-      <w:r>
-        <w:t xml:space="preserve">Previous production deploy: 3bd6215b (111, 11:01), which carries the consent ledger with FEATURE_AI_CONSENT_LEDGER_ENABLED=true live.</w:t>
-      </w:r>
-    </w:p>
-    <w:p>
-      <w:pPr>
-        <w:pStyle w:val="Compact"/>
-        <w:numPr>
-          <w:ilvl w:val="0"/>
-          <w:numId w:val="1102"/>
-        </w:numPr>
-      </w:pPr>
-      <w:r>
-        <w:t xml:space="preserve">Live signup-policy: providers email + apple; google_signin_enabled false (OR-112-1); role_choice true; no code required.</w:t>
-      </w:r>
-    </w:p>
-    <w:p>
-      <w:pPr>
-        <w:pStyle w:val="Compact"/>
-        <w:numPr>
-          <w:ilvl w:val="0"/>
-          <w:numId w:val="1102"/>
-        </w:numPr>
-      </w:pPr>
-      <w:r>
-        <w:t xml:space="preserve">Backend main: 9cfd70d6 (#644, #649, #635 and #646 on top of f04289f9). DEPLOYED 15:19-15:25 PDT (fly-deploy run 37071843710, migrations=apply-migrations, production environment approved by 112 under the standing approval). Migration 20270224000000 finished at 22:23:19Z; Build Week Day 1 focus is now</w:t>
-      </w:r>
-      <w:r>
-        <w:t xml:space="preserve"> </w:t>
-      </w:r>
-      <w:r>
-        <w:t xml:space="preserve">“Consultation + Baseline”</w:t>
-      </w:r>
-      <w:r>
-        <w:t xml:space="preserve">. 0 unfinished migrations, Postgres ERROR/FATAL 0 (22:15-22:26Z), /health 200, /readyz db up, /diagnostic/questions 404, /api/v1/checkout/purchases 401. fly-env-sync plan not re-run: none of the four PRs changed the manifest. Mobile main: f34b5b99 (#324, 13:36), on top of 2c17c241 (#310 consultation onboarding, 12:11).</w:t>
-      </w:r>
-    </w:p>
-    <w:p>
-      <w:pPr>
-        <w:pStyle w:val="Compact"/>
-        <w:numPr>
-          <w:ilvl w:val="1"/>
-          <w:numId w:val="1104"/>
-        </w:numPr>
-      </w:pPr>
-      <w:r>
-        <w:t xml:space="preserve">Required checks: backend 10, mobile 3. Both strict and admin-enforced, 0 reviews.</w:t>
-      </w:r>
-    </w:p>
-    <w:p>
-      <w:pPr>
-        <w:pStyle w:val="Compact"/>
-        <w:numPr>
-          <w:ilvl w:val="1"/>
-          <w:numId w:val="1104"/>
-        </w:numPr>
-      </w:pPr>
-      <w:r>
-        <w:t xml:space="preserve">Linear history and conversation resolution are both OFF (unchanged from 10-01).</w:t>
-      </w:r>
-    </w:p>
-    <w:p>
-      <w:pPr>
-        <w:pStyle w:val="Compact"/>
-        <w:numPr>
-          <w:ilvl w:val="0"/>
-          <w:numId w:val="1102"/>
-        </w:numPr>
-      </w:pPr>
-      <w:r>
         <w:t xml:space="preserve">RELEASE GATE (OR-112-14) LIFTED at 15:25: #635 is deployed. Mobile builds may include #310 again. Batch the next build after the native-dependency PRs merge (Expo Free).</w:t>
       </w:r>
     </w:p>
@@ -8993,7 +9029,7 @@
         <w:pStyle w:val="Compact"/>
         <w:numPr>
           <w:ilvl w:val="0"/>
-          <w:numId w:val="1102"/>
+          <w:numId w:val="1103"/>
         </w:numPr>
       </w:pPr>
       <w:r>
@@ -9005,7 +9041,7 @@
         <w:pStyle w:val="Compact"/>
         <w:numPr>
           <w:ilvl w:val="0"/>
-          <w:numId w:val="1102"/>
+          <w:numId w:val="1103"/>
         </w:numPr>
       </w:pPr>
       <w:r>
@@ -9039,7 +9075,7 @@
         <w:pStyle w:val="Compact"/>
         <w:numPr>
           <w:ilvl w:val="0"/>
-          <w:numId w:val="1105"/>
+          <w:numId w:val="1106"/>
         </w:numPr>
       </w:pPr>
       <w:r>
@@ -9051,7 +9087,7 @@
         <w:pStyle w:val="Compact"/>
         <w:numPr>
           <w:ilvl w:val="0"/>
-          <w:numId w:val="1105"/>
+          <w:numId w:val="1106"/>
         </w:numPr>
       </w:pPr>
       <w:r>
@@ -9063,7 +9099,7 @@
         <w:pStyle w:val="Compact"/>
         <w:numPr>
           <w:ilvl w:val="0"/>
-          <w:numId w:val="1105"/>
+          <w:numId w:val="1106"/>
         </w:numPr>
       </w:pPr>
       <w:r>
@@ -9075,7 +9111,7 @@
         <w:pStyle w:val="Compact"/>
         <w:numPr>
           <w:ilvl w:val="0"/>
-          <w:numId w:val="1105"/>
+          <w:numId w:val="1106"/>
         </w:numPr>
       </w:pPr>
       <w:r>
@@ -9087,7 +9123,7 @@
         <w:pStyle w:val="Compact"/>
         <w:numPr>
           <w:ilvl w:val="0"/>
-          <w:numId w:val="1105"/>
+          <w:numId w:val="1106"/>
         </w:numPr>
       </w:pPr>
       <w:r>
@@ -9109,7 +9145,7 @@
         <w:pStyle w:val="Compact"/>
         <w:numPr>
           <w:ilvl w:val="0"/>
-          <w:numId w:val="1106"/>
+          <w:numId w:val="1107"/>
         </w:numPr>
       </w:pPr>
       <w:r>
@@ -9131,7 +9167,7 @@
         <w:pStyle w:val="Compact"/>
         <w:numPr>
           <w:ilvl w:val="0"/>
-          <w:numId w:val="1106"/>
+          <w:numId w:val="1107"/>
         </w:numPr>
       </w:pPr>
       <w:r>
@@ -9186,7 +9222,7 @@
         <w:pStyle w:val="Compact"/>
         <w:numPr>
           <w:ilvl w:val="0"/>
-          <w:numId w:val="1106"/>
+          <w:numId w:val="1107"/>
         </w:numPr>
       </w:pPr>
       <w:r>
@@ -9247,7 +9283,7 @@
         <w:pStyle w:val="Compact"/>
         <w:numPr>
           <w:ilvl w:val="0"/>
-          <w:numId w:val="1106"/>
+          <w:numId w:val="1107"/>
         </w:numPr>
       </w:pPr>
       <w:r>
@@ -9269,7 +9305,7 @@
         <w:pStyle w:val="Compact"/>
         <w:numPr>
           <w:ilvl w:val="0"/>
-          <w:numId w:val="1106"/>
+          <w:numId w:val="1107"/>
         </w:numPr>
       </w:pPr>
       <w:r>
@@ -9321,7 +9357,7 @@
         <w:pStyle w:val="Compact"/>
         <w:numPr>
           <w:ilvl w:val="0"/>
-          <w:numId w:val="1106"/>
+          <w:numId w:val="1107"/>
         </w:numPr>
       </w:pPr>
       <w:r>
@@ -9367,7 +9403,7 @@
         <w:pStyle w:val="Compact"/>
         <w:numPr>
           <w:ilvl w:val="0"/>
-          <w:numId w:val="1106"/>
+          <w:numId w:val="1107"/>
         </w:numPr>
       </w:pPr>
       <w:r>
@@ -9413,7 +9449,7 @@
         <w:pStyle w:val="Compact"/>
         <w:numPr>
           <w:ilvl w:val="0"/>
-          <w:numId w:val="1106"/>
+          <w:numId w:val="1107"/>
         </w:numPr>
       </w:pPr>
       <w:r>
@@ -9435,7 +9471,7 @@
         <w:pStyle w:val="Compact"/>
         <w:numPr>
           <w:ilvl w:val="0"/>
-          <w:numId w:val="1106"/>
+          <w:numId w:val="1107"/>
         </w:numPr>
       </w:pPr>
       <w:r>
@@ -9469,7 +9505,7 @@
         <w:pStyle w:val="Compact"/>
         <w:numPr>
           <w:ilvl w:val="0"/>
-          <w:numId w:val="1106"/>
+          <w:numId w:val="1107"/>
         </w:numPr>
       </w:pPr>
       <w:r>
@@ -9503,7 +9539,7 @@
         <w:pStyle w:val="Compact"/>
         <w:numPr>
           <w:ilvl w:val="0"/>
-          <w:numId w:val="1106"/>
+          <w:numId w:val="1107"/>
         </w:numPr>
       </w:pPr>
       <w:r>
@@ -9546,7 +9582,7 @@
         <w:pStyle w:val="Compact"/>
         <w:numPr>
           <w:ilvl w:val="0"/>
-          <w:numId w:val="1106"/>
+          <w:numId w:val="1107"/>
         </w:numPr>
       </w:pPr>
       <w:r>
@@ -9580,7 +9616,7 @@
         <w:pStyle w:val="Compact"/>
         <w:numPr>
           <w:ilvl w:val="0"/>
-          <w:numId w:val="1106"/>
+          <w:numId w:val="1107"/>
         </w:numPr>
       </w:pPr>
       <w:r>
@@ -9602,7 +9638,7 @@
         <w:pStyle w:val="Compact"/>
         <w:numPr>
           <w:ilvl w:val="0"/>
-          <w:numId w:val="1106"/>
+          <w:numId w:val="1107"/>
         </w:numPr>
       </w:pPr>
       <w:r>
@@ -9648,7 +9684,7 @@
         <w:pStyle w:val="Compact"/>
         <w:numPr>
           <w:ilvl w:val="0"/>
-          <w:numId w:val="1106"/>
+          <w:numId w:val="1107"/>
         </w:numPr>
       </w:pPr>
       <w:r>
@@ -9682,7 +9718,7 @@
         <w:pStyle w:val="Compact"/>
         <w:numPr>
           <w:ilvl w:val="0"/>
-          <w:numId w:val="1106"/>
+          <w:numId w:val="1107"/>
         </w:numPr>
       </w:pPr>
       <w:r>
@@ -9704,7 +9740,7 @@
         <w:pStyle w:val="Compact"/>
         <w:numPr>
           <w:ilvl w:val="0"/>
-          <w:numId w:val="1106"/>
+          <w:numId w:val="1107"/>
         </w:numPr>
       </w:pPr>
       <w:r>
@@ -9726,7 +9762,7 @@
         <w:pStyle w:val="Compact"/>
         <w:numPr>
           <w:ilvl w:val="0"/>
-          <w:numId w:val="1106"/>
+          <w:numId w:val="1107"/>
         </w:numPr>
       </w:pPr>
       <w:r>
@@ -9748,7 +9784,7 @@
         <w:pStyle w:val="Compact"/>
         <w:numPr>
           <w:ilvl w:val="0"/>
-          <w:numId w:val="1106"/>
+          <w:numId w:val="1107"/>
         </w:numPr>
       </w:pPr>
       <w:r>
@@ -9770,7 +9806,7 @@
         <w:pStyle w:val="Compact"/>
         <w:numPr>
           <w:ilvl w:val="0"/>
-          <w:numId w:val="1106"/>
+          <w:numId w:val="1107"/>
         </w:numPr>
       </w:pPr>
       <w:r>
@@ -9792,7 +9828,7 @@
         <w:pStyle w:val="Compact"/>
         <w:numPr>
           <w:ilvl w:val="0"/>
-          <w:numId w:val="1106"/>
+          <w:numId w:val="1107"/>
         </w:numPr>
       </w:pPr>
       <w:r>
@@ -9832,7 +9868,7 @@
         <w:pStyle w:val="Compact"/>
         <w:numPr>
           <w:ilvl w:val="0"/>
-          <w:numId w:val="1106"/>
+          <w:numId w:val="1107"/>
         </w:numPr>
       </w:pPr>
       <w:r>
@@ -9911,7 +9947,7 @@
         <w:pStyle w:val="Compact"/>
         <w:numPr>
           <w:ilvl w:val="0"/>
-          <w:numId w:val="1106"/>
+          <w:numId w:val="1107"/>
         </w:numPr>
       </w:pPr>
       <w:r>
@@ -9933,7 +9969,7 @@
         <w:pStyle w:val="Compact"/>
         <w:numPr>
           <w:ilvl w:val="0"/>
-          <w:numId w:val="1106"/>
+          <w:numId w:val="1107"/>
         </w:numPr>
       </w:pPr>
       <w:r>
@@ -9955,7 +9991,7 @@
         <w:pStyle w:val="Compact"/>
         <w:numPr>
           <w:ilvl w:val="0"/>
-          <w:numId w:val="1106"/>
+          <w:numId w:val="1107"/>
         </w:numPr>
       </w:pPr>
       <w:r>
@@ -9972,6 +10008,98 @@
         <w:t xml:space="preserve">— Model: Claude Opus 5.5; Scope: #610 Sol Bs; Final state at 112’s stop: DONE: #610 -&gt; 9f2c3865 (B-610-13 moderation action + notice in one transaction; B-610-8 erasure certified only on a definite not-found; C-610-9; 23 fail before; 20/20 green incl. community-live-tests; #314 contract unchanged). Deferred to B-UGC-5: C-610-10 (author-delete half), C-610-11, C-610-12; Report: B-UGC-6-112.md</w:t>
       </w:r>
     </w:p>
+    <w:p>
+      <w:pPr>
+        <w:pStyle w:val="Compact"/>
+        <w:numPr>
+          <w:ilvl w:val="0"/>
+          <w:numId w:val="1107"/>
+        </w:numPr>
+      </w:pPr>
+      <w:r>
+        <w:rPr>
+          <w:b/>
+          <w:bCs/>
+        </w:rPr>
+        <w:t xml:space="preserve">AUD-SOL-7 (round 3)</w:t>
+      </w:r>
+      <w:r>
+        <w:t xml:space="preserve"> </w:t>
+      </w:r>
+      <w:r>
+        <w:t xml:space="preserve">— Model: GPT-6.1 Sol; Scope: lens; Final state at 112’s stop: DONE: APPROVE #610</w:t>
+      </w:r>
+      <w:r>
+        <w:t xml:space="preserve"> </w:t>
+      </w:r>
+      <w:r>
+        <w:t xml:space="preserve">@9f2c3865</w:t>
+      </w:r>
+      <w:r>
+        <w:t xml:space="preserve"> </w:t>
+      </w:r>
+      <w:r>
+        <w:t xml:space="preserve">(0/0/3), #333</w:t>
+      </w:r>
+      <w:r>
+        <w:t xml:space="preserve"> </w:t>
+      </w:r>
+      <w:r>
+        <w:t xml:space="preserve">@806467b9</w:t>
+      </w:r>
+      <w:r>
+        <w:t xml:space="preserve"> </w:t>
+      </w:r>
+      <w:r>
+        <w:t xml:space="preserve">(0/0/0), #330</w:t>
+      </w:r>
+      <w:r>
+        <w:t xml:space="preserve"> </w:t>
+      </w:r>
+      <w:r>
+        <w:t xml:space="preserve">@7d640548</w:t>
+      </w:r>
+      <w:r>
+        <w:t xml:space="preserve"> </w:t>
+      </w:r>
+      <w:r>
+        <w:t xml:space="preserve">(0/0/1); Report: AUD-SOL-7-112.md</w:t>
+      </w:r>
+    </w:p>
+    <w:p>
+      <w:pPr>
+        <w:pStyle w:val="Compact"/>
+        <w:numPr>
+          <w:ilvl w:val="0"/>
+          <w:numId w:val="1107"/>
+        </w:numPr>
+      </w:pPr>
+      <w:r>
+        <w:rPr>
+          <w:b/>
+          <w:bCs/>
+        </w:rPr>
+        <w:t xml:space="preserve">B-PAYSHEET (round 3)</w:t>
+      </w:r>
+      <w:r>
+        <w:t xml:space="preserve"> </w:t>
+      </w:r>
+      <w:r>
+        <w:t xml:space="preserve">— Model: Claude Opus 5.5; Scope: NEW mobile #334; Final state at 112’s stop: DONE: #334</w:t>
+      </w:r>
+      <w:r>
+        <w:t xml:space="preserve"> </w:t>
+      </w:r>
+      <w:r>
+        <w:t xml:space="preserve">@5b6eb654</w:t>
+      </w:r>
+      <w:r>
+        <w:t xml:space="preserve"> </w:t>
+      </w:r>
+      <w:r>
+        <w:t xml:space="preserve">(Day 1 package sheet pays via payment-intent with customer id + ephemeral key; one idempotency key per attempt; per-cause copy; free plans via claim-free; amount_cents fix; 22/22 fail on main). 3/3 green, T4, needs dual audit; Report: B-PAYSHEET-112.md</w:t>
+      </w:r>
+    </w:p>
     <w:bookmarkEnd w:id="41"/>
     <w:bookmarkStart w:id="42" w:name="X810ce142402ae3b56d7967758e6e0c8aba09eff"/>
     <w:p>
@@ -9996,7 +10124,7 @@
         <w:pStyle w:val="Compact"/>
         <w:numPr>
           <w:ilvl w:val="0"/>
-          <w:numId w:val="1107"/>
+          <w:numId w:val="1108"/>
         </w:numPr>
       </w:pPr>
       <w:r>
@@ -10008,7 +10136,7 @@
         <w:pStyle w:val="Compact"/>
         <w:numPr>
           <w:ilvl w:val="0"/>
-          <w:numId w:val="1107"/>
+          <w:numId w:val="1108"/>
         </w:numPr>
       </w:pPr>
       <w:r>
@@ -10020,7 +10148,7 @@
         <w:pStyle w:val="Compact"/>
         <w:numPr>
           <w:ilvl w:val="0"/>
-          <w:numId w:val="1107"/>
+          <w:numId w:val="1108"/>
         </w:numPr>
       </w:pPr>
       <w:r>
@@ -10051,7 +10179,7 @@
         <w:pStyle w:val="Compact"/>
         <w:numPr>
           <w:ilvl w:val="0"/>
-          <w:numId w:val="1108"/>
+          <w:numId w:val="1109"/>
         </w:numPr>
       </w:pPr>
       <w:r>
@@ -10063,82 +10191,82 @@
         <w:pStyle w:val="Compact"/>
         <w:numPr>
           <w:ilvl w:val="1"/>
+          <w:numId w:val="1110"/>
+        </w:numPr>
+      </w:pPr>
+      <w:r>
+        <w:t xml:space="preserve">#635 APPROVE from both at d68c4f68: MERGED 14:58.</w:t>
+      </w:r>
+    </w:p>
+    <w:p>
+      <w:pPr>
+        <w:pStyle w:val="Compact"/>
+        <w:numPr>
+          <w:ilvl w:val="1"/>
+          <w:numId w:val="1110"/>
+        </w:numPr>
+      </w:pPr>
+      <w:r>
+        <w:t xml:space="preserve">#646 APPROVE from both, plus merge-deltas at 58c2d64a: MERGED 15:11.</w:t>
+      </w:r>
+    </w:p>
+    <w:p>
+      <w:pPr>
+        <w:pStyle w:val="Compact"/>
+        <w:numPr>
+          <w:ilvl w:val="1"/>
+          <w:numId w:val="1110"/>
+        </w:numPr>
+      </w:pPr>
+      <w:r>
+        <w:t xml:space="preserve">mobile #321: APPROVE from both at 4f5b058d. HELD as a pair with #627.</w:t>
+      </w:r>
+    </w:p>
+    <w:p>
+      <w:pPr>
+        <w:pStyle w:val="Compact"/>
+        <w:numPr>
+          <w:ilvl w:val="1"/>
+          <w:numId w:val="1110"/>
+        </w:numPr>
+      </w:pPr>
+      <w:r>
+        <w:t xml:space="preserve">#627: Opus APPROVE, Sol REQUEST CHANGES 0/1/2 at c1d69c7f. NEW B-627-8: a duplicate won-dispute reinstatement payment after a lost response or receipt plus request-key expiry. The probes are in probes/AUD-SOL-6-112/.</w:t>
+      </w:r>
+    </w:p>
+    <w:p>
+      <w:pPr>
+        <w:pStyle w:val="Compact"/>
+        <w:numPr>
+          <w:ilvl w:val="0"/>
           <w:numId w:val="1109"/>
         </w:numPr>
       </w:pPr>
       <w:r>
-        <w:t xml:space="preserve">#635 APPROVE from both at d68c4f68: MERGED 14:58.</w:t>
-      </w:r>
-    </w:p>
-    <w:p>
-      <w:pPr>
-        <w:pStyle w:val="Compact"/>
-        <w:numPr>
-          <w:ilvl w:val="1"/>
+        <w:t xml:space="preserve">S-RELEASE-2: #333 → 806467b9 (now T4) and #330 → 7d640548. All of Sol’s B findings are closed with failing-before tests, and CI is green. Both need re-audits.</w:t>
+      </w:r>
+    </w:p>
+    <w:p>
+      <w:pPr>
+        <w:pStyle w:val="Compact"/>
+        <w:numPr>
+          <w:ilvl w:val="0"/>
           <w:numId w:val="1109"/>
         </w:numPr>
       </w:pPr>
       <w:r>
-        <w:t xml:space="preserve">#646 APPROVE from both, plus merge-deltas at 58c2d64a: MERGED 15:11.</w:t>
-      </w:r>
-    </w:p>
-    <w:p>
-      <w:pPr>
-        <w:pStyle w:val="Compact"/>
-        <w:numPr>
-          <w:ilvl w:val="1"/>
+        <w:t xml:space="preserve">B-UGC-6: #610 → 9f2c3865. B-610-13 (moderation action and notice in one transaction), B-610-8 (erasure certified only on a definite not-found) and C-610-9 are closed. All 20 checks are green and the #314 contract is unchanged. It needs a Sol re-audit and an Opus delta, then merges with mobile #314 (dual APPROVE at 48d76d21).</w:t>
+      </w:r>
+    </w:p>
+    <w:p>
+      <w:pPr>
+        <w:pStyle w:val="Compact"/>
+        <w:numPr>
+          <w:ilvl w:val="0"/>
           <w:numId w:val="1109"/>
         </w:numPr>
       </w:pPr>
       <w:r>
-        <w:t xml:space="preserve">mobile #321: APPROVE from both at 4f5b058d. HELD as a pair with #627.</w:t>
-      </w:r>
-    </w:p>
-    <w:p>
-      <w:pPr>
-        <w:pStyle w:val="Compact"/>
-        <w:numPr>
-          <w:ilvl w:val="1"/>
-          <w:numId w:val="1109"/>
-        </w:numPr>
-      </w:pPr>
-      <w:r>
-        <w:t xml:space="preserve">#627: Opus APPROVE, Sol REQUEST CHANGES 0/1/2 at c1d69c7f. NEW B-627-8: a duplicate won-dispute reinstatement payment after a lost response or receipt plus request-key expiry. The probes are in probes/AUD-SOL-6-112/.</w:t>
-      </w:r>
-    </w:p>
-    <w:p>
-      <w:pPr>
-        <w:pStyle w:val="Compact"/>
-        <w:numPr>
-          <w:ilvl w:val="0"/>
-          <w:numId w:val="1108"/>
-        </w:numPr>
-      </w:pPr>
-      <w:r>
-        <w:t xml:space="preserve">S-RELEASE-2: #333 → 806467b9 (now T4) and #330 → 7d640548. All of Sol’s B findings are closed with failing-before tests, and CI is green. Both need re-audits.</w:t>
-      </w:r>
-    </w:p>
-    <w:p>
-      <w:pPr>
-        <w:pStyle w:val="Compact"/>
-        <w:numPr>
-          <w:ilvl w:val="0"/>
-          <w:numId w:val="1108"/>
-        </w:numPr>
-      </w:pPr>
-      <w:r>
-        <w:t xml:space="preserve">B-UGC-6: #610 → 9f2c3865. B-610-13 (moderation action and notice in one transaction), B-610-8 (erasure certified only on a definite not-found) and C-610-9 are closed. All 20 checks are green and the #314 contract is unchanged. It needs a Sol re-audit and an Opus delta, then merges with mobile #314 (dual APPROVE at 48d76d21).</w:t>
-      </w:r>
-    </w:p>
-    <w:p>
-      <w:pPr>
-        <w:pStyle w:val="Compact"/>
-        <w:numPr>
-          <w:ilvl w:val="0"/>
-          <w:numId w:val="1108"/>
-        </w:numPr>
-      </w:pPr>
-      <w:r>
         <w:t xml:space="preserve">LAUNCH BLOCKER found by AUD-OPUS-6: the mobile Day 1 package sheet (PackageSelectionSheet) can’t take payment. It sends a field the backend rejects (400) to an endpoint that never returns payment secrets, so clients see</w:t>
       </w:r>
       <w:r>
@@ -10155,7 +10283,62 @@
       </w:r>
     </w:p>
     <w:bookmarkEnd w:id="43"/>
-    <w:bookmarkStart w:id="44" w:name="X582e2f822231ec3e238ba31532d907188cf21e2"/>
+    <w:bookmarkStart w:id="44" w:name="X4dc40a0d406b99147b5185f9e3ab3ab8c0ee5fe"/>
+    <w:p>
+      <w:pPr>
+        <w:pStyle w:val="Heading4"/>
+      </w:pPr>
+      <w:r>
+        <w:t xml:space="preserve">Round 3 (owner 15:33:</w:t>
+      </w:r>
+      <w:r>
+        <w:t xml:space="preserve"> </w:t>
+      </w:r>
+      <w:r>
+        <w:t xml:space="preserve">“Do the next 2 agents, quickly!”</w:t>
+      </w:r>
+      <w:r>
+        <w:t xml:space="preserve">), 15:35-16:00</w:t>
+      </w:r>
+    </w:p>
+    <w:p>
+      <w:pPr>
+        <w:pStyle w:val="Compact"/>
+        <w:numPr>
+          <w:ilvl w:val="0"/>
+          <w:numId w:val="1111"/>
+        </w:numPr>
+      </w:pPr>
+      <w:r>
+        <w:t xml:space="preserve">AUD-SOL-7: Sol APPROVE on #610 (9f2c3865), #333 (806467b9) and #330 (7d640548). Each needs only an Opus delta from Opus’s approvals at a98d08b5, abfc5d12 and 4c61d915.</w:t>
+      </w:r>
+    </w:p>
+    <w:p>
+      <w:pPr>
+        <w:pStyle w:val="Compact"/>
+        <w:numPr>
+          <w:ilvl w:val="0"/>
+          <w:numId w:val="1111"/>
+        </w:numPr>
+      </w:pPr>
+      <w:r>
+        <w:t xml:space="preserve">B-PAYSHEET: NEW mobile #334 (5b6eb654, T4, 3/3 green) fixes the Day 1 package sheet payment blocker (OR-112-22). It needs a dual audit.</w:t>
+      </w:r>
+    </w:p>
+    <w:p>
+      <w:pPr>
+        <w:pStyle w:val="Compact"/>
+        <w:numPr>
+          <w:ilvl w:val="1"/>
+          <w:numId w:val="1112"/>
+        </w:numPr>
+      </w:pPr>
+      <w:r>
+        <w:t xml:space="preserve">New finding: POST /v1/checkout/payment-intent charges monthly and yearly plans once and grants open-ended access. The sheet now refuses to sell renewing plans, but the API still allows it (OR-112-23).</w:t>
+      </w:r>
+    </w:p>
+    <w:bookmarkEnd w:id="44"/>
+    <w:bookmarkStart w:id="45" w:name="X582e2f822231ec3e238ba31532d907188cf21e2"/>
     <w:p>
       <w:pPr>
         <w:pStyle w:val="Heading4"/>
@@ -10187,7 +10370,7 @@
         <w:pStyle w:val="Compact"/>
         <w:numPr>
           <w:ilvl w:val="0"/>
-          <w:numId w:val="1110"/>
+          <w:numId w:val="1113"/>
         </w:numPr>
       </w:pPr>
       <w:r>
@@ -10201,15 +10384,15 @@
         <w:t xml:space="preserve"> </w:t>
       </w:r>
       <w:r>
-        <w:t xml:space="preserve">— Head: 2c7b1de8; State: UNKNOWN; Base: main; Title: feat(roman): model config, boot probe, /health/roman and honest failure (R1)</w:t>
-      </w:r>
-    </w:p>
-    <w:p>
-      <w:pPr>
-        <w:pStyle w:val="Compact"/>
-        <w:numPr>
-          <w:ilvl w:val="0"/>
-          <w:numId w:val="1110"/>
+        <w:t xml:space="preserve">— Head: 2c7b1de8; State: DIRTY; Base: main; Title: feat(roman): model config, boot probe, /health/roman and honest failure (R1)</w:t>
+      </w:r>
+    </w:p>
+    <w:p>
+      <w:pPr>
+        <w:pStyle w:val="Compact"/>
+        <w:numPr>
+          <w:ilvl w:val="0"/>
+          <w:numId w:val="1113"/>
         </w:numPr>
       </w:pPr>
       <w:r>
@@ -10223,15 +10406,15 @@
         <w:t xml:space="preserve"> </w:t>
       </w:r>
       <w:r>
-        <w:t xml:space="preserve">— Head: d767f65c; State: UNKNOWN; Base: main; Title: feat(roman): AI processing consent record + server-side enforcement (R2)</w:t>
-      </w:r>
-    </w:p>
-    <w:p>
-      <w:pPr>
-        <w:pStyle w:val="Compact"/>
-        <w:numPr>
-          <w:ilvl w:val="0"/>
-          <w:numId w:val="1110"/>
+        <w:t xml:space="preserve">— Head: d767f65c; State: DIRTY; Base: main; Title: feat(roman): AI processing consent record + server-side enforcement (R2)</w:t>
+      </w:r>
+    </w:p>
+    <w:p>
+      <w:pPr>
+        <w:pStyle w:val="Compact"/>
+        <w:numPr>
+          <w:ilvl w:val="0"/>
+          <w:numId w:val="1113"/>
         </w:numPr>
       </w:pPr>
       <w:r>
@@ -10245,15 +10428,15 @@
         <w:t xml:space="preserve"> </w:t>
       </w:r>
       <w:r>
-        <w:t xml:space="preserve">— Head: bb5f13b0; State: UNKNOWN; Base: main; Title: feat(roman): RomanClientContext builder + per-turn grounding injection (R3)</w:t>
-      </w:r>
-    </w:p>
-    <w:p>
-      <w:pPr>
-        <w:pStyle w:val="Compact"/>
-        <w:numPr>
-          <w:ilvl w:val="0"/>
-          <w:numId w:val="1110"/>
+        <w:t xml:space="preserve">— Head: bb5f13b0; State: DIRTY; Base: main; Title: feat(roman): RomanClientContext builder + per-turn grounding injection (R3)</w:t>
+      </w:r>
+    </w:p>
+    <w:p>
+      <w:pPr>
+        <w:pStyle w:val="Compact"/>
+        <w:numPr>
+          <w:ilvl w:val="0"/>
+          <w:numId w:val="1113"/>
         </w:numPr>
       </w:pPr>
       <w:r>
@@ -10267,15 +10450,15 @@
         <w:t xml:space="preserve"> </w:t>
       </w:r>
       <w:r>
-        <w:t xml:space="preserve">— Head: 75c4a181; State: UNKNOWN; Base: main; Title: feat(roman): guardrail contract, deterministic safety router, post-check, buffered emit (R</w:t>
-      </w:r>
-    </w:p>
-    <w:p>
-      <w:pPr>
-        <w:pStyle w:val="Compact"/>
-        <w:numPr>
-          <w:ilvl w:val="0"/>
-          <w:numId w:val="1110"/>
+        <w:t xml:space="preserve">— Head: 75c4a181; State: BEHIND; Base: main; Title: feat(roman): guardrail contract, deterministic safety router, post-check, buffered emit (R</w:t>
+      </w:r>
+    </w:p>
+    <w:p>
+      <w:pPr>
+        <w:pStyle w:val="Compact"/>
+        <w:numPr>
+          <w:ilvl w:val="0"/>
+          <w:numId w:val="1113"/>
         </w:numPr>
       </w:pPr>
       <w:r>
@@ -10289,15 +10472,15 @@
         <w:t xml:space="preserve"> </w:t>
       </w:r>
       <w:r>
-        <w:t xml:space="preserve">— Head: 686d0888; State: UNKNOWN; Base: main; Title: test(roman): eval harness — G1–G30 golden set, six CI layers, live runner (R8; stacked on</w:t>
-      </w:r>
-    </w:p>
-    <w:p>
-      <w:pPr>
-        <w:pStyle w:val="Compact"/>
-        <w:numPr>
-          <w:ilvl w:val="0"/>
-          <w:numId w:val="1110"/>
+        <w:t xml:space="preserve">— Head: 686d0888; State: DIRTY; Base: main; Title: test(roman): eval harness — G1–G30 golden set, six CI layers, live runner (R8; stacked on</w:t>
+      </w:r>
+    </w:p>
+    <w:p>
+      <w:pPr>
+        <w:pStyle w:val="Compact"/>
+        <w:numPr>
+          <w:ilvl w:val="0"/>
+          <w:numId w:val="1113"/>
         </w:numPr>
       </w:pPr>
       <w:r>
@@ -10311,7 +10494,7 @@
         <w:t xml:space="preserve"> </w:t>
       </w:r>
       <w:r>
-        <w:t xml:space="preserve">— Head: bdadfcb4; State: UNKNOWN; Base: main; Latest Opus: APPROVE</w:t>
+        <w:t xml:space="preserve">— Head: bdadfcb4; State: BEHIND; Base: main; Latest Opus: APPROVE</w:t>
       </w:r>
       <w:r>
         <w:t xml:space="preserve"> </w:t>
@@ -10337,7 +10520,7 @@
         <w:pStyle w:val="Compact"/>
         <w:numPr>
           <w:ilvl w:val="0"/>
-          <w:numId w:val="1110"/>
+          <w:numId w:val="1113"/>
         </w:numPr>
       </w:pPr>
       <w:r>
@@ -10351,7 +10534,7 @@
         <w:t xml:space="preserve"> </w:t>
       </w:r>
       <w:r>
-        <w:t xml:space="preserve">— Head: 40616dcf; State: UNKNOWN; Base: main; Latest Opus: REQUEST CHANGES</w:t>
+        <w:t xml:space="preserve">— Head: 40616dcf; State: DIRTY; Base: main; Latest Opus: REQUEST CHANGES</w:t>
       </w:r>
       <w:r>
         <w:t xml:space="preserve"> </w:t>
@@ -10383,7 +10566,7 @@
         <w:pStyle w:val="Compact"/>
         <w:numPr>
           <w:ilvl w:val="0"/>
-          <w:numId w:val="1110"/>
+          <w:numId w:val="1113"/>
         </w:numPr>
       </w:pPr>
       <w:r>
@@ -10406,24 +10589,27 @@
         <w:t xml:space="preserve">@a98d08b5</w:t>
       </w:r>
       <w:r>
-        <w:t xml:space="preserve">; Latest Sol: REQUEST CHANGES</w:t>
-      </w:r>
-      <w:r>
-        <w:t xml:space="preserve"> </w:t>
-      </w:r>
-      <w:r>
-        <w:t xml:space="preserve">@a98d08b5</w:t>
-      </w:r>
-      <w:r>
-        <w:t xml:space="preserve">; Title: feat(community): UGC safety for App Review 1.2 (content filter, blocking, ban/warn, flagge</w:t>
-      </w:r>
-    </w:p>
-    <w:p>
-      <w:pPr>
-        <w:pStyle w:val="Compact"/>
-        <w:numPr>
-          <w:ilvl w:val="0"/>
-          <w:numId w:val="1110"/>
+        <w:t xml:space="preserve">; Latest Sol: APPROVE</w:t>
+      </w:r>
+      <w:r>
+        <w:t xml:space="preserve"> </w:t>
+      </w:r>
+      <w:r>
+        <w:t xml:space="preserve">@9f2c3865</w:t>
+      </w:r>
+      <w:r>
+        <w:t xml:space="preserve"> </w:t>
+      </w:r>
+      <w:r>
+        <w:t xml:space="preserve">(at head); Title: feat(community): UGC safety for App Review 1.2 (content filter, blocking, ban/warn, flagge</w:t>
+      </w:r>
+    </w:p>
+    <w:p>
+      <w:pPr>
+        <w:pStyle w:val="Compact"/>
+        <w:numPr>
+          <w:ilvl w:val="0"/>
+          <w:numId w:val="1113"/>
         </w:numPr>
       </w:pPr>
       <w:r>
@@ -10437,7 +10623,7 @@
         <w:t xml:space="preserve"> </w:t>
       </w:r>
       <w:r>
-        <w:t xml:space="preserve">— Head: fda3afad; State: UNKNOWN; Base: main; Latest Opus: APPROVE</w:t>
+        <w:t xml:space="preserve">— Head: fda3afad; State: BEHIND; Base: main; Latest Opus: APPROVE</w:t>
       </w:r>
       <w:r>
         <w:t xml:space="preserve"> </w:t>
@@ -10463,7 +10649,7 @@
         <w:pStyle w:val="Compact"/>
         <w:numPr>
           <w:ilvl w:val="0"/>
-          <w:numId w:val="1110"/>
+          <w:numId w:val="1113"/>
         </w:numPr>
       </w:pPr>
       <w:r>
@@ -10477,7 +10663,7 @@
         <w:t xml:space="preserve"> </w:t>
       </w:r>
       <w:r>
-        <w:t xml:space="preserve">— Head: c1d69c7f; State: UNKNOWN; Base: main; Latest Opus: APPROVE</w:t>
+        <w:t xml:space="preserve">— Head: c1d69c7f; State: BEHIND; Base: main; Latest Opus: APPROVE</w:t>
       </w:r>
       <w:r>
         <w:t xml:space="preserve"> </w:t>
@@ -10509,7 +10695,7 @@
         <w:pStyle w:val="Compact"/>
         <w:numPr>
           <w:ilvl w:val="0"/>
-          <w:numId w:val="1110"/>
+          <w:numId w:val="1113"/>
         </w:numPr>
       </w:pPr>
       <w:r>
@@ -10523,7 +10709,7 @@
         <w:t xml:space="preserve"> </w:t>
       </w:r>
       <w:r>
-        <w:t xml:space="preserve">— Head: 739e9a54; State: UNKNOWN; Base: main; Latest Opus: APPROVE</w:t>
+        <w:t xml:space="preserve">— Head: 739e9a54; State: BEHIND; Base: main; Latest Opus: APPROVE</w:t>
       </w:r>
       <w:r>
         <w:t xml:space="preserve"> </w:t>
@@ -10555,7 +10741,7 @@
         <w:pStyle w:val="Compact"/>
         <w:numPr>
           <w:ilvl w:val="0"/>
-          <w:numId w:val="1110"/>
+          <w:numId w:val="1113"/>
         </w:numPr>
       </w:pPr>
       <w:r>
@@ -10569,7 +10755,7 @@
         <w:t xml:space="preserve"> </w:t>
       </w:r>
       <w:r>
-        <w:t xml:space="preserve">— Head: 850ec148; State: UNKNOWN; Base: main; Latest Opus: REQUEST CHANGES</w:t>
+        <w:t xml:space="preserve">— Head: 850ec148; State: BEHIND; Base: main; Latest Opus: REQUEST CHANGES</w:t>
       </w:r>
       <w:r>
         <w:t xml:space="preserve"> </w:t>
@@ -10601,7 +10787,7 @@
         <w:pStyle w:val="Compact"/>
         <w:numPr>
           <w:ilvl w:val="0"/>
-          <w:numId w:val="1110"/>
+          <w:numId w:val="1113"/>
         </w:numPr>
       </w:pPr>
       <w:r>
@@ -10615,7 +10801,7 @@
         <w:t xml:space="preserve"> </w:t>
       </w:r>
       <w:r>
-        <w:t xml:space="preserve">— Head: 4d987916; State: UNKNOWN; Base: main; Latest Opus: APPROVE</w:t>
+        <w:t xml:space="preserve">— Head: 4d987916; State: BEHIND; Base: main; Latest Opus: APPROVE</w:t>
       </w:r>
       <w:r>
         <w:t xml:space="preserve"> </w:t>
@@ -10641,7 +10827,7 @@
         <w:pStyle w:val="Compact"/>
         <w:numPr>
           <w:ilvl w:val="0"/>
-          <w:numId w:val="1110"/>
+          <w:numId w:val="1113"/>
         </w:numPr>
       </w:pPr>
       <w:r>
@@ -10681,7 +10867,7 @@
         <w:pStyle w:val="Compact"/>
         <w:numPr>
           <w:ilvl w:val="0"/>
-          <w:numId w:val="1110"/>
+          <w:numId w:val="1113"/>
         </w:numPr>
       </w:pPr>
       <w:r>
@@ -10695,7 +10881,7 @@
         <w:t xml:space="preserve"> </w:t>
       </w:r>
       <w:r>
-        <w:t xml:space="preserve">— Head: 213a186d; State: UNKNOWN; Base: main; Latest Opus: BLOCK</w:t>
+        <w:t xml:space="preserve">— Head: 213a186d; State: BEHIND; Base: main; Latest Opus: BLOCK</w:t>
       </w:r>
       <w:r>
         <w:t xml:space="preserve"> </w:t>
@@ -10721,7 +10907,7 @@
         <w:pStyle w:val="Compact"/>
         <w:numPr>
           <w:ilvl w:val="0"/>
-          <w:numId w:val="1110"/>
+          <w:numId w:val="1113"/>
         </w:numPr>
       </w:pPr>
       <w:r>
@@ -10735,7 +10921,7 @@
         <w:t xml:space="preserve"> </w:t>
       </w:r>
       <w:r>
-        <w:t xml:space="preserve">— Head: bb17e19a; State: UNKNOWN; Base: main; Latest Opus: REQUEST CHANGES</w:t>
+        <w:t xml:space="preserve">— Head: bb17e19a; State: BEHIND; Base: main; Latest Opus: REQUEST CHANGES</w:t>
       </w:r>
       <w:r>
         <w:t xml:space="preserve"> </w:t>
@@ -10761,7 +10947,7 @@
         <w:pStyle w:val="Compact"/>
         <w:numPr>
           <w:ilvl w:val="0"/>
-          <w:numId w:val="1110"/>
+          <w:numId w:val="1113"/>
         </w:numPr>
       </w:pPr>
       <w:r>
@@ -10775,7 +10961,7 @@
         <w:t xml:space="preserve"> </w:t>
       </w:r>
       <w:r>
-        <w:t xml:space="preserve">— Head: 85950984; State: UNKNOWN; Base: main; Latest Opus: REQUEST CHANGES</w:t>
+        <w:t xml:space="preserve">— Head: 85950984; State: BEHIND; Base: main; Latest Opus: REQUEST CHANGES</w:t>
       </w:r>
       <w:r>
         <w:t xml:space="preserve"> </w:t>
@@ -10807,7 +10993,7 @@
         <w:pStyle w:val="Compact"/>
         <w:numPr>
           <w:ilvl w:val="0"/>
-          <w:numId w:val="1110"/>
+          <w:numId w:val="1113"/>
         </w:numPr>
       </w:pPr>
       <w:r>
@@ -10821,7 +11007,7 @@
         <w:t xml:space="preserve"> </w:t>
       </w:r>
       <w:r>
-        <w:t xml:space="preserve">— Head: f21b3c63; State: UNKNOWN; Base: main; Latest Opus: REQUEST CHANGES</w:t>
+        <w:t xml:space="preserve">— Head: f21b3c63; State: BEHIND; Base: main; Latest Opus: REQUEST CHANGES</w:t>
       </w:r>
       <w:r>
         <w:t xml:space="preserve"> </w:t>
@@ -10853,7 +11039,7 @@
         <w:pStyle w:val="Compact"/>
         <w:numPr>
           <w:ilvl w:val="0"/>
-          <w:numId w:val="1110"/>
+          <w:numId w:val="1113"/>
         </w:numPr>
       </w:pPr>
       <w:r>
@@ -10867,15 +11053,15 @@
         <w:t xml:space="preserve"> </w:t>
       </w:r>
       <w:r>
-        <w:t xml:space="preserve">— Head: 7b6165ab; State: UNKNOWN; Base: main; Title: ci(branch-protection): setup script lists the 10 live required checks incl. Schema parity</w:t>
-      </w:r>
-    </w:p>
-    <w:p>
-      <w:pPr>
-        <w:pStyle w:val="Compact"/>
-        <w:numPr>
-          <w:ilvl w:val="0"/>
-          <w:numId w:val="1110"/>
+        <w:t xml:space="preserve">— Head: 7b6165ab; State: BEHIND; Base: main; Title: ci(branch-protection): setup script lists the 10 live required checks incl. Schema parity</w:t>
+      </w:r>
+    </w:p>
+    <w:p>
+      <w:pPr>
+        <w:pStyle w:val="Compact"/>
+        <w:numPr>
+          <w:ilvl w:val="0"/>
+          <w:numId w:val="1113"/>
         </w:numPr>
       </w:pPr>
       <w:r>
@@ -10889,15 +11075,15 @@
         <w:t xml:space="preserve"> </w:t>
       </w:r>
       <w:r>
-        <w:t xml:space="preserve">— Head: 3a93fbde; State: UNKNOWN; Base: main; Title: fix(notifications): booking times in the recipient’s zone, one inbox row per event (B-643-</w:t>
-      </w:r>
-    </w:p>
-    <w:p>
-      <w:pPr>
-        <w:pStyle w:val="Compact"/>
-        <w:numPr>
-          <w:ilvl w:val="0"/>
-          <w:numId w:val="1110"/>
+        <w:t xml:space="preserve">— Head: 3a93fbde; State: BEHIND; Base: main; Title: fix(notifications): booking times in the recipient’s zone, one inbox row per event (B-643-</w:t>
+      </w:r>
+    </w:p>
+    <w:p>
+      <w:pPr>
+        <w:pStyle w:val="Compact"/>
+        <w:numPr>
+          <w:ilvl w:val="0"/>
+          <w:numId w:val="1113"/>
         </w:numPr>
       </w:pPr>
       <w:r>
@@ -10911,7 +11097,7 @@
         <w:t xml:space="preserve"> </w:t>
       </w:r>
       <w:r>
-        <w:t xml:space="preserve">— Head: 81c52a12; State: UNKNOWN; Base: main; Title: feat(notifications): deliver inbox notifications to devices via Expo push (C-643-2)</w:t>
+        <w:t xml:space="preserve">— Head: 81c52a12; State: BEHIND; Base: main; Title: feat(notifications): deliver inbox notifications to devices via Expo push (C-643-2)</w:t>
       </w:r>
     </w:p>
     <w:p>
@@ -10929,15 +11115,15 @@
         <w:t xml:space="preserve"> </w:t>
       </w:r>
       <w:r>
-        <w:t xml:space="preserve">(16 open launch PRs; dependabot bumps and pre-launch PRs omitted)</w:t>
-      </w:r>
-    </w:p>
-    <w:p>
-      <w:pPr>
-        <w:pStyle w:val="Compact"/>
-        <w:numPr>
-          <w:ilvl w:val="0"/>
-          <w:numId w:val="1111"/>
+        <w:t xml:space="preserve">(17 open launch PRs; dependabot bumps and pre-launch PRs omitted)</w:t>
+      </w:r>
+    </w:p>
+    <w:p>
+      <w:pPr>
+        <w:pStyle w:val="Compact"/>
+        <w:numPr>
+          <w:ilvl w:val="0"/>
+          <w:numId w:val="1114"/>
         </w:numPr>
       </w:pPr>
       <w:r>
@@ -10983,7 +11169,7 @@
         <w:pStyle w:val="Compact"/>
         <w:numPr>
           <w:ilvl w:val="0"/>
-          <w:numId w:val="1111"/>
+          <w:numId w:val="1114"/>
         </w:numPr>
       </w:pPr>
       <w:r>
@@ -11029,7 +11215,7 @@
         <w:pStyle w:val="Compact"/>
         <w:numPr>
           <w:ilvl w:val="0"/>
-          <w:numId w:val="1111"/>
+          <w:numId w:val="1114"/>
         </w:numPr>
       </w:pPr>
       <w:r>
@@ -11075,7 +11261,7 @@
         <w:pStyle w:val="Compact"/>
         <w:numPr>
           <w:ilvl w:val="0"/>
-          <w:numId w:val="1111"/>
+          <w:numId w:val="1114"/>
         </w:numPr>
       </w:pPr>
       <w:r>
@@ -11118,7 +11304,7 @@
         <w:pStyle w:val="Compact"/>
         <w:numPr>
           <w:ilvl w:val="0"/>
-          <w:numId w:val="1111"/>
+          <w:numId w:val="1114"/>
         </w:numPr>
       </w:pPr>
       <w:r>
@@ -11164,7 +11350,7 @@
         <w:pStyle w:val="Compact"/>
         <w:numPr>
           <w:ilvl w:val="0"/>
-          <w:numId w:val="1111"/>
+          <w:numId w:val="1114"/>
         </w:numPr>
       </w:pPr>
       <w:r>
@@ -11210,7 +11396,7 @@
         <w:pStyle w:val="Compact"/>
         <w:numPr>
           <w:ilvl w:val="0"/>
-          <w:numId w:val="1111"/>
+          <w:numId w:val="1114"/>
         </w:numPr>
       </w:pPr>
       <w:r>
@@ -11256,7 +11442,7 @@
         <w:pStyle w:val="Compact"/>
         <w:numPr>
           <w:ilvl w:val="0"/>
-          <w:numId w:val="1111"/>
+          <w:numId w:val="1114"/>
         </w:numPr>
       </w:pPr>
       <w:r>
@@ -11302,7 +11488,7 @@
         <w:pStyle w:val="Compact"/>
         <w:numPr>
           <w:ilvl w:val="0"/>
-          <w:numId w:val="1111"/>
+          <w:numId w:val="1114"/>
         </w:numPr>
       </w:pPr>
       <w:r>
@@ -11342,7 +11528,7 @@
         <w:pStyle w:val="Compact"/>
         <w:numPr>
           <w:ilvl w:val="0"/>
-          <w:numId w:val="1111"/>
+          <w:numId w:val="1114"/>
         </w:numPr>
       </w:pPr>
       <w:r>
@@ -11382,7 +11568,7 @@
         <w:pStyle w:val="Compact"/>
         <w:numPr>
           <w:ilvl w:val="0"/>
-          <w:numId w:val="1111"/>
+          <w:numId w:val="1114"/>
         </w:numPr>
       </w:pPr>
       <w:r>
@@ -11422,7 +11608,7 @@
         <w:pStyle w:val="Compact"/>
         <w:numPr>
           <w:ilvl w:val="0"/>
-          <w:numId w:val="1111"/>
+          <w:numId w:val="1114"/>
         </w:numPr>
       </w:pPr>
       <w:r>
@@ -11468,7 +11654,7 @@
         <w:pStyle w:val="Compact"/>
         <w:numPr>
           <w:ilvl w:val="0"/>
-          <w:numId w:val="1111"/>
+          <w:numId w:val="1114"/>
         </w:numPr>
       </w:pPr>
       <w:r>
@@ -11491,24 +11677,27 @@
         <w:t xml:space="preserve">@4c61d915</w:t>
       </w:r>
       <w:r>
-        <w:t xml:space="preserve">; Latest Sol: REQUEST CHANGES</w:t>
-      </w:r>
-      <w:r>
-        <w:t xml:space="preserve"> </w:t>
-      </w:r>
-      <w:r>
-        <w:t xml:space="preserve">@4c61d915</w:t>
-      </w:r>
-      <w:r>
-        <w:t xml:space="preserve">; Title: feat(sentry): native crash capture before JS loads (iOS/Android), no PII</w:t>
-      </w:r>
-    </w:p>
-    <w:p>
-      <w:pPr>
-        <w:pStyle w:val="Compact"/>
-        <w:numPr>
-          <w:ilvl w:val="0"/>
-          <w:numId w:val="1111"/>
+        <w:t xml:space="preserve">; Latest Sol: APPROVE</w:t>
+      </w:r>
+      <w:r>
+        <w:t xml:space="preserve"> </w:t>
+      </w:r>
+      <w:r>
+        <w:t xml:space="preserve">@7d640548</w:t>
+      </w:r>
+      <w:r>
+        <w:t xml:space="preserve"> </w:t>
+      </w:r>
+      <w:r>
+        <w:t xml:space="preserve">(at head); Title: feat(sentry): native crash capture before JS loads (iOS/Android), no PII</w:t>
+      </w:r>
+    </w:p>
+    <w:p>
+      <w:pPr>
+        <w:pStyle w:val="Compact"/>
+        <w:numPr>
+          <w:ilvl w:val="0"/>
+          <w:numId w:val="1114"/>
         </w:numPr>
       </w:pPr>
       <w:r>
@@ -11554,7 +11743,7 @@
         <w:pStyle w:val="Compact"/>
         <w:numPr>
           <w:ilvl w:val="0"/>
-          <w:numId w:val="1111"/>
+          <w:numId w:val="1114"/>
         </w:numPr>
       </w:pPr>
       <w:r>
@@ -11600,7 +11789,7 @@
         <w:pStyle w:val="Compact"/>
         <w:numPr>
           <w:ilvl w:val="0"/>
-          <w:numId w:val="1111"/>
+          <w:numId w:val="1114"/>
         </w:numPr>
       </w:pPr>
       <w:r>
@@ -11623,20 +11812,45 @@
         <w:t xml:space="preserve">@abfc5d12</w:t>
       </w:r>
       <w:r>
-        <w:t xml:space="preserve">; Latest Sol: REQUEST CHANGES</w:t>
-      </w:r>
-      <w:r>
-        <w:t xml:space="preserve"> </w:t>
-      </w:r>
-      <w:r>
-        <w:t xml:space="preserve">@abfc5d12</w:t>
-      </w:r>
-      <w:r>
-        <w:t xml:space="preserve">; Title: feat(release): pre-build release-env check per EAS profile (clinic, production, preview)</w:t>
-      </w:r>
-    </w:p>
-    <w:bookmarkEnd w:id="44"/>
-    <w:bookmarkStart w:id="45" w:name="first-moves-for-agent-113-in-this-order"/>
+        <w:t xml:space="preserve">; Latest Sol: APPROVE</w:t>
+      </w:r>
+      <w:r>
+        <w:t xml:space="preserve"> </w:t>
+      </w:r>
+      <w:r>
+        <w:t xml:space="preserve">@806467b9</w:t>
+      </w:r>
+      <w:r>
+        <w:t xml:space="preserve"> </w:t>
+      </w:r>
+      <w:r>
+        <w:t xml:space="preserve">(at head); Title: feat(release): pre-build release-env check per EAS profile (clinic, production, preview)</w:t>
+      </w:r>
+    </w:p>
+    <w:p>
+      <w:pPr>
+        <w:pStyle w:val="Compact"/>
+        <w:numPr>
+          <w:ilvl w:val="0"/>
+          <w:numId w:val="1114"/>
+        </w:numPr>
+      </w:pPr>
+      <w:r>
+        <w:rPr>
+          <w:b/>
+          <w:bCs/>
+        </w:rPr>
+        <w:t xml:space="preserve">#334</w:t>
+      </w:r>
+      <w:r>
+        <w:t xml:space="preserve"> </w:t>
+      </w:r>
+      <w:r>
+        <w:t xml:space="preserve">— Head: 5b6eb654; State: CLEAN; Base: main; Title: fix(payments): Day 1 package sheet takes payment through payment-intent</w:t>
+      </w:r>
+    </w:p>
+    <w:bookmarkEnd w:id="45"/>
+    <w:bookmarkStart w:id="46" w:name="first-moves-for-agent-113-in-this-order"/>
     <w:p>
       <w:pPr>
         <w:pStyle w:val="Heading4"/>
@@ -11650,95 +11864,44 @@
         <w:pStyle w:val="Compact"/>
         <w:numPr>
           <w:ilvl w:val="0"/>
-          <w:numId w:val="1112"/>
-        </w:numPr>
-      </w:pPr>
-      <w:r>
-        <w:t xml:space="preserve">Bootstrap (START HERE), regenerate the board, and read every HANDOFF section. Then relaunch the two Opus and three Sol audit lenses with short queues, built from the board’s</w:t>
-      </w:r>
-      <w:r>
-        <w:t xml:space="preserve"> </w:t>
-      </w:r>
-      <w:r>
-        <w:t xml:space="preserve">“needs audit”</w:t>
-      </w:r>
-      <w:r>
-        <w:t xml:space="preserve"> </w:t>
-      </w:r>
-      <w:r>
-        <w:t xml:space="preserve">heads below. Use handoffs/op-6870f2ca/lanes/AUD-*.md as templates.</w:t>
-      </w:r>
-    </w:p>
-    <w:p>
-      <w:pPr>
-        <w:pStyle w:val="Compact"/>
-        <w:numPr>
-          <w:ilvl w:val="0"/>
-          <w:numId w:val="1112"/>
-        </w:numPr>
-      </w:pPr>
-      <w:r>
-        <w:t xml:space="preserve">#635 and #646 are MERGED (14:58, 15:11); the deploy status is in the production section. Next, the payment blocker (OR-112-22) and mobile #326 (16e7e97c, needs deltas), then mobile #331. After that comes mobile #326 (16e7e97c, needs deltas), then mobile #331. #331 first needs a fix round: Sol BLOCK 1/3/2 with A = a cross-account destructive-intent / transport-credential race, and Opus B-331-1.</w:t>
-      </w:r>
-    </w:p>
-    <w:p>
-      <w:pPr>
-        <w:pStyle w:val="Compact"/>
-        <w:numPr>
-          <w:ilvl w:val="0"/>
-          <w:numId w:val="1112"/>
-        </w:numPr>
-      </w:pPr>
-      <w:r>
-        <w:t xml:space="preserve">Merge the approved pairs as soon as their other half is approved:</w:t>
-      </w:r>
-    </w:p>
-    <w:p>
-      <w:pPr>
-        <w:pStyle w:val="Compact"/>
-        <w:numPr>
-          <w:ilvl w:val="1"/>
-          <w:numId w:val="1113"/>
-        </w:numPr>
-      </w:pPr>
-      <w:r>
-        <w:t xml:space="preserve">mobile #325 (dual APPROVE at 36f05bba) waits for backend #634, now at round-5 head 4d987916. Its last verdicts were Opus APPROVE and Sol REQUEST CHANGES at d1661ab8, so it needs a Sol re-audit and an Opus delta.</w:t>
-      </w:r>
-    </w:p>
-    <w:p>
-      <w:pPr>
-        <w:pStyle w:val="Compact"/>
-        <w:numPr>
-          <w:ilvl w:val="1"/>
-          <w:numId w:val="1113"/>
-        </w:numPr>
-      </w:pPr>
-      <w:r>
-        <w:t xml:space="preserve">mobile #314 (dual APPROVE at 48d76d21) waits for backend #610, which is fixed at 9f2c3865 (B-UGC-6) and needs a Sol re-audit plus an Opus delta. Then merge #610, deploy, flip the community core flags (OR-112-6), update-branch #314, delta and merge.</w:t>
-      </w:r>
-    </w:p>
-    <w:p>
-      <w:pPr>
-        <w:pStyle w:val="Compact"/>
-        <w:numPr>
-          <w:ilvl w:val="1"/>
-          <w:numId w:val="1113"/>
-        </w:numPr>
-      </w:pPr>
-      <w:r>
-        <w:t xml:space="preserve">For each pair: merge the backend half, deploy (re-run #634’s zero-row queries first), run the manifest flips whose preconditions are live, then update-branch the mobile half, take a delta and merge.</w:t>
-      </w:r>
-    </w:p>
-    <w:p>
-      <w:pPr>
-        <w:pStyle w:val="Compact"/>
-        <w:numPr>
-          <w:ilvl w:val="0"/>
-          <w:numId w:val="1112"/>
-        </w:numPr>
-      </w:pPr>
-      <w:r>
-        <w:t xml:space="preserve">Release trio. #333 (806467b9) and #330 (7d640548) are fixed by S-RELEASE-2 and need dual re-audits. #305 still needs its fix round: Opus RC (B-305-5/6) and Sol RC 0/4/3. Order: #333, #330, #305. Run</w:t>
+          <w:numId w:val="1115"/>
+        </w:numPr>
+      </w:pPr>
+      <w:r>
+        <w:t xml:space="preserve">Quick wins from 112’s last rounds: Opus DELTA audits of #610</w:t>
+      </w:r>
+      <w:r>
+        <w:t xml:space="preserve"> </w:t>
+      </w:r>
+      <w:r>
+        <w:t xml:space="preserve">@9f2c3865</w:t>
+      </w:r>
+      <w:r>
+        <w:t xml:space="preserve">, #333</w:t>
+      </w:r>
+      <w:r>
+        <w:t xml:space="preserve"> </w:t>
+      </w:r>
+      <w:r>
+        <w:t xml:space="preserve">@806467b9</w:t>
+      </w:r>
+      <w:r>
+        <w:t xml:space="preserve"> </w:t>
+      </w:r>
+      <w:r>
+        <w:t xml:space="preserve">and #330</w:t>
+      </w:r>
+      <w:r>
+        <w:t xml:space="preserve"> </w:t>
+      </w:r>
+      <w:r>
+        <w:t xml:space="preserve">@7d640548</w:t>
+      </w:r>
+      <w:r>
+        <w:t xml:space="preserve"> </w:t>
+      </w:r>
+      <w:r>
+        <w:t xml:space="preserve">(Sol APPROVE at all three), then merge. For #610: deploy, flip the community core flags, then update-branch #314, delta and merge. For #333: run</w:t>
       </w:r>
       <w:r>
         <w:t xml:space="preserve"> </w:t>
@@ -11753,6 +11916,117 @@
         <w:t xml:space="preserve"> </w:t>
       </w:r>
       <w:r>
+        <w:t xml:space="preserve">for clinic and preview first. For #330: one preview build plus a forced pre-JS crash check. Then a dual audit of the new #334 (Day 1 package sheet payment fix) and merge it.</w:t>
+      </w:r>
+    </w:p>
+    <w:p>
+      <w:pPr>
+        <w:pStyle w:val="Compact"/>
+        <w:numPr>
+          <w:ilvl w:val="0"/>
+          <w:numId w:val="1115"/>
+        </w:numPr>
+      </w:pPr>
+      <w:r>
+        <w:t xml:space="preserve">Bootstrap (START HERE), regenerate the board, and read every HANDOFF section. Then relaunch the two Opus and three Sol audit lenses with short queues, built from the board’s</w:t>
+      </w:r>
+      <w:r>
+        <w:t xml:space="preserve"> </w:t>
+      </w:r>
+      <w:r>
+        <w:t xml:space="preserve">“needs audit”</w:t>
+      </w:r>
+      <w:r>
+        <w:t xml:space="preserve"> </w:t>
+      </w:r>
+      <w:r>
+        <w:t xml:space="preserve">heads below. Use handoffs/op-6870f2ca/lanes/AUD-*.md as templates.</w:t>
+      </w:r>
+    </w:p>
+    <w:p>
+      <w:pPr>
+        <w:pStyle w:val="Compact"/>
+        <w:numPr>
+          <w:ilvl w:val="0"/>
+          <w:numId w:val="1115"/>
+        </w:numPr>
+      </w:pPr>
+      <w:r>
+        <w:t xml:space="preserve">#635 and #646 are MERGED (14:58, 15:11); the deploy status is in the production section. Next, the payment blocker (OR-112-22) and mobile #326 (16e7e97c, needs deltas), then mobile #331. After that comes mobile #326 (16e7e97c, needs deltas), then mobile #331. #331 first needs a fix round: Sol BLOCK 1/3/2 with A = a cross-account destructive-intent / transport-credential race, and Opus B-331-1.</w:t>
+      </w:r>
+    </w:p>
+    <w:p>
+      <w:pPr>
+        <w:pStyle w:val="Compact"/>
+        <w:numPr>
+          <w:ilvl w:val="0"/>
+          <w:numId w:val="1115"/>
+        </w:numPr>
+      </w:pPr>
+      <w:r>
+        <w:t xml:space="preserve">Merge the approved pairs as soon as their other half is approved:</w:t>
+      </w:r>
+    </w:p>
+    <w:p>
+      <w:pPr>
+        <w:pStyle w:val="Compact"/>
+        <w:numPr>
+          <w:ilvl w:val="1"/>
+          <w:numId w:val="1116"/>
+        </w:numPr>
+      </w:pPr>
+      <w:r>
+        <w:t xml:space="preserve">mobile #325 (dual APPROVE at 36f05bba) waits for backend #634, now at round-5 head 4d987916. Its last verdicts were Opus APPROVE and Sol REQUEST CHANGES at d1661ab8, so it needs a Sol re-audit and an Opus delta.</w:t>
+      </w:r>
+    </w:p>
+    <w:p>
+      <w:pPr>
+        <w:pStyle w:val="Compact"/>
+        <w:numPr>
+          <w:ilvl w:val="1"/>
+          <w:numId w:val="1116"/>
+        </w:numPr>
+      </w:pPr>
+      <w:r>
+        <w:t xml:space="preserve">mobile #314 (dual APPROVE at 48d76d21) waits for backend #610, which is fixed at 9f2c3865 (B-UGC-6) and needs a Sol re-audit plus an Opus delta. Then merge #610, deploy, flip the community core flags (OR-112-6), update-branch #314, delta and merge.</w:t>
+      </w:r>
+    </w:p>
+    <w:p>
+      <w:pPr>
+        <w:pStyle w:val="Compact"/>
+        <w:numPr>
+          <w:ilvl w:val="1"/>
+          <w:numId w:val="1116"/>
+        </w:numPr>
+      </w:pPr>
+      <w:r>
+        <w:t xml:space="preserve">For each pair: merge the backend half, deploy (re-run #634’s zero-row queries first), run the manifest flips whose preconditions are live, then update-branch the mobile half, take a delta and merge.</w:t>
+      </w:r>
+    </w:p>
+    <w:p>
+      <w:pPr>
+        <w:pStyle w:val="Compact"/>
+        <w:numPr>
+          <w:ilvl w:val="0"/>
+          <w:numId w:val="1115"/>
+        </w:numPr>
+      </w:pPr>
+      <w:r>
+        <w:t xml:space="preserve">Release trio. #333 (806467b9) and #330 (7d640548) are fixed by S-RELEASE-2 and need dual re-audits. #305 still needs its fix round: Opus RC (B-305-5/6) and Sol RC 0/4/3. Order: #333, #330, #305. Run</w:t>
+      </w:r>
+      <w:r>
+        <w:t xml:space="preserve"> </w:t>
+      </w:r>
+      <w:r>
+        <w:rPr>
+          <w:rStyle w:val="VerbatimChar"/>
+        </w:rPr>
+        <w:t xml:space="preserve">eas env:exec</w:t>
+      </w:r>
+      <w:r>
+        <w:t xml:space="preserve"> </w:t>
+      </w:r>
+      <w:r>
         <w:t xml:space="preserve">for clinic and preview before merging #333.</w:t>
       </w:r>
     </w:p>
@@ -11761,7 +12035,7 @@
         <w:pStyle w:val="Compact"/>
         <w:numPr>
           <w:ilvl w:val="0"/>
-          <w:numId w:val="1112"/>
+          <w:numId w:val="1115"/>
         </w:numPr>
       </w:pPr>
       <w:r>
@@ -11773,7 +12047,7 @@
         <w:pStyle w:val="Compact"/>
         <w:numPr>
           <w:ilvl w:val="1"/>
-          <w:numId w:val="1114"/>
+          <w:numId w:val="1117"/>
         </w:numPr>
       </w:pPr>
       <w:r>
@@ -11785,7 +12059,7 @@
         <w:pStyle w:val="Compact"/>
         <w:numPr>
           <w:ilvl w:val="1"/>
-          <w:numId w:val="1114"/>
+          <w:numId w:val="1117"/>
         </w:numPr>
       </w:pPr>
       <w:r>
@@ -11797,7 +12071,7 @@
         <w:pStyle w:val="Compact"/>
         <w:numPr>
           <w:ilvl w:val="1"/>
-          <w:numId w:val="1114"/>
+          <w:numId w:val="1117"/>
         </w:numPr>
       </w:pPr>
       <w:r>
@@ -11809,7 +12083,7 @@
         <w:pStyle w:val="Compact"/>
         <w:numPr>
           <w:ilvl w:val="1"/>
-          <w:numId w:val="1114"/>
+          <w:numId w:val="1117"/>
         </w:numPr>
       </w:pPr>
       <w:r>
@@ -11833,7 +12107,7 @@
         <w:pStyle w:val="Compact"/>
         <w:numPr>
           <w:ilvl w:val="1"/>
-          <w:numId w:val="1114"/>
+          <w:numId w:val="1117"/>
         </w:numPr>
       </w:pPr>
       <w:r>
@@ -11845,7 +12119,7 @@
         <w:pStyle w:val="Compact"/>
         <w:numPr>
           <w:ilvl w:val="1"/>
-          <w:numId w:val="1114"/>
+          <w:numId w:val="1117"/>
         </w:numPr>
       </w:pPr>
       <w:r>
@@ -11869,7 +12143,7 @@
         <w:pStyle w:val="Compact"/>
         <w:numPr>
           <w:ilvl w:val="1"/>
-          <w:numId w:val="1114"/>
+          <w:numId w:val="1117"/>
         </w:numPr>
       </w:pPr>
       <w:r>
@@ -11893,7 +12167,7 @@
         <w:pStyle w:val="Compact"/>
         <w:numPr>
           <w:ilvl w:val="1"/>
-          <w:numId w:val="1114"/>
+          <w:numId w:val="1117"/>
         </w:numPr>
       </w:pPr>
       <w:r>
@@ -11914,7 +12188,7 @@
         <w:pStyle w:val="Compact"/>
         <w:numPr>
           <w:ilvl w:val="1"/>
-          <w:numId w:val="1114"/>
+          <w:numId w:val="1117"/>
         </w:numPr>
       </w:pPr>
       <w:r>
@@ -11926,7 +12200,7 @@
         <w:pStyle w:val="Compact"/>
         <w:numPr>
           <w:ilvl w:val="1"/>
-          <w:numId w:val="1114"/>
+          <w:numId w:val="1117"/>
         </w:numPr>
       </w:pPr>
       <w:r>
@@ -11962,7 +12236,7 @@
         <w:pStyle w:val="Compact"/>
         <w:numPr>
           <w:ilvl w:val="0"/>
-          <w:numId w:val="1112"/>
+          <w:numId w:val="1115"/>
         </w:numPr>
       </w:pPr>
       <w:r>
@@ -11974,110 +12248,110 @@
         <w:pStyle w:val="Compact"/>
         <w:numPr>
           <w:ilvl w:val="1"/>
+          <w:numId w:val="1118"/>
+        </w:numPr>
+      </w:pPr>
+      <w:r>
+        <w:t xml:space="preserve">#609/#312: wip/B-JOURNEY-3-609-fixround</w:t>
+      </w:r>
+      <w:r>
+        <w:t xml:space="preserve"> </w:t>
+      </w:r>
+      <w:r>
+        <w:t xml:space="preserve">@11fd4e10</w:t>
+      </w:r>
+      <w:r>
+        <w:t xml:space="preserve"> </w:t>
+      </w:r>
+      <w:r>
+        <w:t xml:space="preserve">and wip/B-JOURNEY-3-312-fixround</w:t>
+      </w:r>
+      <w:r>
+        <w:t xml:space="preserve"> </w:t>
+      </w:r>
+      <w:r>
+        <w:t xml:space="preserve">@25b111d5</w:t>
+      </w:r>
+      <w:r>
+        <w:t xml:space="preserve">. B-609-3 and B-609-4 were not started.</w:t>
+      </w:r>
+    </w:p>
+    <w:p>
+      <w:pPr>
+        <w:pStyle w:val="Compact"/>
+        <w:numPr>
+          <w:ilvl w:val="1"/>
+          <w:numId w:val="1118"/>
+        </w:numPr>
+      </w:pPr>
+      <w:r>
+        <w:t xml:space="preserve">dunning #628/#322: wip/s-dunning-r4-backend</w:t>
+      </w:r>
+      <w:r>
+        <w:t xml:space="preserve"> </w:t>
+      </w:r>
+      <w:r>
+        <w:t xml:space="preserve">@c8a1c95b</w:t>
+      </w:r>
+      <w:r>
+        <w:t xml:space="preserve"> </w:t>
+      </w:r>
+      <w:r>
+        <w:t xml:space="preserve">(remove one banned cast in a test, eslint, finish B-628-11/8/6, push to #628) and the mobile items B-322-1/5/7, C-322-2 (not started).</w:t>
+      </w:r>
+    </w:p>
+    <w:p>
+      <w:pPr>
+        <w:pStyle w:val="Compact"/>
+        <w:numPr>
+          <w:ilvl w:val="1"/>
+          <w:numId w:val="1118"/>
+        </w:numPr>
+      </w:pPr>
+      <w:r>
+        <w:t xml:space="preserve">#329/#332: #329 BLOCK from both lenses at 83ee0e46 (Opus: only A-329-1, which closes when #332 merges into #329; Sol 1/1/1). #332 REQUEST CHANGES from both at 61eea115 (B-332-1: stale period numbers with no error). Also OR-112-16 (idempotent package create).</w:t>
+      </w:r>
+    </w:p>
+    <w:p>
+      <w:pPr>
+        <w:pStyle w:val="Compact"/>
+        <w:numPr>
+          <w:ilvl w:val="1"/>
+          <w:numId w:val="1118"/>
+        </w:numPr>
+      </w:pPr>
+      <w:r>
+        <w:t xml:space="preserve">#317 wearables: Sol REQUEST CHANGES 0/3/2 at 58c2d53 (cancellation before fence creation, native reads after logout, cloud error mapping); Opus APPROVE at the same head.</w:t>
+      </w:r>
+    </w:p>
+    <w:p>
+      <w:pPr>
+        <w:pStyle w:val="Compact"/>
+        <w:numPr>
+          <w:ilvl w:val="1"/>
+          <w:numId w:val="1118"/>
+        </w:numPr>
+      </w:pPr>
+      <w:r>
+        <w:t xml:space="preserve">#305/#330/#333 (release trio, item 4) and #331 (item 2).</w:t>
+      </w:r>
+    </w:p>
+    <w:p>
+      <w:pPr>
+        <w:pStyle w:val="Compact"/>
+        <w:numPr>
+          <w:ilvl w:val="0"/>
           <w:numId w:val="1115"/>
         </w:numPr>
       </w:pPr>
       <w:r>
-        <w:t xml:space="preserve">#609/#312: wip/B-JOURNEY-3-609-fixround</w:t>
-      </w:r>
-      <w:r>
-        <w:t xml:space="preserve"> </w:t>
-      </w:r>
-      <w:r>
-        <w:t xml:space="preserve">@11fd4e10</w:t>
-      </w:r>
-      <w:r>
-        <w:t xml:space="preserve"> </w:t>
-      </w:r>
-      <w:r>
-        <w:t xml:space="preserve">and wip/B-JOURNEY-3-312-fixround</w:t>
-      </w:r>
-      <w:r>
-        <w:t xml:space="preserve"> </w:t>
-      </w:r>
-      <w:r>
-        <w:t xml:space="preserve">@25b111d5</w:t>
-      </w:r>
-      <w:r>
-        <w:t xml:space="preserve">. B-609-3 and B-609-4 were not started.</w:t>
-      </w:r>
-    </w:p>
-    <w:p>
-      <w:pPr>
-        <w:pStyle w:val="Compact"/>
-        <w:numPr>
-          <w:ilvl w:val="1"/>
-          <w:numId w:val="1115"/>
-        </w:numPr>
-      </w:pPr>
-      <w:r>
-        <w:t xml:space="preserve">dunning #628/#322: wip/s-dunning-r4-backend</w:t>
-      </w:r>
-      <w:r>
-        <w:t xml:space="preserve"> </w:t>
-      </w:r>
-      <w:r>
-        <w:t xml:space="preserve">@c8a1c95b</w:t>
-      </w:r>
-      <w:r>
-        <w:t xml:space="preserve"> </w:t>
-      </w:r>
-      <w:r>
-        <w:t xml:space="preserve">(remove one banned cast in a test, eslint, finish B-628-11/8/6, push to #628) and the mobile items B-322-1/5/7, C-322-2 (not started).</w:t>
-      </w:r>
-    </w:p>
-    <w:p>
-      <w:pPr>
-        <w:pStyle w:val="Compact"/>
-        <w:numPr>
-          <w:ilvl w:val="1"/>
-          <w:numId w:val="1115"/>
-        </w:numPr>
-      </w:pPr>
-      <w:r>
-        <w:t xml:space="preserve">#329/#332: #329 BLOCK from both lenses at 83ee0e46 (Opus: only A-329-1, which closes when #332 merges into #329; Sol 1/1/1). #332 REQUEST CHANGES from both at 61eea115 (B-332-1: stale period numbers with no error). Also OR-112-16 (idempotent package create).</w:t>
-      </w:r>
-    </w:p>
-    <w:p>
-      <w:pPr>
-        <w:pStyle w:val="Compact"/>
-        <w:numPr>
-          <w:ilvl w:val="1"/>
-          <w:numId w:val="1115"/>
-        </w:numPr>
-      </w:pPr>
-      <w:r>
-        <w:t xml:space="preserve">#317 wearables: Sol REQUEST CHANGES 0/3/2 at 58c2d53 (cancellation before fence creation, native reads after logout, cloud error mapping); Opus APPROVE at the same head.</w:t>
-      </w:r>
-    </w:p>
-    <w:p>
-      <w:pPr>
-        <w:pStyle w:val="Compact"/>
-        <w:numPr>
-          <w:ilvl w:val="1"/>
-          <w:numId w:val="1115"/>
-        </w:numPr>
-      </w:pPr>
-      <w:r>
-        <w:t xml:space="preserve">#305/#330/#333 (release trio, item 4) and #331 (item 2).</w:t>
-      </w:r>
-    </w:p>
-    <w:p>
-      <w:pPr>
-        <w:pStyle w:val="Compact"/>
-        <w:numPr>
-          <w:ilvl w:val="0"/>
-          <w:numId w:val="1112"/>
-        </w:numPr>
-      </w:pPr>
-      <w:r>
         <w:t xml:space="preserve">Then start the not-started launch scope in section 12.C order, keeping 4-5 auditor lanes busy at all times.</w:t>
       </w:r>
     </w:p>
-    <w:bookmarkEnd w:id="45"/>
     <w:bookmarkEnd w:id="46"/>
     <w:bookmarkEnd w:id="47"/>
-    <w:bookmarkStart w:id="53" w:name="lessons-how-to-be-1-better"/>
+    <w:bookmarkEnd w:id="48"/>
+    <w:bookmarkStart w:id="54" w:name="lessons-how-to-be-1-better"/>
     <w:p>
       <w:pPr>
         <w:pStyle w:val="Heading2"/>
@@ -12086,7 +12360,7 @@
         <w:t xml:space="preserve">6. Lessons: how to be 1% better</w:t>
       </w:r>
     </w:p>
-    <w:bookmarkStart w:id="48" w:name="s-lessons-newest-read-these-first"/>
+    <w:bookmarkStart w:id="49" w:name="s-lessons-newest-read-these-first"/>
     <w:p>
       <w:pPr>
         <w:pStyle w:val="Heading3"/>
@@ -12100,7 +12374,7 @@
         <w:pStyle w:val="Compact"/>
         <w:numPr>
           <w:ilvl w:val="0"/>
-          <w:numId w:val="1116"/>
+          <w:numId w:val="1119"/>
         </w:numPr>
       </w:pPr>
       <w:r>
@@ -12112,7 +12386,7 @@
         <w:pStyle w:val="Compact"/>
         <w:numPr>
           <w:ilvl w:val="0"/>
-          <w:numId w:val="1116"/>
+          <w:numId w:val="1119"/>
         </w:numPr>
       </w:pPr>
       <w:r>
@@ -12124,7 +12398,7 @@
         <w:pStyle w:val="Compact"/>
         <w:numPr>
           <w:ilvl w:val="0"/>
-          <w:numId w:val="1116"/>
+          <w:numId w:val="1119"/>
         </w:numPr>
       </w:pPr>
       <w:r>
@@ -12136,7 +12410,7 @@
         <w:pStyle w:val="Compact"/>
         <w:numPr>
           <w:ilvl w:val="1"/>
-          <w:numId w:val="1117"/>
+          <w:numId w:val="1120"/>
         </w:numPr>
       </w:pPr>
       <w:r>
@@ -12148,7 +12422,7 @@
         <w:pStyle w:val="Compact"/>
         <w:numPr>
           <w:ilvl w:val="1"/>
-          <w:numId w:val="1117"/>
+          <w:numId w:val="1120"/>
         </w:numPr>
       </w:pPr>
       <w:r>
@@ -12160,7 +12434,7 @@
         <w:pStyle w:val="Compact"/>
         <w:numPr>
           <w:ilvl w:val="1"/>
-          <w:numId w:val="1117"/>
+          <w:numId w:val="1120"/>
         </w:numPr>
       </w:pPr>
       <w:r>
@@ -12172,7 +12446,7 @@
         <w:pStyle w:val="Compact"/>
         <w:numPr>
           <w:ilvl w:val="0"/>
-          <w:numId w:val="1116"/>
+          <w:numId w:val="1119"/>
         </w:numPr>
       </w:pPr>
       <w:r>
@@ -12184,7 +12458,7 @@
         <w:pStyle w:val="Compact"/>
         <w:numPr>
           <w:ilvl w:val="0"/>
-          <w:numId w:val="1116"/>
+          <w:numId w:val="1119"/>
         </w:numPr>
       </w:pPr>
       <w:r>
@@ -12196,7 +12470,7 @@
         <w:pStyle w:val="Compact"/>
         <w:numPr>
           <w:ilvl w:val="0"/>
-          <w:numId w:val="1116"/>
+          <w:numId w:val="1119"/>
         </w:numPr>
       </w:pPr>
       <w:r>
@@ -12208,7 +12482,7 @@
         <w:pStyle w:val="Compact"/>
         <w:numPr>
           <w:ilvl w:val="0"/>
-          <w:numId w:val="1116"/>
+          <w:numId w:val="1119"/>
         </w:numPr>
       </w:pPr>
       <w:r>
@@ -12232,7 +12506,7 @@
         <w:pStyle w:val="Compact"/>
         <w:numPr>
           <w:ilvl w:val="0"/>
-          <w:numId w:val="1116"/>
+          <w:numId w:val="1119"/>
         </w:numPr>
       </w:pPr>
       <w:r>
@@ -12256,7 +12530,7 @@
         <w:pStyle w:val="Compact"/>
         <w:numPr>
           <w:ilvl w:val="0"/>
-          <w:numId w:val="1116"/>
+          <w:numId w:val="1119"/>
         </w:numPr>
       </w:pPr>
       <w:r>
@@ -12283,7 +12557,7 @@
         <w:pStyle w:val="Compact"/>
         <w:numPr>
           <w:ilvl w:val="0"/>
-          <w:numId w:val="1116"/>
+          <w:numId w:val="1119"/>
         </w:numPr>
       </w:pPr>
       <w:r>
@@ -12337,7 +12611,7 @@
         <w:pStyle w:val="Compact"/>
         <w:numPr>
           <w:ilvl w:val="0"/>
-          <w:numId w:val="1116"/>
+          <w:numId w:val="1119"/>
         </w:numPr>
       </w:pPr>
       <w:r>
@@ -12349,15 +12623,15 @@
         <w:pStyle w:val="Compact"/>
         <w:numPr>
           <w:ilvl w:val="0"/>
-          <w:numId w:val="1116"/>
+          <w:numId w:val="1119"/>
         </w:numPr>
       </w:pPr>
       <w:r>
         <w:t xml:space="preserve">Small traps that cost minutes: pkill self-match (use pid files); the environment-approval API’s JSON body; fly-env-sync plan also needs the environment approval; Danger fails non-Conventional PR titles; stacked PRs get no CI.</w:t>
       </w:r>
     </w:p>
-    <w:bookmarkEnd w:id="48"/>
-    <w:bookmarkStart w:id="50" w:name="s-lessons"/>
+    <w:bookmarkEnd w:id="49"/>
+    <w:bookmarkStart w:id="51" w:name="s-lessons"/>
     <w:p>
       <w:pPr>
         <w:pStyle w:val="Heading3"/>
@@ -12371,7 +12645,7 @@
         <w:pStyle w:val="Compact"/>
         <w:numPr>
           <w:ilvl w:val="0"/>
-          <w:numId w:val="1118"/>
+          <w:numId w:val="1121"/>
         </w:numPr>
       </w:pPr>
       <w:r>
@@ -12383,7 +12657,7 @@
         <w:pStyle w:val="Compact"/>
         <w:numPr>
           <w:ilvl w:val="0"/>
-          <w:numId w:val="1118"/>
+          <w:numId w:val="1121"/>
         </w:numPr>
       </w:pPr>
       <w:r>
@@ -12407,7 +12681,7 @@
         <w:pStyle w:val="Compact"/>
         <w:numPr>
           <w:ilvl w:val="0"/>
-          <w:numId w:val="1118"/>
+          <w:numId w:val="1121"/>
         </w:numPr>
       </w:pPr>
       <w:r>
@@ -12419,7 +12693,7 @@
         <w:pStyle w:val="Compact"/>
         <w:numPr>
           <w:ilvl w:val="0"/>
-          <w:numId w:val="1118"/>
+          <w:numId w:val="1121"/>
         </w:numPr>
       </w:pPr>
       <w:r>
@@ -12440,7 +12714,7 @@
       <w:r>
         <w:t xml:space="preserve"> </w:t>
       </w:r>
-      <w:hyperlink r:id="rId49">
+      <w:hyperlink r:id="rId50">
         <w:r>
           <w:rPr>
             <w:rStyle w:val="Hyperlink"/>
@@ -12460,7 +12734,7 @@
         <w:pStyle w:val="Compact"/>
         <w:numPr>
           <w:ilvl w:val="0"/>
-          <w:numId w:val="1118"/>
+          <w:numId w:val="1121"/>
         </w:numPr>
       </w:pPr>
       <w:r>
@@ -12511,7 +12785,7 @@
         <w:pStyle w:val="Compact"/>
         <w:numPr>
           <w:ilvl w:val="0"/>
-          <w:numId w:val="1118"/>
+          <w:numId w:val="1121"/>
         </w:numPr>
       </w:pPr>
       <w:r>
@@ -12550,7 +12824,7 @@
         <w:pStyle w:val="Compact"/>
         <w:numPr>
           <w:ilvl w:val="0"/>
-          <w:numId w:val="1118"/>
+          <w:numId w:val="1121"/>
         </w:numPr>
       </w:pPr>
       <w:r>
@@ -12574,7 +12848,7 @@
         <w:pStyle w:val="Compact"/>
         <w:numPr>
           <w:ilvl w:val="0"/>
-          <w:numId w:val="1118"/>
+          <w:numId w:val="1121"/>
         </w:numPr>
       </w:pPr>
       <w:r>
@@ -12598,7 +12872,7 @@
         <w:pStyle w:val="Compact"/>
         <w:numPr>
           <w:ilvl w:val="0"/>
-          <w:numId w:val="1118"/>
+          <w:numId w:val="1121"/>
         </w:numPr>
       </w:pPr>
       <w:r>
@@ -12610,7 +12884,7 @@
         <w:pStyle w:val="Compact"/>
         <w:numPr>
           <w:ilvl w:val="0"/>
-          <w:numId w:val="1118"/>
+          <w:numId w:val="1121"/>
         </w:numPr>
       </w:pPr>
       <w:r>
@@ -12622,15 +12896,15 @@
         <w:pStyle w:val="Compact"/>
         <w:numPr>
           <w:ilvl w:val="0"/>
-          <w:numId w:val="1118"/>
+          <w:numId w:val="1121"/>
         </w:numPr>
       </w:pPr>
       <w:r>
         <w:t xml:space="preserve">The safety check may refuse PR-body edits that carry long agent-written text (B-TRAIN-2’s and the operator’s #604/#607/#609 body updates were refused). Don’t retry or route around it: keep the text in the lane report, point auditors to it, and let the PR’s own builder fold it in with its next fix round.</w:t>
       </w:r>
     </w:p>
-    <w:bookmarkEnd w:id="50"/>
-    <w:bookmarkStart w:id="51" w:name="s-lessons-1"/>
+    <w:bookmarkEnd w:id="51"/>
+    <w:bookmarkStart w:id="52" w:name="s-lessons-1"/>
     <w:p>
       <w:pPr>
         <w:pStyle w:val="Heading3"/>
@@ -12643,7 +12917,7 @@
       <w:pPr>
         <w:numPr>
           <w:ilvl w:val="0"/>
-          <w:numId w:val="1119"/>
+          <w:numId w:val="1122"/>
         </w:numPr>
       </w:pPr>
       <w:r>
@@ -12681,7 +12955,7 @@
       <w:pPr>
         <w:numPr>
           <w:ilvl w:val="0"/>
-          <w:numId w:val="1119"/>
+          <w:numId w:val="1122"/>
         </w:numPr>
       </w:pPr>
       <w:r>
@@ -12692,7 +12966,7 @@
       <w:pPr>
         <w:numPr>
           <w:ilvl w:val="0"/>
-          <w:numId w:val="1119"/>
+          <w:numId w:val="1122"/>
         </w:numPr>
       </w:pPr>
       <w:r>
@@ -12715,7 +12989,7 @@
       <w:pPr>
         <w:numPr>
           <w:ilvl w:val="0"/>
-          <w:numId w:val="1119"/>
+          <w:numId w:val="1122"/>
         </w:numPr>
       </w:pPr>
       <w:r>
@@ -12726,7 +13000,7 @@
       <w:pPr>
         <w:numPr>
           <w:ilvl w:val="0"/>
-          <w:numId w:val="1119"/>
+          <w:numId w:val="1122"/>
         </w:numPr>
       </w:pPr>
       <w:r>
@@ -12749,7 +13023,7 @@
       <w:pPr>
         <w:numPr>
           <w:ilvl w:val="0"/>
-          <w:numId w:val="1119"/>
+          <w:numId w:val="1122"/>
         </w:numPr>
       </w:pPr>
       <w:r>
@@ -12760,7 +13034,7 @@
       <w:pPr>
         <w:numPr>
           <w:ilvl w:val="0"/>
-          <w:numId w:val="1119"/>
+          <w:numId w:val="1122"/>
         </w:numPr>
       </w:pPr>
       <w:r>
@@ -12771,7 +13045,7 @@
       <w:pPr>
         <w:numPr>
           <w:ilvl w:val="0"/>
-          <w:numId w:val="1119"/>
+          <w:numId w:val="1122"/>
         </w:numPr>
       </w:pPr>
       <w:r>
@@ -12782,7 +13056,7 @@
       <w:pPr>
         <w:numPr>
           <w:ilvl w:val="0"/>
-          <w:numId w:val="1119"/>
+          <w:numId w:val="1122"/>
         </w:numPr>
       </w:pPr>
       <w:r>
@@ -12813,8 +13087,8 @@
         <w:t xml:space="preserve">authority in every message. Bradley’s standing approval covers merging audited, dependency-checked PRs; each deploy still needs his click (or an explicit standing approval).</w:t>
       </w:r>
     </w:p>
-    <w:bookmarkEnd w:id="51"/>
-    <w:bookmarkStart w:id="52" w:name="s-lessons-carried-from-v3"/>
+    <w:bookmarkEnd w:id="52"/>
+    <w:bookmarkStart w:id="53" w:name="s-lessons-carried-from-v3"/>
     <w:p>
       <w:pPr>
         <w:pStyle w:val="Heading3"/>
@@ -12835,7 +13109,7 @@
       <w:pPr>
         <w:numPr>
           <w:ilvl w:val="0"/>
-          <w:numId w:val="1120"/>
+          <w:numId w:val="1123"/>
         </w:numPr>
       </w:pPr>
       <w:r>
@@ -12846,7 +13120,7 @@
       <w:pPr>
         <w:numPr>
           <w:ilvl w:val="0"/>
-          <w:numId w:val="1120"/>
+          <w:numId w:val="1123"/>
         </w:numPr>
       </w:pPr>
       <w:r>
@@ -12878,7 +13152,7 @@
       <w:pPr>
         <w:numPr>
           <w:ilvl w:val="0"/>
-          <w:numId w:val="1120"/>
+          <w:numId w:val="1123"/>
         </w:numPr>
       </w:pPr>
       <w:r>
@@ -12889,7 +13163,7 @@
       <w:pPr>
         <w:numPr>
           <w:ilvl w:val="1"/>
-          <w:numId w:val="1121"/>
+          <w:numId w:val="1124"/>
         </w:numPr>
       </w:pPr>
       <w:r>
@@ -12912,7 +13186,7 @@
       <w:pPr>
         <w:numPr>
           <w:ilvl w:val="1"/>
-          <w:numId w:val="1121"/>
+          <w:numId w:val="1124"/>
         </w:numPr>
       </w:pPr>
       <w:r>
@@ -12923,7 +13197,7 @@
       <w:pPr>
         <w:numPr>
           <w:ilvl w:val="1"/>
-          <w:numId w:val="1121"/>
+          <w:numId w:val="1124"/>
         </w:numPr>
       </w:pPr>
       <w:r>
@@ -12934,7 +13208,7 @@
       <w:pPr>
         <w:numPr>
           <w:ilvl w:val="1"/>
-          <w:numId w:val="1121"/>
+          <w:numId w:val="1124"/>
         </w:numPr>
       </w:pPr>
       <w:r>
@@ -12945,7 +13219,7 @@
       <w:pPr>
         <w:numPr>
           <w:ilvl w:val="0"/>
-          <w:numId w:val="1120"/>
+          <w:numId w:val="1123"/>
         </w:numPr>
       </w:pPr>
       <w:r>
@@ -12956,7 +13230,7 @@
       <w:pPr>
         <w:numPr>
           <w:ilvl w:val="0"/>
-          <w:numId w:val="1120"/>
+          <w:numId w:val="1123"/>
         </w:numPr>
       </w:pPr>
       <w:r>
@@ -12967,7 +13241,7 @@
       <w:pPr>
         <w:numPr>
           <w:ilvl w:val="0"/>
-          <w:numId w:val="1120"/>
+          <w:numId w:val="1123"/>
         </w:numPr>
       </w:pPr>
       <w:r>
@@ -12978,7 +13252,7 @@
       <w:pPr>
         <w:numPr>
           <w:ilvl w:val="0"/>
-          <w:numId w:val="1120"/>
+          <w:numId w:val="1123"/>
         </w:numPr>
       </w:pPr>
       <w:r>
@@ -12989,7 +13263,7 @@
       <w:pPr>
         <w:numPr>
           <w:ilvl w:val="0"/>
-          <w:numId w:val="1120"/>
+          <w:numId w:val="1123"/>
         </w:numPr>
       </w:pPr>
       <w:r>
@@ -13000,7 +13274,7 @@
       <w:pPr>
         <w:numPr>
           <w:ilvl w:val="1"/>
-          <w:numId w:val="1122"/>
+          <w:numId w:val="1125"/>
         </w:numPr>
       </w:pPr>
       <w:r>
@@ -13011,7 +13285,7 @@
       <w:pPr>
         <w:numPr>
           <w:ilvl w:val="1"/>
-          <w:numId w:val="1122"/>
+          <w:numId w:val="1125"/>
         </w:numPr>
       </w:pPr>
       <w:r>
@@ -13022,7 +13296,7 @@
       <w:pPr>
         <w:numPr>
           <w:ilvl w:val="1"/>
-          <w:numId w:val="1122"/>
+          <w:numId w:val="1125"/>
         </w:numPr>
       </w:pPr>
       <w:r>
@@ -13033,7 +13307,7 @@
       <w:pPr>
         <w:numPr>
           <w:ilvl w:val="0"/>
-          <w:numId w:val="1120"/>
+          <w:numId w:val="1123"/>
         </w:numPr>
       </w:pPr>
       <w:r>
@@ -13083,7 +13357,7 @@
       <w:pPr>
         <w:numPr>
           <w:ilvl w:val="0"/>
-          <w:numId w:val="1120"/>
+          <w:numId w:val="1123"/>
         </w:numPr>
       </w:pPr>
       <w:r>
@@ -13094,7 +13368,7 @@
       <w:pPr>
         <w:numPr>
           <w:ilvl w:val="0"/>
-          <w:numId w:val="1120"/>
+          <w:numId w:val="1123"/>
         </w:numPr>
       </w:pPr>
       <w:r>
@@ -13111,7 +13385,7 @@
       <w:pPr>
         <w:numPr>
           <w:ilvl w:val="0"/>
-          <w:numId w:val="1120"/>
+          <w:numId w:val="1123"/>
         </w:numPr>
       </w:pPr>
       <w:r>
@@ -13122,16 +13396,16 @@
       <w:pPr>
         <w:numPr>
           <w:ilvl w:val="0"/>
-          <w:numId w:val="1120"/>
+          <w:numId w:val="1123"/>
         </w:numPr>
       </w:pPr>
       <w:r>
         <w:t xml:space="preserve">Be fast and short. He’s under a deadline with limited money. Lead with what changed for the clinic journey; keep jargon out; give numbers, not adjectives.</w:t>
       </w:r>
     </w:p>
-    <w:bookmarkEnd w:id="52"/>
     <w:bookmarkEnd w:id="53"/>
-    <w:bookmarkStart w:id="54" w:name="X8d34259dfddb8eff6b558a6d57db97d4e42af82"/>
+    <w:bookmarkEnd w:id="54"/>
+    <w:bookmarkStart w:id="55" w:name="X8d34259dfddb8eff6b558a6d57db97d4e42af82"/>
     <w:p>
       <w:pPr>
         <w:pStyle w:val="Heading2"/>
@@ -13153,7 +13427,7 @@
         <w:pStyle w:val="Compact"/>
         <w:numPr>
           <w:ilvl w:val="0"/>
-          <w:numId w:val="1123"/>
+          <w:numId w:val="1126"/>
         </w:numPr>
       </w:pPr>
       <w:r>
@@ -13165,7 +13439,7 @@
         <w:pStyle w:val="Compact"/>
         <w:numPr>
           <w:ilvl w:val="1"/>
-          <w:numId w:val="1124"/>
+          <w:numId w:val="1127"/>
         </w:numPr>
       </w:pPr>
       <w:r>
@@ -13177,7 +13451,7 @@
         <w:pStyle w:val="Compact"/>
         <w:numPr>
           <w:ilvl w:val="1"/>
-          <w:numId w:val="1124"/>
+          <w:numId w:val="1127"/>
         </w:numPr>
       </w:pPr>
       <w:r>
@@ -13189,7 +13463,7 @@
         <w:pStyle w:val="Compact"/>
         <w:numPr>
           <w:ilvl w:val="0"/>
-          <w:numId w:val="1123"/>
+          <w:numId w:val="1126"/>
         </w:numPr>
       </w:pPr>
       <w:r>
@@ -13201,7 +13475,7 @@
         <w:pStyle w:val="Compact"/>
         <w:numPr>
           <w:ilvl w:val="1"/>
-          <w:numId w:val="1125"/>
+          <w:numId w:val="1128"/>
         </w:numPr>
       </w:pPr>
       <w:r>
@@ -13213,7 +13487,7 @@
         <w:pStyle w:val="Compact"/>
         <w:numPr>
           <w:ilvl w:val="1"/>
-          <w:numId w:val="1125"/>
+          <w:numId w:val="1128"/>
         </w:numPr>
       </w:pPr>
       <w:r>
@@ -13225,7 +13499,7 @@
         <w:pStyle w:val="Compact"/>
         <w:numPr>
           <w:ilvl w:val="1"/>
-          <w:numId w:val="1125"/>
+          <w:numId w:val="1128"/>
         </w:numPr>
       </w:pPr>
       <w:r>
@@ -13237,7 +13511,7 @@
         <w:pStyle w:val="Compact"/>
         <w:numPr>
           <w:ilvl w:val="1"/>
-          <w:numId w:val="1125"/>
+          <w:numId w:val="1128"/>
         </w:numPr>
       </w:pPr>
       <w:r>
@@ -13249,7 +13523,7 @@
         <w:pStyle w:val="Compact"/>
         <w:numPr>
           <w:ilvl w:val="1"/>
-          <w:numId w:val="1125"/>
+          <w:numId w:val="1128"/>
         </w:numPr>
       </w:pPr>
       <w:r>
@@ -13261,7 +13535,7 @@
         <w:pStyle w:val="Compact"/>
         <w:numPr>
           <w:ilvl w:val="1"/>
-          <w:numId w:val="1125"/>
+          <w:numId w:val="1128"/>
         </w:numPr>
       </w:pPr>
       <w:r>
@@ -13273,7 +13547,7 @@
         <w:pStyle w:val="Compact"/>
         <w:numPr>
           <w:ilvl w:val="0"/>
-          <w:numId w:val="1123"/>
+          <w:numId w:val="1126"/>
         </w:numPr>
       </w:pPr>
       <w:r>
@@ -13285,7 +13559,7 @@
         <w:pStyle w:val="Compact"/>
         <w:numPr>
           <w:ilvl w:val="0"/>
-          <w:numId w:val="1123"/>
+          <w:numId w:val="1126"/>
         </w:numPr>
       </w:pPr>
       <w:r>
@@ -13297,7 +13571,7 @@
         <w:pStyle w:val="Compact"/>
         <w:numPr>
           <w:ilvl w:val="0"/>
-          <w:numId w:val="1123"/>
+          <w:numId w:val="1126"/>
         </w:numPr>
       </w:pPr>
       <w:r>
@@ -13309,7 +13583,7 @@
         <w:pStyle w:val="Compact"/>
         <w:numPr>
           <w:ilvl w:val="0"/>
-          <w:numId w:val="1123"/>
+          <w:numId w:val="1126"/>
         </w:numPr>
       </w:pPr>
       <w:r>
@@ -13321,7 +13595,7 @@
         <w:pStyle w:val="Compact"/>
         <w:numPr>
           <w:ilvl w:val="0"/>
-          <w:numId w:val="1123"/>
+          <w:numId w:val="1126"/>
         </w:numPr>
       </w:pPr>
       <w:r>
@@ -13341,7 +13615,7 @@
         <w:pStyle w:val="Compact"/>
         <w:numPr>
           <w:ilvl w:val="0"/>
-          <w:numId w:val="1126"/>
+          <w:numId w:val="1129"/>
         </w:numPr>
       </w:pPr>
       <w:r>
@@ -13353,7 +13627,7 @@
         <w:pStyle w:val="Compact"/>
         <w:numPr>
           <w:ilvl w:val="0"/>
-          <w:numId w:val="1126"/>
+          <w:numId w:val="1129"/>
         </w:numPr>
       </w:pPr>
       <w:r>
@@ -13377,7 +13651,7 @@
         <w:pStyle w:val="Compact"/>
         <w:numPr>
           <w:ilvl w:val="0"/>
-          <w:numId w:val="1126"/>
+          <w:numId w:val="1129"/>
         </w:numPr>
       </w:pPr>
       <w:r>
@@ -13389,7 +13663,7 @@
         <w:pStyle w:val="Compact"/>
         <w:numPr>
           <w:ilvl w:val="0"/>
-          <w:numId w:val="1126"/>
+          <w:numId w:val="1129"/>
         </w:numPr>
       </w:pPr>
       <w:r>
@@ -13401,7 +13675,7 @@
         <w:pStyle w:val="Compact"/>
         <w:numPr>
           <w:ilvl w:val="0"/>
-          <w:numId w:val="1126"/>
+          <w:numId w:val="1129"/>
         </w:numPr>
       </w:pPr>
       <w:r>
@@ -13413,7 +13687,7 @@
         <w:pStyle w:val="Compact"/>
         <w:numPr>
           <w:ilvl w:val="0"/>
-          <w:numId w:val="1126"/>
+          <w:numId w:val="1129"/>
         </w:numPr>
       </w:pPr>
       <w:r>
@@ -13425,7 +13699,7 @@
         <w:pStyle w:val="Compact"/>
         <w:numPr>
           <w:ilvl w:val="0"/>
-          <w:numId w:val="1126"/>
+          <w:numId w:val="1129"/>
         </w:numPr>
       </w:pPr>
       <w:r>
@@ -13444,8 +13718,8 @@
         <w:t xml:space="preserve">line in a lane report (check every HANDOFF section).</w:t>
       </w:r>
     </w:p>
-    <w:bookmarkEnd w:id="54"/>
-    <w:bookmarkStart w:id="55" w:name="the-operating-loop"/>
+    <w:bookmarkEnd w:id="55"/>
+    <w:bookmarkStart w:id="56" w:name="the-operating-loop"/>
     <w:p>
       <w:pPr>
         <w:pStyle w:val="Heading2"/>
@@ -13466,7 +13740,7 @@
       <w:pPr>
         <w:numPr>
           <w:ilvl w:val="0"/>
-          <w:numId w:val="1127"/>
+          <w:numId w:val="1130"/>
         </w:numPr>
       </w:pPr>
       <w:r>
@@ -13477,7 +13751,7 @@
       <w:pPr>
         <w:numPr>
           <w:ilvl w:val="0"/>
-          <w:numId w:val="1127"/>
+          <w:numId w:val="1130"/>
         </w:numPr>
       </w:pPr>
       <w:r>
@@ -13488,7 +13762,7 @@
       <w:pPr>
         <w:numPr>
           <w:ilvl w:val="0"/>
-          <w:numId w:val="1127"/>
+          <w:numId w:val="1130"/>
         </w:numPr>
       </w:pPr>
       <w:r>
@@ -13499,7 +13773,7 @@
       <w:pPr>
         <w:numPr>
           <w:ilvl w:val="1"/>
-          <w:numId w:val="1128"/>
+          <w:numId w:val="1131"/>
         </w:numPr>
       </w:pPr>
       <w:r>
@@ -13510,7 +13784,7 @@
       <w:pPr>
         <w:numPr>
           <w:ilvl w:val="1"/>
-          <w:numId w:val="1128"/>
+          <w:numId w:val="1131"/>
         </w:numPr>
       </w:pPr>
       <w:r>
@@ -13521,7 +13795,7 @@
       <w:pPr>
         <w:numPr>
           <w:ilvl w:val="1"/>
-          <w:numId w:val="1128"/>
+          <w:numId w:val="1131"/>
         </w:numPr>
       </w:pPr>
       <w:r>
@@ -13532,7 +13806,7 @@
       <w:pPr>
         <w:numPr>
           <w:ilvl w:val="1"/>
-          <w:numId w:val="1128"/>
+          <w:numId w:val="1131"/>
         </w:numPr>
       </w:pPr>
       <w:r>
@@ -13543,7 +13817,7 @@
       <w:pPr>
         <w:numPr>
           <w:ilvl w:val="1"/>
-          <w:numId w:val="1128"/>
+          <w:numId w:val="1131"/>
         </w:numPr>
       </w:pPr>
       <w:r>
@@ -13554,7 +13828,7 @@
       <w:pPr>
         <w:numPr>
           <w:ilvl w:val="0"/>
-          <w:numId w:val="1127"/>
+          <w:numId w:val="1130"/>
         </w:numPr>
       </w:pPr>
       <w:r>
@@ -13565,7 +13839,7 @@
       <w:pPr>
         <w:numPr>
           <w:ilvl w:val="0"/>
-          <w:numId w:val="1127"/>
+          <w:numId w:val="1130"/>
         </w:numPr>
       </w:pPr>
       <w:r>
@@ -13576,15 +13850,15 @@
       <w:pPr>
         <w:numPr>
           <w:ilvl w:val="0"/>
-          <w:numId w:val="1127"/>
+          <w:numId w:val="1130"/>
         </w:numPr>
       </w:pPr>
       <w:r>
         <w:t xml:space="preserve">Stacked PRs: retarget to main only so CI runs, and audit the incremental range (parent head..head). Closing and reopening a PR re-triggers pull_request CI after a retarget.</w:t>
       </w:r>
     </w:p>
-    <w:bookmarkEnd w:id="55"/>
-    <w:bookmarkStart w:id="56" w:name="grading-every-pr-and-slice-t0-t4"/>
+    <w:bookmarkEnd w:id="56"/>
+    <w:bookmarkStart w:id="57" w:name="grading-every-pr-and-slice-t0-t4"/>
     <w:p>
       <w:pPr>
         <w:pStyle w:val="Heading2"/>
@@ -13986,7 +14260,7 @@
       <w:pPr>
         <w:numPr>
           <w:ilvl w:val="0"/>
-          <w:numId w:val="1129"/>
+          <w:numId w:val="1132"/>
         </w:numPr>
       </w:pPr>
       <w:r>
@@ -13997,7 +14271,7 @@
       <w:pPr>
         <w:numPr>
           <w:ilvl w:val="0"/>
-          <w:numId w:val="1129"/>
+          <w:numId w:val="1132"/>
         </w:numPr>
       </w:pPr>
       <w:r>
@@ -14008,7 +14282,7 @@
       <w:pPr>
         <w:numPr>
           <w:ilvl w:val="0"/>
-          <w:numId w:val="1129"/>
+          <w:numId w:val="1132"/>
         </w:numPr>
       </w:pPr>
       <w:r>
@@ -14019,7 +14293,7 @@
       <w:pPr>
         <w:numPr>
           <w:ilvl w:val="0"/>
-          <w:numId w:val="1129"/>
+          <w:numId w:val="1132"/>
         </w:numPr>
       </w:pPr>
       <w:r>
@@ -14030,7 +14304,7 @@
       <w:pPr>
         <w:numPr>
           <w:ilvl w:val="0"/>
-          <w:numId w:val="1129"/>
+          <w:numId w:val="1132"/>
         </w:numPr>
       </w:pPr>
       <w:r>
@@ -14041,7 +14315,7 @@
       <w:pPr>
         <w:numPr>
           <w:ilvl w:val="0"/>
-          <w:numId w:val="1129"/>
+          <w:numId w:val="1132"/>
         </w:numPr>
       </w:pPr>
       <w:r>
@@ -14052,7 +14326,7 @@
       <w:pPr>
         <w:numPr>
           <w:ilvl w:val="0"/>
-          <w:numId w:val="1129"/>
+          <w:numId w:val="1132"/>
         </w:numPr>
       </w:pPr>
       <w:r>
@@ -14063,7 +14337,7 @@
       <w:pPr>
         <w:numPr>
           <w:ilvl w:val="0"/>
-          <w:numId w:val="1129"/>
+          <w:numId w:val="1132"/>
         </w:numPr>
       </w:pPr>
       <w:r>
@@ -14122,7 +14396,7 @@
       <w:pPr>
         <w:numPr>
           <w:ilvl w:val="0"/>
-          <w:numId w:val="1130"/>
+          <w:numId w:val="1133"/>
         </w:numPr>
       </w:pPr>
       <w:r>
@@ -14133,7 +14407,7 @@
       <w:pPr>
         <w:numPr>
           <w:ilvl w:val="0"/>
-          <w:numId w:val="1130"/>
+          <w:numId w:val="1133"/>
         </w:numPr>
       </w:pPr>
       <w:r>
@@ -14144,7 +14418,7 @@
       <w:pPr>
         <w:numPr>
           <w:ilvl w:val="0"/>
-          <w:numId w:val="1130"/>
+          <w:numId w:val="1133"/>
         </w:numPr>
       </w:pPr>
       <w:r>
@@ -14155,7 +14429,7 @@
       <w:pPr>
         <w:numPr>
           <w:ilvl w:val="0"/>
-          <w:numId w:val="1130"/>
+          <w:numId w:val="1133"/>
         </w:numPr>
       </w:pPr>
       <w:r>
@@ -14166,7 +14440,7 @@
       <w:pPr>
         <w:numPr>
           <w:ilvl w:val="0"/>
-          <w:numId w:val="1130"/>
+          <w:numId w:val="1133"/>
         </w:numPr>
       </w:pPr>
       <w:r>
@@ -14177,7 +14451,7 @@
       <w:pPr>
         <w:numPr>
           <w:ilvl w:val="0"/>
-          <w:numId w:val="1130"/>
+          <w:numId w:val="1133"/>
         </w:numPr>
       </w:pPr>
       <w:r>
@@ -14204,7 +14478,7 @@
       <w:pPr>
         <w:numPr>
           <w:ilvl w:val="0"/>
-          <w:numId w:val="1131"/>
+          <w:numId w:val="1134"/>
         </w:numPr>
       </w:pPr>
       <w:r>
@@ -14215,7 +14489,7 @@
       <w:pPr>
         <w:numPr>
           <w:ilvl w:val="0"/>
-          <w:numId w:val="1131"/>
+          <w:numId w:val="1134"/>
         </w:numPr>
       </w:pPr>
       <w:r>
@@ -14226,7 +14500,7 @@
       <w:pPr>
         <w:numPr>
           <w:ilvl w:val="0"/>
-          <w:numId w:val="1131"/>
+          <w:numId w:val="1134"/>
         </w:numPr>
       </w:pPr>
       <w:r>
@@ -14257,8 +14531,8 @@
         <w:t xml:space="preserve">A merged PR is not live. An orphaned screen is not a feature.</w:t>
       </w:r>
     </w:p>
-    <w:bookmarkEnd w:id="56"/>
-    <w:bookmarkStart w:id="57" w:name="the-22-rules-compressed"/>
+    <w:bookmarkEnd w:id="57"/>
+    <w:bookmarkStart w:id="58" w:name="the-22-rules-compressed"/>
     <w:p>
       <w:pPr>
         <w:pStyle w:val="Heading2"/>
@@ -14279,7 +14553,7 @@
       <w:pPr>
         <w:numPr>
           <w:ilvl w:val="0"/>
-          <w:numId w:val="1132"/>
+          <w:numId w:val="1135"/>
         </w:numPr>
       </w:pPr>
       <w:r>
@@ -14290,7 +14564,7 @@
       <w:pPr>
         <w:numPr>
           <w:ilvl w:val="0"/>
-          <w:numId w:val="1132"/>
+          <w:numId w:val="1135"/>
         </w:numPr>
       </w:pPr>
       <w:r>
@@ -14301,7 +14575,7 @@
       <w:pPr>
         <w:numPr>
           <w:ilvl w:val="0"/>
-          <w:numId w:val="1132"/>
+          <w:numId w:val="1135"/>
         </w:numPr>
       </w:pPr>
       <w:r>
@@ -14312,7 +14586,7 @@
       <w:pPr>
         <w:numPr>
           <w:ilvl w:val="0"/>
-          <w:numId w:val="1132"/>
+          <w:numId w:val="1135"/>
         </w:numPr>
       </w:pPr>
       <w:r>
@@ -14323,7 +14597,7 @@
       <w:pPr>
         <w:numPr>
           <w:ilvl w:val="0"/>
-          <w:numId w:val="1132"/>
+          <w:numId w:val="1135"/>
         </w:numPr>
       </w:pPr>
       <w:r>
@@ -14334,7 +14608,7 @@
       <w:pPr>
         <w:numPr>
           <w:ilvl w:val="0"/>
-          <w:numId w:val="1132"/>
+          <w:numId w:val="1135"/>
         </w:numPr>
       </w:pPr>
       <w:r>
@@ -14345,7 +14619,7 @@
       <w:pPr>
         <w:numPr>
           <w:ilvl w:val="0"/>
-          <w:numId w:val="1132"/>
+          <w:numId w:val="1135"/>
         </w:numPr>
       </w:pPr>
       <w:r>
@@ -14356,7 +14630,7 @@
       <w:pPr>
         <w:numPr>
           <w:ilvl w:val="0"/>
-          <w:numId w:val="1132"/>
+          <w:numId w:val="1135"/>
         </w:numPr>
       </w:pPr>
       <w:r>
@@ -14379,7 +14653,7 @@
       <w:pPr>
         <w:numPr>
           <w:ilvl w:val="0"/>
-          <w:numId w:val="1132"/>
+          <w:numId w:val="1135"/>
         </w:numPr>
       </w:pPr>
       <w:r>
@@ -14390,7 +14664,7 @@
       <w:pPr>
         <w:numPr>
           <w:ilvl w:val="0"/>
-          <w:numId w:val="1132"/>
+          <w:numId w:val="1135"/>
         </w:numPr>
       </w:pPr>
       <w:r>
@@ -14401,7 +14675,7 @@
       <w:pPr>
         <w:numPr>
           <w:ilvl w:val="0"/>
-          <w:numId w:val="1132"/>
+          <w:numId w:val="1135"/>
         </w:numPr>
       </w:pPr>
       <w:r>
@@ -14412,7 +14686,7 @@
       <w:pPr>
         <w:numPr>
           <w:ilvl w:val="0"/>
-          <w:numId w:val="1132"/>
+          <w:numId w:val="1135"/>
         </w:numPr>
       </w:pPr>
       <w:r>
@@ -14423,7 +14697,7 @@
       <w:pPr>
         <w:numPr>
           <w:ilvl w:val="0"/>
-          <w:numId w:val="1132"/>
+          <w:numId w:val="1135"/>
         </w:numPr>
       </w:pPr>
       <w:r>
@@ -14434,7 +14708,7 @@
       <w:pPr>
         <w:numPr>
           <w:ilvl w:val="0"/>
-          <w:numId w:val="1132"/>
+          <w:numId w:val="1135"/>
         </w:numPr>
       </w:pPr>
       <w:r>
@@ -14445,7 +14719,7 @@
       <w:pPr>
         <w:numPr>
           <w:ilvl w:val="0"/>
-          <w:numId w:val="1132"/>
+          <w:numId w:val="1135"/>
         </w:numPr>
       </w:pPr>
       <w:r>
@@ -14456,7 +14730,7 @@
       <w:pPr>
         <w:numPr>
           <w:ilvl w:val="0"/>
-          <w:numId w:val="1132"/>
+          <w:numId w:val="1135"/>
         </w:numPr>
       </w:pPr>
       <w:r>
@@ -14467,7 +14741,7 @@
       <w:pPr>
         <w:numPr>
           <w:ilvl w:val="0"/>
-          <w:numId w:val="1132"/>
+          <w:numId w:val="1135"/>
         </w:numPr>
       </w:pPr>
       <w:r>
@@ -14478,7 +14752,7 @@
       <w:pPr>
         <w:numPr>
           <w:ilvl w:val="0"/>
-          <w:numId w:val="1132"/>
+          <w:numId w:val="1135"/>
         </w:numPr>
       </w:pPr>
       <w:r>
@@ -14489,7 +14763,7 @@
       <w:pPr>
         <w:numPr>
           <w:ilvl w:val="0"/>
-          <w:numId w:val="1132"/>
+          <w:numId w:val="1135"/>
         </w:numPr>
       </w:pPr>
       <w:r>
@@ -14500,7 +14774,7 @@
       <w:pPr>
         <w:numPr>
           <w:ilvl w:val="0"/>
-          <w:numId w:val="1132"/>
+          <w:numId w:val="1135"/>
         </w:numPr>
       </w:pPr>
       <w:r>
@@ -14511,7 +14785,7 @@
       <w:pPr>
         <w:numPr>
           <w:ilvl w:val="0"/>
-          <w:numId w:val="1132"/>
+          <w:numId w:val="1135"/>
         </w:numPr>
       </w:pPr>
       <w:r>
@@ -14522,15 +14796,15 @@
       <w:pPr>
         <w:numPr>
           <w:ilvl w:val="0"/>
-          <w:numId w:val="1132"/>
+          <w:numId w:val="1135"/>
         </w:numPr>
       </w:pPr>
       <w:r>
         <w:t xml:space="preserve">G22 Governance must earn its cost.</w:t>
       </w:r>
     </w:p>
-    <w:bookmarkEnd w:id="57"/>
-    <w:bookmarkStart w:id="58" w:name="X0635bdffa95aec1579e8024febda83fa602250d"/>
+    <w:bookmarkEnd w:id="58"/>
+    <w:bookmarkStart w:id="59" w:name="X0635bdffa95aec1579e8024febda83fa602250d"/>
     <w:p>
       <w:pPr>
         <w:pStyle w:val="Heading2"/>
@@ -15380,7 +15654,7 @@
       <w:pPr>
         <w:numPr>
           <w:ilvl w:val="0"/>
-          <w:numId w:val="1133"/>
+          <w:numId w:val="1136"/>
         </w:numPr>
       </w:pPr>
       <w:r>
@@ -15391,7 +15665,7 @@
       <w:pPr>
         <w:numPr>
           <w:ilvl w:val="0"/>
-          <w:numId w:val="1133"/>
+          <w:numId w:val="1136"/>
         </w:numPr>
       </w:pPr>
       <w:r>
@@ -15405,7 +15679,7 @@
       <w:pPr>
         <w:numPr>
           <w:ilvl w:val="0"/>
-          <w:numId w:val="1133"/>
+          <w:numId w:val="1136"/>
         </w:numPr>
       </w:pPr>
       <w:r>
@@ -15425,7 +15699,7 @@
       <w:pPr>
         <w:numPr>
           <w:ilvl w:val="0"/>
-          <w:numId w:val="1133"/>
+          <w:numId w:val="1136"/>
         </w:numPr>
       </w:pPr>
       <w:r>
@@ -15436,7 +15710,7 @@
       <w:pPr>
         <w:numPr>
           <w:ilvl w:val="0"/>
-          <w:numId w:val="1133"/>
+          <w:numId w:val="1136"/>
         </w:numPr>
       </w:pPr>
       <w:r>
@@ -15455,7 +15729,7 @@
       <w:pPr>
         <w:numPr>
           <w:ilvl w:val="0"/>
-          <w:numId w:val="1134"/>
+          <w:numId w:val="1137"/>
         </w:numPr>
       </w:pPr>
       <w:r>
@@ -15466,7 +15740,7 @@
       <w:pPr>
         <w:numPr>
           <w:ilvl w:val="0"/>
-          <w:numId w:val="1134"/>
+          <w:numId w:val="1137"/>
         </w:numPr>
       </w:pPr>
       <w:r>
@@ -15477,7 +15751,7 @@
       <w:pPr>
         <w:numPr>
           <w:ilvl w:val="0"/>
-          <w:numId w:val="1134"/>
+          <w:numId w:val="1137"/>
         </w:numPr>
       </w:pPr>
       <w:r>
@@ -15488,7 +15762,7 @@
       <w:pPr>
         <w:numPr>
           <w:ilvl w:val="0"/>
-          <w:numId w:val="1134"/>
+          <w:numId w:val="1137"/>
         </w:numPr>
       </w:pPr>
       <w:r>
@@ -15499,7 +15773,7 @@
       <w:pPr>
         <w:numPr>
           <w:ilvl w:val="0"/>
-          <w:numId w:val="1134"/>
+          <w:numId w:val="1137"/>
         </w:numPr>
       </w:pPr>
       <w:r>
@@ -15510,7 +15784,7 @@
       <w:pPr>
         <w:numPr>
           <w:ilvl w:val="0"/>
-          <w:numId w:val="1134"/>
+          <w:numId w:val="1137"/>
         </w:numPr>
       </w:pPr>
       <w:r>
@@ -15521,7 +15795,7 @@
       <w:pPr>
         <w:numPr>
           <w:ilvl w:val="0"/>
-          <w:numId w:val="1134"/>
+          <w:numId w:val="1137"/>
         </w:numPr>
       </w:pPr>
       <w:r>
@@ -15532,7 +15806,7 @@
       <w:pPr>
         <w:numPr>
           <w:ilvl w:val="0"/>
-          <w:numId w:val="1134"/>
+          <w:numId w:val="1137"/>
         </w:numPr>
       </w:pPr>
       <w:r>
@@ -15543,7 +15817,7 @@
       <w:pPr>
         <w:numPr>
           <w:ilvl w:val="0"/>
-          <w:numId w:val="1134"/>
+          <w:numId w:val="1137"/>
         </w:numPr>
       </w:pPr>
       <w:r>
@@ -15566,8 +15840,8 @@
         <w:t xml:space="preserve">Every owner decision goes in LAST_OPERATOR_STATE.md §3 and the LIVE_STATE.md directions table within minutes (time and near-verbatim words). Anything superseded stays, marked superseded. Unrecorded chat decisions are lost to agent 111.</w:t>
       </w:r>
     </w:p>
-    <w:bookmarkEnd w:id="58"/>
-    <w:bookmarkStart w:id="59" w:name="X87932c8f9fe1df03120e42570292aae951dc720"/>
+    <w:bookmarkEnd w:id="59"/>
+    <w:bookmarkStart w:id="60" w:name="X87932c8f9fe1df03120e42570292aae951dc720"/>
     <w:p>
       <w:pPr>
         <w:pStyle w:val="Heading2"/>
@@ -15609,7 +15883,7 @@
         <w:pStyle w:val="Compact"/>
         <w:numPr>
           <w:ilvl w:val="0"/>
-          <w:numId w:val="1135"/>
+          <w:numId w:val="1138"/>
         </w:numPr>
       </w:pPr>
       <w:r>
@@ -15630,7 +15904,7 @@
         <w:pStyle w:val="Compact"/>
         <w:numPr>
           <w:ilvl w:val="0"/>
-          <w:numId w:val="1135"/>
+          <w:numId w:val="1138"/>
         </w:numPr>
       </w:pPr>
       <w:r>
@@ -15642,7 +15916,7 @@
         <w:pStyle w:val="Compact"/>
         <w:numPr>
           <w:ilvl w:val="0"/>
-          <w:numId w:val="1135"/>
+          <w:numId w:val="1138"/>
         </w:numPr>
       </w:pPr>
       <w:r>
@@ -15661,18 +15935,18 @@
       <w:pPr>
         <w:numPr>
           <w:ilvl w:val="0"/>
-          <w:numId w:val="1136"/>
-        </w:numPr>
-      </w:pPr>
-      <w:r>
-        <w:t xml:space="preserve">FIRST: the Day 1 package-sheet payment fix (OR-112-22, mobile PackageSelectionSheet: payment-intent endpoint, customer id, specific copy). Then the #627 B-627-8 fix (duplicate won-dispute reinstatement; Sol probe in probes/AUD-SOL-6-112/) followed by a Sol delta, then merge #627 and #321 together.</w:t>
-      </w:r>
-    </w:p>
-    <w:p>
-      <w:pPr>
-        <w:numPr>
-          <w:ilvl w:val="0"/>
-          <w:numId w:val="1136"/>
+          <w:numId w:val="1139"/>
+        </w:numPr>
+      </w:pPr>
+      <w:r>
+        <w:t xml:space="preserve">FIRST: the Day 1 package-sheet payment fix is BUILT as mobile #334 (needs a dual audit). Next, OR-112-23: the backend rejects renewing plans on payment-intent, and the sheet routes renewing plans to subscription checkout. Then the #627 B-627-8 fix (duplicate won-dispute reinstatement; Sol probe in probes/AUD-SOL-6-112/) followed by a Sol delta, then merge #627 and #321 together.</w:t>
+      </w:r>
+    </w:p>
+    <w:p>
+      <w:pPr>
+        <w:numPr>
+          <w:ilvl w:val="0"/>
+          <w:numId w:val="1139"/>
         </w:numPr>
       </w:pPr>
       <w:r>
@@ -15683,7 +15957,7 @@
       <w:pPr>
         <w:numPr>
           <w:ilvl w:val="0"/>
-          <w:numId w:val="1136"/>
+          <w:numId w:val="1139"/>
         </w:numPr>
       </w:pPr>
       <w:r>
@@ -15694,7 +15968,7 @@
       <w:pPr>
         <w:numPr>
           <w:ilvl w:val="0"/>
-          <w:numId w:val="1136"/>
+          <w:numId w:val="1139"/>
         </w:numPr>
       </w:pPr>
       <w:r>
@@ -15705,7 +15979,7 @@
       <w:pPr>
         <w:numPr>
           <w:ilvl w:val="0"/>
-          <w:numId w:val="1136"/>
+          <w:numId w:val="1139"/>
         </w:numPr>
       </w:pPr>
       <w:r>
@@ -15717,7 +15991,7 @@
         <w:pStyle w:val="Compact"/>
         <w:numPr>
           <w:ilvl w:val="1"/>
-          <w:numId w:val="1137"/>
+          <w:numId w:val="1140"/>
         </w:numPr>
       </w:pPr>
       <w:r>
@@ -15729,7 +16003,7 @@
         <w:pStyle w:val="Compact"/>
         <w:numPr>
           <w:ilvl w:val="1"/>
-          <w:numId w:val="1137"/>
+          <w:numId w:val="1140"/>
         </w:numPr>
       </w:pPr>
       <w:r>
@@ -15741,7 +16015,7 @@
         <w:pStyle w:val="Compact"/>
         <w:numPr>
           <w:ilvl w:val="1"/>
-          <w:numId w:val="1137"/>
+          <w:numId w:val="1140"/>
         </w:numPr>
       </w:pPr>
       <w:r>
@@ -15753,7 +16027,7 @@
         <w:pStyle w:val="Compact"/>
         <w:numPr>
           <w:ilvl w:val="1"/>
-          <w:numId w:val="1137"/>
+          <w:numId w:val="1140"/>
         </w:numPr>
       </w:pPr>
       <w:r>
@@ -15765,7 +16039,7 @@
         <w:pStyle w:val="Compact"/>
         <w:numPr>
           <w:ilvl w:val="1"/>
-          <w:numId w:val="1137"/>
+          <w:numId w:val="1140"/>
         </w:numPr>
       </w:pPr>
       <w:r>
@@ -15777,7 +16051,7 @@
         <w:pStyle w:val="Compact"/>
         <w:numPr>
           <w:ilvl w:val="1"/>
-          <w:numId w:val="1137"/>
+          <w:numId w:val="1140"/>
         </w:numPr>
       </w:pPr>
       <w:r>
@@ -15789,7 +16063,7 @@
         <w:pStyle w:val="Compact"/>
         <w:numPr>
           <w:ilvl w:val="1"/>
-          <w:numId w:val="1137"/>
+          <w:numId w:val="1140"/>
         </w:numPr>
       </w:pPr>
       <w:r>
@@ -15801,7 +16075,7 @@
         <w:pStyle w:val="Compact"/>
         <w:numPr>
           <w:ilvl w:val="1"/>
-          <w:numId w:val="1137"/>
+          <w:numId w:val="1140"/>
         </w:numPr>
       </w:pPr>
       <w:r>
@@ -15813,7 +16087,7 @@
         <w:pStyle w:val="Compact"/>
         <w:numPr>
           <w:ilvl w:val="1"/>
-          <w:numId w:val="1137"/>
+          <w:numId w:val="1140"/>
         </w:numPr>
       </w:pPr>
       <w:r>
@@ -15824,7 +16098,7 @@
       <w:pPr>
         <w:numPr>
           <w:ilvl w:val="0"/>
-          <w:numId w:val="1136"/>
+          <w:numId w:val="1139"/>
         </w:numPr>
       </w:pPr>
       <w:r>
@@ -15844,7 +16118,7 @@
         <w:pStyle w:val="Compact"/>
         <w:numPr>
           <w:ilvl w:val="0"/>
-          <w:numId w:val="1138"/>
+          <w:numId w:val="1141"/>
         </w:numPr>
       </w:pPr>
       <w:r>
@@ -15856,7 +16130,7 @@
         <w:pStyle w:val="Compact"/>
         <w:numPr>
           <w:ilvl w:val="0"/>
-          <w:numId w:val="1138"/>
+          <w:numId w:val="1141"/>
         </w:numPr>
       </w:pPr>
       <w:r>
@@ -15868,7 +16142,7 @@
         <w:pStyle w:val="Compact"/>
         <w:numPr>
           <w:ilvl w:val="0"/>
-          <w:numId w:val="1138"/>
+          <w:numId w:val="1141"/>
         </w:numPr>
       </w:pPr>
       <w:r>
@@ -15880,7 +16154,7 @@
         <w:pStyle w:val="Compact"/>
         <w:numPr>
           <w:ilvl w:val="0"/>
-          <w:numId w:val="1138"/>
+          <w:numId w:val="1141"/>
         </w:numPr>
       </w:pPr>
       <w:r>
@@ -15892,7 +16166,7 @@
         <w:pStyle w:val="Compact"/>
         <w:numPr>
           <w:ilvl w:val="0"/>
-          <w:numId w:val="1138"/>
+          <w:numId w:val="1141"/>
         </w:numPr>
       </w:pPr>
       <w:r>
@@ -15904,7 +16178,7 @@
         <w:pStyle w:val="Compact"/>
         <w:numPr>
           <w:ilvl w:val="0"/>
-          <w:numId w:val="1138"/>
+          <w:numId w:val="1141"/>
         </w:numPr>
       </w:pPr>
       <w:r>
@@ -15916,7 +16190,7 @@
         <w:pStyle w:val="Compact"/>
         <w:numPr>
           <w:ilvl w:val="0"/>
-          <w:numId w:val="1138"/>
+          <w:numId w:val="1141"/>
         </w:numPr>
       </w:pPr>
       <w:r>
@@ -15928,7 +16202,7 @@
         <w:pStyle w:val="Compact"/>
         <w:numPr>
           <w:ilvl w:val="0"/>
-          <w:numId w:val="1138"/>
+          <w:numId w:val="1141"/>
         </w:numPr>
       </w:pPr>
       <w:r>
@@ -15940,7 +16214,7 @@
         <w:pStyle w:val="Compact"/>
         <w:numPr>
           <w:ilvl w:val="0"/>
-          <w:numId w:val="1138"/>
+          <w:numId w:val="1141"/>
         </w:numPr>
       </w:pPr>
       <w:r>
@@ -15952,7 +16226,7 @@
         <w:pStyle w:val="Compact"/>
         <w:numPr>
           <w:ilvl w:val="0"/>
-          <w:numId w:val="1138"/>
+          <w:numId w:val="1141"/>
         </w:numPr>
       </w:pPr>
       <w:r>
@@ -15964,7 +16238,7 @@
         <w:pStyle w:val="Compact"/>
         <w:numPr>
           <w:ilvl w:val="0"/>
-          <w:numId w:val="1138"/>
+          <w:numId w:val="1141"/>
         </w:numPr>
       </w:pPr>
       <w:r>
@@ -15976,7 +16250,7 @@
         <w:pStyle w:val="Compact"/>
         <w:numPr>
           <w:ilvl w:val="0"/>
-          <w:numId w:val="1138"/>
+          <w:numId w:val="1141"/>
         </w:numPr>
       </w:pPr>
       <w:r>
@@ -15988,7 +16262,7 @@
         <w:pStyle w:val="Compact"/>
         <w:numPr>
           <w:ilvl w:val="0"/>
-          <w:numId w:val="1138"/>
+          <w:numId w:val="1141"/>
         </w:numPr>
       </w:pPr>
       <w:r>
@@ -16000,7 +16274,7 @@
         <w:pStyle w:val="Compact"/>
         <w:numPr>
           <w:ilvl w:val="0"/>
-          <w:numId w:val="1138"/>
+          <w:numId w:val="1141"/>
         </w:numPr>
       </w:pPr>
       <w:r>
@@ -16012,7 +16286,7 @@
         <w:pStyle w:val="Compact"/>
         <w:numPr>
           <w:ilvl w:val="0"/>
-          <w:numId w:val="1138"/>
+          <w:numId w:val="1141"/>
         </w:numPr>
       </w:pPr>
       <w:r>
@@ -16024,7 +16298,7 @@
         <w:pStyle w:val="Compact"/>
         <w:numPr>
           <w:ilvl w:val="0"/>
-          <w:numId w:val="1138"/>
+          <w:numId w:val="1141"/>
         </w:numPr>
       </w:pPr>
       <w:r>
@@ -16036,7 +16310,7 @@
         <w:pStyle w:val="Compact"/>
         <w:numPr>
           <w:ilvl w:val="0"/>
-          <w:numId w:val="1138"/>
+          <w:numId w:val="1141"/>
         </w:numPr>
       </w:pPr>
       <w:r>
@@ -16048,7 +16322,7 @@
         <w:pStyle w:val="Compact"/>
         <w:numPr>
           <w:ilvl w:val="0"/>
-          <w:numId w:val="1138"/>
+          <w:numId w:val="1141"/>
         </w:numPr>
       </w:pPr>
       <w:r>
@@ -16072,7 +16346,7 @@
         <w:pStyle w:val="Compact"/>
         <w:numPr>
           <w:ilvl w:val="0"/>
-          <w:numId w:val="1138"/>
+          <w:numId w:val="1141"/>
         </w:numPr>
       </w:pPr>
       <w:r>
@@ -16119,7 +16393,7 @@
         <w:pStyle w:val="Compact"/>
         <w:numPr>
           <w:ilvl w:val="0"/>
-          <w:numId w:val="1139"/>
+          <w:numId w:val="1142"/>
         </w:numPr>
       </w:pPr>
       <w:r>
@@ -16131,7 +16405,7 @@
         <w:pStyle w:val="Compact"/>
         <w:numPr>
           <w:ilvl w:val="0"/>
-          <w:numId w:val="1139"/>
+          <w:numId w:val="1142"/>
         </w:numPr>
       </w:pPr>
       <w:r>
@@ -16143,7 +16417,7 @@
         <w:pStyle w:val="Compact"/>
         <w:numPr>
           <w:ilvl w:val="0"/>
-          <w:numId w:val="1139"/>
+          <w:numId w:val="1142"/>
         </w:numPr>
       </w:pPr>
       <w:r>
@@ -16155,7 +16429,7 @@
         <w:pStyle w:val="Compact"/>
         <w:numPr>
           <w:ilvl w:val="0"/>
-          <w:numId w:val="1139"/>
+          <w:numId w:val="1142"/>
         </w:numPr>
       </w:pPr>
       <w:r>
@@ -16167,7 +16441,7 @@
         <w:pStyle w:val="Compact"/>
         <w:numPr>
           <w:ilvl w:val="0"/>
-          <w:numId w:val="1139"/>
+          <w:numId w:val="1142"/>
         </w:numPr>
       </w:pPr>
       <w:r>
@@ -16179,7 +16453,7 @@
         <w:pStyle w:val="Compact"/>
         <w:numPr>
           <w:ilvl w:val="0"/>
-          <w:numId w:val="1139"/>
+          <w:numId w:val="1142"/>
         </w:numPr>
       </w:pPr>
       <w:r>
@@ -16191,7 +16465,7 @@
         <w:pStyle w:val="Compact"/>
         <w:numPr>
           <w:ilvl w:val="0"/>
-          <w:numId w:val="1139"/>
+          <w:numId w:val="1142"/>
         </w:numPr>
       </w:pPr>
       <w:r>
@@ -16211,7 +16485,7 @@
         <w:pStyle w:val="Compact"/>
         <w:numPr>
           <w:ilvl w:val="0"/>
-          <w:numId w:val="1140"/>
+          <w:numId w:val="1143"/>
         </w:numPr>
       </w:pPr>
       <w:r>
@@ -16223,7 +16497,7 @@
         <w:pStyle w:val="Compact"/>
         <w:numPr>
           <w:ilvl w:val="0"/>
-          <w:numId w:val="1140"/>
+          <w:numId w:val="1143"/>
         </w:numPr>
       </w:pPr>
       <w:r>
@@ -16235,7 +16509,7 @@
         <w:pStyle w:val="Compact"/>
         <w:numPr>
           <w:ilvl w:val="0"/>
-          <w:numId w:val="1140"/>
+          <w:numId w:val="1143"/>
         </w:numPr>
       </w:pPr>
       <w:r>
@@ -16247,15 +16521,15 @@
         <w:pStyle w:val="Compact"/>
         <w:numPr>
           <w:ilvl w:val="0"/>
-          <w:numId w:val="1140"/>
+          <w:numId w:val="1143"/>
         </w:numPr>
       </w:pPr>
       <w:r>
         <w:t xml:space="preserve">Submit only when the whole launch scope meets the bar. Give Bradley a measured date from merge throughput.</w:t>
       </w:r>
     </w:p>
-    <w:bookmarkEnd w:id="59"/>
-    <w:bookmarkStart w:id="60" w:name="X66fa6cb9a96ab16550ae0f545deb8ece155990f"/>
+    <w:bookmarkEnd w:id="60"/>
+    <w:bookmarkStart w:id="61" w:name="X66fa6cb9a96ab16550ae0f545deb8ece155990f"/>
     <w:p>
       <w:pPr>
         <w:pStyle w:val="Heading2"/>
@@ -16269,7 +16543,7 @@
         <w:pStyle w:val="Compact"/>
         <w:numPr>
           <w:ilvl w:val="0"/>
-          <w:numId w:val="1141"/>
+          <w:numId w:val="1144"/>
         </w:numPr>
       </w:pPr>
       <w:r>
@@ -16281,7 +16555,7 @@
         <w:pStyle w:val="Compact"/>
         <w:numPr>
           <w:ilvl w:val="1"/>
-          <w:numId w:val="1142"/>
+          <w:numId w:val="1145"/>
         </w:numPr>
       </w:pPr>
       <w:r>
@@ -16308,7 +16582,7 @@
         <w:pStyle w:val="Compact"/>
         <w:numPr>
           <w:ilvl w:val="1"/>
-          <w:numId w:val="1142"/>
+          <w:numId w:val="1145"/>
         </w:numPr>
       </w:pPr>
       <w:r>
@@ -16320,7 +16594,7 @@
         <w:pStyle w:val="Compact"/>
         <w:numPr>
           <w:ilvl w:val="1"/>
-          <w:numId w:val="1142"/>
+          <w:numId w:val="1145"/>
         </w:numPr>
       </w:pPr>
       <w:r>
@@ -16359,7 +16633,7 @@
         <w:pStyle w:val="Compact"/>
         <w:numPr>
           <w:ilvl w:val="0"/>
-          <w:numId w:val="1141"/>
+          <w:numId w:val="1144"/>
         </w:numPr>
       </w:pPr>
       <w:r>
@@ -16383,7 +16657,7 @@
         <w:pStyle w:val="Compact"/>
         <w:numPr>
           <w:ilvl w:val="0"/>
-          <w:numId w:val="1141"/>
+          <w:numId w:val="1144"/>
         </w:numPr>
       </w:pPr>
       <w:r>
@@ -16395,7 +16669,7 @@
         <w:pStyle w:val="Compact"/>
         <w:numPr>
           <w:ilvl w:val="0"/>
-          <w:numId w:val="1141"/>
+          <w:numId w:val="1144"/>
         </w:numPr>
       </w:pPr>
       <w:r>
@@ -16407,7 +16681,7 @@
         <w:pStyle w:val="Compact"/>
         <w:numPr>
           <w:ilvl w:val="1"/>
-          <w:numId w:val="1143"/>
+          <w:numId w:val="1146"/>
         </w:numPr>
       </w:pPr>
       <w:r>
@@ -16419,7 +16693,7 @@
         <w:pStyle w:val="Compact"/>
         <w:numPr>
           <w:ilvl w:val="1"/>
-          <w:numId w:val="1143"/>
+          <w:numId w:val="1146"/>
         </w:numPr>
       </w:pPr>
       <w:r>
@@ -16440,7 +16714,7 @@
         <w:pStyle w:val="Compact"/>
         <w:numPr>
           <w:ilvl w:val="1"/>
-          <w:numId w:val="1143"/>
+          <w:numId w:val="1146"/>
         </w:numPr>
       </w:pPr>
       <w:r>
@@ -16452,7 +16726,7 @@
         <w:pStyle w:val="Compact"/>
         <w:numPr>
           <w:ilvl w:val="1"/>
-          <w:numId w:val="1143"/>
+          <w:numId w:val="1146"/>
         </w:numPr>
       </w:pPr>
       <w:r>
@@ -16464,7 +16738,7 @@
         <w:pStyle w:val="Compact"/>
         <w:numPr>
           <w:ilvl w:val="1"/>
-          <w:numId w:val="1143"/>
+          <w:numId w:val="1146"/>
         </w:numPr>
       </w:pPr>
       <w:r>
@@ -16476,7 +16750,7 @@
         <w:pStyle w:val="Compact"/>
         <w:numPr>
           <w:ilvl w:val="0"/>
-          <w:numId w:val="1141"/>
+          <w:numId w:val="1144"/>
         </w:numPr>
       </w:pPr>
       <w:r>
@@ -16491,7 +16765,7 @@
         <w:pStyle w:val="Compact"/>
         <w:numPr>
           <w:ilvl w:val="0"/>
-          <w:numId w:val="1141"/>
+          <w:numId w:val="1144"/>
         </w:numPr>
       </w:pPr>
       <w:r>
@@ -16503,7 +16777,7 @@
         <w:pStyle w:val="Compact"/>
         <w:numPr>
           <w:ilvl w:val="0"/>
-          <w:numId w:val="1141"/>
+          <w:numId w:val="1144"/>
         </w:numPr>
       </w:pPr>
       <w:r>
@@ -16527,15 +16801,15 @@
         <w:pStyle w:val="Compact"/>
         <w:numPr>
           <w:ilvl w:val="0"/>
-          <w:numId w:val="1141"/>
+          <w:numId w:val="1144"/>
         </w:numPr>
       </w:pPr>
       <w:r>
         <w:t xml:space="preserve">Bradley: Bellevue, WA (America/Los_Angeles); iPhone for TestFlight; Samsung Android phone; Mac without Homebrew.</w:t>
       </w:r>
     </w:p>
-    <w:bookmarkEnd w:id="60"/>
-    <w:bookmarkStart w:id="61" w:name="definition-of-done-the-clinic-launch"/>
+    <w:bookmarkEnd w:id="61"/>
+    <w:bookmarkStart w:id="62" w:name="definition-of-done-the-clinic-launch"/>
     <w:p>
       <w:pPr>
         <w:pStyle w:val="Heading2"/>
@@ -16556,7 +16830,7 @@
       <w:pPr>
         <w:numPr>
           <w:ilvl w:val="0"/>
-          <w:numId w:val="1144"/>
+          <w:numId w:val="1147"/>
         </w:numPr>
       </w:pPr>
       <w:r>
@@ -16567,7 +16841,7 @@
       <w:pPr>
         <w:numPr>
           <w:ilvl w:val="0"/>
-          <w:numId w:val="1144"/>
+          <w:numId w:val="1147"/>
         </w:numPr>
       </w:pPr>
       <w:r>
@@ -16578,7 +16852,7 @@
       <w:pPr>
         <w:numPr>
           <w:ilvl w:val="0"/>
-          <w:numId w:val="1144"/>
+          <w:numId w:val="1147"/>
         </w:numPr>
       </w:pPr>
       <w:r>
@@ -16589,7 +16863,7 @@
       <w:pPr>
         <w:numPr>
           <w:ilvl w:val="0"/>
-          <w:numId w:val="1144"/>
+          <w:numId w:val="1147"/>
         </w:numPr>
       </w:pPr>
       <w:r>
@@ -16600,7 +16874,7 @@
       <w:pPr>
         <w:numPr>
           <w:ilvl w:val="1"/>
-          <w:numId w:val="1145"/>
+          <w:numId w:val="1148"/>
         </w:numPr>
       </w:pPr>
       <w:r>
@@ -16611,7 +16885,7 @@
       <w:pPr>
         <w:numPr>
           <w:ilvl w:val="1"/>
-          <w:numId w:val="1145"/>
+          <w:numId w:val="1148"/>
         </w:numPr>
       </w:pPr>
       <w:r>
@@ -16622,7 +16896,7 @@
       <w:pPr>
         <w:numPr>
           <w:ilvl w:val="1"/>
-          <w:numId w:val="1145"/>
+          <w:numId w:val="1148"/>
         </w:numPr>
       </w:pPr>
       <w:r>
@@ -16633,7 +16907,7 @@
       <w:pPr>
         <w:numPr>
           <w:ilvl w:val="1"/>
-          <w:numId w:val="1145"/>
+          <w:numId w:val="1148"/>
         </w:numPr>
       </w:pPr>
       <w:r>
@@ -16644,7 +16918,7 @@
       <w:pPr>
         <w:numPr>
           <w:ilvl w:val="1"/>
-          <w:numId w:val="1145"/>
+          <w:numId w:val="1148"/>
         </w:numPr>
       </w:pPr>
       <w:r>
@@ -16655,7 +16929,7 @@
       <w:pPr>
         <w:numPr>
           <w:ilvl w:val="1"/>
-          <w:numId w:val="1145"/>
+          <w:numId w:val="1148"/>
         </w:numPr>
       </w:pPr>
       <w:r>
@@ -16666,7 +16940,7 @@
       <w:pPr>
         <w:numPr>
           <w:ilvl w:val="0"/>
-          <w:numId w:val="1144"/>
+          <w:numId w:val="1147"/>
         </w:numPr>
       </w:pPr>
       <w:r>
@@ -16677,7 +16951,7 @@
       <w:pPr>
         <w:numPr>
           <w:ilvl w:val="0"/>
-          <w:numId w:val="1144"/>
+          <w:numId w:val="1147"/>
         </w:numPr>
       </w:pPr>
       <w:r>
@@ -16688,7 +16962,7 @@
       <w:pPr>
         <w:numPr>
           <w:ilvl w:val="0"/>
-          <w:numId w:val="1144"/>
+          <w:numId w:val="1147"/>
         </w:numPr>
       </w:pPr>
       <w:r>
@@ -16699,7 +16973,7 @@
       <w:pPr>
         <w:numPr>
           <w:ilvl w:val="0"/>
-          <w:numId w:val="1144"/>
+          <w:numId w:val="1147"/>
         </w:numPr>
       </w:pPr>
       <w:r>
@@ -16710,7 +16984,7 @@
       <w:pPr>
         <w:numPr>
           <w:ilvl w:val="0"/>
-          <w:numId w:val="1144"/>
+          <w:numId w:val="1147"/>
         </w:numPr>
       </w:pPr>
       <w:r>
@@ -16721,7 +16995,7 @@
       <w:pPr>
         <w:numPr>
           <w:ilvl w:val="0"/>
-          <w:numId w:val="1144"/>
+          <w:numId w:val="1147"/>
         </w:numPr>
       </w:pPr>
       <w:r>
@@ -16732,7 +17006,7 @@
       <w:pPr>
         <w:numPr>
           <w:ilvl w:val="0"/>
-          <w:numId w:val="1144"/>
+          <w:numId w:val="1147"/>
         </w:numPr>
       </w:pPr>
       <w:r>
@@ -16747,8 +17021,8 @@
         <w:t xml:space="preserve">Until then, report the exact rung reached and the remaining gap. Never round progress up.</w:t>
       </w:r>
     </w:p>
-    <w:bookmarkEnd w:id="61"/>
-    <w:bookmarkStart w:id="62" w:name="importer-bucket-b-paused"/>
+    <w:bookmarkEnd w:id="62"/>
+    <w:bookmarkStart w:id="63" w:name="importer-bucket-b-paused"/>
     <w:p>
       <w:pPr>
         <w:pStyle w:val="Heading2"/>
@@ -16777,7 +17051,7 @@
       <w:pPr>
         <w:numPr>
           <w:ilvl w:val="0"/>
-          <w:numId w:val="1146"/>
+          <w:numId w:val="1149"/>
         </w:numPr>
       </w:pPr>
       <w:r>
@@ -16788,7 +17062,7 @@
       <w:pPr>
         <w:numPr>
           <w:ilvl w:val="0"/>
-          <w:numId w:val="1146"/>
+          <w:numId w:val="1149"/>
         </w:numPr>
       </w:pPr>
       <w:r>
@@ -16799,7 +17073,7 @@
       <w:pPr>
         <w:numPr>
           <w:ilvl w:val="0"/>
-          <w:numId w:val="1146"/>
+          <w:numId w:val="1149"/>
         </w:numPr>
       </w:pPr>
       <w:r>
@@ -16810,7 +17084,7 @@
       <w:pPr>
         <w:numPr>
           <w:ilvl w:val="0"/>
-          <w:numId w:val="1146"/>
+          <w:numId w:val="1149"/>
         </w:numPr>
       </w:pPr>
       <w:r>
@@ -16821,7 +17095,7 @@
       <w:pPr>
         <w:numPr>
           <w:ilvl w:val="0"/>
-          <w:numId w:val="1146"/>
+          <w:numId w:val="1149"/>
         </w:numPr>
       </w:pPr>
       <w:r>
@@ -16832,7 +17106,7 @@
       <w:pPr>
         <w:numPr>
           <w:ilvl w:val="0"/>
-          <w:numId w:val="1146"/>
+          <w:numId w:val="1149"/>
         </w:numPr>
       </w:pPr>
       <w:r>
@@ -16847,8 +17121,8 @@
         <w:t xml:space="preserve">Read every importer doc and decision record word for word before touching it.</w:t>
       </w:r>
     </w:p>
-    <w:bookmarkEnd w:id="62"/>
-    <w:bookmarkStart w:id="63" w:name="final-directive"/>
+    <w:bookmarkEnd w:id="63"/>
+    <w:bookmarkStart w:id="64" w:name="final-directive"/>
     <w:p>
       <w:pPr>
         <w:pStyle w:val="Heading2"/>
@@ -16895,8 +17169,8 @@
         <w:t xml:space="preserve">, have every lane write a HANDOFF section, regenerate this prompt as v7 with board.py, and leave nothing running. That is how agent 112 handed to you.</w:t>
       </w:r>
     </w:p>
-    <w:bookmarkEnd w:id="63"/>
     <w:bookmarkEnd w:id="64"/>
+    <w:bookmarkEnd w:id="65"/>
     <w:sectPr>
       <w:footnotePr>
         <w:numRestart w:val="eachSect"/>
@@ -18080,34 +18354,7 @@
     <w:abstractNumId w:val="991"/>
   </w:num>
   <w:num w:numId="1112">
-    <w:abstractNumId w:val="99411"/>
-    <w:lvlOverride w:ilvl="0">
-      <w:startOverride w:val="1"/>
-    </w:lvlOverride>
-    <w:lvlOverride w:ilvl="1">
-      <w:startOverride w:val="1"/>
-    </w:lvlOverride>
-    <w:lvlOverride w:ilvl="2">
-      <w:startOverride w:val="1"/>
-    </w:lvlOverride>
-    <w:lvlOverride w:ilvl="3">
-      <w:startOverride w:val="1"/>
-    </w:lvlOverride>
-    <w:lvlOverride w:ilvl="4">
-      <w:startOverride w:val="1"/>
-    </w:lvlOverride>
-    <w:lvlOverride w:ilvl="5">
-      <w:startOverride w:val="1"/>
-    </w:lvlOverride>
-    <w:lvlOverride w:ilvl="6">
-      <w:startOverride w:val="1"/>
-    </w:lvlOverride>
-    <w:lvlOverride w:ilvl="7">
-      <w:startOverride w:val="1"/>
-    </w:lvlOverride>
-    <w:lvlOverride w:ilvl="8">
-      <w:startOverride w:val="1"/>
-    </w:lvlOverride>
+    <w:abstractNumId w:val="991"/>
   </w:num>
   <w:num w:numId="1113">
     <w:abstractNumId w:val="991"/>
@@ -18116,70 +18363,43 @@
     <w:abstractNumId w:val="991"/>
   </w:num>
   <w:num w:numId="1115">
-    <w:abstractNumId w:val="991"/>
+    <w:abstractNumId w:val="99410"/>
+    <w:lvlOverride w:ilvl="0">
+      <w:startOverride w:val="0"/>
+    </w:lvlOverride>
+    <w:lvlOverride w:ilvl="1">
+      <w:startOverride w:val="0"/>
+    </w:lvlOverride>
+    <w:lvlOverride w:ilvl="2">
+      <w:startOverride w:val="0"/>
+    </w:lvlOverride>
+    <w:lvlOverride w:ilvl="3">
+      <w:startOverride w:val="0"/>
+    </w:lvlOverride>
+    <w:lvlOverride w:ilvl="4">
+      <w:startOverride w:val="0"/>
+    </w:lvlOverride>
+    <w:lvlOverride w:ilvl="5">
+      <w:startOverride w:val="0"/>
+    </w:lvlOverride>
+    <w:lvlOverride w:ilvl="6">
+      <w:startOverride w:val="0"/>
+    </w:lvlOverride>
+    <w:lvlOverride w:ilvl="7">
+      <w:startOverride w:val="0"/>
+    </w:lvlOverride>
+    <w:lvlOverride w:ilvl="8">
+      <w:startOverride w:val="0"/>
+    </w:lvlOverride>
   </w:num>
   <w:num w:numId="1116">
-    <w:abstractNumId w:val="99411"/>
-    <w:lvlOverride w:ilvl="0">
-      <w:startOverride w:val="1"/>
-    </w:lvlOverride>
-    <w:lvlOverride w:ilvl="1">
-      <w:startOverride w:val="1"/>
-    </w:lvlOverride>
-    <w:lvlOverride w:ilvl="2">
-      <w:startOverride w:val="1"/>
-    </w:lvlOverride>
-    <w:lvlOverride w:ilvl="3">
-      <w:startOverride w:val="1"/>
-    </w:lvlOverride>
-    <w:lvlOverride w:ilvl="4">
-      <w:startOverride w:val="1"/>
-    </w:lvlOverride>
-    <w:lvlOverride w:ilvl="5">
-      <w:startOverride w:val="1"/>
-    </w:lvlOverride>
-    <w:lvlOverride w:ilvl="6">
-      <w:startOverride w:val="1"/>
-    </w:lvlOverride>
-    <w:lvlOverride w:ilvl="7">
-      <w:startOverride w:val="1"/>
-    </w:lvlOverride>
-    <w:lvlOverride w:ilvl="8">
-      <w:startOverride w:val="1"/>
-    </w:lvlOverride>
+    <w:abstractNumId w:val="991"/>
   </w:num>
   <w:num w:numId="1117">
     <w:abstractNumId w:val="991"/>
   </w:num>
   <w:num w:numId="1118">
-    <w:abstractNumId w:val="99411"/>
-    <w:lvlOverride w:ilvl="0">
-      <w:startOverride w:val="1"/>
-    </w:lvlOverride>
-    <w:lvlOverride w:ilvl="1">
-      <w:startOverride w:val="1"/>
-    </w:lvlOverride>
-    <w:lvlOverride w:ilvl="2">
-      <w:startOverride w:val="1"/>
-    </w:lvlOverride>
-    <w:lvlOverride w:ilvl="3">
-      <w:startOverride w:val="1"/>
-    </w:lvlOverride>
-    <w:lvlOverride w:ilvl="4">
-      <w:startOverride w:val="1"/>
-    </w:lvlOverride>
-    <w:lvlOverride w:ilvl="5">
-      <w:startOverride w:val="1"/>
-    </w:lvlOverride>
-    <w:lvlOverride w:ilvl="6">
-      <w:startOverride w:val="1"/>
-    </w:lvlOverride>
-    <w:lvlOverride w:ilvl="7">
-      <w:startOverride w:val="1"/>
-    </w:lvlOverride>
-    <w:lvlOverride w:ilvl="8">
-      <w:startOverride w:val="1"/>
-    </w:lvlOverride>
+    <w:abstractNumId w:val="991"/>
   </w:num>
   <w:num w:numId="1119">
     <w:abstractNumId w:val="99411"/>
@@ -18212,6 +18432,9 @@
     </w:lvlOverride>
   </w:num>
   <w:num w:numId="1120">
+    <w:abstractNumId w:val="991"/>
+  </w:num>
+  <w:num w:numId="1121">
     <w:abstractNumId w:val="99411"/>
     <w:lvlOverride w:ilvl="0">
       <w:startOverride w:val="1"/>
@@ -18241,11 +18464,35 @@
       <w:startOverride w:val="1"/>
     </w:lvlOverride>
   </w:num>
-  <w:num w:numId="1121">
-    <w:abstractNumId w:val="991"/>
-  </w:num>
   <w:num w:numId="1122">
-    <w:abstractNumId w:val="991"/>
+    <w:abstractNumId w:val="99411"/>
+    <w:lvlOverride w:ilvl="0">
+      <w:startOverride w:val="1"/>
+    </w:lvlOverride>
+    <w:lvlOverride w:ilvl="1">
+      <w:startOverride w:val="1"/>
+    </w:lvlOverride>
+    <w:lvlOverride w:ilvl="2">
+      <w:startOverride w:val="1"/>
+    </w:lvlOverride>
+    <w:lvlOverride w:ilvl="3">
+      <w:startOverride w:val="1"/>
+    </w:lvlOverride>
+    <w:lvlOverride w:ilvl="4">
+      <w:startOverride w:val="1"/>
+    </w:lvlOverride>
+    <w:lvlOverride w:ilvl="5">
+      <w:startOverride w:val="1"/>
+    </w:lvlOverride>
+    <w:lvlOverride w:ilvl="6">
+      <w:startOverride w:val="1"/>
+    </w:lvlOverride>
+    <w:lvlOverride w:ilvl="7">
+      <w:startOverride w:val="1"/>
+    </w:lvlOverride>
+    <w:lvlOverride w:ilvl="8">
+      <w:startOverride w:val="1"/>
+    </w:lvlOverride>
   </w:num>
   <w:num w:numId="1123">
     <w:abstractNumId w:val="99411"/>
@@ -18320,7 +18567,34 @@
     <w:abstractNumId w:val="991"/>
   </w:num>
   <w:num w:numId="1129">
-    <w:abstractNumId w:val="991"/>
+    <w:abstractNumId w:val="99411"/>
+    <w:lvlOverride w:ilvl="0">
+      <w:startOverride w:val="1"/>
+    </w:lvlOverride>
+    <w:lvlOverride w:ilvl="1">
+      <w:startOverride w:val="1"/>
+    </w:lvlOverride>
+    <w:lvlOverride w:ilvl="2">
+      <w:startOverride w:val="1"/>
+    </w:lvlOverride>
+    <w:lvlOverride w:ilvl="3">
+      <w:startOverride w:val="1"/>
+    </w:lvlOverride>
+    <w:lvlOverride w:ilvl="4">
+      <w:startOverride w:val="1"/>
+    </w:lvlOverride>
+    <w:lvlOverride w:ilvl="5">
+      <w:startOverride w:val="1"/>
+    </w:lvlOverride>
+    <w:lvlOverride w:ilvl="6">
+      <w:startOverride w:val="1"/>
+    </w:lvlOverride>
+    <w:lvlOverride w:ilvl="7">
+      <w:startOverride w:val="1"/>
+    </w:lvlOverride>
+    <w:lvlOverride w:ilvl="8">
+      <w:startOverride w:val="1"/>
+    </w:lvlOverride>
   </w:num>
   <w:num w:numId="1130">
     <w:abstractNumId w:val="991"/>
@@ -18329,34 +18603,7 @@
     <w:abstractNumId w:val="991"/>
   </w:num>
   <w:num w:numId="1132">
-    <w:abstractNumId w:val="99411"/>
-    <w:lvlOverride w:ilvl="0">
-      <w:startOverride w:val="1"/>
-    </w:lvlOverride>
-    <w:lvlOverride w:ilvl="1">
-      <w:startOverride w:val="1"/>
-    </w:lvlOverride>
-    <w:lvlOverride w:ilvl="2">
-      <w:startOverride w:val="1"/>
-    </w:lvlOverride>
-    <w:lvlOverride w:ilvl="3">
-      <w:startOverride w:val="1"/>
-    </w:lvlOverride>
-    <w:lvlOverride w:ilvl="4">
-      <w:startOverride w:val="1"/>
-    </w:lvlOverride>
-    <w:lvlOverride w:ilvl="5">
-      <w:startOverride w:val="1"/>
-    </w:lvlOverride>
-    <w:lvlOverride w:ilvl="6">
-      <w:startOverride w:val="1"/>
-    </w:lvlOverride>
-    <w:lvlOverride w:ilvl="7">
-      <w:startOverride w:val="1"/>
-    </w:lvlOverride>
-    <w:lvlOverride w:ilvl="8">
-      <w:startOverride w:val="1"/>
-    </w:lvlOverride>
+    <w:abstractNumId w:val="991"/>
   </w:num>
   <w:num w:numId="1133">
     <w:abstractNumId w:val="991"/>
@@ -18395,76 +18642,103 @@
     </w:lvlOverride>
   </w:num>
   <w:num w:numId="1136">
-    <w:abstractNumId w:val="99410"/>
-    <w:lvlOverride w:ilvl="0">
-      <w:startOverride w:val="0"/>
-    </w:lvlOverride>
-    <w:lvlOverride w:ilvl="1">
-      <w:startOverride w:val="0"/>
-    </w:lvlOverride>
-    <w:lvlOverride w:ilvl="2">
-      <w:startOverride w:val="0"/>
-    </w:lvlOverride>
-    <w:lvlOverride w:ilvl="3">
-      <w:startOverride w:val="0"/>
-    </w:lvlOverride>
-    <w:lvlOverride w:ilvl="4">
-      <w:startOverride w:val="0"/>
-    </w:lvlOverride>
-    <w:lvlOverride w:ilvl="5">
-      <w:startOverride w:val="0"/>
-    </w:lvlOverride>
-    <w:lvlOverride w:ilvl="6">
-      <w:startOverride w:val="0"/>
-    </w:lvlOverride>
-    <w:lvlOverride w:ilvl="7">
-      <w:startOverride w:val="0"/>
-    </w:lvlOverride>
-    <w:lvlOverride w:ilvl="8">
-      <w:startOverride w:val="0"/>
-    </w:lvlOverride>
+    <w:abstractNumId w:val="991"/>
   </w:num>
   <w:num w:numId="1137">
     <w:abstractNumId w:val="991"/>
   </w:num>
   <w:num w:numId="1138">
-    <w:abstractNumId w:val="99419"/>
+    <w:abstractNumId w:val="99411"/>
     <w:lvlOverride w:ilvl="0">
-      <w:startOverride w:val="9"/>
+      <w:startOverride w:val="1"/>
     </w:lvlOverride>
     <w:lvlOverride w:ilvl="1">
-      <w:startOverride w:val="9"/>
+      <w:startOverride w:val="1"/>
     </w:lvlOverride>
     <w:lvlOverride w:ilvl="2">
-      <w:startOverride w:val="9"/>
+      <w:startOverride w:val="1"/>
     </w:lvlOverride>
     <w:lvlOverride w:ilvl="3">
-      <w:startOverride w:val="9"/>
+      <w:startOverride w:val="1"/>
     </w:lvlOverride>
     <w:lvlOverride w:ilvl="4">
-      <w:startOverride w:val="9"/>
+      <w:startOverride w:val="1"/>
     </w:lvlOverride>
     <w:lvlOverride w:ilvl="5">
-      <w:startOverride w:val="9"/>
+      <w:startOverride w:val="1"/>
     </w:lvlOverride>
     <w:lvlOverride w:ilvl="6">
-      <w:startOverride w:val="9"/>
+      <w:startOverride w:val="1"/>
     </w:lvlOverride>
     <w:lvlOverride w:ilvl="7">
-      <w:startOverride w:val="9"/>
+      <w:startOverride w:val="1"/>
     </w:lvlOverride>
     <w:lvlOverride w:ilvl="8">
-      <w:startOverride w:val="9"/>
+      <w:startOverride w:val="1"/>
     </w:lvlOverride>
   </w:num>
   <w:num w:numId="1139">
-    <w:abstractNumId w:val="991"/>
+    <w:abstractNumId w:val="99410"/>
+    <w:lvlOverride w:ilvl="0">
+      <w:startOverride w:val="0"/>
+    </w:lvlOverride>
+    <w:lvlOverride w:ilvl="1">
+      <w:startOverride w:val="0"/>
+    </w:lvlOverride>
+    <w:lvlOverride w:ilvl="2">
+      <w:startOverride w:val="0"/>
+    </w:lvlOverride>
+    <w:lvlOverride w:ilvl="3">
+      <w:startOverride w:val="0"/>
+    </w:lvlOverride>
+    <w:lvlOverride w:ilvl="4">
+      <w:startOverride w:val="0"/>
+    </w:lvlOverride>
+    <w:lvlOverride w:ilvl="5">
+      <w:startOverride w:val="0"/>
+    </w:lvlOverride>
+    <w:lvlOverride w:ilvl="6">
+      <w:startOverride w:val="0"/>
+    </w:lvlOverride>
+    <w:lvlOverride w:ilvl="7">
+      <w:startOverride w:val="0"/>
+    </w:lvlOverride>
+    <w:lvlOverride w:ilvl="8">
+      <w:startOverride w:val="0"/>
+    </w:lvlOverride>
   </w:num>
   <w:num w:numId="1140">
     <w:abstractNumId w:val="991"/>
   </w:num>
   <w:num w:numId="1141">
-    <w:abstractNumId w:val="991"/>
+    <w:abstractNumId w:val="99419"/>
+    <w:lvlOverride w:ilvl="0">
+      <w:startOverride w:val="9"/>
+    </w:lvlOverride>
+    <w:lvlOverride w:ilvl="1">
+      <w:startOverride w:val="9"/>
+    </w:lvlOverride>
+    <w:lvlOverride w:ilvl="2">
+      <w:startOverride w:val="9"/>
+    </w:lvlOverride>
+    <w:lvlOverride w:ilvl="3">
+      <w:startOverride w:val="9"/>
+    </w:lvlOverride>
+    <w:lvlOverride w:ilvl="4">
+      <w:startOverride w:val="9"/>
+    </w:lvlOverride>
+    <w:lvlOverride w:ilvl="5">
+      <w:startOverride w:val="9"/>
+    </w:lvlOverride>
+    <w:lvlOverride w:ilvl="6">
+      <w:startOverride w:val="9"/>
+    </w:lvlOverride>
+    <w:lvlOverride w:ilvl="7">
+      <w:startOverride w:val="9"/>
+    </w:lvlOverride>
+    <w:lvlOverride w:ilvl="8">
+      <w:startOverride w:val="9"/>
+    </w:lvlOverride>
   </w:num>
   <w:num w:numId="1142">
     <w:abstractNumId w:val="991"/>
@@ -18473,39 +18747,48 @@
     <w:abstractNumId w:val="991"/>
   </w:num>
   <w:num w:numId="1144">
-    <w:abstractNumId w:val="99411"/>
-    <w:lvlOverride w:ilvl="0">
-      <w:startOverride w:val="1"/>
-    </w:lvlOverride>
-    <w:lvlOverride w:ilvl="1">
-      <w:startOverride w:val="1"/>
-    </w:lvlOverride>
-    <w:lvlOverride w:ilvl="2">
-      <w:startOverride w:val="1"/>
-    </w:lvlOverride>
-    <w:lvlOverride w:ilvl="3">
-      <w:startOverride w:val="1"/>
-    </w:lvlOverride>
-    <w:lvlOverride w:ilvl="4">
-      <w:startOverride w:val="1"/>
-    </w:lvlOverride>
-    <w:lvlOverride w:ilvl="5">
-      <w:startOverride w:val="1"/>
-    </w:lvlOverride>
-    <w:lvlOverride w:ilvl="6">
-      <w:startOverride w:val="1"/>
-    </w:lvlOverride>
-    <w:lvlOverride w:ilvl="7">
-      <w:startOverride w:val="1"/>
-    </w:lvlOverride>
-    <w:lvlOverride w:ilvl="8">
-      <w:startOverride w:val="1"/>
-    </w:lvlOverride>
+    <w:abstractNumId w:val="991"/>
   </w:num>
   <w:num w:numId="1145">
     <w:abstractNumId w:val="991"/>
   </w:num>
   <w:num w:numId="1146">
+    <w:abstractNumId w:val="991"/>
+  </w:num>
+  <w:num w:numId="1147">
+    <w:abstractNumId w:val="99411"/>
+    <w:lvlOverride w:ilvl="0">
+      <w:startOverride w:val="1"/>
+    </w:lvlOverride>
+    <w:lvlOverride w:ilvl="1">
+      <w:startOverride w:val="1"/>
+    </w:lvlOverride>
+    <w:lvlOverride w:ilvl="2">
+      <w:startOverride w:val="1"/>
+    </w:lvlOverride>
+    <w:lvlOverride w:ilvl="3">
+      <w:startOverride w:val="1"/>
+    </w:lvlOverride>
+    <w:lvlOverride w:ilvl="4">
+      <w:startOverride w:val="1"/>
+    </w:lvlOverride>
+    <w:lvlOverride w:ilvl="5">
+      <w:startOverride w:val="1"/>
+    </w:lvlOverride>
+    <w:lvlOverride w:ilvl="6">
+      <w:startOverride w:val="1"/>
+    </w:lvlOverride>
+    <w:lvlOverride w:ilvl="7">
+      <w:startOverride w:val="1"/>
+    </w:lvlOverride>
+    <w:lvlOverride w:ilvl="8">
+      <w:startOverride w:val="1"/>
+    </w:lvlOverride>
+  </w:num>
+  <w:num w:numId="1148">
+    <w:abstractNumId w:val="991"/>
+  </w:num>
+  <w:num w:numId="1149">
     <w:abstractNumId w:val="991"/>
   </w:num>
 </w:numbering>

</xml_diff>

<commit_message>
op 112: owner 16:05 no agents; v6 recurring-first
</commit_message>
<xml_diff>
--- a/handoffs/op-6870f2ca/TGP-Operator-Prompt-v6-Agent-113.docx
+++ b/handoffs/op-6870f2ca/TGP-Operator-Prompt-v6-Agent-113.docx
@@ -25,7 +25,7 @@
         <w:t xml:space="preserve">“lets prepare for your OUT OF CREDIT reitre … prep for [the next agent] (a fresh, no prior context agent) who will need you to cleanly stop, no wasted work, and a great pickup-prompt from you - just like you used the agent 111 prompt document, but perferably yours would be even better!”</w:t>
       </w:r>
       <w:r>
-        <w:t xml:space="preserve">). Snapshot: 2026-10-02 16:01 PDT (real clock). The newest copy lives in tgp-agent-context at handoffs/op-6870f2ca/TGP-Operator-Prompt-v6-Agent-113.md (and .docx). Paste this whole document as the first message to the next operator and attach the owner documents listed in section 3.4. It replaces prompt v5 (handoffs/op-f083060f/TGP-Operator-Prompt-v5-Agent-111.md, kept for history). Most of v5 is carried over word for word. Changed or new: the START HERE card (new), 0.A (new), 2 (10-02 update), 3 (rewritten: new ops kit), 4.14 (new), 5 (rewritten), 6.0 (112’s lessons, new), 7, 12, 13, 14 and 16.</w:t>
+        <w:t xml:space="preserve">). Snapshot: 2026-10-02 16:06 PDT (real clock). The newest copy lives in tgp-agent-context at handoffs/op-6870f2ca/TGP-Operator-Prompt-v6-Agent-113.md (and .docx). Paste this whole document as the first message to the next operator and attach the owner documents listed in section 3.4. It replaces prompt v5 (handoffs/op-f083060f/TGP-Operator-Prompt-v5-Agent-111.md, kept for history). Most of v5 is carried over word for word. Changed or new: the START HERE card (new), 0.A (new), 2 (10-02 update), 3 (rewritten: new ops kit), 4.14 (new), 5 (rewritten), 6.0 (112’s lessons, new), 7, 12, 13, 14 and 16.</w:t>
       </w:r>
     </w:p>
     <w:p>
@@ -2658,7 +2658,7 @@
         </w:numPr>
       </w:pPr>
       <w:r>
-        <w:t xml:space="preserve">Agent 112 (11:20-16:01) merged mobile #310 (consultation onboarding), backend #607 (consultation intake; deployed 13:01-13:08 with migration 20270212000000) and mobile #324 (one support email). It also ran 17 parallel lanes that produced about 35 audit verdicts and 15 fix rounds or new PRs.</w:t>
+        <w:t xml:space="preserve">Agent 112 (11:20-16:06) merged mobile #310 (consultation onboarding), backend #607 (consultation intake; deployed 13:01-13:08 with migration 20270212000000) and mobile #324 (one support email). It also ran 17 parallel lanes that produced about 35 audit verdicts and 15 fix rounds or new PRs.</w:t>
       </w:r>
     </w:p>
     <w:p>
@@ -8792,6 +8792,30 @@
         </w:numPr>
       </w:pPr>
       <w:r>
+        <w:t xml:space="preserve">OWNER DECISION 16:04 (verbatim):</w:t>
+      </w:r>
+      <w:r>
+        <w:t xml:space="preserve"> </w:t>
+      </w:r>
+      <w:r>
+        <w:t xml:space="preserve">“We absolutely NEED - LITERALLY MOST CRITICAL OF ALL - RECCURING packages and system, for sure - do NOT EVER compromise down to JUST one time payment as the only path!!!”</w:t>
+      </w:r>
+      <w:r>
+        <w:t xml:space="preserve"> </w:t>
+      </w:r>
+      <w:r>
+        <w:t xml:space="preserve">This supersedes the interim in OR-112-23. Recurring packages are the #1 launch item, and #334 does not merge without the recurring path.</w:t>
+      </w:r>
+    </w:p>
+    <w:p>
+      <w:pPr>
+        <w:pStyle w:val="Compact"/>
+        <w:numPr>
+          <w:ilvl w:val="0"/>
+          <w:numId w:val="1094"/>
+        </w:numPr>
+      </w:pPr>
+      <w:r>
         <w:t xml:space="preserve">OR-112-23: a renewing (monthly or yearly) plan must never be sold as a one-time payment with open-ended access, because that loses TGP and the coach recurring revenue. Two parts:</w:t>
       </w:r>
     </w:p>
@@ -8856,13 +8880,13 @@
         <w:t xml:space="preserve">. If this prompt and the train log disagree, the train log wins, and GitHub beats both.</w:t>
       </w:r>
     </w:p>
-    <w:bookmarkStart w:id="47" w:name="X9f00f1bf385b3e0cec3dcee84a73d8f7a17079c"/>
+    <w:bookmarkStart w:id="47" w:name="Xd3fe068de1f33b0435fb246ba9329be97d7cd38"/>
     <w:p>
       <w:pPr>
         <w:pStyle w:val="Heading3"/>
       </w:pPr>
       <w:r>
-        <w:t xml:space="preserve">AGENT 112 STATE FOR AGENT 113: snapshot 2026-10-02 16:01 PDT (real clock)</w:t>
+        <w:t xml:space="preserve">AGENT 112 STATE FOR AGENT 113: snapshot 2026-10-02 16:06 PDT (real clock)</w:t>
       </w:r>
     </w:p>
     <w:bookmarkStart w:id="39" w:name="production-and-mains"/>
@@ -10337,6 +10361,27 @@
         <w:t xml:space="preserve">New finding: POST /v1/checkout/payment-intent charges monthly and yearly plans once and grants open-ended access. The sheet now refuses to sell renewing plans, but the API still allows it (OR-112-23).</w:t>
       </w:r>
     </w:p>
+    <w:p>
+      <w:pPr>
+        <w:pStyle w:val="Compact"/>
+        <w:numPr>
+          <w:ilvl w:val="0"/>
+          <w:numId w:val="1111"/>
+        </w:numPr>
+      </w:pPr>
+      <w:r>
+        <w:t xml:space="preserve">16:04 OWNER: recurring packages are the most critical item; never one-time-only (recorded verbatim). 16:05 OWNER:</w:t>
+      </w:r>
+      <w:r>
+        <w:t xml:space="preserve"> </w:t>
+      </w:r>
+      <w:r>
+        <w:t xml:space="preserve">“dont start any agents”</w:t>
+      </w:r>
+      <w:r>
+        <w:t xml:space="preserve">. No agent was started.</w:t>
+      </w:r>
+    </w:p>
     <w:bookmarkEnd w:id="44"/>
     <w:bookmarkStart w:id="45" w:name="X582e2f822231ec3e238ba31532d907188cf21e2"/>
     <w:p>
@@ -11868,7 +11913,13 @@
         </w:numPr>
       </w:pPr>
       <w:r>
-        <w:t xml:space="preserve">Quick wins from 112’s last rounds: Opus DELTA audits of #610</w:t>
+        <w:t xml:space="preserve">MOST CRITICAL (OWNER 16:04): get recurring packages selling as real subscriptions on every purchase surface, starting with the #334 extension plus the backend payment-intent guard (v6 section 12 item 0). Never ship one-time-only.</w:t>
+      </w:r>
+      <w:r>
+        <w:t xml:space="preserve"> </w:t>
+      </w:r>
+      <w:r>
+        <w:t xml:space="preserve">0b. Quick wins from 112’s last rounds: Opus DELTA audits of #610</w:t>
       </w:r>
       <w:r>
         <w:t xml:space="preserve"> </w:t>
@@ -15933,17 +15984,82 @@
     </w:p>
     <w:p>
       <w:pPr>
+        <w:pStyle w:val="Compact"/>
         <w:numPr>
           <w:ilvl w:val="0"/>
           <w:numId w:val="1139"/>
         </w:numPr>
       </w:pPr>
       <w:r>
-        <w:t xml:space="preserve">FIRST: the Day 1 package-sheet payment fix is BUILT as mobile #334 (needs a dual audit). Next, OR-112-23: the backend rejects renewing plans on payment-intent, and the sheet routes renewing plans to subscription checkout. Then the #627 B-627-8 fix (duplicate won-dispute reinstatement; Sol probe in probes/AUD-SOL-6-112/) followed by a Sol delta, then merge #627 and #321 together.</w:t>
-      </w:r>
-    </w:p>
-    <w:p>
-      <w:pPr>
+        <w:t xml:space="preserve">FIRST AND MOST CRITICAL (OWNER 16:04): recurring packages. Every surface that sells a package (the Day 1 sheet in #334, package detail, storefront and join links) must sell renewing plans as real Stripe subscriptions. One-time-only is never acceptable. The subscription path already exists: POST /v1/checkout/sessions creates a Checkout session in mode=subscription, with transfer_data sending payment to the coach’s Connect account, and webhooks activate it. The billing portal and dunning from #628 are also in place. Work:</w:t>
+      </w:r>
+    </w:p>
+    <w:p>
+      <w:pPr>
+        <w:pStyle w:val="Compact"/>
+        <w:numPr>
+          <w:ilvl w:val="1"/>
+          <w:numId w:val="1140"/>
+        </w:numPr>
+      </w:pPr>
+    </w:p>
+    <w:p>
+      <w:pPr>
+        <w:pStyle w:val="Compact"/>
+        <w:numPr>
+          <w:ilvl w:val="2"/>
+          <w:numId w:val="1141"/>
+        </w:numPr>
+      </w:pPr>
+      <w:r>
+        <w:t xml:space="preserve">#334: renewing plans go through /v1/checkout/sessions with the DTO’s exact fields. Open the Checkout URL in an in-app browser, handle the return deep link, wait for the entitlement, and give each failure cause its own message. #334 must NOT merge while it only refuses renewing plans.</w:t>
+      </w:r>
+    </w:p>
+    <w:p>
+      <w:pPr>
+        <w:pStyle w:val="Compact"/>
+        <w:numPr>
+          <w:ilvl w:val="1"/>
+          <w:numId w:val="1140"/>
+        </w:numPr>
+      </w:pPr>
+    </w:p>
+    <w:p>
+      <w:pPr>
+        <w:pStyle w:val="Compact"/>
+        <w:numPr>
+          <w:ilvl w:val="2"/>
+          <w:numId w:val="1142"/>
+        </w:numPr>
+      </w:pPr>
+      <w:r>
+        <w:t xml:space="preserve">Backend: payment-intent rejects renewing packages with a coded error.</w:t>
+      </w:r>
+    </w:p>
+    <w:p>
+      <w:pPr>
+        <w:pStyle w:val="Compact"/>
+        <w:numPr>
+          <w:ilvl w:val="1"/>
+          <w:numId w:val="1140"/>
+        </w:numPr>
+      </w:pPr>
+    </w:p>
+    <w:p>
+      <w:pPr>
+        <w:pStyle w:val="Compact"/>
+        <w:numPr>
+          <w:ilvl w:val="2"/>
+          <w:numId w:val="1143"/>
+        </w:numPr>
+      </w:pPr>
+      <w:r>
+        <w:t xml:space="preserve">Prove it end to end in Stripe test mode: subscribe, renewal webhook, cancel and dunning. Then the #627 B-627-8 fix (duplicate won-dispute reinstatement; Sol probe in probes/AUD-SOL-6-112/) followed by a Sol delta, then merge #627 and #321 together.</w:t>
+      </w:r>
+    </w:p>
+    <w:p>
+      <w:pPr>
+        <w:pStyle w:val="Compact"/>
         <w:numPr>
           <w:ilvl w:val="0"/>
           <w:numId w:val="1139"/>
@@ -15955,6 +16071,7 @@
     </w:p>
     <w:p>
       <w:pPr>
+        <w:pStyle w:val="Compact"/>
         <w:numPr>
           <w:ilvl w:val="0"/>
           <w:numId w:val="1139"/>
@@ -15966,6 +16083,7 @@
     </w:p>
     <w:p>
       <w:pPr>
+        <w:pStyle w:val="Compact"/>
         <w:numPr>
           <w:ilvl w:val="0"/>
           <w:numId w:val="1139"/>
@@ -15977,6 +16095,7 @@
     </w:p>
     <w:p>
       <w:pPr>
+        <w:pStyle w:val="Compact"/>
         <w:numPr>
           <w:ilvl w:val="0"/>
           <w:numId w:val="1139"/>
@@ -15991,7 +16110,7 @@
         <w:pStyle w:val="Compact"/>
         <w:numPr>
           <w:ilvl w:val="1"/>
-          <w:numId w:val="1140"/>
+          <w:numId w:val="1144"/>
         </w:numPr>
       </w:pPr>
       <w:r>
@@ -16003,7 +16122,7 @@
         <w:pStyle w:val="Compact"/>
         <w:numPr>
           <w:ilvl w:val="1"/>
-          <w:numId w:val="1140"/>
+          <w:numId w:val="1144"/>
         </w:numPr>
       </w:pPr>
       <w:r>
@@ -16015,7 +16134,7 @@
         <w:pStyle w:val="Compact"/>
         <w:numPr>
           <w:ilvl w:val="1"/>
-          <w:numId w:val="1140"/>
+          <w:numId w:val="1144"/>
         </w:numPr>
       </w:pPr>
       <w:r>
@@ -16027,7 +16146,7 @@
         <w:pStyle w:val="Compact"/>
         <w:numPr>
           <w:ilvl w:val="1"/>
-          <w:numId w:val="1140"/>
+          <w:numId w:val="1144"/>
         </w:numPr>
       </w:pPr>
       <w:r>
@@ -16039,7 +16158,7 @@
         <w:pStyle w:val="Compact"/>
         <w:numPr>
           <w:ilvl w:val="1"/>
-          <w:numId w:val="1140"/>
+          <w:numId w:val="1144"/>
         </w:numPr>
       </w:pPr>
       <w:r>
@@ -16051,7 +16170,7 @@
         <w:pStyle w:val="Compact"/>
         <w:numPr>
           <w:ilvl w:val="1"/>
-          <w:numId w:val="1140"/>
+          <w:numId w:val="1144"/>
         </w:numPr>
       </w:pPr>
       <w:r>
@@ -16063,7 +16182,7 @@
         <w:pStyle w:val="Compact"/>
         <w:numPr>
           <w:ilvl w:val="1"/>
-          <w:numId w:val="1140"/>
+          <w:numId w:val="1144"/>
         </w:numPr>
       </w:pPr>
       <w:r>
@@ -16075,7 +16194,7 @@
         <w:pStyle w:val="Compact"/>
         <w:numPr>
           <w:ilvl w:val="1"/>
-          <w:numId w:val="1140"/>
+          <w:numId w:val="1144"/>
         </w:numPr>
       </w:pPr>
       <w:r>
@@ -16087,7 +16206,7 @@
         <w:pStyle w:val="Compact"/>
         <w:numPr>
           <w:ilvl w:val="1"/>
-          <w:numId w:val="1140"/>
+          <w:numId w:val="1144"/>
         </w:numPr>
       </w:pPr>
       <w:r>
@@ -16096,6 +16215,7 @@
     </w:p>
     <w:p>
       <w:pPr>
+        <w:pStyle w:val="Compact"/>
         <w:numPr>
           <w:ilvl w:val="0"/>
           <w:numId w:val="1139"/>
@@ -16118,7 +16238,7 @@
         <w:pStyle w:val="Compact"/>
         <w:numPr>
           <w:ilvl w:val="0"/>
-          <w:numId w:val="1141"/>
+          <w:numId w:val="1145"/>
         </w:numPr>
       </w:pPr>
       <w:r>
@@ -16130,7 +16250,7 @@
         <w:pStyle w:val="Compact"/>
         <w:numPr>
           <w:ilvl w:val="0"/>
-          <w:numId w:val="1141"/>
+          <w:numId w:val="1145"/>
         </w:numPr>
       </w:pPr>
       <w:r>
@@ -16142,7 +16262,7 @@
         <w:pStyle w:val="Compact"/>
         <w:numPr>
           <w:ilvl w:val="0"/>
-          <w:numId w:val="1141"/>
+          <w:numId w:val="1145"/>
         </w:numPr>
       </w:pPr>
       <w:r>
@@ -16154,7 +16274,7 @@
         <w:pStyle w:val="Compact"/>
         <w:numPr>
           <w:ilvl w:val="0"/>
-          <w:numId w:val="1141"/>
+          <w:numId w:val="1145"/>
         </w:numPr>
       </w:pPr>
       <w:r>
@@ -16166,7 +16286,7 @@
         <w:pStyle w:val="Compact"/>
         <w:numPr>
           <w:ilvl w:val="0"/>
-          <w:numId w:val="1141"/>
+          <w:numId w:val="1145"/>
         </w:numPr>
       </w:pPr>
       <w:r>
@@ -16178,7 +16298,7 @@
         <w:pStyle w:val="Compact"/>
         <w:numPr>
           <w:ilvl w:val="0"/>
-          <w:numId w:val="1141"/>
+          <w:numId w:val="1145"/>
         </w:numPr>
       </w:pPr>
       <w:r>
@@ -16190,7 +16310,7 @@
         <w:pStyle w:val="Compact"/>
         <w:numPr>
           <w:ilvl w:val="0"/>
-          <w:numId w:val="1141"/>
+          <w:numId w:val="1145"/>
         </w:numPr>
       </w:pPr>
       <w:r>
@@ -16202,7 +16322,7 @@
         <w:pStyle w:val="Compact"/>
         <w:numPr>
           <w:ilvl w:val="0"/>
-          <w:numId w:val="1141"/>
+          <w:numId w:val="1145"/>
         </w:numPr>
       </w:pPr>
       <w:r>
@@ -16214,7 +16334,7 @@
         <w:pStyle w:val="Compact"/>
         <w:numPr>
           <w:ilvl w:val="0"/>
-          <w:numId w:val="1141"/>
+          <w:numId w:val="1145"/>
         </w:numPr>
       </w:pPr>
       <w:r>
@@ -16226,7 +16346,7 @@
         <w:pStyle w:val="Compact"/>
         <w:numPr>
           <w:ilvl w:val="0"/>
-          <w:numId w:val="1141"/>
+          <w:numId w:val="1145"/>
         </w:numPr>
       </w:pPr>
       <w:r>
@@ -16238,7 +16358,7 @@
         <w:pStyle w:val="Compact"/>
         <w:numPr>
           <w:ilvl w:val="0"/>
-          <w:numId w:val="1141"/>
+          <w:numId w:val="1145"/>
         </w:numPr>
       </w:pPr>
       <w:r>
@@ -16250,7 +16370,7 @@
         <w:pStyle w:val="Compact"/>
         <w:numPr>
           <w:ilvl w:val="0"/>
-          <w:numId w:val="1141"/>
+          <w:numId w:val="1145"/>
         </w:numPr>
       </w:pPr>
       <w:r>
@@ -16262,7 +16382,7 @@
         <w:pStyle w:val="Compact"/>
         <w:numPr>
           <w:ilvl w:val="0"/>
-          <w:numId w:val="1141"/>
+          <w:numId w:val="1145"/>
         </w:numPr>
       </w:pPr>
       <w:r>
@@ -16274,7 +16394,7 @@
         <w:pStyle w:val="Compact"/>
         <w:numPr>
           <w:ilvl w:val="0"/>
-          <w:numId w:val="1141"/>
+          <w:numId w:val="1145"/>
         </w:numPr>
       </w:pPr>
       <w:r>
@@ -16286,7 +16406,7 @@
         <w:pStyle w:val="Compact"/>
         <w:numPr>
           <w:ilvl w:val="0"/>
-          <w:numId w:val="1141"/>
+          <w:numId w:val="1145"/>
         </w:numPr>
       </w:pPr>
       <w:r>
@@ -16298,7 +16418,7 @@
         <w:pStyle w:val="Compact"/>
         <w:numPr>
           <w:ilvl w:val="0"/>
-          <w:numId w:val="1141"/>
+          <w:numId w:val="1145"/>
         </w:numPr>
       </w:pPr>
       <w:r>
@@ -16310,7 +16430,7 @@
         <w:pStyle w:val="Compact"/>
         <w:numPr>
           <w:ilvl w:val="0"/>
-          <w:numId w:val="1141"/>
+          <w:numId w:val="1145"/>
         </w:numPr>
       </w:pPr>
       <w:r>
@@ -16322,7 +16442,7 @@
         <w:pStyle w:val="Compact"/>
         <w:numPr>
           <w:ilvl w:val="0"/>
-          <w:numId w:val="1141"/>
+          <w:numId w:val="1145"/>
         </w:numPr>
       </w:pPr>
       <w:r>
@@ -16346,7 +16466,7 @@
         <w:pStyle w:val="Compact"/>
         <w:numPr>
           <w:ilvl w:val="0"/>
-          <w:numId w:val="1141"/>
+          <w:numId w:val="1145"/>
         </w:numPr>
       </w:pPr>
       <w:r>
@@ -16393,7 +16513,7 @@
         <w:pStyle w:val="Compact"/>
         <w:numPr>
           <w:ilvl w:val="0"/>
-          <w:numId w:val="1142"/>
+          <w:numId w:val="1146"/>
         </w:numPr>
       </w:pPr>
       <w:r>
@@ -16405,7 +16525,7 @@
         <w:pStyle w:val="Compact"/>
         <w:numPr>
           <w:ilvl w:val="0"/>
-          <w:numId w:val="1142"/>
+          <w:numId w:val="1146"/>
         </w:numPr>
       </w:pPr>
       <w:r>
@@ -16417,7 +16537,7 @@
         <w:pStyle w:val="Compact"/>
         <w:numPr>
           <w:ilvl w:val="0"/>
-          <w:numId w:val="1142"/>
+          <w:numId w:val="1146"/>
         </w:numPr>
       </w:pPr>
       <w:r>
@@ -16429,7 +16549,7 @@
         <w:pStyle w:val="Compact"/>
         <w:numPr>
           <w:ilvl w:val="0"/>
-          <w:numId w:val="1142"/>
+          <w:numId w:val="1146"/>
         </w:numPr>
       </w:pPr>
       <w:r>
@@ -16441,7 +16561,7 @@
         <w:pStyle w:val="Compact"/>
         <w:numPr>
           <w:ilvl w:val="0"/>
-          <w:numId w:val="1142"/>
+          <w:numId w:val="1146"/>
         </w:numPr>
       </w:pPr>
       <w:r>
@@ -16453,7 +16573,7 @@
         <w:pStyle w:val="Compact"/>
         <w:numPr>
           <w:ilvl w:val="0"/>
-          <w:numId w:val="1142"/>
+          <w:numId w:val="1146"/>
         </w:numPr>
       </w:pPr>
       <w:r>
@@ -16465,7 +16585,7 @@
         <w:pStyle w:val="Compact"/>
         <w:numPr>
           <w:ilvl w:val="0"/>
-          <w:numId w:val="1142"/>
+          <w:numId w:val="1146"/>
         </w:numPr>
       </w:pPr>
       <w:r>
@@ -16485,7 +16605,7 @@
         <w:pStyle w:val="Compact"/>
         <w:numPr>
           <w:ilvl w:val="0"/>
-          <w:numId w:val="1143"/>
+          <w:numId w:val="1147"/>
         </w:numPr>
       </w:pPr>
       <w:r>
@@ -16497,7 +16617,7 @@
         <w:pStyle w:val="Compact"/>
         <w:numPr>
           <w:ilvl w:val="0"/>
-          <w:numId w:val="1143"/>
+          <w:numId w:val="1147"/>
         </w:numPr>
       </w:pPr>
       <w:r>
@@ -16509,7 +16629,7 @@
         <w:pStyle w:val="Compact"/>
         <w:numPr>
           <w:ilvl w:val="0"/>
-          <w:numId w:val="1143"/>
+          <w:numId w:val="1147"/>
         </w:numPr>
       </w:pPr>
       <w:r>
@@ -16521,7 +16641,7 @@
         <w:pStyle w:val="Compact"/>
         <w:numPr>
           <w:ilvl w:val="0"/>
-          <w:numId w:val="1143"/>
+          <w:numId w:val="1147"/>
         </w:numPr>
       </w:pPr>
       <w:r>
@@ -16543,7 +16663,7 @@
         <w:pStyle w:val="Compact"/>
         <w:numPr>
           <w:ilvl w:val="0"/>
-          <w:numId w:val="1144"/>
+          <w:numId w:val="1148"/>
         </w:numPr>
       </w:pPr>
       <w:r>
@@ -16555,7 +16675,7 @@
         <w:pStyle w:val="Compact"/>
         <w:numPr>
           <w:ilvl w:val="1"/>
-          <w:numId w:val="1145"/>
+          <w:numId w:val="1149"/>
         </w:numPr>
       </w:pPr>
       <w:r>
@@ -16582,7 +16702,7 @@
         <w:pStyle w:val="Compact"/>
         <w:numPr>
           <w:ilvl w:val="1"/>
-          <w:numId w:val="1145"/>
+          <w:numId w:val="1149"/>
         </w:numPr>
       </w:pPr>
       <w:r>
@@ -16594,7 +16714,7 @@
         <w:pStyle w:val="Compact"/>
         <w:numPr>
           <w:ilvl w:val="1"/>
-          <w:numId w:val="1145"/>
+          <w:numId w:val="1149"/>
         </w:numPr>
       </w:pPr>
       <w:r>
@@ -16633,7 +16753,7 @@
         <w:pStyle w:val="Compact"/>
         <w:numPr>
           <w:ilvl w:val="0"/>
-          <w:numId w:val="1144"/>
+          <w:numId w:val="1148"/>
         </w:numPr>
       </w:pPr>
       <w:r>
@@ -16657,7 +16777,7 @@
         <w:pStyle w:val="Compact"/>
         <w:numPr>
           <w:ilvl w:val="0"/>
-          <w:numId w:val="1144"/>
+          <w:numId w:val="1148"/>
         </w:numPr>
       </w:pPr>
       <w:r>
@@ -16669,7 +16789,7 @@
         <w:pStyle w:val="Compact"/>
         <w:numPr>
           <w:ilvl w:val="0"/>
-          <w:numId w:val="1144"/>
+          <w:numId w:val="1148"/>
         </w:numPr>
       </w:pPr>
       <w:r>
@@ -16681,7 +16801,7 @@
         <w:pStyle w:val="Compact"/>
         <w:numPr>
           <w:ilvl w:val="1"/>
-          <w:numId w:val="1146"/>
+          <w:numId w:val="1150"/>
         </w:numPr>
       </w:pPr>
       <w:r>
@@ -16693,7 +16813,7 @@
         <w:pStyle w:val="Compact"/>
         <w:numPr>
           <w:ilvl w:val="1"/>
-          <w:numId w:val="1146"/>
+          <w:numId w:val="1150"/>
         </w:numPr>
       </w:pPr>
       <w:r>
@@ -16714,7 +16834,7 @@
         <w:pStyle w:val="Compact"/>
         <w:numPr>
           <w:ilvl w:val="1"/>
-          <w:numId w:val="1146"/>
+          <w:numId w:val="1150"/>
         </w:numPr>
       </w:pPr>
       <w:r>
@@ -16726,7 +16846,7 @@
         <w:pStyle w:val="Compact"/>
         <w:numPr>
           <w:ilvl w:val="1"/>
-          <w:numId w:val="1146"/>
+          <w:numId w:val="1150"/>
         </w:numPr>
       </w:pPr>
       <w:r>
@@ -16738,7 +16858,7 @@
         <w:pStyle w:val="Compact"/>
         <w:numPr>
           <w:ilvl w:val="1"/>
-          <w:numId w:val="1146"/>
+          <w:numId w:val="1150"/>
         </w:numPr>
       </w:pPr>
       <w:r>
@@ -16750,7 +16870,7 @@
         <w:pStyle w:val="Compact"/>
         <w:numPr>
           <w:ilvl w:val="0"/>
-          <w:numId w:val="1144"/>
+          <w:numId w:val="1148"/>
         </w:numPr>
       </w:pPr>
       <w:r>
@@ -16765,7 +16885,7 @@
         <w:pStyle w:val="Compact"/>
         <w:numPr>
           <w:ilvl w:val="0"/>
-          <w:numId w:val="1144"/>
+          <w:numId w:val="1148"/>
         </w:numPr>
       </w:pPr>
       <w:r>
@@ -16777,7 +16897,7 @@
         <w:pStyle w:val="Compact"/>
         <w:numPr>
           <w:ilvl w:val="0"/>
-          <w:numId w:val="1144"/>
+          <w:numId w:val="1148"/>
         </w:numPr>
       </w:pPr>
       <w:r>
@@ -16801,7 +16921,7 @@
         <w:pStyle w:val="Compact"/>
         <w:numPr>
           <w:ilvl w:val="0"/>
-          <w:numId w:val="1144"/>
+          <w:numId w:val="1148"/>
         </w:numPr>
       </w:pPr>
       <w:r>
@@ -16830,7 +16950,7 @@
       <w:pPr>
         <w:numPr>
           <w:ilvl w:val="0"/>
-          <w:numId w:val="1147"/>
+          <w:numId w:val="1151"/>
         </w:numPr>
       </w:pPr>
       <w:r>
@@ -16841,7 +16961,7 @@
       <w:pPr>
         <w:numPr>
           <w:ilvl w:val="0"/>
-          <w:numId w:val="1147"/>
+          <w:numId w:val="1151"/>
         </w:numPr>
       </w:pPr>
       <w:r>
@@ -16852,7 +16972,7 @@
       <w:pPr>
         <w:numPr>
           <w:ilvl w:val="0"/>
-          <w:numId w:val="1147"/>
+          <w:numId w:val="1151"/>
         </w:numPr>
       </w:pPr>
       <w:r>
@@ -16863,7 +16983,7 @@
       <w:pPr>
         <w:numPr>
           <w:ilvl w:val="0"/>
-          <w:numId w:val="1147"/>
+          <w:numId w:val="1151"/>
         </w:numPr>
       </w:pPr>
       <w:r>
@@ -16874,7 +16994,7 @@
       <w:pPr>
         <w:numPr>
           <w:ilvl w:val="1"/>
-          <w:numId w:val="1148"/>
+          <w:numId w:val="1152"/>
         </w:numPr>
       </w:pPr>
       <w:r>
@@ -16885,7 +17005,7 @@
       <w:pPr>
         <w:numPr>
           <w:ilvl w:val="1"/>
-          <w:numId w:val="1148"/>
+          <w:numId w:val="1152"/>
         </w:numPr>
       </w:pPr>
       <w:r>
@@ -16896,7 +17016,7 @@
       <w:pPr>
         <w:numPr>
           <w:ilvl w:val="1"/>
-          <w:numId w:val="1148"/>
+          <w:numId w:val="1152"/>
         </w:numPr>
       </w:pPr>
       <w:r>
@@ -16907,7 +17027,7 @@
       <w:pPr>
         <w:numPr>
           <w:ilvl w:val="1"/>
-          <w:numId w:val="1148"/>
+          <w:numId w:val="1152"/>
         </w:numPr>
       </w:pPr>
       <w:r>
@@ -16918,7 +17038,7 @@
       <w:pPr>
         <w:numPr>
           <w:ilvl w:val="1"/>
-          <w:numId w:val="1148"/>
+          <w:numId w:val="1152"/>
         </w:numPr>
       </w:pPr>
       <w:r>
@@ -16929,7 +17049,7 @@
       <w:pPr>
         <w:numPr>
           <w:ilvl w:val="1"/>
-          <w:numId w:val="1148"/>
+          <w:numId w:val="1152"/>
         </w:numPr>
       </w:pPr>
       <w:r>
@@ -16940,7 +17060,7 @@
       <w:pPr>
         <w:numPr>
           <w:ilvl w:val="0"/>
-          <w:numId w:val="1147"/>
+          <w:numId w:val="1151"/>
         </w:numPr>
       </w:pPr>
       <w:r>
@@ -16951,7 +17071,7 @@
       <w:pPr>
         <w:numPr>
           <w:ilvl w:val="0"/>
-          <w:numId w:val="1147"/>
+          <w:numId w:val="1151"/>
         </w:numPr>
       </w:pPr>
       <w:r>
@@ -16962,7 +17082,7 @@
       <w:pPr>
         <w:numPr>
           <w:ilvl w:val="0"/>
-          <w:numId w:val="1147"/>
+          <w:numId w:val="1151"/>
         </w:numPr>
       </w:pPr>
       <w:r>
@@ -16973,7 +17093,7 @@
       <w:pPr>
         <w:numPr>
           <w:ilvl w:val="0"/>
-          <w:numId w:val="1147"/>
+          <w:numId w:val="1151"/>
         </w:numPr>
       </w:pPr>
       <w:r>
@@ -16984,7 +17104,7 @@
       <w:pPr>
         <w:numPr>
           <w:ilvl w:val="0"/>
-          <w:numId w:val="1147"/>
+          <w:numId w:val="1151"/>
         </w:numPr>
       </w:pPr>
       <w:r>
@@ -16995,7 +17115,7 @@
       <w:pPr>
         <w:numPr>
           <w:ilvl w:val="0"/>
-          <w:numId w:val="1147"/>
+          <w:numId w:val="1151"/>
         </w:numPr>
       </w:pPr>
       <w:r>
@@ -17006,7 +17126,7 @@
       <w:pPr>
         <w:numPr>
           <w:ilvl w:val="0"/>
-          <w:numId w:val="1147"/>
+          <w:numId w:val="1151"/>
         </w:numPr>
       </w:pPr>
       <w:r>
@@ -17051,7 +17171,7 @@
       <w:pPr>
         <w:numPr>
           <w:ilvl w:val="0"/>
-          <w:numId w:val="1149"/>
+          <w:numId w:val="1153"/>
         </w:numPr>
       </w:pPr>
       <w:r>
@@ -17062,7 +17182,7 @@
       <w:pPr>
         <w:numPr>
           <w:ilvl w:val="0"/>
-          <w:numId w:val="1149"/>
+          <w:numId w:val="1153"/>
         </w:numPr>
       </w:pPr>
       <w:r>
@@ -17073,7 +17193,7 @@
       <w:pPr>
         <w:numPr>
           <w:ilvl w:val="0"/>
-          <w:numId w:val="1149"/>
+          <w:numId w:val="1153"/>
         </w:numPr>
       </w:pPr>
       <w:r>
@@ -17084,7 +17204,7 @@
       <w:pPr>
         <w:numPr>
           <w:ilvl w:val="0"/>
-          <w:numId w:val="1149"/>
+          <w:numId w:val="1153"/>
         </w:numPr>
       </w:pPr>
       <w:r>
@@ -17095,7 +17215,7 @@
       <w:pPr>
         <w:numPr>
           <w:ilvl w:val="0"/>
-          <w:numId w:val="1149"/>
+          <w:numId w:val="1153"/>
         </w:numPr>
       </w:pPr>
       <w:r>
@@ -17106,7 +17226,7 @@
       <w:pPr>
         <w:numPr>
           <w:ilvl w:val="0"/>
-          <w:numId w:val="1149"/>
+          <w:numId w:val="1153"/>
         </w:numPr>
       </w:pPr>
       <w:r>
@@ -17548,6 +17668,261 @@
       <w:start w:val="0"/>
       <w:numFmt w:val="decimal"/>
       <w:lvlText w:val="%9."/>
+      <w:lvlJc w:val="left"/>
+      <w:pPr>
+        <w:ind w:left="6480" w:hanging="360"/>
+      </w:pPr>
+    </w:lvl>
+  </w:abstractNum>
+  <w:abstractNum w:abstractNumId="99731">
+    <w:nsid w:val="00A99731"/>
+    <w:multiLevelType w:val="multilevel"/>
+    <w:lvl w:ilvl="0">
+      <w:start w:val="1"/>
+      <w:numFmt w:val="lowerLetter"/>
+      <w:lvlText w:val="(%1)"/>
+      <w:lvlJc w:val="left"/>
+      <w:pPr>
+        <w:ind w:left="720" w:hanging="360"/>
+      </w:pPr>
+    </w:lvl>
+    <w:lvl w:ilvl="1">
+      <w:start w:val="1"/>
+      <w:numFmt w:val="lowerLetter"/>
+      <w:lvlText w:val="(%2)"/>
+      <w:lvlJc w:val="left"/>
+      <w:pPr>
+        <w:ind w:left="1440" w:hanging="360"/>
+      </w:pPr>
+    </w:lvl>
+    <w:lvl w:ilvl="2">
+      <w:start w:val="1"/>
+      <w:numFmt w:val="lowerLetter"/>
+      <w:lvlText w:val="(%3)"/>
+      <w:lvlJc w:val="left"/>
+      <w:pPr>
+        <w:ind w:left="2160" w:hanging="360"/>
+      </w:pPr>
+    </w:lvl>
+    <w:lvl w:ilvl="3">
+      <w:start w:val="1"/>
+      <w:numFmt w:val="lowerLetter"/>
+      <w:lvlText w:val="(%4)"/>
+      <w:lvlJc w:val="left"/>
+      <w:pPr>
+        <w:ind w:left="2880" w:hanging="360"/>
+      </w:pPr>
+    </w:lvl>
+    <w:lvl w:ilvl="4">
+      <w:start w:val="1"/>
+      <w:numFmt w:val="lowerLetter"/>
+      <w:lvlText w:val="(%5)"/>
+      <w:lvlJc w:val="left"/>
+      <w:pPr>
+        <w:ind w:left="3600" w:hanging="360"/>
+      </w:pPr>
+    </w:lvl>
+    <w:lvl w:ilvl="5">
+      <w:start w:val="1"/>
+      <w:numFmt w:val="lowerLetter"/>
+      <w:lvlText w:val="(%6)"/>
+      <w:lvlJc w:val="left"/>
+      <w:pPr>
+        <w:ind w:left="4320" w:hanging="360"/>
+      </w:pPr>
+    </w:lvl>
+    <w:lvl w:ilvl="6">
+      <w:start w:val="1"/>
+      <w:numFmt w:val="lowerLetter"/>
+      <w:lvlText w:val="(%7)"/>
+      <w:lvlJc w:val="left"/>
+      <w:pPr>
+        <w:ind w:left="5040" w:hanging="360"/>
+      </w:pPr>
+    </w:lvl>
+    <w:lvl w:ilvl="7">
+      <w:start w:val="1"/>
+      <w:numFmt w:val="lowerLetter"/>
+      <w:lvlText w:val="(%8)"/>
+      <w:lvlJc w:val="left"/>
+      <w:pPr>
+        <w:ind w:left="5760" w:hanging="360"/>
+      </w:pPr>
+    </w:lvl>
+    <w:lvl w:ilvl="8">
+      <w:start w:val="1"/>
+      <w:numFmt w:val="lowerLetter"/>
+      <w:lvlText w:val="(%9)"/>
+      <w:lvlJc w:val="left"/>
+      <w:pPr>
+        <w:ind w:left="6480" w:hanging="360"/>
+      </w:pPr>
+    </w:lvl>
+  </w:abstractNum>
+  <w:abstractNum w:abstractNumId="99732">
+    <w:nsid w:val="00A99732"/>
+    <w:multiLevelType w:val="multilevel"/>
+    <w:lvl w:ilvl="0">
+      <w:start w:val="2"/>
+      <w:numFmt w:val="lowerLetter"/>
+      <w:lvlText w:val="(%1)"/>
+      <w:lvlJc w:val="left"/>
+      <w:pPr>
+        <w:ind w:left="720" w:hanging="360"/>
+      </w:pPr>
+    </w:lvl>
+    <w:lvl w:ilvl="1">
+      <w:start w:val="2"/>
+      <w:numFmt w:val="lowerLetter"/>
+      <w:lvlText w:val="(%2)"/>
+      <w:lvlJc w:val="left"/>
+      <w:pPr>
+        <w:ind w:left="1440" w:hanging="360"/>
+      </w:pPr>
+    </w:lvl>
+    <w:lvl w:ilvl="2">
+      <w:start w:val="2"/>
+      <w:numFmt w:val="lowerLetter"/>
+      <w:lvlText w:val="(%3)"/>
+      <w:lvlJc w:val="left"/>
+      <w:pPr>
+        <w:ind w:left="2160" w:hanging="360"/>
+      </w:pPr>
+    </w:lvl>
+    <w:lvl w:ilvl="3">
+      <w:start w:val="2"/>
+      <w:numFmt w:val="lowerLetter"/>
+      <w:lvlText w:val="(%4)"/>
+      <w:lvlJc w:val="left"/>
+      <w:pPr>
+        <w:ind w:left="2880" w:hanging="360"/>
+      </w:pPr>
+    </w:lvl>
+    <w:lvl w:ilvl="4">
+      <w:start w:val="2"/>
+      <w:numFmt w:val="lowerLetter"/>
+      <w:lvlText w:val="(%5)"/>
+      <w:lvlJc w:val="left"/>
+      <w:pPr>
+        <w:ind w:left="3600" w:hanging="360"/>
+      </w:pPr>
+    </w:lvl>
+    <w:lvl w:ilvl="5">
+      <w:start w:val="2"/>
+      <w:numFmt w:val="lowerLetter"/>
+      <w:lvlText w:val="(%6)"/>
+      <w:lvlJc w:val="left"/>
+      <w:pPr>
+        <w:ind w:left="4320" w:hanging="360"/>
+      </w:pPr>
+    </w:lvl>
+    <w:lvl w:ilvl="6">
+      <w:start w:val="2"/>
+      <w:numFmt w:val="lowerLetter"/>
+      <w:lvlText w:val="(%7)"/>
+      <w:lvlJc w:val="left"/>
+      <w:pPr>
+        <w:ind w:left="5040" w:hanging="360"/>
+      </w:pPr>
+    </w:lvl>
+    <w:lvl w:ilvl="7">
+      <w:start w:val="2"/>
+      <w:numFmt w:val="lowerLetter"/>
+      <w:lvlText w:val="(%8)"/>
+      <w:lvlJc w:val="left"/>
+      <w:pPr>
+        <w:ind w:left="5760" w:hanging="360"/>
+      </w:pPr>
+    </w:lvl>
+    <w:lvl w:ilvl="8">
+      <w:start w:val="2"/>
+      <w:numFmt w:val="lowerLetter"/>
+      <w:lvlText w:val="(%9)"/>
+      <w:lvlJc w:val="left"/>
+      <w:pPr>
+        <w:ind w:left="6480" w:hanging="360"/>
+      </w:pPr>
+    </w:lvl>
+  </w:abstractNum>
+  <w:abstractNum w:abstractNumId="99733">
+    <w:nsid w:val="00A99733"/>
+    <w:multiLevelType w:val="multilevel"/>
+    <w:lvl w:ilvl="0">
+      <w:start w:val="3"/>
+      <w:numFmt w:val="lowerLetter"/>
+      <w:lvlText w:val="(%1)"/>
+      <w:lvlJc w:val="left"/>
+      <w:pPr>
+        <w:ind w:left="720" w:hanging="360"/>
+      </w:pPr>
+    </w:lvl>
+    <w:lvl w:ilvl="1">
+      <w:start w:val="3"/>
+      <w:numFmt w:val="lowerLetter"/>
+      <w:lvlText w:val="(%2)"/>
+      <w:lvlJc w:val="left"/>
+      <w:pPr>
+        <w:ind w:left="1440" w:hanging="360"/>
+      </w:pPr>
+    </w:lvl>
+    <w:lvl w:ilvl="2">
+      <w:start w:val="3"/>
+      <w:numFmt w:val="lowerLetter"/>
+      <w:lvlText w:val="(%3)"/>
+      <w:lvlJc w:val="left"/>
+      <w:pPr>
+        <w:ind w:left="2160" w:hanging="360"/>
+      </w:pPr>
+    </w:lvl>
+    <w:lvl w:ilvl="3">
+      <w:start w:val="3"/>
+      <w:numFmt w:val="lowerLetter"/>
+      <w:lvlText w:val="(%4)"/>
+      <w:lvlJc w:val="left"/>
+      <w:pPr>
+        <w:ind w:left="2880" w:hanging="360"/>
+      </w:pPr>
+    </w:lvl>
+    <w:lvl w:ilvl="4">
+      <w:start w:val="3"/>
+      <w:numFmt w:val="lowerLetter"/>
+      <w:lvlText w:val="(%5)"/>
+      <w:lvlJc w:val="left"/>
+      <w:pPr>
+        <w:ind w:left="3600" w:hanging="360"/>
+      </w:pPr>
+    </w:lvl>
+    <w:lvl w:ilvl="5">
+      <w:start w:val="3"/>
+      <w:numFmt w:val="lowerLetter"/>
+      <w:lvlText w:val="(%6)"/>
+      <w:lvlJc w:val="left"/>
+      <w:pPr>
+        <w:ind w:left="4320" w:hanging="360"/>
+      </w:pPr>
+    </w:lvl>
+    <w:lvl w:ilvl="6">
+      <w:start w:val="3"/>
+      <w:numFmt w:val="lowerLetter"/>
+      <w:lvlText w:val="(%7)"/>
+      <w:lvlJc w:val="left"/>
+      <w:pPr>
+        <w:ind w:left="5040" w:hanging="360"/>
+      </w:pPr>
+    </w:lvl>
+    <w:lvl w:ilvl="7">
+      <w:start w:val="3"/>
+      <w:numFmt w:val="lowerLetter"/>
+      <w:lvlText w:val="(%8)"/>
+      <w:lvlJc w:val="left"/>
+      <w:pPr>
+        <w:ind w:left="5760" w:hanging="360"/>
+      </w:pPr>
+    </w:lvl>
+    <w:lvl w:ilvl="8">
+      <w:start w:val="3"/>
+      <w:numFmt w:val="lowerLetter"/>
+      <w:lvlText w:val="(%9)"/>
       <w:lvlJc w:val="left"/>
       <w:pPr>
         <w:ind w:left="6480" w:hanging="360"/>
@@ -18711,84 +19086,177 @@
     <w:abstractNumId w:val="991"/>
   </w:num>
   <w:num w:numId="1141">
-    <w:abstractNumId w:val="99419"/>
+    <w:abstractNumId w:val="99731"/>
     <w:lvlOverride w:ilvl="0">
-      <w:startOverride w:val="9"/>
+      <w:startOverride w:val="1"/>
     </w:lvlOverride>
     <w:lvlOverride w:ilvl="1">
-      <w:startOverride w:val="9"/>
+      <w:startOverride w:val="1"/>
     </w:lvlOverride>
     <w:lvlOverride w:ilvl="2">
-      <w:startOverride w:val="9"/>
+      <w:startOverride w:val="1"/>
     </w:lvlOverride>
     <w:lvlOverride w:ilvl="3">
-      <w:startOverride w:val="9"/>
+      <w:startOverride w:val="1"/>
     </w:lvlOverride>
     <w:lvlOverride w:ilvl="4">
-      <w:startOverride w:val="9"/>
+      <w:startOverride w:val="1"/>
     </w:lvlOverride>
     <w:lvlOverride w:ilvl="5">
-      <w:startOverride w:val="9"/>
+      <w:startOverride w:val="1"/>
     </w:lvlOverride>
     <w:lvlOverride w:ilvl="6">
-      <w:startOverride w:val="9"/>
+      <w:startOverride w:val="1"/>
     </w:lvlOverride>
     <w:lvlOverride w:ilvl="7">
-      <w:startOverride w:val="9"/>
+      <w:startOverride w:val="1"/>
     </w:lvlOverride>
     <w:lvlOverride w:ilvl="8">
-      <w:startOverride w:val="9"/>
+      <w:startOverride w:val="1"/>
     </w:lvlOverride>
   </w:num>
   <w:num w:numId="1142">
-    <w:abstractNumId w:val="991"/>
+    <w:abstractNumId w:val="99732"/>
+    <w:lvlOverride w:ilvl="0">
+      <w:startOverride w:val="2"/>
+    </w:lvlOverride>
+    <w:lvlOverride w:ilvl="1">
+      <w:startOverride w:val="2"/>
+    </w:lvlOverride>
+    <w:lvlOverride w:ilvl="2">
+      <w:startOverride w:val="2"/>
+    </w:lvlOverride>
+    <w:lvlOverride w:ilvl="3">
+      <w:startOverride w:val="2"/>
+    </w:lvlOverride>
+    <w:lvlOverride w:ilvl="4">
+      <w:startOverride w:val="2"/>
+    </w:lvlOverride>
+    <w:lvlOverride w:ilvl="5">
+      <w:startOverride w:val="2"/>
+    </w:lvlOverride>
+    <w:lvlOverride w:ilvl="6">
+      <w:startOverride w:val="2"/>
+    </w:lvlOverride>
+    <w:lvlOverride w:ilvl="7">
+      <w:startOverride w:val="2"/>
+    </w:lvlOverride>
+    <w:lvlOverride w:ilvl="8">
+      <w:startOverride w:val="2"/>
+    </w:lvlOverride>
   </w:num>
   <w:num w:numId="1143">
-    <w:abstractNumId w:val="991"/>
+    <w:abstractNumId w:val="99733"/>
+    <w:lvlOverride w:ilvl="0">
+      <w:startOverride w:val="3"/>
+    </w:lvlOverride>
+    <w:lvlOverride w:ilvl="1">
+      <w:startOverride w:val="3"/>
+    </w:lvlOverride>
+    <w:lvlOverride w:ilvl="2">
+      <w:startOverride w:val="3"/>
+    </w:lvlOverride>
+    <w:lvlOverride w:ilvl="3">
+      <w:startOverride w:val="3"/>
+    </w:lvlOverride>
+    <w:lvlOverride w:ilvl="4">
+      <w:startOverride w:val="3"/>
+    </w:lvlOverride>
+    <w:lvlOverride w:ilvl="5">
+      <w:startOverride w:val="3"/>
+    </w:lvlOverride>
+    <w:lvlOverride w:ilvl="6">
+      <w:startOverride w:val="3"/>
+    </w:lvlOverride>
+    <w:lvlOverride w:ilvl="7">
+      <w:startOverride w:val="3"/>
+    </w:lvlOverride>
+    <w:lvlOverride w:ilvl="8">
+      <w:startOverride w:val="3"/>
+    </w:lvlOverride>
   </w:num>
   <w:num w:numId="1144">
     <w:abstractNumId w:val="991"/>
   </w:num>
   <w:num w:numId="1145">
-    <w:abstractNumId w:val="991"/>
+    <w:abstractNumId w:val="99419"/>
+    <w:lvlOverride w:ilvl="0">
+      <w:startOverride w:val="9"/>
+    </w:lvlOverride>
+    <w:lvlOverride w:ilvl="1">
+      <w:startOverride w:val="9"/>
+    </w:lvlOverride>
+    <w:lvlOverride w:ilvl="2">
+      <w:startOverride w:val="9"/>
+    </w:lvlOverride>
+    <w:lvlOverride w:ilvl="3">
+      <w:startOverride w:val="9"/>
+    </w:lvlOverride>
+    <w:lvlOverride w:ilvl="4">
+      <w:startOverride w:val="9"/>
+    </w:lvlOverride>
+    <w:lvlOverride w:ilvl="5">
+      <w:startOverride w:val="9"/>
+    </w:lvlOverride>
+    <w:lvlOverride w:ilvl="6">
+      <w:startOverride w:val="9"/>
+    </w:lvlOverride>
+    <w:lvlOverride w:ilvl="7">
+      <w:startOverride w:val="9"/>
+    </w:lvlOverride>
+    <w:lvlOverride w:ilvl="8">
+      <w:startOverride w:val="9"/>
+    </w:lvlOverride>
   </w:num>
   <w:num w:numId="1146">
     <w:abstractNumId w:val="991"/>
   </w:num>
   <w:num w:numId="1147">
-    <w:abstractNumId w:val="99411"/>
-    <w:lvlOverride w:ilvl="0">
-      <w:startOverride w:val="1"/>
-    </w:lvlOverride>
-    <w:lvlOverride w:ilvl="1">
-      <w:startOverride w:val="1"/>
-    </w:lvlOverride>
-    <w:lvlOverride w:ilvl="2">
-      <w:startOverride w:val="1"/>
-    </w:lvlOverride>
-    <w:lvlOverride w:ilvl="3">
-      <w:startOverride w:val="1"/>
-    </w:lvlOverride>
-    <w:lvlOverride w:ilvl="4">
-      <w:startOverride w:val="1"/>
-    </w:lvlOverride>
-    <w:lvlOverride w:ilvl="5">
-      <w:startOverride w:val="1"/>
-    </w:lvlOverride>
-    <w:lvlOverride w:ilvl="6">
-      <w:startOverride w:val="1"/>
-    </w:lvlOverride>
-    <w:lvlOverride w:ilvl="7">
-      <w:startOverride w:val="1"/>
-    </w:lvlOverride>
-    <w:lvlOverride w:ilvl="8">
-      <w:startOverride w:val="1"/>
-    </w:lvlOverride>
+    <w:abstractNumId w:val="991"/>
   </w:num>
   <w:num w:numId="1148">
     <w:abstractNumId w:val="991"/>
   </w:num>
   <w:num w:numId="1149">
+    <w:abstractNumId w:val="991"/>
+  </w:num>
+  <w:num w:numId="1150">
+    <w:abstractNumId w:val="991"/>
+  </w:num>
+  <w:num w:numId="1151">
+    <w:abstractNumId w:val="99411"/>
+    <w:lvlOverride w:ilvl="0">
+      <w:startOverride w:val="1"/>
+    </w:lvlOverride>
+    <w:lvlOverride w:ilvl="1">
+      <w:startOverride w:val="1"/>
+    </w:lvlOverride>
+    <w:lvlOverride w:ilvl="2">
+      <w:startOverride w:val="1"/>
+    </w:lvlOverride>
+    <w:lvlOverride w:ilvl="3">
+      <w:startOverride w:val="1"/>
+    </w:lvlOverride>
+    <w:lvlOverride w:ilvl="4">
+      <w:startOverride w:val="1"/>
+    </w:lvlOverride>
+    <w:lvlOverride w:ilvl="5">
+      <w:startOverride w:val="1"/>
+    </w:lvlOverride>
+    <w:lvlOverride w:ilvl="6">
+      <w:startOverride w:val="1"/>
+    </w:lvlOverride>
+    <w:lvlOverride w:ilvl="7">
+      <w:startOverride w:val="1"/>
+    </w:lvlOverride>
+    <w:lvlOverride w:ilvl="8">
+      <w:startOverride w:val="1"/>
+    </w:lvlOverride>
+  </w:num>
+  <w:num w:numId="1152">
+    <w:abstractNumId w:val="991"/>
+  </w:num>
+  <w:num w:numId="1153">
     <w:abstractNumId w:val="991"/>
   </w:num>
 </w:numbering>

</xml_diff>